<commit_message>
Promote approved Q3(a) document repair
</commit_message>
<xml_diff>
--- a/HW4-Solution.docx
+++ b/HW4-Solution.docx
@@ -74,23 +74,14 @@
         </w:rPr>
         <w:fldChar w:fldCharType="separate"/>
       </w:r>
-      <w:hyperlink w:anchor="_Toc235827747" w:history="1">
-        <w:r>
-          <w:rPr>
-            <w:rStyle w:val="Hyperlink"/>
-            <w:rFonts w:ascii="Arial" w:hAnsi="Arial" w:cs="Arial" w:hint="cs"/>
-            <w:noProof/>
-            <w:rtl/>
-          </w:rPr>
-          <w:t>שאלה</w:t>
-        </w:r>
+      <w:hyperlink w:anchor="_Toc235876152" w:history="1">
         <w:r>
           <w:rPr>
             <w:rStyle w:val="Hyperlink"/>
             <w:noProof/>
             <w:rtl/>
           </w:rPr>
-          <w:t xml:space="preserve"> 1</w:t>
+          <w:t>שאלה 1</w:t>
         </w:r>
         <w:r>
           <w:rPr>
@@ -111,7 +102,7 @@
             <w:noProof/>
             <w:webHidden/>
           </w:rPr>
-          <w:instrText xml:space="preserve"> PAGEREF _Toc235827747 \h </w:instrText>
+          <w:instrText xml:space="preserve"> PAGEREF _Toc235876152 \h </w:instrText>
         </w:r>
         <w:r>
           <w:rPr>
@@ -155,23 +146,14 @@
           <w14:ligatures w14:val="standardContextual"/>
         </w:rPr>
       </w:pPr>
-      <w:hyperlink w:anchor="_Toc235827748" w:history="1">
-        <w:r>
-          <w:rPr>
-            <w:rStyle w:val="Hyperlink"/>
-            <w:rFonts w:ascii="Arial" w:hAnsi="Arial" w:cs="Arial" w:hint="cs"/>
-            <w:noProof/>
-            <w:rtl/>
-          </w:rPr>
-          <w:t>שאלה</w:t>
-        </w:r>
+      <w:hyperlink w:anchor="_Toc235876153" w:history="1">
         <w:r>
           <w:rPr>
             <w:rStyle w:val="Hyperlink"/>
             <w:noProof/>
             <w:rtl/>
           </w:rPr>
-          <w:t xml:space="preserve"> 2</w:t>
+          <w:t>שאלה 2</w:t>
         </w:r>
         <w:r>
           <w:rPr>
@@ -192,7 +174,7 @@
             <w:noProof/>
             <w:webHidden/>
           </w:rPr>
-          <w:instrText xml:space="preserve"> PAGEREF _Toc235827748 \h </w:instrText>
+          <w:instrText xml:space="preserve"> PAGEREF _Toc235876153 \h </w:instrText>
         </w:r>
         <w:r>
           <w:rPr>
@@ -236,23 +218,14 @@
           <w14:ligatures w14:val="standardContextual"/>
         </w:rPr>
       </w:pPr>
-      <w:hyperlink w:anchor="_Toc235827749" w:history="1">
-        <w:r>
-          <w:rPr>
-            <w:rStyle w:val="Hyperlink"/>
-            <w:rFonts w:ascii="Arial" w:hAnsi="Arial" w:cs="Arial" w:hint="cs"/>
-            <w:noProof/>
-            <w:rtl/>
-          </w:rPr>
-          <w:t>שאלה</w:t>
-        </w:r>
+      <w:hyperlink w:anchor="_Toc235876154" w:history="1">
         <w:r>
           <w:rPr>
             <w:rStyle w:val="Hyperlink"/>
             <w:noProof/>
             <w:rtl/>
           </w:rPr>
-          <w:t xml:space="preserve"> 3</w:t>
+          <w:t>שאלה 3</w:t>
         </w:r>
         <w:r>
           <w:rPr>
@@ -273,7 +246,7 @@
             <w:noProof/>
             <w:webHidden/>
           </w:rPr>
-          <w:instrText xml:space="preserve"> PAGEREF _Toc235827749 \h </w:instrText>
+          <w:instrText xml:space="preserve"> PAGEREF _Toc235876154 \h </w:instrText>
         </w:r>
         <w:r>
           <w:rPr>
@@ -293,7 +266,7 @@
             <w:noProof/>
             <w:webHidden/>
           </w:rPr>
-          <w:t>9</w:t>
+          <w:t>10</w:t>
         </w:r>
         <w:r>
           <w:rPr>
@@ -317,7 +290,7 @@
         </w:rPr>
         <w:fldChar w:fldCharType="end"/>
       </w:r>
-      <w:bookmarkStart w:id="1" w:name="_Toc235827747"/>
+      <w:bookmarkStart w:id="1" w:name="_Toc235876152"/>
       <w:r>
         <w:rPr>
           <w:rtl/>
@@ -6764,7 +6737,7 @@
         </w:rPr>
       </w:pPr>
       <w:bookmarkStart w:id="2" w:name="שאלה-2"/>
-      <w:bookmarkStart w:id="3" w:name="_Toc235827748"/>
+      <w:bookmarkStart w:id="3" w:name="_Toc235876153"/>
       <w:bookmarkEnd w:id="0"/>
       <w:r>
         <w:rPr>
@@ -10760,6 +10733,7 @@
         <w:rPr>
           <w:rtl/>
         </w:rPr>
+        <w:lastRenderedPageBreak/>
         <w:t xml:space="preserve">כעת ההטיה. הצבת </w:t>
       </w:r>
       <m:oMath>
@@ -14932,282 +14906,140 @@
       </w:r>
     </w:p>
     <w:p>
+      <w:r>
+        <w:br w:type="page"/>
+      </w:r>
+    </w:p>
+    <w:p>
       <w:pPr>
         <w:pStyle w:val="Heading1"/>
         <w:rPr>
           <w:rtl/>
         </w:rPr>
       </w:pPr>
-      <w:bookmarkStart w:id="4" w:name="_Toc235827749"/>
-      <w:r>
-        <w:rPr>
-          <w:rtl/>
-        </w:rPr>
+      <w:bookmarkStart w:id="4" w:name="_Toc235876154"/>
+      <w:r>
+        <w:rPr>
+          <w:rtl/>
+        </w:rPr>
+        <w:lastRenderedPageBreak/>
         <w:t>שאלה 3</w:t>
       </w:r>
       <w:bookmarkEnd w:id="4"/>
     </w:p>
     <w:p>
       <w:pPr>
-        <w:pStyle w:val="OriginalQuestion"/>
-        <w:bidi w:val="0"/>
+        <w:keepLines/>
+        <w:spacing w:after="0" w:line="20" w:lineRule="exact"/>
       </w:pPr>
       <w:r>
         <w:rPr>
-          <w:rFonts w:eastAsia="Aptos" w:cs="Aptos"/>
-          <w:b/>
-        </w:rPr>
-        <w:t>Question 3 (Implementing set networks in PyTorch (25 pts)). Consider set data with Sₙ symmetry. A set of n elements, each with d feature dimensions, is represented as a matrix X ∈ ℝⁿˣ</w:t>
-      </w:r>
-      <w:r>
-        <w:rPr>
-          <w:rFonts w:eastAsia="Aptos" w:cs="Aptos"/>
-          <w:b/>
-        </w:rPr>
-        <w:t>ᵈ</w:t>
-      </w:r>
-      <w:r>
-        <w:rPr>
-          <w:rFonts w:eastAsia="Aptos" w:cs="Aptos"/>
-          <w:b/>
-        </w:rPr>
-        <w:t xml:space="preserve"> whose i-th row X</w:t>
-      </w:r>
-      <w:r>
-        <w:rPr>
-          <w:rFonts w:eastAsia="Aptos" w:cs="Aptos"/>
-          <w:b/>
-        </w:rPr>
-        <w:t>ᵢ</w:t>
-      </w:r>
-      <w:r>
-        <w:rPr>
-          <w:rFonts w:eastAsia="Aptos" w:cs="Aptos"/>
-          <w:b/>
-        </w:rPr>
-        <w:t xml:space="preserve"> ∈ ℝ</w:t>
-      </w:r>
-      <w:r>
-        <w:rPr>
-          <w:rFonts w:eastAsia="Aptos" w:cs="Aptos"/>
-          <w:b/>
-        </w:rPr>
-        <w:t>ᵈ</w:t>
-      </w:r>
-      <w:r>
-        <w:rPr>
-          <w:rFonts w:eastAsia="Aptos" w:cs="Aptos"/>
-          <w:b/>
-        </w:rPr>
-        <w:t xml:space="preserve"> is the feature vector of the i-th element. A permutation π ∈ Sₙ acts by permuting the rows, (π · X)</w:t>
-      </w:r>
-      <w:r>
-        <w:rPr>
-          <w:rFonts w:eastAsia="Aptos" w:cs="Aptos"/>
-          <w:b/>
-        </w:rPr>
-        <w:t>ᵢ</w:t>
-      </w:r>
-      <w:r>
-        <w:rPr>
-          <w:rFonts w:eastAsia="Aptos" w:cs="Aptos"/>
-          <w:b/>
-        </w:rPr>
-        <w:t xml:space="preserve"> = X_{π⁻¹(i)}. Recall the two target behaviours:</w:t>
+          <w:sz w:val="2"/>
+          <w:szCs w:val="2"/>
+        </w:rPr>
+        <w:t xml:space="preserve"> </w:t>
       </w:r>
     </w:p>
     <w:p>
       <w:pPr>
-        <w:pStyle w:val="OriginalQuestion"/>
-        <w:numPr>
-          <w:ilvl w:val="0"/>
-          <w:numId w:val="2"/>
-        </w:numPr>
-        <w:bidi w:val="0"/>
+        <w:pStyle w:val="BodyText"/>
+        <w:keepLines/>
+        <w:spacing w:before="0" w:after="160"/>
+        <w:jc w:val="center"/>
       </w:pPr>
       <w:r>
         <w:rPr>
-          <w:rFonts w:eastAsia="Aptos" w:cs="Aptos"/>
-        </w:rPr>
-        <w:t>a network F : ℝⁿˣ</w:t>
-      </w:r>
-      <w:r>
-        <w:rPr>
-          <w:rFonts w:eastAsia="Aptos" w:cs="Aptos"/>
-        </w:rPr>
-        <w:t>ᵈ</w:t>
-      </w:r>
-      <w:r>
-        <w:rPr>
-          <w:rFonts w:eastAsia="Aptos" w:cs="Aptos"/>
-        </w:rPr>
-        <w:t xml:space="preserve"> → ℝ</w:t>
-      </w:r>
-      <w:r>
-        <w:rPr>
-          <w:rFonts w:eastAsia="Aptos" w:cs="Aptos"/>
-        </w:rPr>
-        <w:t>ᵖ</w:t>
-      </w:r>
-      <w:r>
-        <w:rPr>
-          <w:rFonts w:eastAsia="Aptos" w:cs="Aptos"/>
-        </w:rPr>
-        <w:t xml:space="preserve"> is invariant if F(π · X) = F(X) for all π ∈ Sₙ;</w:t>
+          <w:noProof/>
+        </w:rPr>
+        <w:drawing>
+          <wp:inline distT="0" distB="0" distL="0" distR="0" wp14:anchorId="3B1CF75B" wp14:editId="614A4409">
+            <wp:extent cx="5532120" cy="7584577"/>
+            <wp:effectExtent l="0" t="0" r="0" b="0"/>
+            <wp:docPr id="26" name="Picture 26"/>
+            <wp:cNvGraphicFramePr>
+              <a:graphicFrameLocks xmlns:a="http://schemas.openxmlformats.org/drawingml/2006/main" noChangeAspect="1"/>
+            </wp:cNvGraphicFramePr>
+            <a:graphic xmlns:a="http://schemas.openxmlformats.org/drawingml/2006/main">
+              <a:graphicData uri="http://schemas.openxmlformats.org/drawingml/2006/picture">
+                <pic:pic xmlns:pic="http://schemas.openxmlformats.org/drawingml/2006/picture">
+                  <pic:nvPicPr>
+                    <pic:cNvPr id="0" name="q3-prompt-page4.png"/>
+                    <pic:cNvPicPr/>
+                  </pic:nvPicPr>
+                  <pic:blipFill>
+                    <a:blip r:embed="rId10"/>
+                    <a:stretch>
+                      <a:fillRect/>
+                    </a:stretch>
+                  </pic:blipFill>
+                  <pic:spPr>
+                    <a:xfrm>
+                      <a:off x="0" y="0"/>
+                      <a:ext cx="5532120" cy="7584577"/>
+                    </a:xfrm>
+                    <a:prstGeom prst="rect">
+                      <a:avLst/>
+                    </a:prstGeom>
+                  </pic:spPr>
+                </pic:pic>
+              </a:graphicData>
+            </a:graphic>
+          </wp:inline>
+        </w:drawing>
+      </w:r>
+    </w:p>
+    <w:p>
+      <w:r>
+        <w:br w:type="page"/>
       </w:r>
     </w:p>
     <w:p>
       <w:pPr>
-        <w:pStyle w:val="OriginalQuestion"/>
-        <w:numPr>
-          <w:ilvl w:val="0"/>
-          <w:numId w:val="2"/>
-        </w:numPr>
-        <w:bidi w:val="0"/>
+        <w:pStyle w:val="BodyText"/>
+        <w:keepLines/>
+        <w:spacing w:before="0" w:after="160"/>
+        <w:jc w:val="center"/>
       </w:pPr>
       <w:r>
         <w:rPr>
-          <w:rFonts w:eastAsia="Aptos" w:cs="Aptos"/>
-        </w:rPr>
-        <w:t>a layer f : ℝⁿˣ</w:t>
-      </w:r>
-      <w:r>
-        <w:rPr>
-          <w:rFonts w:eastAsia="Aptos" w:cs="Aptos"/>
-        </w:rPr>
-        <w:t>ᵈ</w:t>
-      </w:r>
-      <w:r>
-        <w:rPr>
-          <w:rFonts w:eastAsia="Aptos" w:cs="Aptos"/>
-        </w:rPr>
-        <w:t xml:space="preserve"> → ℝⁿˣ</w:t>
-      </w:r>
-      <w:r>
-        <w:rPr>
-          <w:rFonts w:eastAsia="Aptos" w:cs="Aptos"/>
-        </w:rPr>
-        <w:t>ᵈ</w:t>
-      </w:r>
-      <w:r>
-        <w:rPr>
-          <w:rFonts w:eastAsia="Aptos" w:cs="Aptos"/>
-        </w:rPr>
-        <w:t>′ is equivariant if f(π · X) = π · f(X) for all π ∈ Sₙ.</w:t>
-      </w:r>
-    </w:p>
-    <w:p>
-      <w:pPr>
-        <w:pStyle w:val="OriginalQuestion"/>
-        <w:bidi w:val="0"/>
-      </w:pPr>
-      <w:r>
-        <w:rPr>
-          <w:rFonts w:eastAsia="Aptos" w:cs="Aptos"/>
-        </w:rPr>
-        <w:t>You will implement the following architectures in PyTorch. For each one, supply (i) a torch.nn.Module class implementing it, and (ii) a test function. Your implementations must accept inputs of shape (n, d) with d ≥ 1 arbitrary.</w:t>
-      </w:r>
-    </w:p>
-    <w:p>
-      <w:pPr>
-        <w:pStyle w:val="OriginalQuestion"/>
-        <w:bidi w:val="0"/>
-      </w:pPr>
-      <w:r>
-        <w:rPr>
-          <w:rFonts w:eastAsia="Aptos" w:cs="Aptos"/>
-          <w:b/>
-        </w:rPr>
-        <w:t>Specification of the test functions. First decide, for each architecture, whether it is invariant or equivariant; this determines which property the test checks. For parts (a)–(d) the test does not train the network: with randomly initialized parameters it must</w:t>
-      </w:r>
-    </w:p>
-    <w:p>
-      <w:pPr>
-        <w:pStyle w:val="OriginalQuestion"/>
-        <w:numPr>
-          <w:ilvl w:val="0"/>
-          <w:numId w:val="3"/>
-        </w:numPr>
-        <w:bidi w:val="0"/>
-      </w:pPr>
-      <w:r>
-        <w:rPr>
-          <w:rFonts w:eastAsia="Aptos" w:cs="Aptos"/>
-        </w:rPr>
-        <w:t>generate a random input X ∈ ℝⁿˣ</w:t>
-      </w:r>
-      <w:r>
-        <w:rPr>
-          <w:rFonts w:eastAsia="Aptos" w:cs="Aptos"/>
-        </w:rPr>
-        <w:t>ᵈ</w:t>
-      </w:r>
-      <w:r>
-        <w:rPr>
-          <w:rFonts w:eastAsia="Aptos" w:cs="Aptos"/>
-        </w:rPr>
-        <w:t>;</w:t>
-      </w:r>
-    </w:p>
-    <w:p>
-      <w:pPr>
-        <w:pStyle w:val="OriginalQuestion"/>
-        <w:numPr>
-          <w:ilvl w:val="0"/>
-          <w:numId w:val="3"/>
-        </w:numPr>
-        <w:bidi w:val="0"/>
-      </w:pPr>
-      <w:r>
-        <w:rPr>
-          <w:rFonts w:eastAsia="Aptos" w:cs="Aptos"/>
-        </w:rPr>
-        <w:t>draw a random permutation π ∈ Sₙ and form π · X;</w:t>
-      </w:r>
-    </w:p>
-    <w:p>
-      <w:pPr>
-        <w:pStyle w:val="OriginalQuestion"/>
-        <w:numPr>
-          <w:ilvl w:val="0"/>
-          <w:numId w:val="3"/>
-        </w:numPr>
-        <w:bidi w:val="0"/>
-      </w:pPr>
-      <w:r>
-        <w:rPr>
-          <w:rFonts w:eastAsia="Aptos" w:cs="Aptos"/>
-        </w:rPr>
-        <w:t>compare the network’s outputs on X and on π · X (for an invariant net: F(π · X) ≈ F(X); for an equivariant layer: f(π · X) ≈ π · f(X));</w:t>
-      </w:r>
-    </w:p>
-    <w:p>
-      <w:pPr>
-        <w:pStyle w:val="OriginalQuestion"/>
-        <w:numPr>
-          <w:ilvl w:val="0"/>
-          <w:numId w:val="3"/>
-        </w:numPr>
-        <w:bidi w:val="0"/>
-      </w:pPr>
-      <w:r>
-        <w:rPr>
-          <w:rFonts w:eastAsia="Aptos" w:cs="Aptos"/>
-        </w:rPr>
-        <w:t>return a boolean: True iff the relevant equality holds up to a numerical tolerance (e.g. atol=1e-5) that you state.</w:t>
-      </w:r>
-    </w:p>
-    <w:p>
-      <w:pPr>
-        <w:pStyle w:val="OriginalQuestion"/>
-        <w:bidi w:val="0"/>
-      </w:pPr>
-      <w:r>
-        <w:rPr>
-          <w:rFonts w:eastAsia="Aptos" w:cs="Aptos"/>
-          <w:b/>
-        </w:rPr>
-        <w:t>Architectures. Throughout, “your favourite model” means any standard network you choose, e.g. an MLP applied to the flattened input; state which one you used.</w:t>
+          <w:noProof/>
+        </w:rPr>
+        <w:lastRenderedPageBreak/>
+        <w:drawing>
+          <wp:inline distT="0" distB="0" distL="0" distR="0" wp14:anchorId="7920EF46" wp14:editId="7F8840BE">
+            <wp:extent cx="5532120" cy="829138"/>
+            <wp:effectExtent l="0" t="0" r="0" b="0"/>
+            <wp:docPr id="27" name="Picture 27"/>
+            <wp:cNvGraphicFramePr>
+              <a:graphicFrameLocks xmlns:a="http://schemas.openxmlformats.org/drawingml/2006/main" noChangeAspect="1"/>
+            </wp:cNvGraphicFramePr>
+            <a:graphic xmlns:a="http://schemas.openxmlformats.org/drawingml/2006/main">
+              <a:graphicData uri="http://schemas.openxmlformats.org/drawingml/2006/picture">
+                <pic:pic xmlns:pic="http://schemas.openxmlformats.org/drawingml/2006/picture">
+                  <pic:nvPicPr>
+                    <pic:cNvPr id="0" name="q3-prompt-page5.png"/>
+                    <pic:cNvPicPr/>
+                  </pic:nvPicPr>
+                  <pic:blipFill>
+                    <a:blip r:embed="rId11"/>
+                    <a:stretch>
+                      <a:fillRect/>
+                    </a:stretch>
+                  </pic:blipFill>
+                  <pic:spPr>
+                    <a:xfrm>
+                      <a:off x="0" y="0"/>
+                      <a:ext cx="5532120" cy="829138"/>
+                    </a:xfrm>
+                    <a:prstGeom prst="rect">
+                      <a:avLst/>
+                    </a:prstGeom>
+                  </pic:spPr>
+                </pic:pic>
+              </a:graphicData>
+            </a:graphic>
+          </wp:inline>
+        </w:drawing>
       </w:r>
     </w:p>
     <w:p>
@@ -15225,126 +15057,78 @@
       </w:r>
     </w:p>
     <w:p>
-      <w:pPr>
-        <w:pStyle w:val="OriginalQuestion"/>
-        <w:bidi w:val="0"/>
-      </w:pPr>
-      <w:r>
-        <w:rPr>
-          <w:rFonts w:eastAsia="Aptos" w:cs="Aptos"/>
-          <w:b/>
-        </w:rPr>
-        <w:t>(a) Canonization-based network. Apply a canonization function c : ℝⁿˣ</w:t>
-      </w:r>
-      <w:r>
-        <w:rPr>
-          <w:rFonts w:eastAsia="Aptos" w:cs="Aptos"/>
-          <w:b/>
-        </w:rPr>
-        <w:t>ᵈ</w:t>
-      </w:r>
-      <w:r>
-        <w:rPr>
-          <w:rFonts w:eastAsia="Aptos" w:cs="Aptos"/>
-          <w:b/>
-        </w:rPr>
-        <w:t xml:space="preserve"> → ℝⁿˣ</w:t>
-      </w:r>
-      <w:r>
-        <w:rPr>
-          <w:rFonts w:eastAsia="Aptos" w:cs="Aptos"/>
-          <w:b/>
-        </w:rPr>
-        <w:t>ᵈ</w:t>
-      </w:r>
-      <w:r>
-        <w:rPr>
-          <w:rFonts w:eastAsia="Aptos" w:cs="Aptos"/>
-          <w:b/>
-        </w:rPr>
-        <w:t xml:space="preserve"> that reorders the rows by a fixed, deterministic rule (for instance, sort the rows in lexicographic order, with a deterministic tie-break), so that c(π · X) = c(X) for every π; then apply your favourite model to c(X). State your canonization rule and why it is permutation-invariant.</w:t>
+      <w:r>
+        <w:rPr>
+          <w:rtl/>
+        </w:rPr>
+        <w:t xml:space="preserve">נגדיר את פונקציית הקנוניזציה </w:t>
+      </w:r>
+      <m:oMath>
+        <m:r>
+          <w:rPr>
+            <w:rFonts w:ascii="Cambria Math" w:hAnsi="Cambria Math" w:cs="Cambria Math"/>
+          </w:rPr>
+          <m:t>c</m:t>
+        </m:r>
+        <m:r>
+          <w:rPr>
+            <w:rFonts w:ascii="Cambria Math" w:hAnsi="Cambria Math" w:cs="Cambria Math"/>
+          </w:rPr>
+          <m:t>(</m:t>
+        </m:r>
+        <m:r>
+          <w:rPr>
+            <w:rFonts w:ascii="Cambria Math" w:hAnsi="Cambria Math" w:cs="Cambria Math"/>
+          </w:rPr>
+          <m:t>X</m:t>
+        </m:r>
+        <m:r>
+          <w:rPr>
+            <w:rFonts w:ascii="Cambria Math" w:hAnsi="Cambria Math" w:cs="Cambria Math"/>
+          </w:rPr>
+          <m:t>)</m:t>
+        </m:r>
+      </m:oMath>
+      <w:r>
+        <w:rPr>
+          <w:rtl/>
+        </w:rPr>
+        <w:t xml:space="preserve"> כמטריצה המתקבלת ממיון שורות </w:t>
+      </w:r>
+      <m:oMath>
+        <m:r>
+          <w:rPr>
+            <w:rFonts w:ascii="Cambria Math" w:hAnsi="Cambria Math" w:cs="Cambria Math"/>
+          </w:rPr>
+          <m:t>X</m:t>
+        </m:r>
+      </m:oMath>
+      <w:r>
+        <w:rPr>
+          <w:rtl/>
+        </w:rPr>
+        <w:t xml:space="preserve"> בסדר לקסיקוגרפי לפי כל </w:t>
+      </w:r>
+      <m:oMath>
+        <m:r>
+          <w:rPr>
+            <w:rFonts w:ascii="Cambria Math" w:hAnsi="Cambria Math" w:cs="Cambria Math"/>
+          </w:rPr>
+          <m:t>d</m:t>
+        </m:r>
+      </m:oMath>
+      <w:r>
+        <w:rPr>
+          <w:rtl/>
+        </w:rPr>
+        <w:t xml:space="preserve"> הקואורדינטות. במימוש, המיון מתבצע באמצעות מיונים יציבים, מן הקואורדינטה האחרונה אל הראשונה. אם שתי שורות שוות בכל הקואורדינטות, החלפתן אינה משנה את המטריצה, ולכן אין צורך בשובר שוויון נוסף.</w:t>
       </w:r>
     </w:p>
     <w:p>
-      <w:pPr>
-        <w:jc w:val="right"/>
-      </w:pPr>
-      <w:r>
-        <w:rPr>
-          <w:rtl/>
-        </w:rPr>
-        <w:t xml:space="preserve">נגדיר את פונקציית הקנוניזציה </w:t>
-      </w:r>
-      <m:oMath>
-        <m:r>
-          <w:rPr>
-            <w:rFonts w:ascii="Cambria Math" w:hAnsi="Cambria Math" w:cs="Cambria Math"/>
-          </w:rPr>
-          <m:t>c</m:t>
-        </m:r>
-        <m:r>
-          <w:rPr>
-            <w:rFonts w:ascii="Cambria Math" w:hAnsi="Cambria Math" w:cs="Cambria Math"/>
-          </w:rPr>
-          <m:t>(</m:t>
-        </m:r>
-        <m:r>
-          <w:rPr>
-            <w:rFonts w:ascii="Cambria Math" w:hAnsi="Cambria Math" w:cs="Cambria Math"/>
-          </w:rPr>
-          <m:t>X</m:t>
-        </m:r>
-        <m:r>
-          <w:rPr>
-            <w:rFonts w:ascii="Cambria Math" w:hAnsi="Cambria Math" w:cs="Cambria Math"/>
-          </w:rPr>
-          <m:t>)</m:t>
-        </m:r>
-      </m:oMath>
-      <w:r>
-        <w:rPr>
-          <w:rtl/>
-        </w:rPr>
-        <w:t xml:space="preserve"> כמטריצה המתקבלת ממיון שורות </w:t>
-      </w:r>
-      <m:oMath>
-        <m:r>
-          <w:rPr>
-            <w:rFonts w:ascii="Cambria Math" w:hAnsi="Cambria Math" w:cs="Cambria Math"/>
-          </w:rPr>
-          <m:t>X</m:t>
-        </m:r>
-      </m:oMath>
-      <w:r>
-        <w:rPr>
-          <w:rtl/>
-        </w:rPr>
-        <w:t xml:space="preserve"> בסדר לקסיקוגרפי לפי כל </w:t>
-      </w:r>
-      <m:oMath>
-        <m:r>
-          <w:rPr>
-            <w:rFonts w:ascii="Cambria Math" w:hAnsi="Cambria Math" w:cs="Cambria Math"/>
-          </w:rPr>
-          <m:t>d</m:t>
-        </m:r>
-      </m:oMath>
-      <w:r>
-        <w:rPr>
-          <w:rtl/>
-        </w:rPr>
-        <w:t xml:space="preserve"> הקואורדינטות. במימוש, המיון מתבצע באמצעות מיונים יציבים, מן הקואורדינטה האחרונה אל הראשונה. אם שתי שורות שוות בכל הקואורדינטות, החלפתן אינה משנה את המטריצה, ולכן אין צורך בשובר שוויון נוסף.</w:t>
-      </w:r>
-    </w:p>
-    <w:p>
-      <w:pPr>
-        <w:jc w:val="right"/>
-      </w:pPr>
-      <w:r>
-        <w:rPr>
-          <w:rtl/>
-        </w:rPr>
-        <w:lastRenderedPageBreak/>
+      <w:r>
+        <w:rPr>
+          <w:rtl/>
+        </w:rPr>
         <w:t xml:space="preserve">לכל </w:t>
       </w:r>
       <m:oMath>
@@ -15495,9 +15279,6 @@
       </m:oMathPara>
     </w:p>
     <w:p>
-      <w:pPr>
-        <w:jc w:val="right"/>
-      </w:pPr>
       <w:r>
         <w:rPr>
           <w:rtl/>
@@ -15630,9 +15411,6 @@
       </m:oMathPara>
     </w:p>
     <w:p>
-      <w:pPr>
-        <w:jc w:val="right"/>
-      </w:pPr>
       <w:r>
         <w:rPr>
           <w:rtl/>
@@ -15775,9 +15553,6 @@
       </m:oMathPara>
     </w:p>
     <w:p>
-      <w:pPr>
-        <w:jc w:val="right"/>
-      </w:pPr>
       <w:r>
         <w:rPr>
           <w:rtl/>
@@ -15976,9 +15751,6 @@
       </m:oMathPara>
     </w:p>
     <w:p>
-      <w:pPr>
-        <w:jc w:val="right"/>
-      </w:pPr>
       <w:r>
         <w:rPr>
           <w:rtl/>
@@ -16001,9 +15773,6 @@
       </w:r>
     </w:p>
     <w:p>
-      <w:pPr>
-        <w:jc w:val="right"/>
-      </w:pPr>
       <w:r>
         <w:rPr>
           <w:rtl/>
@@ -16282,7 +16051,12 @@
       </w:r>
     </w:p>
     <w:sectPr>
-      <w:headerReference w:type="default" r:id="rId10"/>
+      <w:headerReference w:type="even" r:id="rId12"/>
+      <w:headerReference w:type="default" r:id="rId13"/>
+      <w:footerReference w:type="even" r:id="rId14"/>
+      <w:footerReference w:type="default" r:id="rId15"/>
+      <w:headerReference w:type="first" r:id="rId16"/>
+      <w:footerReference w:type="first" r:id="rId17"/>
       <w:pgSz w:w="11906" w:h="16838"/>
       <w:pgMar w:top="1134" w:right="1247" w:bottom="1134" w:left="1247" w:header="652" w:footer="652" w:gutter="0"/>
       <w:cols w:space="720"/>
@@ -16316,6 +16090,36 @@
 </w:endnotes>
 </file>
 
+<file path=word/footer1.xml><?xml version="1.0" encoding="utf-8"?>
+<w:ftr xmlns:wpc="http://schemas.microsoft.com/office/word/2010/wordprocessingCanvas" xmlns:cx="http://schemas.microsoft.com/office/drawing/2014/chartex" xmlns:cx1="http://schemas.microsoft.com/office/drawing/2015/9/8/chartex" xmlns:cx2="http://schemas.microsoft.com/office/drawing/2015/10/21/chartex" xmlns:cx3="http://schemas.microsoft.com/office/drawing/2016/5/9/chartex" xmlns:cx4="http://schemas.microsoft.com/office/drawing/2016/5/10/chartex" xmlns:cx5="http://schemas.microsoft.com/office/drawing/2016/5/11/chartex" xmlns:cx6="http://schemas.microsoft.com/office/drawing/2016/5/12/chartex" xmlns:cx7="http://schemas.microsoft.com/office/drawing/2016/5/13/chartex" xmlns:cx8="http://schemas.microsoft.com/office/drawing/2016/5/14/chartex" xmlns:mc="http://schemas.openxmlformats.org/markup-compatibility/2006" xmlns:aink="http://schemas.microsoft.com/office/drawing/2016/ink" xmlns:am3d="http://schemas.microsoft.com/office/drawing/2017/model3d" xmlns:o="urn:schemas-microsoft-com:office:office" xmlns:oel="http://schemas.microsoft.com/office/2019/extlst" xmlns:r="http://schemas.openxmlformats.org/officeDocument/2006/relationships" xmlns:m="http://schemas.openxmlformats.org/officeDocument/2006/math" xmlns:v="urn:schemas-microsoft-com:vml" xmlns:wp14="http://schemas.microsoft.com/office/word/2010/wordprocessingDrawing" xmlns:wp="http://schemas.openxmlformats.org/drawingml/2006/wordprocessingDrawing" xmlns:w10="urn:schemas-microsoft-com:office:word" xmlns:w="http://schemas.openxmlformats.org/wordprocessingml/2006/main" xmlns:w14="http://schemas.microsoft.com/office/word/2010/wordml" xmlns:w15="http://schemas.microsoft.com/office/word/2012/wordml" xmlns:w16cei="http://schemas.microsoft.com/office/word/2026/wordml/cei" xmlns:w16cex="http://schemas.microsoft.com/office/word/2018/wordml/cex" xmlns:w16cid="http://schemas.microsoft.com/office/word/2016/wordml/cid" xmlns:w16="http://schemas.microsoft.com/office/word/2018/wordml" xmlns:w16du="http://schemas.microsoft.com/office/word/2023/wordml/word16du" xmlns:w16sdtdh="http://schemas.microsoft.com/office/word/2020/wordml/sdtdatahash" xmlns:w16sdtfl="http://schemas.microsoft.com/office/word/2024/wordml/sdtformatlock" xmlns:w16se="http://schemas.microsoft.com/office/word/2015/wordml/symex" xmlns:wpg="http://schemas.microsoft.com/office/word/2010/wordprocessingGroup" xmlns:wpi="http://schemas.microsoft.com/office/word/2010/wordprocessingInk" xmlns:wne="http://schemas.microsoft.com/office/word/2006/wordml" xmlns:wps="http://schemas.microsoft.com/office/word/2010/wordprocessingShape" mc:Ignorable="w14 w15 w16se w16cid w16 w16cex w16sdtdh w16sdtfl w16du wp14">
+  <w:p>
+    <w:pPr>
+      <w:pStyle w:val="Footer"/>
+    </w:pPr>
+  </w:p>
+</w:ftr>
+</file>
+
+<file path=word/footer2.xml><?xml version="1.0" encoding="utf-8"?>
+<w:ftr xmlns:wpc="http://schemas.microsoft.com/office/word/2010/wordprocessingCanvas" xmlns:cx="http://schemas.microsoft.com/office/drawing/2014/chartex" xmlns:cx1="http://schemas.microsoft.com/office/drawing/2015/9/8/chartex" xmlns:cx2="http://schemas.microsoft.com/office/drawing/2015/10/21/chartex" xmlns:cx3="http://schemas.microsoft.com/office/drawing/2016/5/9/chartex" xmlns:cx4="http://schemas.microsoft.com/office/drawing/2016/5/10/chartex" xmlns:cx5="http://schemas.microsoft.com/office/drawing/2016/5/11/chartex" xmlns:cx6="http://schemas.microsoft.com/office/drawing/2016/5/12/chartex" xmlns:cx7="http://schemas.microsoft.com/office/drawing/2016/5/13/chartex" xmlns:cx8="http://schemas.microsoft.com/office/drawing/2016/5/14/chartex" xmlns:mc="http://schemas.openxmlformats.org/markup-compatibility/2006" xmlns:aink="http://schemas.microsoft.com/office/drawing/2016/ink" xmlns:am3d="http://schemas.microsoft.com/office/drawing/2017/model3d" xmlns:o="urn:schemas-microsoft-com:office:office" xmlns:oel="http://schemas.microsoft.com/office/2019/extlst" xmlns:r="http://schemas.openxmlformats.org/officeDocument/2006/relationships" xmlns:m="http://schemas.openxmlformats.org/officeDocument/2006/math" xmlns:v="urn:schemas-microsoft-com:vml" xmlns:wp14="http://schemas.microsoft.com/office/word/2010/wordprocessingDrawing" xmlns:wp="http://schemas.openxmlformats.org/drawingml/2006/wordprocessingDrawing" xmlns:w10="urn:schemas-microsoft-com:office:word" xmlns:w="http://schemas.openxmlformats.org/wordprocessingml/2006/main" xmlns:w14="http://schemas.microsoft.com/office/word/2010/wordml" xmlns:w15="http://schemas.microsoft.com/office/word/2012/wordml" xmlns:w16cei="http://schemas.microsoft.com/office/word/2026/wordml/cei" xmlns:w16cex="http://schemas.microsoft.com/office/word/2018/wordml/cex" xmlns:w16cid="http://schemas.microsoft.com/office/word/2016/wordml/cid" xmlns:w16="http://schemas.microsoft.com/office/word/2018/wordml" xmlns:w16du="http://schemas.microsoft.com/office/word/2023/wordml/word16du" xmlns:w16sdtdh="http://schemas.microsoft.com/office/word/2020/wordml/sdtdatahash" xmlns:w16sdtfl="http://schemas.microsoft.com/office/word/2024/wordml/sdtformatlock" xmlns:w16se="http://schemas.microsoft.com/office/word/2015/wordml/symex" xmlns:wpg="http://schemas.microsoft.com/office/word/2010/wordprocessingGroup" xmlns:wpi="http://schemas.microsoft.com/office/word/2010/wordprocessingInk" xmlns:wne="http://schemas.microsoft.com/office/word/2006/wordml" xmlns:wps="http://schemas.microsoft.com/office/word/2010/wordprocessingShape" mc:Ignorable="w14 w15 w16se w16cid w16 w16cex w16sdtdh w16sdtfl w16du wp14">
+  <w:p>
+    <w:pPr>
+      <w:pStyle w:val="Footer"/>
+    </w:pPr>
+  </w:p>
+</w:ftr>
+</file>
+
+<file path=word/footer3.xml><?xml version="1.0" encoding="utf-8"?>
+<w:ftr xmlns:wpc="http://schemas.microsoft.com/office/word/2010/wordprocessingCanvas" xmlns:cx="http://schemas.microsoft.com/office/drawing/2014/chartex" xmlns:cx1="http://schemas.microsoft.com/office/drawing/2015/9/8/chartex" xmlns:cx2="http://schemas.microsoft.com/office/drawing/2015/10/21/chartex" xmlns:cx3="http://schemas.microsoft.com/office/drawing/2016/5/9/chartex" xmlns:cx4="http://schemas.microsoft.com/office/drawing/2016/5/10/chartex" xmlns:cx5="http://schemas.microsoft.com/office/drawing/2016/5/11/chartex" xmlns:cx6="http://schemas.microsoft.com/office/drawing/2016/5/12/chartex" xmlns:cx7="http://schemas.microsoft.com/office/drawing/2016/5/13/chartex" xmlns:cx8="http://schemas.microsoft.com/office/drawing/2016/5/14/chartex" xmlns:mc="http://schemas.openxmlformats.org/markup-compatibility/2006" xmlns:aink="http://schemas.microsoft.com/office/drawing/2016/ink" xmlns:am3d="http://schemas.microsoft.com/office/drawing/2017/model3d" xmlns:o="urn:schemas-microsoft-com:office:office" xmlns:oel="http://schemas.microsoft.com/office/2019/extlst" xmlns:r="http://schemas.openxmlformats.org/officeDocument/2006/relationships" xmlns:m="http://schemas.openxmlformats.org/officeDocument/2006/math" xmlns:v="urn:schemas-microsoft-com:vml" xmlns:wp14="http://schemas.microsoft.com/office/word/2010/wordprocessingDrawing" xmlns:wp="http://schemas.openxmlformats.org/drawingml/2006/wordprocessingDrawing" xmlns:w10="urn:schemas-microsoft-com:office:word" xmlns:w="http://schemas.openxmlformats.org/wordprocessingml/2006/main" xmlns:w14="http://schemas.microsoft.com/office/word/2010/wordml" xmlns:w15="http://schemas.microsoft.com/office/word/2012/wordml" xmlns:w16cei="http://schemas.microsoft.com/office/word/2026/wordml/cei" xmlns:w16cex="http://schemas.microsoft.com/office/word/2018/wordml/cex" xmlns:w16cid="http://schemas.microsoft.com/office/word/2016/wordml/cid" xmlns:w16="http://schemas.microsoft.com/office/word/2018/wordml" xmlns:w16du="http://schemas.microsoft.com/office/word/2023/wordml/word16du" xmlns:w16sdtdh="http://schemas.microsoft.com/office/word/2020/wordml/sdtdatahash" xmlns:w16sdtfl="http://schemas.microsoft.com/office/word/2024/wordml/sdtformatlock" xmlns:w16se="http://schemas.microsoft.com/office/word/2015/wordml/symex" xmlns:wpg="http://schemas.microsoft.com/office/word/2010/wordprocessingGroup" xmlns:wpi="http://schemas.microsoft.com/office/word/2010/wordprocessingInk" xmlns:wne="http://schemas.microsoft.com/office/word/2006/wordml" xmlns:wps="http://schemas.microsoft.com/office/word/2010/wordprocessingShape" mc:Ignorable="w14 w15 w16se w16cid w16 w16cex w16sdtdh w16sdtfl w16du wp14">
+  <w:p>
+    <w:pPr>
+      <w:pStyle w:val="Footer"/>
+    </w:pPr>
+  </w:p>
+</w:ftr>
+</file>
+
 <file path=word/footnotes.xml><?xml version="1.0" encoding="utf-8"?>
 <w:footnotes xmlns:wpc="http://schemas.microsoft.com/office/word/2010/wordprocessingCanvas" xmlns:cx="http://schemas.microsoft.com/office/drawing/2014/chartex" xmlns:cx1="http://schemas.microsoft.com/office/drawing/2015/9/8/chartex" xmlns:cx2="http://schemas.microsoft.com/office/drawing/2015/10/21/chartex" xmlns:cx3="http://schemas.microsoft.com/office/drawing/2016/5/9/chartex" xmlns:cx4="http://schemas.microsoft.com/office/drawing/2016/5/10/chartex" xmlns:cx5="http://schemas.microsoft.com/office/drawing/2016/5/11/chartex" xmlns:cx6="http://schemas.microsoft.com/office/drawing/2016/5/12/chartex" xmlns:cx7="http://schemas.microsoft.com/office/drawing/2016/5/13/chartex" xmlns:cx8="http://schemas.microsoft.com/office/drawing/2016/5/14/chartex" xmlns:mc="http://schemas.openxmlformats.org/markup-compatibility/2006" xmlns:aink="http://schemas.microsoft.com/office/drawing/2016/ink" xmlns:am3d="http://schemas.microsoft.com/office/drawing/2017/model3d" xmlns:o="urn:schemas-microsoft-com:office:office" xmlns:oel="http://schemas.microsoft.com/office/2019/extlst" xmlns:r="http://schemas.openxmlformats.org/officeDocument/2006/relationships" xmlns:m="http://schemas.openxmlformats.org/officeDocument/2006/math" xmlns:v="urn:schemas-microsoft-com:vml" xmlns:wp14="http://schemas.microsoft.com/office/word/2010/wordprocessingDrawing" xmlns:wp="http://schemas.openxmlformats.org/drawingml/2006/wordprocessingDrawing" xmlns:w10="urn:schemas-microsoft-com:office:word" xmlns:w="http://schemas.openxmlformats.org/wordprocessingml/2006/main" xmlns:w14="http://schemas.microsoft.com/office/word/2010/wordml" xmlns:w15="http://schemas.microsoft.com/office/word/2012/wordml" xmlns:w16cei="http://schemas.microsoft.com/office/word/2026/wordml/cei" xmlns:w16cex="http://schemas.microsoft.com/office/word/2018/wordml/cex" xmlns:w16cid="http://schemas.microsoft.com/office/word/2016/wordml/cid" xmlns:w16="http://schemas.microsoft.com/office/word/2018/wordml" xmlns:w16du="http://schemas.microsoft.com/office/word/2023/wordml/word16du" xmlns:w16sdtdh="http://schemas.microsoft.com/office/word/2020/wordml/sdtdatahash" xmlns:w16sdtfl="http://schemas.microsoft.com/office/word/2024/wordml/sdtformatlock" xmlns:w16se="http://schemas.microsoft.com/office/word/2015/wordml/symex" xmlns:wpg="http://schemas.microsoft.com/office/word/2010/wordprocessingGroup" xmlns:wpi="http://schemas.microsoft.com/office/word/2010/wordprocessingInk" xmlns:wne="http://schemas.microsoft.com/office/word/2006/wordml" xmlns:wps="http://schemas.microsoft.com/office/word/2010/wordprocessingShape" mc:Ignorable="w14 w15 w16se w16cid w16 w16cex w16sdtdh w16sdtfl w16du wp14">
   <w:footnote w:type="separator" w:id="-1">
@@ -16336,6 +16140,16 @@
 </file>
 
 <file path=word/header1.xml><?xml version="1.0" encoding="utf-8"?>
+<w:hdr xmlns:wpc="http://schemas.microsoft.com/office/word/2010/wordprocessingCanvas" xmlns:cx="http://schemas.microsoft.com/office/drawing/2014/chartex" xmlns:cx1="http://schemas.microsoft.com/office/drawing/2015/9/8/chartex" xmlns:cx2="http://schemas.microsoft.com/office/drawing/2015/10/21/chartex" xmlns:cx3="http://schemas.microsoft.com/office/drawing/2016/5/9/chartex" xmlns:cx4="http://schemas.microsoft.com/office/drawing/2016/5/10/chartex" xmlns:cx5="http://schemas.microsoft.com/office/drawing/2016/5/11/chartex" xmlns:cx6="http://schemas.microsoft.com/office/drawing/2016/5/12/chartex" xmlns:cx7="http://schemas.microsoft.com/office/drawing/2016/5/13/chartex" xmlns:cx8="http://schemas.microsoft.com/office/drawing/2016/5/14/chartex" xmlns:mc="http://schemas.openxmlformats.org/markup-compatibility/2006" xmlns:aink="http://schemas.microsoft.com/office/drawing/2016/ink" xmlns:am3d="http://schemas.microsoft.com/office/drawing/2017/model3d" xmlns:o="urn:schemas-microsoft-com:office:office" xmlns:oel="http://schemas.microsoft.com/office/2019/extlst" xmlns:r="http://schemas.openxmlformats.org/officeDocument/2006/relationships" xmlns:m="http://schemas.openxmlformats.org/officeDocument/2006/math" xmlns:v="urn:schemas-microsoft-com:vml" xmlns:wp14="http://schemas.microsoft.com/office/word/2010/wordprocessingDrawing" xmlns:wp="http://schemas.openxmlformats.org/drawingml/2006/wordprocessingDrawing" xmlns:w10="urn:schemas-microsoft-com:office:word" xmlns:w="http://schemas.openxmlformats.org/wordprocessingml/2006/main" xmlns:w14="http://schemas.microsoft.com/office/word/2010/wordml" xmlns:w15="http://schemas.microsoft.com/office/word/2012/wordml" xmlns:w16cei="http://schemas.microsoft.com/office/word/2026/wordml/cei" xmlns:w16cex="http://schemas.microsoft.com/office/word/2018/wordml/cex" xmlns:w16cid="http://schemas.microsoft.com/office/word/2016/wordml/cid" xmlns:w16="http://schemas.microsoft.com/office/word/2018/wordml" xmlns:w16du="http://schemas.microsoft.com/office/word/2023/wordml/word16du" xmlns:w16sdtdh="http://schemas.microsoft.com/office/word/2020/wordml/sdtdatahash" xmlns:w16sdtfl="http://schemas.microsoft.com/office/word/2024/wordml/sdtformatlock" xmlns:w16se="http://schemas.microsoft.com/office/word/2015/wordml/symex" xmlns:wpg="http://schemas.microsoft.com/office/word/2010/wordprocessingGroup" xmlns:wpi="http://schemas.microsoft.com/office/word/2010/wordprocessingInk" xmlns:wne="http://schemas.microsoft.com/office/word/2006/wordml" xmlns:wps="http://schemas.microsoft.com/office/word/2010/wordprocessingShape" mc:Ignorable="w14 w15 w16se w16cid w16 w16cex w16sdtdh w16sdtfl w16du wp14">
+  <w:p>
+    <w:pPr>
+      <w:pStyle w:val="Header"/>
+    </w:pPr>
+  </w:p>
+</w:hdr>
+</file>
+
+<file path=word/header2.xml><?xml version="1.0" encoding="utf-8"?>
 <w:hdr xmlns:wpc="http://schemas.microsoft.com/office/word/2010/wordprocessingCanvas" xmlns:cx="http://schemas.microsoft.com/office/drawing/2014/chartex" xmlns:cx1="http://schemas.microsoft.com/office/drawing/2015/9/8/chartex" xmlns:cx2="http://schemas.microsoft.com/office/drawing/2015/10/21/chartex" xmlns:cx3="http://schemas.microsoft.com/office/drawing/2016/5/9/chartex" xmlns:cx4="http://schemas.microsoft.com/office/drawing/2016/5/10/chartex" xmlns:cx5="http://schemas.microsoft.com/office/drawing/2016/5/11/chartex" xmlns:cx6="http://schemas.microsoft.com/office/drawing/2016/5/12/chartex" xmlns:cx7="http://schemas.microsoft.com/office/drawing/2016/5/13/chartex" xmlns:cx8="http://schemas.microsoft.com/office/drawing/2016/5/14/chartex" xmlns:mc="http://schemas.openxmlformats.org/markup-compatibility/2006" xmlns:aink="http://schemas.microsoft.com/office/drawing/2016/ink" xmlns:am3d="http://schemas.microsoft.com/office/drawing/2017/model3d" xmlns:o="urn:schemas-microsoft-com:office:office" xmlns:oel="http://schemas.microsoft.com/office/2019/extlst" xmlns:r="http://schemas.openxmlformats.org/officeDocument/2006/relationships" xmlns:m="http://schemas.openxmlformats.org/officeDocument/2006/math" xmlns:v="urn:schemas-microsoft-com:vml" xmlns:wp14="http://schemas.microsoft.com/office/word/2010/wordprocessingDrawing" xmlns:wp="http://schemas.openxmlformats.org/drawingml/2006/wordprocessingDrawing" xmlns:w10="urn:schemas-microsoft-com:office:word" xmlns:w="http://schemas.openxmlformats.org/wordprocessingml/2006/main" xmlns:w14="http://schemas.microsoft.com/office/word/2010/wordml" xmlns:w15="http://schemas.microsoft.com/office/word/2012/wordml" xmlns:w16cei="http://schemas.microsoft.com/office/word/2026/wordml/cei" xmlns:w16cex="http://schemas.microsoft.com/office/word/2018/wordml/cex" xmlns:w16cid="http://schemas.microsoft.com/office/word/2016/wordml/cid" xmlns:w16="http://schemas.microsoft.com/office/word/2018/wordml" xmlns:w16du="http://schemas.microsoft.com/office/word/2023/wordml/word16du" xmlns:w16sdtdh="http://schemas.microsoft.com/office/word/2020/wordml/sdtdatahash" xmlns:w16sdtfl="http://schemas.microsoft.com/office/word/2024/wordml/sdtformatlock" xmlns:w16se="http://schemas.microsoft.com/office/word/2015/wordml/symex" xmlns:wpg="http://schemas.microsoft.com/office/word/2010/wordprocessingGroup" xmlns:wpi="http://schemas.microsoft.com/office/word/2010/wordprocessingInk" xmlns:wne="http://schemas.microsoft.com/office/word/2006/wordml" xmlns:wps="http://schemas.microsoft.com/office/word/2010/wordprocessingShape" mc:Ignorable="w14 w15 w16se w16cid w16 w16cex w16sdtdh w16sdtfl w16du wp14">
   <w:p>
     <w:pPr>
@@ -16388,6 +16202,16 @@
       </w:rPr>
       <w:t>23/07/2026</w:t>
     </w:r>
+  </w:p>
+</w:hdr>
+</file>
+
+<file path=word/header3.xml><?xml version="1.0" encoding="utf-8"?>
+<w:hdr xmlns:wpc="http://schemas.microsoft.com/office/word/2010/wordprocessingCanvas" xmlns:cx="http://schemas.microsoft.com/office/drawing/2014/chartex" xmlns:cx1="http://schemas.microsoft.com/office/drawing/2015/9/8/chartex" xmlns:cx2="http://schemas.microsoft.com/office/drawing/2015/10/21/chartex" xmlns:cx3="http://schemas.microsoft.com/office/drawing/2016/5/9/chartex" xmlns:cx4="http://schemas.microsoft.com/office/drawing/2016/5/10/chartex" xmlns:cx5="http://schemas.microsoft.com/office/drawing/2016/5/11/chartex" xmlns:cx6="http://schemas.microsoft.com/office/drawing/2016/5/12/chartex" xmlns:cx7="http://schemas.microsoft.com/office/drawing/2016/5/13/chartex" xmlns:cx8="http://schemas.microsoft.com/office/drawing/2016/5/14/chartex" xmlns:mc="http://schemas.openxmlformats.org/markup-compatibility/2006" xmlns:aink="http://schemas.microsoft.com/office/drawing/2016/ink" xmlns:am3d="http://schemas.microsoft.com/office/drawing/2017/model3d" xmlns:o="urn:schemas-microsoft-com:office:office" xmlns:oel="http://schemas.microsoft.com/office/2019/extlst" xmlns:r="http://schemas.openxmlformats.org/officeDocument/2006/relationships" xmlns:m="http://schemas.openxmlformats.org/officeDocument/2006/math" xmlns:v="urn:schemas-microsoft-com:vml" xmlns:wp14="http://schemas.microsoft.com/office/word/2010/wordprocessingDrawing" xmlns:wp="http://schemas.openxmlformats.org/drawingml/2006/wordprocessingDrawing" xmlns:w10="urn:schemas-microsoft-com:office:word" xmlns:w="http://schemas.openxmlformats.org/wordprocessingml/2006/main" xmlns:w14="http://schemas.microsoft.com/office/word/2010/wordml" xmlns:w15="http://schemas.microsoft.com/office/word/2012/wordml" xmlns:w16cei="http://schemas.microsoft.com/office/word/2026/wordml/cei" xmlns:w16cex="http://schemas.microsoft.com/office/word/2018/wordml/cex" xmlns:w16cid="http://schemas.microsoft.com/office/word/2016/wordml/cid" xmlns:w16="http://schemas.microsoft.com/office/word/2018/wordml" xmlns:w16du="http://schemas.microsoft.com/office/word/2023/wordml/word16du" xmlns:w16sdtdh="http://schemas.microsoft.com/office/word/2020/wordml/sdtdatahash" xmlns:w16sdtfl="http://schemas.microsoft.com/office/word/2024/wordml/sdtformatlock" xmlns:w16se="http://schemas.microsoft.com/office/word/2015/wordml/symex" xmlns:wpg="http://schemas.microsoft.com/office/word/2010/wordprocessingGroup" xmlns:wpi="http://schemas.microsoft.com/office/word/2010/wordprocessingInk" xmlns:wne="http://schemas.microsoft.com/office/word/2006/wordml" xmlns:wps="http://schemas.microsoft.com/office/word/2010/wordprocessingShape" mc:Ignorable="w14 w15 w16se w16cid w16 w16cex w16sdtdh w16sdtfl w16du wp14">
+  <w:p>
+    <w:pPr>
+      <w:pStyle w:val="Header"/>
+    </w:pPr>
   </w:p>
 </w:hdr>
 </file>
@@ -16471,213 +16295,8 @@
       </w:pPr>
     </w:lvl>
   </w:abstractNum>
-  <w:abstractNum w:abstractNumId="1" w15:restartNumberingAfterBreak="0">
-    <w:nsid w:val="1F332140"/>
-    <w:multiLevelType w:val="hybridMultilevel"/>
-    <w:tmpl w:val="A62ED37A"/>
-    <w:lvl w:ilvl="0" w:tplc="04090001">
-      <w:start w:val="1"/>
-      <w:numFmt w:val="bullet"/>
-      <w:lvlText w:val=""/>
-      <w:lvlJc w:val="left"/>
-      <w:pPr>
-        <w:ind w:left="1037" w:hanging="360"/>
-      </w:pPr>
-      <w:rPr>
-        <w:rFonts w:ascii="Symbol" w:hAnsi="Symbol" w:hint="default"/>
-      </w:rPr>
-    </w:lvl>
-    <w:lvl w:ilvl="1" w:tplc="04090003" w:tentative="1">
-      <w:start w:val="1"/>
-      <w:numFmt w:val="bullet"/>
-      <w:lvlText w:val="o"/>
-      <w:lvlJc w:val="left"/>
-      <w:pPr>
-        <w:ind w:left="1757" w:hanging="360"/>
-      </w:pPr>
-      <w:rPr>
-        <w:rFonts w:ascii="Courier New" w:hAnsi="Courier New" w:cs="Courier New" w:hint="default"/>
-      </w:rPr>
-    </w:lvl>
-    <w:lvl w:ilvl="2" w:tplc="04090005" w:tentative="1">
-      <w:start w:val="1"/>
-      <w:numFmt w:val="bullet"/>
-      <w:lvlText w:val=""/>
-      <w:lvlJc w:val="left"/>
-      <w:pPr>
-        <w:ind w:left="2477" w:hanging="360"/>
-      </w:pPr>
-      <w:rPr>
-        <w:rFonts w:ascii="Wingdings" w:hAnsi="Wingdings" w:hint="default"/>
-      </w:rPr>
-    </w:lvl>
-    <w:lvl w:ilvl="3" w:tplc="04090001" w:tentative="1">
-      <w:start w:val="1"/>
-      <w:numFmt w:val="bullet"/>
-      <w:lvlText w:val=""/>
-      <w:lvlJc w:val="left"/>
-      <w:pPr>
-        <w:ind w:left="3197" w:hanging="360"/>
-      </w:pPr>
-      <w:rPr>
-        <w:rFonts w:ascii="Symbol" w:hAnsi="Symbol" w:hint="default"/>
-      </w:rPr>
-    </w:lvl>
-    <w:lvl w:ilvl="4" w:tplc="04090003" w:tentative="1">
-      <w:start w:val="1"/>
-      <w:numFmt w:val="bullet"/>
-      <w:lvlText w:val="o"/>
-      <w:lvlJc w:val="left"/>
-      <w:pPr>
-        <w:ind w:left="3917" w:hanging="360"/>
-      </w:pPr>
-      <w:rPr>
-        <w:rFonts w:ascii="Courier New" w:hAnsi="Courier New" w:cs="Courier New" w:hint="default"/>
-      </w:rPr>
-    </w:lvl>
-    <w:lvl w:ilvl="5" w:tplc="04090005" w:tentative="1">
-      <w:start w:val="1"/>
-      <w:numFmt w:val="bullet"/>
-      <w:lvlText w:val=""/>
-      <w:lvlJc w:val="left"/>
-      <w:pPr>
-        <w:ind w:left="4637" w:hanging="360"/>
-      </w:pPr>
-      <w:rPr>
-        <w:rFonts w:ascii="Wingdings" w:hAnsi="Wingdings" w:hint="default"/>
-      </w:rPr>
-    </w:lvl>
-    <w:lvl w:ilvl="6" w:tplc="04090001" w:tentative="1">
-      <w:start w:val="1"/>
-      <w:numFmt w:val="bullet"/>
-      <w:lvlText w:val=""/>
-      <w:lvlJc w:val="left"/>
-      <w:pPr>
-        <w:ind w:left="5357" w:hanging="360"/>
-      </w:pPr>
-      <w:rPr>
-        <w:rFonts w:ascii="Symbol" w:hAnsi="Symbol" w:hint="default"/>
-      </w:rPr>
-    </w:lvl>
-    <w:lvl w:ilvl="7" w:tplc="04090003" w:tentative="1">
-      <w:start w:val="1"/>
-      <w:numFmt w:val="bullet"/>
-      <w:lvlText w:val="o"/>
-      <w:lvlJc w:val="left"/>
-      <w:pPr>
-        <w:ind w:left="6077" w:hanging="360"/>
-      </w:pPr>
-      <w:rPr>
-        <w:rFonts w:ascii="Courier New" w:hAnsi="Courier New" w:cs="Courier New" w:hint="default"/>
-      </w:rPr>
-    </w:lvl>
-    <w:lvl w:ilvl="8" w:tplc="04090005" w:tentative="1">
-      <w:start w:val="1"/>
-      <w:numFmt w:val="bullet"/>
-      <w:lvlText w:val=""/>
-      <w:lvlJc w:val="left"/>
-      <w:pPr>
-        <w:ind w:left="6797" w:hanging="360"/>
-      </w:pPr>
-      <w:rPr>
-        <w:rFonts w:ascii="Wingdings" w:hAnsi="Wingdings" w:hint="default"/>
-      </w:rPr>
-    </w:lvl>
-  </w:abstractNum>
-  <w:abstractNum w:abstractNumId="2" w15:restartNumberingAfterBreak="0">
-    <w:nsid w:val="648C1128"/>
-    <w:multiLevelType w:val="hybridMultilevel"/>
-    <w:tmpl w:val="A6382B60"/>
-    <w:lvl w:ilvl="0" w:tplc="0409000F">
-      <w:start w:val="1"/>
-      <w:numFmt w:val="decimal"/>
-      <w:lvlText w:val="%1."/>
-      <w:lvlJc w:val="left"/>
-      <w:pPr>
-        <w:ind w:left="1037" w:hanging="360"/>
-      </w:pPr>
-    </w:lvl>
-    <w:lvl w:ilvl="1" w:tplc="04090019" w:tentative="1">
-      <w:start w:val="1"/>
-      <w:numFmt w:val="lowerLetter"/>
-      <w:lvlText w:val="%2."/>
-      <w:lvlJc w:val="left"/>
-      <w:pPr>
-        <w:ind w:left="1757" w:hanging="360"/>
-      </w:pPr>
-    </w:lvl>
-    <w:lvl w:ilvl="2" w:tplc="0409001B" w:tentative="1">
-      <w:start w:val="1"/>
-      <w:numFmt w:val="lowerRoman"/>
-      <w:lvlText w:val="%3."/>
-      <w:lvlJc w:val="right"/>
-      <w:pPr>
-        <w:ind w:left="2477" w:hanging="180"/>
-      </w:pPr>
-    </w:lvl>
-    <w:lvl w:ilvl="3" w:tplc="0409000F" w:tentative="1">
-      <w:start w:val="1"/>
-      <w:numFmt w:val="decimal"/>
-      <w:lvlText w:val="%4."/>
-      <w:lvlJc w:val="left"/>
-      <w:pPr>
-        <w:ind w:left="3197" w:hanging="360"/>
-      </w:pPr>
-    </w:lvl>
-    <w:lvl w:ilvl="4" w:tplc="04090019" w:tentative="1">
-      <w:start w:val="1"/>
-      <w:numFmt w:val="lowerLetter"/>
-      <w:lvlText w:val="%5."/>
-      <w:lvlJc w:val="left"/>
-      <w:pPr>
-        <w:ind w:left="3917" w:hanging="360"/>
-      </w:pPr>
-    </w:lvl>
-    <w:lvl w:ilvl="5" w:tplc="0409001B" w:tentative="1">
-      <w:start w:val="1"/>
-      <w:numFmt w:val="lowerRoman"/>
-      <w:lvlText w:val="%6."/>
-      <w:lvlJc w:val="right"/>
-      <w:pPr>
-        <w:ind w:left="4637" w:hanging="180"/>
-      </w:pPr>
-    </w:lvl>
-    <w:lvl w:ilvl="6" w:tplc="0409000F" w:tentative="1">
-      <w:start w:val="1"/>
-      <w:numFmt w:val="decimal"/>
-      <w:lvlText w:val="%7."/>
-      <w:lvlJc w:val="left"/>
-      <w:pPr>
-        <w:ind w:left="5357" w:hanging="360"/>
-      </w:pPr>
-    </w:lvl>
-    <w:lvl w:ilvl="7" w:tplc="04090019" w:tentative="1">
-      <w:start w:val="1"/>
-      <w:numFmt w:val="lowerLetter"/>
-      <w:lvlText w:val="%8."/>
-      <w:lvlJc w:val="left"/>
-      <w:pPr>
-        <w:ind w:left="6077" w:hanging="360"/>
-      </w:pPr>
-    </w:lvl>
-    <w:lvl w:ilvl="8" w:tplc="0409001B" w:tentative="1">
-      <w:start w:val="1"/>
-      <w:numFmt w:val="lowerRoman"/>
-      <w:lvlText w:val="%9."/>
-      <w:lvlJc w:val="right"/>
-      <w:pPr>
-        <w:ind w:left="6797" w:hanging="180"/>
-      </w:pPr>
-    </w:lvl>
-  </w:abstractNum>
   <w:num w:numId="1" w16cid:durableId="2014524048">
     <w:abstractNumId w:val="0"/>
-  </w:num>
-  <w:num w:numId="2" w16cid:durableId="1065370505">
-    <w:abstractNumId w:val="1"/>
-  </w:num>
-  <w:num w:numId="3" w16cid:durableId="1389845248">
-    <w:abstractNumId w:val="2"/>
   </w:num>
 </w:numbering>
 </file>
@@ -17717,19 +17336,6 @@
       <w:color w:val="666666"/>
     </w:rPr>
   </w:style>
-  <w:style w:type="paragraph" w:customStyle="1" w:styleId="OriginalQuestion">
-    <w:name w:val="Original Question"/>
-    <w:basedOn w:val="Normal"/>
-    <w:pPr>
-      <w:spacing w:after="50"/>
-      <w:ind w:left="317" w:right="259"/>
-    </w:pPr>
-    <w:rPr>
-      <w:rFonts w:ascii="Aptos" w:hAnsi="Aptos"/>
-      <w:color w:val="404040"/>
-      <w:sz w:val="18"/>
-    </w:rPr>
-  </w:style>
 </w:styles>
 </file>
 

</xml_diff>

<commit_message>
Complete approved Q3(b) symmetrization
</commit_message>
<xml_diff>
--- a/HW4-Solution.docx
+++ b/HW4-Solution.docx
@@ -74,7 +74,7 @@
         </w:rPr>
         <w:fldChar w:fldCharType="separate"/>
       </w:r>
-      <w:hyperlink w:anchor="_Toc235876152" w:history="1">
+      <w:hyperlink w:anchor="_Toc235884418" w:history="1">
         <w:r>
           <w:rPr>
             <w:rStyle w:val="Hyperlink"/>
@@ -102,7 +102,7 @@
             <w:noProof/>
             <w:webHidden/>
           </w:rPr>
-          <w:instrText xml:space="preserve"> PAGEREF _Toc235876152 \h </w:instrText>
+          <w:instrText xml:space="preserve"> PAGEREF _Toc235884418 \h </w:instrText>
         </w:r>
         <w:r>
           <w:rPr>
@@ -146,7 +146,7 @@
           <w14:ligatures w14:val="standardContextual"/>
         </w:rPr>
       </w:pPr>
-      <w:hyperlink w:anchor="_Toc235876153" w:history="1">
+      <w:hyperlink w:anchor="_Toc235884419" w:history="1">
         <w:r>
           <w:rPr>
             <w:rStyle w:val="Hyperlink"/>
@@ -174,7 +174,7 @@
             <w:noProof/>
             <w:webHidden/>
           </w:rPr>
-          <w:instrText xml:space="preserve"> PAGEREF _Toc235876153 \h </w:instrText>
+          <w:instrText xml:space="preserve"> PAGEREF _Toc235884419 \h </w:instrText>
         </w:r>
         <w:r>
           <w:rPr>
@@ -218,7 +218,7 @@
           <w14:ligatures w14:val="standardContextual"/>
         </w:rPr>
       </w:pPr>
-      <w:hyperlink w:anchor="_Toc235876154" w:history="1">
+      <w:hyperlink w:anchor="_Toc235884420" w:history="1">
         <w:r>
           <w:rPr>
             <w:rStyle w:val="Hyperlink"/>
@@ -246,7 +246,7 @@
             <w:noProof/>
             <w:webHidden/>
           </w:rPr>
-          <w:instrText xml:space="preserve"> PAGEREF _Toc235876154 \h </w:instrText>
+          <w:instrText xml:space="preserve"> PAGEREF _Toc235884420 \h </w:instrText>
         </w:r>
         <w:r>
           <w:rPr>
@@ -290,7 +290,7 @@
         </w:rPr>
         <w:fldChar w:fldCharType="end"/>
       </w:r>
-      <w:bookmarkStart w:id="1" w:name="_Toc235876152"/>
+      <w:bookmarkStart w:id="1" w:name="_Toc235884418"/>
       <w:r>
         <w:rPr>
           <w:rtl/>
@@ -5158,7 +5158,6 @@
             <w:rPr>
               <w:rFonts w:ascii="Cambria Math" w:hAnsi="Cambria Math"/>
             </w:rPr>
-            <w:lastRenderedPageBreak/>
             <m:t>⟨</m:t>
           </m:r>
           <m:sSub>
@@ -6737,13 +6736,12 @@
         </w:rPr>
       </w:pPr>
       <w:bookmarkStart w:id="2" w:name="שאלה-2"/>
-      <w:bookmarkStart w:id="3" w:name="_Toc235876153"/>
+      <w:bookmarkStart w:id="3" w:name="_Toc235884419"/>
       <w:bookmarkEnd w:id="0"/>
       <w:r>
         <w:rPr>
           <w:rtl/>
         </w:rPr>
-        <w:lastRenderedPageBreak/>
         <w:t>שאלה 2</w:t>
       </w:r>
       <w:bookmarkEnd w:id="3"/>
@@ -7534,7 +7532,6 @@
         <w:rPr>
           <w:rtl/>
         </w:rPr>
-        <w:lastRenderedPageBreak/>
         <w:t>סעיף א. חבורת הסימטריה.</w:t>
       </w:r>
     </w:p>
@@ -10733,7 +10730,6 @@
         <w:rPr>
           <w:rtl/>
         </w:rPr>
-        <w:lastRenderedPageBreak/>
         <w:t xml:space="preserve">כעת ההטיה. הצבת </w:t>
       </w:r>
       <m:oMath>
@@ -13297,7 +13293,6 @@
         <w:rPr>
           <w:noProof/>
         </w:rPr>
-        <w:lastRenderedPageBreak/>
         <w:drawing>
           <wp:inline distT="0" distB="0" distL="0" distR="0" wp14:anchorId="4BF4112C" wp14:editId="6D43A830">
             <wp:extent cx="5806440" cy="3483864"/>
@@ -13495,7 +13490,6 @@
         <w:rPr>
           <w:rtl/>
         </w:rPr>
-        <w:lastRenderedPageBreak/>
         <w:t>סעיף ד. שכבה לינארית אינווריאנטית.</w:t>
       </w:r>
     </w:p>
@@ -14804,7 +14798,6 @@
         <w:rPr>
           <w:rtl/>
         </w:rPr>
-        <w:lastRenderedPageBreak/>
         <w:t>סעיף ה. טנזורים תלת-ממדיים.</w:t>
       </w:r>
     </w:p>
@@ -14917,12 +14910,11 @@
           <w:rtl/>
         </w:rPr>
       </w:pPr>
-      <w:bookmarkStart w:id="4" w:name="_Toc235876154"/>
-      <w:r>
-        <w:rPr>
-          <w:rtl/>
-        </w:rPr>
-        <w:lastRenderedPageBreak/>
+      <w:bookmarkStart w:id="4" w:name="_Toc235884420"/>
+      <w:r>
+        <w:rPr>
+          <w:rtl/>
+        </w:rPr>
         <w:t>שאלה 3</w:t>
       </w:r>
       <w:bookmarkEnd w:id="4"/>
@@ -15004,7 +14996,6 @@
         <w:rPr>
           <w:noProof/>
         </w:rPr>
-        <w:lastRenderedPageBreak/>
         <w:drawing>
           <wp:inline distT="0" distB="0" distL="0" distR="0" wp14:anchorId="7920EF46" wp14:editId="7F8840BE">
             <wp:extent cx="5532120" cy="829138"/>
@@ -15068,25 +15059,7 @@
           <w:rPr>
             <w:rFonts w:ascii="Cambria Math" w:hAnsi="Cambria Math" w:cs="Cambria Math"/>
           </w:rPr>
-          <m:t>c</m:t>
-        </m:r>
-        <m:r>
-          <w:rPr>
-            <w:rFonts w:ascii="Cambria Math" w:hAnsi="Cambria Math" w:cs="Cambria Math"/>
-          </w:rPr>
-          <m:t>(</m:t>
-        </m:r>
-        <m:r>
-          <w:rPr>
-            <w:rFonts w:ascii="Cambria Math" w:hAnsi="Cambria Math" w:cs="Cambria Math"/>
-          </w:rPr>
-          <m:t>X</m:t>
-        </m:r>
-        <m:r>
-          <w:rPr>
-            <w:rFonts w:ascii="Cambria Math" w:hAnsi="Cambria Math" w:cs="Cambria Math"/>
-          </w:rPr>
-          <m:t>)</m:t>
+          <m:t>c(X)</m:t>
         </m:r>
       </m:oMath>
       <w:r>
@@ -15136,65 +15109,35 @@
           <w:rPr>
             <w:rFonts w:ascii="Cambria Math" w:hAnsi="Cambria Math" w:cs="Cambria Math"/>
           </w:rPr>
-          <m:t>π</m:t>
-        </m:r>
+          <m:t>π ∈ Sₙ</m:t>
+        </m:r>
+      </m:oMath>
+      <w:r>
+        <w:rPr>
+          <w:rtl/>
+        </w:rPr>
+        <w:t xml:space="preserve">, המטריצות </w:t>
+      </w:r>
+      <m:oMath>
         <m:r>
           <w:rPr>
             <w:rFonts w:ascii="Cambria Math" w:hAnsi="Cambria Math" w:cs="Cambria Math"/>
           </w:rPr>
-          <m:t xml:space="preserve"> ∈ </m:t>
-        </m:r>
+          <m:t>X</m:t>
+        </m:r>
+      </m:oMath>
+      <w:r>
+        <w:rPr>
+          <w:rtl/>
+        </w:rPr>
+        <w:t xml:space="preserve"> ו-</w:t>
+      </w:r>
+      <m:oMath>
         <m:r>
           <w:rPr>
             <w:rFonts w:ascii="Cambria Math" w:hAnsi="Cambria Math" w:cs="Cambria Math"/>
           </w:rPr>
-          <m:t>S</m:t>
-        </m:r>
-        <m:r>
-          <w:rPr>
-            <w:rFonts w:ascii="Cambria Math" w:hAnsi="Cambria Math" w:cs="Cambria Math"/>
-          </w:rPr>
-          <m:t>ₙ</m:t>
-        </m:r>
-      </m:oMath>
-      <w:r>
-        <w:rPr>
-          <w:rtl/>
-        </w:rPr>
-        <w:t xml:space="preserve">, המטריצות </w:t>
-      </w:r>
-      <m:oMath>
-        <m:r>
-          <w:rPr>
-            <w:rFonts w:ascii="Cambria Math" w:hAnsi="Cambria Math" w:cs="Cambria Math"/>
-          </w:rPr>
-          <m:t>X</m:t>
-        </m:r>
-      </m:oMath>
-      <w:r>
-        <w:rPr>
-          <w:rtl/>
-        </w:rPr>
-        <w:t xml:space="preserve"> ו-</w:t>
-      </w:r>
-      <m:oMath>
-        <m:r>
-          <w:rPr>
-            <w:rFonts w:ascii="Cambria Math" w:hAnsi="Cambria Math" w:cs="Cambria Math"/>
-          </w:rPr>
-          <m:t>π</m:t>
-        </m:r>
-        <m:r>
-          <w:rPr>
-            <w:rFonts w:ascii="Cambria Math" w:hAnsi="Cambria Math" w:cs="Cambria Math"/>
-          </w:rPr>
-          <m:t xml:space="preserve"> · </m:t>
-        </m:r>
-        <m:r>
-          <w:rPr>
-            <w:rFonts w:ascii="Cambria Math" w:hAnsi="Cambria Math" w:cs="Cambria Math"/>
-          </w:rPr>
-          <m:t>X</m:t>
+          <m:t>π · X</m:t>
         </m:r>
       </m:oMath>
       <w:r>
@@ -15219,61 +15162,7 @@
             <w:rPr>
               <w:rFonts w:ascii="Cambria Math" w:hAnsi="Cambria Math" w:cs="Cambria Math"/>
             </w:rPr>
-            <m:t>c</m:t>
-          </m:r>
-          <m:r>
-            <w:rPr>
-              <w:rFonts w:ascii="Cambria Math" w:hAnsi="Cambria Math" w:cs="Cambria Math"/>
-            </w:rPr>
-            <m:t>(</m:t>
-          </m:r>
-          <m:r>
-            <w:rPr>
-              <w:rFonts w:ascii="Cambria Math" w:hAnsi="Cambria Math" w:cs="Cambria Math"/>
-            </w:rPr>
-            <m:t>π</m:t>
-          </m:r>
-          <m:r>
-            <w:rPr>
-              <w:rFonts w:ascii="Cambria Math" w:hAnsi="Cambria Math" w:cs="Cambria Math"/>
-            </w:rPr>
-            <m:t xml:space="preserve"> · </m:t>
-          </m:r>
-          <m:r>
-            <w:rPr>
-              <w:rFonts w:ascii="Cambria Math" w:hAnsi="Cambria Math" w:cs="Cambria Math"/>
-            </w:rPr>
-            <m:t>X</m:t>
-          </m:r>
-          <m:r>
-            <w:rPr>
-              <w:rFonts w:ascii="Cambria Math" w:hAnsi="Cambria Math" w:cs="Cambria Math"/>
-            </w:rPr>
-            <m:t xml:space="preserve">) = </m:t>
-          </m:r>
-          <m:r>
-            <w:rPr>
-              <w:rFonts w:ascii="Cambria Math" w:hAnsi="Cambria Math" w:cs="Cambria Math"/>
-            </w:rPr>
-            <m:t>c</m:t>
-          </m:r>
-          <m:r>
-            <w:rPr>
-              <w:rFonts w:ascii="Cambria Math" w:hAnsi="Cambria Math" w:cs="Cambria Math"/>
-            </w:rPr>
-            <m:t>(</m:t>
-          </m:r>
-          <m:r>
-            <w:rPr>
-              <w:rFonts w:ascii="Cambria Math" w:hAnsi="Cambria Math" w:cs="Cambria Math"/>
-            </w:rPr>
-            <m:t>X</m:t>
-          </m:r>
-          <m:r>
-            <w:rPr>
-              <w:rFonts w:ascii="Cambria Math" w:hAnsi="Cambria Math" w:cs="Cambria Math"/>
-            </w:rPr>
-            <m:t>).</m:t>
+            <m:t>c(π · X) = c(X).</m:t>
           </m:r>
         </m:oMath>
       </m:oMathPara>
@@ -15315,61 +15204,7 @@
             <w:rPr>
               <w:rFonts w:ascii="Cambria Math" w:hAnsi="Cambria Math" w:cs="Cambria Math"/>
             </w:rPr>
-            <m:t>F</m:t>
-          </m:r>
-          <m:r>
-            <w:rPr>
-              <w:rFonts w:ascii="Cambria Math" w:hAnsi="Cambria Math" w:cs="Cambria Math"/>
-            </w:rPr>
-            <m:t>(</m:t>
-          </m:r>
-          <m:r>
-            <w:rPr>
-              <w:rFonts w:ascii="Cambria Math" w:hAnsi="Cambria Math" w:cs="Cambria Math"/>
-            </w:rPr>
-            <m:t>X</m:t>
-          </m:r>
-          <m:r>
-            <w:rPr>
-              <w:rFonts w:ascii="Cambria Math" w:hAnsi="Cambria Math" w:cs="Cambria Math"/>
-            </w:rPr>
-            <m:t>) = h(</m:t>
-          </m:r>
-          <m:r>
-            <w:rPr>
-              <w:rFonts w:ascii="Cambria Math" w:hAnsi="Cambria Math" w:cs="Cambria Math"/>
-            </w:rPr>
-            <m:t>vec</m:t>
-          </m:r>
-          <m:r>
-            <w:rPr>
-              <w:rFonts w:ascii="Cambria Math" w:hAnsi="Cambria Math" w:cs="Cambria Math"/>
-            </w:rPr>
-            <m:t>(</m:t>
-          </m:r>
-          <m:r>
-            <w:rPr>
-              <w:rFonts w:ascii="Cambria Math" w:hAnsi="Cambria Math" w:cs="Cambria Math"/>
-            </w:rPr>
-            <m:t>c</m:t>
-          </m:r>
-          <m:r>
-            <w:rPr>
-              <w:rFonts w:ascii="Cambria Math" w:hAnsi="Cambria Math" w:cs="Cambria Math"/>
-            </w:rPr>
-            <m:t>(</m:t>
-          </m:r>
-          <m:r>
-            <w:rPr>
-              <w:rFonts w:ascii="Cambria Math" w:hAnsi="Cambria Math" w:cs="Cambria Math"/>
-            </w:rPr>
-            <m:t>X</m:t>
-          </m:r>
-          <m:r>
-            <w:rPr>
-              <w:rFonts w:ascii="Cambria Math" w:hAnsi="Cambria Math" w:cs="Cambria Math"/>
-            </w:rPr>
-            <m:t xml:space="preserve">))),    h : </m:t>
+            <m:t xml:space="preserve">F(X) = h(vec(c(X))),    h : </m:t>
           </m:r>
           <m:r>
             <m:rPr>
@@ -15378,34 +15213,7 @@
             <w:rPr>
               <w:rFonts w:ascii="Cambria Math" w:hAnsi="Cambria Math" w:cs="Cambria Math"/>
             </w:rPr>
-            <m:t>Rⁿ</m:t>
-          </m:r>
-          <m:r>
-            <w:rPr>
-              <w:rFonts w:ascii="Cambria Math" w:hAnsi="Cambria Math" w:cs="Cambria Math"/>
-            </w:rPr>
-            <m:t>ᵈ</m:t>
-          </m:r>
-          <m:r>
-            <m:rPr>
-              <m:scr m:val="double-struck"/>
-            </m:rPr>
-            <w:rPr>
-              <w:rFonts w:ascii="Cambria Math" w:hAnsi="Cambria Math" w:cs="Cambria Math"/>
-            </w:rPr>
-            <m:t xml:space="preserve"> → R</m:t>
-          </m:r>
-          <m:r>
-            <w:rPr>
-              <w:rFonts w:ascii="Cambria Math" w:hAnsi="Cambria Math" w:cs="Cambria Math"/>
-            </w:rPr>
-            <m:t>ᵖ</m:t>
-          </m:r>
-          <m:r>
-            <w:rPr>
-              <w:rFonts w:ascii="Cambria Math" w:hAnsi="Cambria Math" w:cs="Cambria Math"/>
-            </w:rPr>
-            <m:t>.</m:t>
+            <m:t>Rⁿᵈ → Rᵖ.</m:t>
           </m:r>
         </m:oMath>
       </m:oMathPara>
@@ -15433,121 +15241,7 @@
             <w:rPr>
               <w:rFonts w:ascii="Cambria Math" w:hAnsi="Cambria Math" w:cs="Cambria Math"/>
             </w:rPr>
-            <m:t>Linear</m:t>
-          </m:r>
-          <m:r>
-            <w:rPr>
-              <w:rFonts w:ascii="Cambria Math" w:hAnsi="Cambria Math" w:cs="Cambria Math"/>
-            </w:rPr>
-            <m:t>(</m:t>
-          </m:r>
-          <m:r>
-            <w:rPr>
-              <w:rFonts w:ascii="Cambria Math" w:hAnsi="Cambria Math" w:cs="Cambria Math"/>
-            </w:rPr>
-            <m:t>nd</m:t>
-          </m:r>
-          <m:r>
-            <w:rPr>
-              <w:rFonts w:ascii="Cambria Math" w:hAnsi="Cambria Math" w:cs="Cambria Math"/>
-            </w:rPr>
-            <m:t xml:space="preserve">, </m:t>
-          </m:r>
-          <m:r>
-            <w:rPr>
-              <w:rFonts w:ascii="Cambria Math" w:hAnsi="Cambria Math" w:cs="Cambria Math"/>
-            </w:rPr>
-            <m:t>m</m:t>
-          </m:r>
-          <m:r>
-            <w:rPr>
-              <w:rFonts w:ascii="Cambria Math" w:hAnsi="Cambria Math" w:cs="Cambria Math"/>
-            </w:rPr>
-            <m:t xml:space="preserve">) → </m:t>
-          </m:r>
-          <m:r>
-            <w:rPr>
-              <w:rFonts w:ascii="Cambria Math" w:hAnsi="Cambria Math" w:cs="Cambria Math"/>
-            </w:rPr>
-            <m:t>ReLU</m:t>
-          </m:r>
-          <m:r>
-            <w:rPr>
-              <w:rFonts w:ascii="Cambria Math" w:hAnsi="Cambria Math" w:cs="Cambria Math"/>
-            </w:rPr>
-            <m:t xml:space="preserve"> → </m:t>
-          </m:r>
-          <m:r>
-            <w:rPr>
-              <w:rFonts w:ascii="Cambria Math" w:hAnsi="Cambria Math" w:cs="Cambria Math"/>
-            </w:rPr>
-            <m:t>Linear</m:t>
-          </m:r>
-          <m:r>
-            <w:rPr>
-              <w:rFonts w:ascii="Cambria Math" w:hAnsi="Cambria Math" w:cs="Cambria Math"/>
-            </w:rPr>
-            <m:t>(</m:t>
-          </m:r>
-          <m:r>
-            <w:rPr>
-              <w:rFonts w:ascii="Cambria Math" w:hAnsi="Cambria Math" w:cs="Cambria Math"/>
-            </w:rPr>
-            <m:t>m</m:t>
-          </m:r>
-          <m:r>
-            <w:rPr>
-              <w:rFonts w:ascii="Cambria Math" w:hAnsi="Cambria Math" w:cs="Cambria Math"/>
-            </w:rPr>
-            <m:t xml:space="preserve">, </m:t>
-          </m:r>
-          <m:r>
-            <w:rPr>
-              <w:rFonts w:ascii="Cambria Math" w:hAnsi="Cambria Math" w:cs="Cambria Math"/>
-            </w:rPr>
-            <m:t>p</m:t>
-          </m:r>
-          <m:r>
-            <w:rPr>
-              <w:rFonts w:ascii="Cambria Math" w:hAnsi="Cambria Math" w:cs="Cambria Math"/>
-            </w:rPr>
-            <m:t xml:space="preserve">),    </m:t>
-          </m:r>
-          <m:r>
-            <w:rPr>
-              <w:rFonts w:ascii="Cambria Math" w:hAnsi="Cambria Math" w:cs="Cambria Math"/>
-            </w:rPr>
-            <m:t>m</m:t>
-          </m:r>
-          <m:r>
-            <w:rPr>
-              <w:rFonts w:ascii="Cambria Math" w:hAnsi="Cambria Math" w:cs="Cambria Math"/>
-            </w:rPr>
-            <m:t xml:space="preserve"> = ⌊(</m:t>
-          </m:r>
-          <m:r>
-            <w:rPr>
-              <w:rFonts w:ascii="Cambria Math" w:hAnsi="Cambria Math" w:cs="Cambria Math"/>
-            </w:rPr>
-            <m:t>nd</m:t>
-          </m:r>
-          <m:r>
-            <w:rPr>
-              <w:rFonts w:ascii="Cambria Math" w:hAnsi="Cambria Math" w:cs="Cambria Math"/>
-            </w:rPr>
-            <m:t xml:space="preserve"> + </m:t>
-          </m:r>
-          <m:r>
-            <w:rPr>
-              <w:rFonts w:ascii="Cambria Math" w:hAnsi="Cambria Math" w:cs="Cambria Math"/>
-            </w:rPr>
-            <m:t>p</m:t>
-          </m:r>
-          <m:r>
-            <w:rPr>
-              <w:rFonts w:ascii="Cambria Math" w:hAnsi="Cambria Math" w:cs="Cambria Math"/>
-            </w:rPr>
-            <m:t>)/2⌋.</m:t>
+            <m:t>Linear(nd, 32) → ReLU → Linear(32, p).</m:t>
           </m:r>
         </m:oMath>
       </m:oMathPara>
@@ -15564,25 +15258,7 @@
           <w:rPr>
             <w:rFonts w:ascii="Cambria Math" w:hAnsi="Cambria Math" w:cs="Cambria Math"/>
           </w:rPr>
-          <m:t>π</m:t>
-        </m:r>
-        <m:r>
-          <w:rPr>
-            <w:rFonts w:ascii="Cambria Math" w:hAnsi="Cambria Math" w:cs="Cambria Math"/>
-          </w:rPr>
-          <m:t xml:space="preserve"> ∈ </m:t>
-        </m:r>
-        <m:r>
-          <w:rPr>
-            <w:rFonts w:ascii="Cambria Math" w:hAnsi="Cambria Math" w:cs="Cambria Math"/>
-          </w:rPr>
-          <m:t>S</m:t>
-        </m:r>
-        <m:r>
-          <w:rPr>
-            <w:rFonts w:ascii="Cambria Math" w:hAnsi="Cambria Math" w:cs="Cambria Math"/>
-          </w:rPr>
-          <m:t>ₙ</m:t>
+          <m:t>π ∈ Sₙ</m:t>
         </m:r>
       </m:oMath>
       <w:r>
@@ -15607,145 +15283,7 @@
             <w:rPr>
               <w:rFonts w:ascii="Cambria Math" w:hAnsi="Cambria Math" w:cs="Cambria Math"/>
             </w:rPr>
-            <m:t>F</m:t>
-          </m:r>
-          <m:r>
-            <w:rPr>
-              <w:rFonts w:ascii="Cambria Math" w:hAnsi="Cambria Math" w:cs="Cambria Math"/>
-            </w:rPr>
-            <m:t>(</m:t>
-          </m:r>
-          <m:r>
-            <w:rPr>
-              <w:rFonts w:ascii="Cambria Math" w:hAnsi="Cambria Math" w:cs="Cambria Math"/>
-            </w:rPr>
-            <m:t>π</m:t>
-          </m:r>
-          <m:r>
-            <w:rPr>
-              <w:rFonts w:ascii="Cambria Math" w:hAnsi="Cambria Math" w:cs="Cambria Math"/>
-            </w:rPr>
-            <m:t xml:space="preserve"> · </m:t>
-          </m:r>
-          <m:r>
-            <w:rPr>
-              <w:rFonts w:ascii="Cambria Math" w:hAnsi="Cambria Math" w:cs="Cambria Math"/>
-            </w:rPr>
-            <m:t>X</m:t>
-          </m:r>
-          <m:r>
-            <w:rPr>
-              <w:rFonts w:ascii="Cambria Math" w:hAnsi="Cambria Math" w:cs="Cambria Math"/>
-            </w:rPr>
-            <m:t>) = h(</m:t>
-          </m:r>
-          <m:r>
-            <w:rPr>
-              <w:rFonts w:ascii="Cambria Math" w:hAnsi="Cambria Math" w:cs="Cambria Math"/>
-            </w:rPr>
-            <m:t>vec</m:t>
-          </m:r>
-          <m:r>
-            <w:rPr>
-              <w:rFonts w:ascii="Cambria Math" w:hAnsi="Cambria Math" w:cs="Cambria Math"/>
-            </w:rPr>
-            <m:t>(</m:t>
-          </m:r>
-          <m:r>
-            <w:rPr>
-              <w:rFonts w:ascii="Cambria Math" w:hAnsi="Cambria Math" w:cs="Cambria Math"/>
-            </w:rPr>
-            <m:t>c</m:t>
-          </m:r>
-          <m:r>
-            <w:rPr>
-              <w:rFonts w:ascii="Cambria Math" w:hAnsi="Cambria Math" w:cs="Cambria Math"/>
-            </w:rPr>
-            <m:t>(</m:t>
-          </m:r>
-          <m:r>
-            <w:rPr>
-              <w:rFonts w:ascii="Cambria Math" w:hAnsi="Cambria Math" w:cs="Cambria Math"/>
-            </w:rPr>
-            <m:t>π</m:t>
-          </m:r>
-          <m:r>
-            <w:rPr>
-              <w:rFonts w:ascii="Cambria Math" w:hAnsi="Cambria Math" w:cs="Cambria Math"/>
-            </w:rPr>
-            <m:t xml:space="preserve"> · </m:t>
-          </m:r>
-          <m:r>
-            <w:rPr>
-              <w:rFonts w:ascii="Cambria Math" w:hAnsi="Cambria Math" w:cs="Cambria Math"/>
-            </w:rPr>
-            <m:t>X</m:t>
-          </m:r>
-          <m:r>
-            <w:rPr>
-              <w:rFonts w:ascii="Cambria Math" w:hAnsi="Cambria Math" w:cs="Cambria Math"/>
-            </w:rPr>
-            <m:t>))) = h(</m:t>
-          </m:r>
-          <m:r>
-            <w:rPr>
-              <w:rFonts w:ascii="Cambria Math" w:hAnsi="Cambria Math" w:cs="Cambria Math"/>
-            </w:rPr>
-            <m:t>vec</m:t>
-          </m:r>
-          <m:r>
-            <w:rPr>
-              <w:rFonts w:ascii="Cambria Math" w:hAnsi="Cambria Math" w:cs="Cambria Math"/>
-            </w:rPr>
-            <m:t>(</m:t>
-          </m:r>
-          <m:r>
-            <w:rPr>
-              <w:rFonts w:ascii="Cambria Math" w:hAnsi="Cambria Math" w:cs="Cambria Math"/>
-            </w:rPr>
-            <m:t>c</m:t>
-          </m:r>
-          <m:r>
-            <w:rPr>
-              <w:rFonts w:ascii="Cambria Math" w:hAnsi="Cambria Math" w:cs="Cambria Math"/>
-            </w:rPr>
-            <m:t>(</m:t>
-          </m:r>
-          <m:r>
-            <w:rPr>
-              <w:rFonts w:ascii="Cambria Math" w:hAnsi="Cambria Math" w:cs="Cambria Math"/>
-            </w:rPr>
-            <m:t>X</m:t>
-          </m:r>
-          <m:r>
-            <w:rPr>
-              <w:rFonts w:ascii="Cambria Math" w:hAnsi="Cambria Math" w:cs="Cambria Math"/>
-            </w:rPr>
-            <m:t xml:space="preserve">))) = </m:t>
-          </m:r>
-          <m:r>
-            <w:rPr>
-              <w:rFonts w:ascii="Cambria Math" w:hAnsi="Cambria Math" w:cs="Cambria Math"/>
-            </w:rPr>
-            <m:t>F</m:t>
-          </m:r>
-          <m:r>
-            <w:rPr>
-              <w:rFonts w:ascii="Cambria Math" w:hAnsi="Cambria Math" w:cs="Cambria Math"/>
-            </w:rPr>
-            <m:t>(</m:t>
-          </m:r>
-          <m:r>
-            <w:rPr>
-              <w:rFonts w:ascii="Cambria Math" w:hAnsi="Cambria Math" w:cs="Cambria Math"/>
-            </w:rPr>
-            <m:t>X</m:t>
-          </m:r>
-          <m:r>
-            <w:rPr>
-              <w:rFonts w:ascii="Cambria Math" w:hAnsi="Cambria Math" w:cs="Cambria Math"/>
-            </w:rPr>
-            <m:t>).</m:t>
+            <m:t>F(π · X) = h(vec(c(π · X))) = h(vec(c(X))) = F(X).</m:t>
           </m:r>
         </m:oMath>
       </m:oMathPara>
@@ -15784,13 +15322,21 @@
           <w:rPr>
             <w:rFonts w:ascii="Cambria Math" w:hAnsi="Cambria Math" w:cs="Cambria Math"/>
           </w:rPr>
-          <m:t>n</m:t>
-        </m:r>
+          <m:t>n = 5</m:t>
+        </m:r>
+      </m:oMath>
+      <w:r>
+        <w:rPr>
+          <w:rtl/>
+        </w:rPr>
+        <w:t xml:space="preserve">, </w:t>
+      </w:r>
+      <m:oMath>
         <m:r>
           <w:rPr>
             <w:rFonts w:ascii="Cambria Math" w:hAnsi="Cambria Math" w:cs="Cambria Math"/>
           </w:rPr>
-          <m:t xml:space="preserve"> = 20</m:t>
+          <m:t>d = 3</m:t>
         </m:r>
       </m:oMath>
       <w:r>
@@ -15804,157 +15350,856 @@
           <w:rPr>
             <w:rFonts w:ascii="Cambria Math" w:hAnsi="Cambria Math" w:cs="Cambria Math"/>
           </w:rPr>
-          <m:t>d</m:t>
-        </m:r>
+          <m:t>p = 4</m:t>
+        </m:r>
+      </m:oMath>
+      <w:r>
+        <w:rPr>
+          <w:rtl/>
+        </w:rPr>
+        <w:t xml:space="preserve">, </w:t>
+      </w:r>
+      <m:oMath>
         <m:r>
           <w:rPr>
             <w:rFonts w:ascii="Cambria Math" w:hAnsi="Cambria Math" w:cs="Cambria Math"/>
           </w:rPr>
-          <m:t xml:space="preserve"> = 3</m:t>
-        </m:r>
-      </m:oMath>
-      <w:r>
-        <w:rPr>
-          <w:rtl/>
-        </w:rPr>
-        <w:t xml:space="preserve">, </w:t>
+          <m:t>m = 32</m:t>
+        </m:r>
+      </m:oMath>
+      <w:r>
+        <w:rPr>
+          <w:rtl/>
+        </w:rPr>
+        <w:t xml:space="preserve"> ובזרע אקראי </w:t>
       </w:r>
       <m:oMath>
         <m:r>
           <w:rPr>
             <w:rFonts w:ascii="Cambria Math" w:hAnsi="Cambria Math" w:cs="Cambria Math"/>
           </w:rPr>
-          <m:t>p</m:t>
-        </m:r>
+          <m:t>2319</m:t>
+        </m:r>
+      </m:oMath>
+      <w:r>
+        <w:rPr>
+          <w:rtl/>
+        </w:rPr>
+        <w:t xml:space="preserve">. דגמנו את איברי </w:t>
+      </w:r>
+      <m:oMath>
         <m:r>
           <w:rPr>
             <w:rFonts w:ascii="Cambria Math" w:hAnsi="Cambria Math" w:cs="Cambria Math"/>
           </w:rPr>
-          <m:t xml:space="preserve"> = 4</m:t>
-        </m:r>
-      </m:oMath>
-      <w:r>
-        <w:rPr>
-          <w:rtl/>
-        </w:rPr>
-        <w:t xml:space="preserve">, </w:t>
+          <m:t>X</m:t>
+        </m:r>
+      </m:oMath>
+      <w:r>
+        <w:rPr>
+          <w:rtl/>
+        </w:rPr>
+        <w:t xml:space="preserve"> באופן בלתי-תלוי מהתפלגות נורמלית סטנדרטית, דגמנו פרמוטציה אקראית והשווינו בין </w:t>
       </w:r>
       <m:oMath>
         <m:r>
           <w:rPr>
             <w:rFonts w:ascii="Cambria Math" w:hAnsi="Cambria Math" w:cs="Cambria Math"/>
           </w:rPr>
-          <m:t>m</m:t>
-        </m:r>
+          <m:t>F(π · X)</m:t>
+        </m:r>
+      </m:oMath>
+      <w:r>
+        <w:rPr>
+          <w:rtl/>
+        </w:rPr>
+        <w:t xml:space="preserve"> ובין </w:t>
+      </w:r>
+      <m:oMath>
         <m:r>
           <w:rPr>
             <w:rFonts w:ascii="Cambria Math" w:hAnsi="Cambria Math" w:cs="Cambria Math"/>
           </w:rPr>
-          <m:t xml:space="preserve"> = 32</m:t>
-        </m:r>
-      </m:oMath>
-      <w:r>
-        <w:rPr>
-          <w:rtl/>
-        </w:rPr>
-        <w:t xml:space="preserve"> ובזרע אקראי </w:t>
+          <m:t>F(X)</m:t>
+        </m:r>
+      </m:oMath>
+      <w:r>
+        <w:rPr>
+          <w:rtl/>
+        </w:rPr>
+        <w:t xml:space="preserve"> באמצעות </w:t>
       </w:r>
       <m:oMath>
         <m:r>
           <w:rPr>
             <w:rFonts w:ascii="Cambria Math" w:hAnsi="Cambria Math" w:cs="Cambria Math"/>
           </w:rPr>
-          <m:t>2319</m:t>
-        </m:r>
-      </m:oMath>
-      <w:r>
-        <w:rPr>
-          <w:rtl/>
-        </w:rPr>
-        <w:t xml:space="preserve">. דגמנו את איברי </w:t>
+          <m:t>torch.allclose</m:t>
+        </m:r>
+      </m:oMath>
+      <w:r>
+        <w:rPr>
+          <w:rtl/>
+        </w:rPr>
+        <w:t xml:space="preserve">, עם </w:t>
       </w:r>
       <m:oMath>
         <m:r>
           <w:rPr>
             <w:rFonts w:ascii="Cambria Math" w:hAnsi="Cambria Math" w:cs="Cambria Math"/>
           </w:rPr>
-          <m:t>X</m:t>
-        </m:r>
-      </m:oMath>
-      <w:r>
-        <w:rPr>
-          <w:rtl/>
-        </w:rPr>
-        <w:t xml:space="preserve"> באופן בלתי-תלוי מהתפלגות נורמלית סטנדרטית, דגמנו פרמוטציה אקראית והשווינו בין </w:t>
+          <m:t>atol = 10⁻⁵</m:t>
+        </m:r>
+      </m:oMath>
+      <w:r>
+        <w:rPr>
+          <w:rtl/>
+        </w:rPr>
+        <w:t xml:space="preserve"> ו-</w:t>
       </w:r>
       <m:oMath>
         <m:r>
           <w:rPr>
             <w:rFonts w:ascii="Cambria Math" w:hAnsi="Cambria Math" w:cs="Cambria Math"/>
           </w:rPr>
-          <m:t>F</m:t>
-        </m:r>
+          <m:t>rtol = 0</m:t>
+        </m:r>
+      </m:oMath>
+      <w:r>
+        <w:rPr>
+          <w:rtl/>
+        </w:rPr>
+        <w:t xml:space="preserve">. המבחן עבר בהצלחה, וההפרש המוחלט המרבי היה </w:t>
+      </w:r>
+      <m:oMath>
         <m:r>
           <w:rPr>
             <w:rFonts w:ascii="Cambria Math" w:hAnsi="Cambria Math" w:cs="Cambria Math"/>
           </w:rPr>
-          <m:t>(</m:t>
-        </m:r>
-        <m:r>
-          <w:rPr>
-            <w:rFonts w:ascii="Cambria Math" w:hAnsi="Cambria Math" w:cs="Cambria Math"/>
-          </w:rPr>
-          <m:t>π</m:t>
-        </m:r>
-        <m:r>
-          <w:rPr>
-            <w:rFonts w:ascii="Cambria Math" w:hAnsi="Cambria Math" w:cs="Cambria Math"/>
-          </w:rPr>
-          <m:t xml:space="preserve"> · </m:t>
-        </m:r>
-        <m:r>
-          <w:rPr>
-            <w:rFonts w:ascii="Cambria Math" w:hAnsi="Cambria Math" w:cs="Cambria Math"/>
-          </w:rPr>
-          <m:t>X</m:t>
-        </m:r>
-        <m:r>
-          <w:rPr>
-            <w:rFonts w:ascii="Cambria Math" w:hAnsi="Cambria Math" w:cs="Cambria Math"/>
-          </w:rPr>
-          <m:t>)</m:t>
-        </m:r>
-      </m:oMath>
-      <w:r>
-        <w:rPr>
-          <w:rtl/>
-        </w:rPr>
-        <w:t xml:space="preserve"> ובין </w:t>
-      </w:r>
-      <m:oMath>
-        <m:r>
-          <w:rPr>
-            <w:rFonts w:ascii="Cambria Math" w:hAnsi="Cambria Math" w:cs="Cambria Math"/>
-          </w:rPr>
-          <m:t>F</m:t>
-        </m:r>
-        <m:r>
-          <w:rPr>
-            <w:rFonts w:ascii="Cambria Math" w:hAnsi="Cambria Math" w:cs="Cambria Math"/>
-          </w:rPr>
-          <m:t>(</m:t>
-        </m:r>
-        <m:r>
-          <w:rPr>
-            <w:rFonts w:ascii="Cambria Math" w:hAnsi="Cambria Math" w:cs="Cambria Math"/>
-          </w:rPr>
-          <m:t>X</m:t>
-        </m:r>
-        <m:r>
-          <w:rPr>
-            <w:rFonts w:ascii="Cambria Math" w:hAnsi="Cambria Math" w:cs="Cambria Math"/>
-          </w:rPr>
-          <m:t>)</m:t>
+          <m:t>0</m:t>
+        </m:r>
+      </m:oMath>
+      <w:r>
+        <w:rPr>
+          <w:rtl/>
+        </w:rPr>
+        <w:t>. בנוסף עבר בהצלחה מבחן שכלל שוויון בקואורדינטות מוקדמות ושורות כפולות.</w:t>
+      </w:r>
+    </w:p>
+    <w:p>
+      <w:pPr>
+        <w:pStyle w:val="Heading2"/>
+        <w:rPr>
+          <w:rtl/>
+        </w:rPr>
+      </w:pPr>
+      <w:r>
+        <w:rPr>
+          <w:rtl/>
+        </w:rPr>
+        <w:t>סעיף ב. רשת מבוססת סימטריזציה.</w:t>
+      </w:r>
+    </w:p>
+    <w:p>
+      <w:r>
+        <w:rPr>
+          <w:rtl/>
+        </w:rPr>
+        <w:t>בחרנו ב-</w:t>
+      </w:r>
+      <m:oMath>
+        <m:r>
+          <w:rPr>
+            <w:rFonts w:ascii="Cambria Math" w:hAnsi="Cambria Math"/>
+          </w:rPr>
+          <m:t>h:</m:t>
+        </m:r>
+        <m:sSup>
+          <m:sSupPr>
+            <m:ctrlPr>
+              <w:rPr>
+                <w:rFonts w:ascii="Cambria Math" w:hAnsi="Cambria Math"/>
+              </w:rPr>
+            </m:ctrlPr>
+          </m:sSupPr>
+          <m:e>
+            <m:r>
+              <m:rPr>
+                <m:scr m:val="double-struck"/>
+              </m:rPr>
+              <w:rPr>
+                <w:rFonts w:ascii="Cambria Math" w:hAnsi="Cambria Math"/>
+              </w:rPr>
+              <m:t>R</m:t>
+            </m:r>
+          </m:e>
+          <m:sup>
+            <m:r>
+              <w:rPr>
+                <w:rFonts w:ascii="Cambria Math" w:hAnsi="Cambria Math"/>
+              </w:rPr>
+              <m:t>5×3</m:t>
+            </m:r>
+          </m:sup>
+        </m:sSup>
+        <m:r>
+          <w:rPr>
+            <w:rFonts w:ascii="Cambria Math" w:hAnsi="Cambria Math"/>
+          </w:rPr>
+          <m:t>→</m:t>
+        </m:r>
+        <m:sSup>
+          <m:sSupPr>
+            <m:ctrlPr>
+              <w:rPr>
+                <w:rFonts w:ascii="Cambria Math" w:hAnsi="Cambria Math"/>
+              </w:rPr>
+            </m:ctrlPr>
+          </m:sSupPr>
+          <m:e>
+            <m:r>
+              <m:rPr>
+                <m:scr m:val="double-struck"/>
+              </m:rPr>
+              <w:rPr>
+                <w:rFonts w:ascii="Cambria Math" w:hAnsi="Cambria Math"/>
+              </w:rPr>
+              <m:t>R</m:t>
+            </m:r>
+          </m:e>
+          <m:sup>
+            <m:r>
+              <w:rPr>
+                <w:rFonts w:ascii="Cambria Math" w:hAnsi="Cambria Math"/>
+              </w:rPr>
+              <m:t>4</m:t>
+            </m:r>
+          </m:sup>
+        </m:sSup>
+      </m:oMath>
+      <w:r>
+        <w:rPr>
+          <w:rtl/>
+        </w:rPr>
+        <w:t xml:space="preserve"> כרשת </w:t>
+      </w:r>
+      <m:oMath>
+        <m:r>
+          <m:rPr>
+            <m:nor/>
+          </m:rPr>
+          <m:t>MLP</m:t>
+        </m:r>
+      </m:oMath>
+      <w:r>
+        <w:rPr>
+          <w:rtl/>
+        </w:rPr>
+        <w:t xml:space="preserve"> בעלת שתי שכבות לינאריות. תחילה משטחים את הקלט לווקטור מממד </w:t>
+      </w:r>
+      <m:oMath>
+        <m:r>
+          <w:rPr>
+            <w:rFonts w:ascii="Cambria Math" w:hAnsi="Cambria Math"/>
+          </w:rPr>
+          <m:t>15</m:t>
+        </m:r>
+      </m:oMath>
+      <w:r>
+        <w:rPr>
+          <w:rtl/>
+        </w:rPr>
+        <w:t xml:space="preserve">, ולאחר מכן מפעילים שכבה לינארית לרוחב </w:t>
+      </w:r>
+      <m:oMath>
+        <m:r>
+          <w:rPr>
+            <w:rFonts w:ascii="Cambria Math" w:hAnsi="Cambria Math"/>
+          </w:rPr>
+          <m:t>32</m:t>
+        </m:r>
+      </m:oMath>
+      <w:r>
+        <w:rPr>
+          <w:rtl/>
+        </w:rPr>
+        <w:t xml:space="preserve">, פונקציית </w:t>
+      </w:r>
+      <m:oMath>
+        <m:r>
+          <m:rPr>
+            <m:nor/>
+          </m:rPr>
+          <m:t>ReLU</m:t>
+        </m:r>
+      </m:oMath>
+      <w:r>
+        <w:rPr>
+          <w:rtl/>
+        </w:rPr>
+        <w:t xml:space="preserve"> ושכבה לינארית לממד </w:t>
+      </w:r>
+      <m:oMath>
+        <m:r>
+          <w:rPr>
+            <w:rFonts w:ascii="Cambria Math" w:hAnsi="Cambria Math"/>
+          </w:rPr>
+          <m:t>4</m:t>
+        </m:r>
+      </m:oMath>
+      <w:r>
+        <w:rPr>
+          <w:rtl/>
+        </w:rPr>
+        <w:t>.</w:t>
+      </w:r>
+    </w:p>
+    <w:p>
+      <w:r>
+        <w:rPr>
+          <w:rtl/>
+        </w:rPr>
+        <w:t xml:space="preserve">נגדיר את הרשת המסומטרת באמצעות מיצוע על כל </w:t>
+      </w:r>
+      <m:oMath>
+        <m:r>
+          <w:rPr>
+            <w:rFonts w:ascii="Cambria Math" w:hAnsi="Cambria Math"/>
+          </w:rPr>
+          <m:t>5!=120</m:t>
+        </m:r>
+      </m:oMath>
+      <w:r>
+        <w:rPr>
+          <w:rtl/>
+        </w:rPr>
+        <w:t xml:space="preserve"> הפרמוטציות:</w:t>
+      </w:r>
+    </w:p>
+    <w:p>
+      <w:pPr>
+        <w:bidi w:val="0"/>
+        <w:spacing w:before="60" w:after="60"/>
+        <w:jc w:val="center"/>
+      </w:pPr>
+      <m:oMathPara>
+        <m:oMathParaPr>
+          <m:jc m:val="center"/>
+        </m:oMathParaPr>
+        <m:oMath>
+          <m:r>
+            <w:rPr>
+              <w:rFonts w:ascii="Cambria Math" w:hAnsi="Cambria Math"/>
+            </w:rPr>
+            <m:t>F(X)=</m:t>
+          </m:r>
+          <m:f>
+            <m:fPr>
+              <m:ctrlPr>
+                <w:rPr>
+                  <w:rFonts w:ascii="Cambria Math" w:hAnsi="Cambria Math"/>
+                </w:rPr>
+              </m:ctrlPr>
+            </m:fPr>
+            <m:num>
+              <m:r>
+                <w:rPr>
+                  <w:rFonts w:ascii="Cambria Math" w:hAnsi="Cambria Math"/>
+                </w:rPr>
+                <m:t>1</m:t>
+              </m:r>
+            </m:num>
+            <m:den>
+              <m:r>
+                <w:rPr>
+                  <w:rFonts w:ascii="Cambria Math" w:hAnsi="Cambria Math"/>
+                </w:rPr>
+                <m:t>5!</m:t>
+              </m:r>
+            </m:den>
+          </m:f>
+          <m:nary>
+            <m:naryPr>
+              <m:chr m:val="∑"/>
+              <m:limLoc m:val="undOvr"/>
+              <m:grow m:val="1"/>
+              <m:supHide m:val="1"/>
+              <m:ctrlPr>
+                <w:rPr>
+                  <w:rFonts w:ascii="Cambria Math" w:hAnsi="Cambria Math"/>
+                </w:rPr>
+              </m:ctrlPr>
+            </m:naryPr>
+            <m:sub>
+              <m:r>
+                <w:rPr>
+                  <w:rFonts w:ascii="Cambria Math" w:hAnsi="Cambria Math"/>
+                </w:rPr>
+                <m:t>π∈</m:t>
+              </m:r>
+              <m:sSub>
+                <m:sSubPr>
+                  <m:ctrlPr>
+                    <w:rPr>
+                      <w:rFonts w:ascii="Cambria Math" w:hAnsi="Cambria Math"/>
+                    </w:rPr>
+                  </m:ctrlPr>
+                </m:sSubPr>
+                <m:e>
+                  <m:r>
+                    <w:rPr>
+                      <w:rFonts w:ascii="Cambria Math" w:hAnsi="Cambria Math"/>
+                    </w:rPr>
+                    <m:t>S</m:t>
+                  </m:r>
+                </m:e>
+                <m:sub>
+                  <m:r>
+                    <w:rPr>
+                      <w:rFonts w:ascii="Cambria Math" w:hAnsi="Cambria Math"/>
+                    </w:rPr>
+                    <m:t>5</m:t>
+                  </m:r>
+                </m:sub>
+              </m:sSub>
+            </m:sub>
+            <m:sup/>
+            <m:e>
+              <m:r>
+                <w:rPr>
+                  <w:rFonts w:ascii="Cambria Math" w:hAnsi="Cambria Math"/>
+                </w:rPr>
+                <m:t>h(π·X).</m:t>
+              </m:r>
+            </m:e>
+          </m:nary>
+        </m:oMath>
+      </m:oMathPara>
+    </w:p>
+    <w:p>
+      <w:r>
+        <w:rPr>
+          <w:rtl/>
+        </w:rPr>
+        <w:t xml:space="preserve">כדי לוודא שהרשת אינווריאנטית, יהי </w:t>
+      </w:r>
+      <m:oMath>
+        <m:r>
+          <w:rPr>
+            <w:rFonts w:ascii="Cambria Math" w:hAnsi="Cambria Math"/>
+          </w:rPr>
+          <m:t>σ∈</m:t>
+        </m:r>
+        <m:sSub>
+          <m:sSubPr>
+            <m:ctrlPr>
+              <w:rPr>
+                <w:rFonts w:ascii="Cambria Math" w:hAnsi="Cambria Math"/>
+              </w:rPr>
+            </m:ctrlPr>
+          </m:sSubPr>
+          <m:e>
+            <m:r>
+              <w:rPr>
+                <w:rFonts w:ascii="Cambria Math" w:hAnsi="Cambria Math"/>
+              </w:rPr>
+              <m:t>S</m:t>
+            </m:r>
+          </m:e>
+          <m:sub>
+            <m:r>
+              <w:rPr>
+                <w:rFonts w:ascii="Cambria Math" w:hAnsi="Cambria Math"/>
+              </w:rPr>
+              <m:t>5</m:t>
+            </m:r>
+          </m:sub>
+        </m:sSub>
+      </m:oMath>
+      <w:r>
+        <w:rPr>
+          <w:rtl/>
+        </w:rPr>
+        <w:t>. מתקיים</w:t>
+      </w:r>
+    </w:p>
+    <w:p>
+      <w:pPr>
+        <w:bidi w:val="0"/>
+        <w:spacing w:before="60" w:after="60"/>
+        <w:jc w:val="center"/>
+      </w:pPr>
+      <m:oMathPara>
+        <m:oMathParaPr>
+          <m:jc m:val="center"/>
+        </m:oMathParaPr>
+        <m:oMath>
+          <m:r>
+            <w:rPr>
+              <w:rFonts w:ascii="Cambria Math" w:hAnsi="Cambria Math"/>
+            </w:rPr>
+            <m:t>F(σ·X)=</m:t>
+          </m:r>
+          <m:f>
+            <m:fPr>
+              <m:ctrlPr>
+                <w:rPr>
+                  <w:rFonts w:ascii="Cambria Math" w:hAnsi="Cambria Math"/>
+                </w:rPr>
+              </m:ctrlPr>
+            </m:fPr>
+            <m:num>
+              <m:r>
+                <w:rPr>
+                  <w:rFonts w:ascii="Cambria Math" w:hAnsi="Cambria Math"/>
+                </w:rPr>
+                <m:t>1</m:t>
+              </m:r>
+            </m:num>
+            <m:den>
+              <m:r>
+                <w:rPr>
+                  <w:rFonts w:ascii="Cambria Math" w:hAnsi="Cambria Math"/>
+                </w:rPr>
+                <m:t>5!</m:t>
+              </m:r>
+            </m:den>
+          </m:f>
+          <m:nary>
+            <m:naryPr>
+              <m:chr m:val="∑"/>
+              <m:limLoc m:val="undOvr"/>
+              <m:grow m:val="1"/>
+              <m:supHide m:val="1"/>
+              <m:ctrlPr>
+                <w:rPr>
+                  <w:rFonts w:ascii="Cambria Math" w:hAnsi="Cambria Math"/>
+                </w:rPr>
+              </m:ctrlPr>
+            </m:naryPr>
+            <m:sub>
+              <m:r>
+                <w:rPr>
+                  <w:rFonts w:ascii="Cambria Math" w:hAnsi="Cambria Math"/>
+                </w:rPr>
+                <m:t>π∈</m:t>
+              </m:r>
+              <m:sSub>
+                <m:sSubPr>
+                  <m:ctrlPr>
+                    <w:rPr>
+                      <w:rFonts w:ascii="Cambria Math" w:hAnsi="Cambria Math"/>
+                    </w:rPr>
+                  </m:ctrlPr>
+                </m:sSubPr>
+                <m:e>
+                  <m:r>
+                    <w:rPr>
+                      <w:rFonts w:ascii="Cambria Math" w:hAnsi="Cambria Math"/>
+                    </w:rPr>
+                    <m:t>S</m:t>
+                  </m:r>
+                </m:e>
+                <m:sub>
+                  <m:r>
+                    <w:rPr>
+                      <w:rFonts w:ascii="Cambria Math" w:hAnsi="Cambria Math"/>
+                    </w:rPr>
+                    <m:t>5</m:t>
+                  </m:r>
+                </m:sub>
+              </m:sSub>
+            </m:sub>
+            <m:sup/>
+            <m:e>
+              <m:r>
+                <w:rPr>
+                  <w:rFonts w:ascii="Cambria Math" w:hAnsi="Cambria Math"/>
+                </w:rPr>
+                <m:t>h((πσ)·X).</m:t>
+              </m:r>
+            </m:e>
+          </m:nary>
+        </m:oMath>
+      </m:oMathPara>
+    </w:p>
+    <w:p>
+      <w:r>
+        <w:rPr>
+          <w:rtl/>
+        </w:rPr>
+        <w:t xml:space="preserve">ההעתקה </w:t>
+      </w:r>
+      <m:oMath>
+        <m:r>
+          <w:rPr>
+            <w:rFonts w:ascii="Cambria Math" w:hAnsi="Cambria Math"/>
+          </w:rPr>
+          <m:t>π↦ρ=πσ</m:t>
+        </m:r>
+      </m:oMath>
+      <w:r>
+        <w:rPr>
+          <w:rtl/>
+        </w:rPr>
+        <w:t xml:space="preserve"> היא חח״ע ועל </w:t>
+      </w:r>
+      <m:oMath>
+        <m:sSub>
+          <m:sSubPr>
+            <m:ctrlPr>
+              <w:rPr>
+                <w:rFonts w:ascii="Cambria Math" w:hAnsi="Cambria Math"/>
+              </w:rPr>
+            </m:ctrlPr>
+          </m:sSubPr>
+          <m:e>
+            <m:r>
+              <w:rPr>
+                <w:rFonts w:ascii="Cambria Math" w:hAnsi="Cambria Math"/>
+              </w:rPr>
+              <m:t>S</m:t>
+            </m:r>
+          </m:e>
+          <m:sub>
+            <m:r>
+              <w:rPr>
+                <w:rFonts w:ascii="Cambria Math" w:hAnsi="Cambria Math"/>
+              </w:rPr>
+              <m:t>5</m:t>
+            </m:r>
+          </m:sub>
+        </m:sSub>
+      </m:oMath>
+      <w:r>
+        <w:rPr>
+          <w:rtl/>
+        </w:rPr>
+        <w:t xml:space="preserve">, וההעתקה ההפוכה שלה היא </w:t>
+      </w:r>
+      <m:oMath>
+        <m:r>
+          <w:rPr>
+            <w:rFonts w:ascii="Cambria Math" w:hAnsi="Cambria Math"/>
+          </w:rPr>
+          <m:t>ρ↦ρ</m:t>
+        </m:r>
+        <m:sSup>
+          <m:sSupPr>
+            <m:ctrlPr>
+              <w:rPr>
+                <w:rFonts w:ascii="Cambria Math" w:hAnsi="Cambria Math"/>
+              </w:rPr>
+            </m:ctrlPr>
+          </m:sSupPr>
+          <m:e>
+            <m:r>
+              <w:rPr>
+                <w:rFonts w:ascii="Cambria Math" w:hAnsi="Cambria Math"/>
+              </w:rPr>
+              <m:t>σ</m:t>
+            </m:r>
+          </m:e>
+          <m:sup>
+            <m:r>
+              <w:rPr>
+                <w:rFonts w:ascii="Cambria Math" w:hAnsi="Cambria Math"/>
+              </w:rPr>
+              <m:t>-1</m:t>
+            </m:r>
+          </m:sup>
+        </m:sSup>
+      </m:oMath>
+      <w:r>
+        <w:rPr>
+          <w:rtl/>
+        </w:rPr>
+        <w:t>. לכן שינוי האינדקס אינו משנה את איברי הסכום, ומתקבל</w:t>
+      </w:r>
+    </w:p>
+    <w:p>
+      <w:pPr>
+        <w:bidi w:val="0"/>
+        <w:spacing w:before="60" w:after="60"/>
+        <w:jc w:val="center"/>
+      </w:pPr>
+      <m:oMathPara>
+        <m:oMathParaPr>
+          <m:jc m:val="center"/>
+        </m:oMathParaPr>
+        <m:oMath>
+          <m:r>
+            <w:rPr>
+              <w:rFonts w:ascii="Cambria Math" w:hAnsi="Cambria Math"/>
+            </w:rPr>
+            <m:t>F(σ·X)=</m:t>
+          </m:r>
+          <m:f>
+            <m:fPr>
+              <m:ctrlPr>
+                <w:rPr>
+                  <w:rFonts w:ascii="Cambria Math" w:hAnsi="Cambria Math"/>
+                </w:rPr>
+              </m:ctrlPr>
+            </m:fPr>
+            <m:num>
+              <m:r>
+                <w:rPr>
+                  <w:rFonts w:ascii="Cambria Math" w:hAnsi="Cambria Math"/>
+                </w:rPr>
+                <m:t>1</m:t>
+              </m:r>
+            </m:num>
+            <m:den>
+              <m:r>
+                <w:rPr>
+                  <w:rFonts w:ascii="Cambria Math" w:hAnsi="Cambria Math"/>
+                </w:rPr>
+                <m:t>5!</m:t>
+              </m:r>
+            </m:den>
+          </m:f>
+          <m:nary>
+            <m:naryPr>
+              <m:chr m:val="∑"/>
+              <m:limLoc m:val="undOvr"/>
+              <m:grow m:val="1"/>
+              <m:supHide m:val="1"/>
+              <m:ctrlPr>
+                <w:rPr>
+                  <w:rFonts w:ascii="Cambria Math" w:hAnsi="Cambria Math"/>
+                </w:rPr>
+              </m:ctrlPr>
+            </m:naryPr>
+            <m:sub>
+              <m:r>
+                <w:rPr>
+                  <w:rFonts w:ascii="Cambria Math" w:hAnsi="Cambria Math"/>
+                </w:rPr>
+                <m:t>ρ∈</m:t>
+              </m:r>
+              <m:sSub>
+                <m:sSubPr>
+                  <m:ctrlPr>
+                    <w:rPr>
+                      <w:rFonts w:ascii="Cambria Math" w:hAnsi="Cambria Math"/>
+                    </w:rPr>
+                  </m:ctrlPr>
+                </m:sSubPr>
+                <m:e>
+                  <m:r>
+                    <w:rPr>
+                      <w:rFonts w:ascii="Cambria Math" w:hAnsi="Cambria Math"/>
+                    </w:rPr>
+                    <m:t>S</m:t>
+                  </m:r>
+                </m:e>
+                <m:sub>
+                  <m:r>
+                    <w:rPr>
+                      <w:rFonts w:ascii="Cambria Math" w:hAnsi="Cambria Math"/>
+                    </w:rPr>
+                    <m:t>5</m:t>
+                  </m:r>
+                </m:sub>
+              </m:sSub>
+            </m:sub>
+            <m:sup/>
+            <m:e>
+              <m:r>
+                <w:rPr>
+                  <w:rFonts w:ascii="Cambria Math" w:hAnsi="Cambria Math"/>
+                </w:rPr>
+                <m:t>h(ρ·X)=F(X).</m:t>
+              </m:r>
+            </m:e>
+          </m:nary>
+        </m:oMath>
+      </m:oMathPara>
+    </w:p>
+    <w:p>
+      <w:r>
+        <w:rPr>
+          <w:rtl/>
+        </w:rPr>
+        <w:t xml:space="preserve">במימוש יצרנו את כל הפרמוטציות של חמש השורות, הפעלנו את </w:t>
+      </w:r>
+      <m:oMath>
+        <m:r>
+          <w:rPr>
+            <w:rFonts w:ascii="Cambria Math" w:hAnsi="Cambria Math"/>
+          </w:rPr>
+          <m:t>h</m:t>
+        </m:r>
+      </m:oMath>
+      <w:r>
+        <w:rPr>
+          <w:rtl/>
+        </w:rPr>
+        <w:t xml:space="preserve"> על כל קלט שעבר פרמוטציה, וחישבנו את הממוצע של </w:t>
+      </w:r>
+      <m:oMath>
+        <m:r>
+          <w:rPr>
+            <w:rFonts w:ascii="Cambria Math" w:hAnsi="Cambria Math"/>
+          </w:rPr>
+          <m:t>120</m:t>
+        </m:r>
+      </m:oMath>
+      <w:r>
+        <w:rPr>
+          <w:rtl/>
+        </w:rPr>
+        <w:t xml:space="preserve"> הפלטים.</w:t>
+      </w:r>
+    </w:p>
+    <w:p>
+      <w:r>
+        <w:rPr>
+          <w:rtl/>
+        </w:rPr>
+        <w:t xml:space="preserve">בהרצה עם </w:t>
+      </w:r>
+      <m:oMath>
+        <m:r>
+          <m:rPr>
+            <m:nor/>
+          </m:rPr>
+          <m:t>seed</m:t>
+        </m:r>
+        <m:r>
+          <w:rPr>
+            <w:rFonts w:ascii="Cambria Math" w:hAnsi="Cambria Math"/>
+          </w:rPr>
+          <m:t>=2319</m:t>
+        </m:r>
+      </m:oMath>
+      <w:r>
+        <w:rPr>
+          <w:rtl/>
+        </w:rPr>
+        <w:t xml:space="preserve"> השווינו בין </w:t>
+      </w:r>
+      <m:oMath>
+        <m:r>
+          <w:rPr>
+            <w:rFonts w:ascii="Cambria Math" w:hAnsi="Cambria Math"/>
+          </w:rPr>
+          <m:t>F(X)</m:t>
+        </m:r>
+      </m:oMath>
+      <w:r>
+        <w:rPr>
+          <w:rtl/>
+        </w:rPr>
+        <w:t xml:space="preserve"> לבין </w:t>
+      </w:r>
+      <m:oMath>
+        <m:r>
+          <w:rPr>
+            <w:rFonts w:ascii="Cambria Math" w:hAnsi="Cambria Math"/>
+          </w:rPr>
+          <m:t>F(σ·X)</m:t>
         </m:r>
       </m:oMath>
       <w:r>
@@ -15965,49 +16210,56 @@
       </w:r>
       <m:oMath>
         <m:r>
-          <w:rPr>
-            <w:rFonts w:ascii="Cambria Math" w:hAnsi="Cambria Math" w:cs="Cambria Math"/>
-          </w:rPr>
-          <m:t>torc</m:t>
-        </m:r>
-        <m:r>
-          <w:rPr>
-            <w:rFonts w:ascii="Cambria Math" w:hAnsi="Cambria Math" w:cs="Cambria Math"/>
-          </w:rPr>
-          <m:t>h</m:t>
-        </m:r>
-        <m:r>
-          <w:rPr>
-            <w:rFonts w:ascii="Cambria Math" w:hAnsi="Cambria Math" w:cs="Cambria Math"/>
-          </w:rPr>
-          <m:t>.</m:t>
-        </m:r>
-        <m:r>
-          <w:rPr>
-            <w:rFonts w:ascii="Cambria Math" w:hAnsi="Cambria Math" w:cs="Cambria Math"/>
-          </w:rPr>
-          <m:t>allclose</m:t>
-        </m:r>
-      </m:oMath>
-      <w:r>
-        <w:rPr>
-          <w:rtl/>
-        </w:rPr>
-        <w:t xml:space="preserve">, עם </w:t>
-      </w:r>
-      <m:oMath>
-        <m:r>
-          <w:rPr>
-            <w:rFonts w:ascii="Cambria Math" w:hAnsi="Cambria Math" w:cs="Cambria Math"/>
-          </w:rPr>
+          <m:rPr>
+            <m:nor/>
+          </m:rPr>
+          <m:t>torch.allclose</m:t>
+        </m:r>
+      </m:oMath>
+      <w:r>
+        <w:rPr>
+          <w:rtl/>
+        </w:rPr>
+        <w:t xml:space="preserve"> עם </w:t>
+      </w:r>
+      <m:oMath>
+        <m:r>
+          <m:rPr>
+            <m:nor/>
+          </m:rPr>
           <m:t>atol</m:t>
         </m:r>
         <m:r>
           <w:rPr>
-            <w:rFonts w:ascii="Cambria Math" w:hAnsi="Cambria Math" w:cs="Cambria Math"/>
-          </w:rPr>
-          <m:t xml:space="preserve"> = 10⁻⁵</m:t>
-        </m:r>
+            <w:rFonts w:ascii="Cambria Math" w:hAnsi="Cambria Math"/>
+          </w:rPr>
+          <m:t>=</m:t>
+        </m:r>
+        <m:sSup>
+          <m:sSupPr>
+            <m:ctrlPr>
+              <w:rPr>
+                <w:rFonts w:ascii="Cambria Math" w:hAnsi="Cambria Math"/>
+              </w:rPr>
+            </m:ctrlPr>
+          </m:sSupPr>
+          <m:e>
+            <m:r>
+              <w:rPr>
+                <w:rFonts w:ascii="Cambria Math" w:hAnsi="Cambria Math"/>
+              </w:rPr>
+              <m:t>10</m:t>
+            </m:r>
+          </m:e>
+          <m:sup>
+            <m:r>
+              <w:rPr>
+                <w:rFonts w:ascii="Cambria Math" w:hAnsi="Cambria Math"/>
+              </w:rPr>
+              <m:t>-5</m:t>
+            </m:r>
+          </m:sup>
+        </m:sSup>
       </m:oMath>
       <w:r>
         <w:rPr>
@@ -16017,37 +16269,62 @@
       </w:r>
       <m:oMath>
         <m:r>
-          <w:rPr>
-            <w:rFonts w:ascii="Cambria Math" w:hAnsi="Cambria Math" w:cs="Cambria Math"/>
-          </w:rPr>
+          <m:rPr>
+            <m:nor/>
+          </m:rPr>
           <m:t>rtol</m:t>
         </m:r>
         <m:r>
           <w:rPr>
-            <w:rFonts w:ascii="Cambria Math" w:hAnsi="Cambria Math" w:cs="Cambria Math"/>
-          </w:rPr>
-          <m:t xml:space="preserve"> = 0</m:t>
-        </m:r>
-      </m:oMath>
-      <w:r>
-        <w:rPr>
-          <w:rtl/>
-        </w:rPr>
-        <w:t xml:space="preserve">. המבחן עבר בהצלחה, וההפרש המוחלט המרבי היה </w:t>
-      </w:r>
-      <m:oMath>
-        <m:r>
-          <w:rPr>
-            <w:rFonts w:ascii="Cambria Math" w:hAnsi="Cambria Math" w:cs="Cambria Math"/>
-          </w:rPr>
-          <m:t>0</m:t>
-        </m:r>
-      </m:oMath>
-      <w:r>
-        <w:rPr>
-          <w:rtl/>
-        </w:rPr>
-        <w:t>. בנוסף עבר בהצלחה מבחן שכלל שוויון בקואורדינטות מוקדמות ושורות כפולות.</w:t>
+            <w:rFonts w:ascii="Cambria Math" w:hAnsi="Cambria Math"/>
+          </w:rPr>
+          <m:t>=0</m:t>
+        </m:r>
+      </m:oMath>
+      <w:r>
+        <w:rPr>
+          <w:rtl/>
+        </w:rPr>
+        <w:t xml:space="preserve">. הבדיקה עברה, וההפרש המוחלט המרבי היה </w:t>
+      </w:r>
+      <m:oMath>
+        <m:r>
+          <w:rPr>
+            <w:rFonts w:ascii="Cambria Math" w:hAnsi="Cambria Math"/>
+          </w:rPr>
+          <m:t>2.98·</m:t>
+        </m:r>
+        <m:sSup>
+          <m:sSupPr>
+            <m:ctrlPr>
+              <w:rPr>
+                <w:rFonts w:ascii="Cambria Math" w:hAnsi="Cambria Math"/>
+              </w:rPr>
+            </m:ctrlPr>
+          </m:sSupPr>
+          <m:e>
+            <m:r>
+              <w:rPr>
+                <w:rFonts w:ascii="Cambria Math" w:hAnsi="Cambria Math"/>
+              </w:rPr>
+              <m:t>10</m:t>
+            </m:r>
+          </m:e>
+          <m:sup>
+            <m:r>
+              <w:rPr>
+                <w:rFonts w:ascii="Cambria Math" w:hAnsi="Cambria Math"/>
+              </w:rPr>
+              <m:t>-8</m:t>
+            </m:r>
+          </m:sup>
+        </m:sSup>
+      </m:oMath>
+      <w:r>
+        <w:rPr>
+          <w:rtl/>
+        </w:rPr>
+        <w:t>.</w:t>
       </w:r>
     </w:p>
     <w:sectPr>

</xml_diff>

<commit_message>
Complete HW4 Question 3(c)
</commit_message>
<xml_diff>
--- a/HW4-Solution.docx
+++ b/HW4-Solution.docx
@@ -74,7 +74,7 @@
         </w:rPr>
         <w:fldChar w:fldCharType="separate"/>
       </w:r>
-      <w:hyperlink w:anchor="_Toc235884418" w:history="1">
+      <w:hyperlink w:anchor="_Toc236066117" w:history="1">
         <w:r>
           <w:rPr>
             <w:rStyle w:val="Hyperlink"/>
@@ -102,7 +102,7 @@
             <w:noProof/>
             <w:webHidden/>
           </w:rPr>
-          <w:instrText xml:space="preserve"> PAGEREF _Toc235884418 \h </w:instrText>
+          <w:instrText xml:space="preserve"> PAGEREF _Toc236066117 \h </w:instrText>
         </w:r>
         <w:r>
           <w:rPr>
@@ -146,7 +146,7 @@
           <w14:ligatures w14:val="standardContextual"/>
         </w:rPr>
       </w:pPr>
-      <w:hyperlink w:anchor="_Toc235884419" w:history="1">
+      <w:hyperlink w:anchor="_Toc236066118" w:history="1">
         <w:r>
           <w:rPr>
             <w:rStyle w:val="Hyperlink"/>
@@ -174,7 +174,7 @@
             <w:noProof/>
             <w:webHidden/>
           </w:rPr>
-          <w:instrText xml:space="preserve"> PAGEREF _Toc235884419 \h </w:instrText>
+          <w:instrText xml:space="preserve"> PAGEREF _Toc236066118 \h </w:instrText>
         </w:r>
         <w:r>
           <w:rPr>
@@ -218,7 +218,7 @@
           <w14:ligatures w14:val="standardContextual"/>
         </w:rPr>
       </w:pPr>
-      <w:hyperlink w:anchor="_Toc235884420" w:history="1">
+      <w:hyperlink w:anchor="_Toc236066119" w:history="1">
         <w:r>
           <w:rPr>
             <w:rStyle w:val="Hyperlink"/>
@@ -246,7 +246,7 @@
             <w:noProof/>
             <w:webHidden/>
           </w:rPr>
-          <w:instrText xml:space="preserve"> PAGEREF _Toc235884420 \h </w:instrText>
+          <w:instrText xml:space="preserve"> PAGEREF _Toc236066119 \h </w:instrText>
         </w:r>
         <w:r>
           <w:rPr>
@@ -290,7 +290,7 @@
         </w:rPr>
         <w:fldChar w:fldCharType="end"/>
       </w:r>
-      <w:bookmarkStart w:id="1" w:name="_Toc235884418"/>
+      <w:bookmarkStart w:id="1" w:name="_Toc236066117"/>
       <w:r>
         <w:rPr>
           <w:rtl/>
@@ -6736,7 +6736,7 @@
         </w:rPr>
       </w:pPr>
       <w:bookmarkStart w:id="2" w:name="שאלה-2"/>
-      <w:bookmarkStart w:id="3" w:name="_Toc235884419"/>
+      <w:bookmarkStart w:id="3" w:name="_Toc236066118"/>
       <w:bookmarkEnd w:id="0"/>
       <w:r>
         <w:rPr>
@@ -14910,7 +14910,7 @@
           <w:rtl/>
         </w:rPr>
       </w:pPr>
-      <w:bookmarkStart w:id="4" w:name="_Toc235884420"/>
+      <w:bookmarkStart w:id="4" w:name="_Toc236066119"/>
       <w:r>
         <w:rPr>
           <w:rtl/>
@@ -16325,6 +16325,1749 @@
           <w:rtl/>
         </w:rPr>
         <w:t>.</w:t>
+      </w:r>
+    </w:p>
+    <w:p>
+      <w:pPr>
+        <w:pStyle w:val="Heading2"/>
+        <w:rPr>
+          <w:rtl/>
+        </w:rPr>
+      </w:pPr>
+      <w:r>
+        <w:rPr>
+          <w:rtl/>
+        </w:rPr>
+        <w:t>סעיף ג. סימטריזציה מדוגמת.</w:t>
+      </w:r>
+    </w:p>
+    <w:p>
+      <w:r>
+        <w:rPr>
+          <w:rtl/>
+        </w:rPr>
+        <w:t xml:space="preserve">במקום למצע על כל הפרמוטציות, נבחר פעם אחת, באופן אחיד וללא החזרה, תת־קבוצה אקראית </w:t>
+      </w:r>
+      <m:oMath>
+        <m:r>
+          <w:rPr>
+            <w:rFonts w:ascii="Cambria Math" w:hAnsi="Cambria Math"/>
+          </w:rPr>
+          <m:t>P⊆</m:t>
+        </m:r>
+        <m:sSub>
+          <m:sSubPr>
+            <m:ctrlPr>
+              <w:rPr>
+                <w:rFonts w:ascii="Cambria Math" w:hAnsi="Cambria Math"/>
+              </w:rPr>
+            </m:ctrlPr>
+          </m:sSubPr>
+          <m:e>
+            <m:r>
+              <w:rPr>
+                <w:rFonts w:ascii="Cambria Math" w:hAnsi="Cambria Math"/>
+              </w:rPr>
+              <m:t>S</m:t>
+            </m:r>
+          </m:e>
+          <m:sub>
+            <m:r>
+              <w:rPr>
+                <w:rFonts w:ascii="Cambria Math" w:hAnsi="Cambria Math"/>
+              </w:rPr>
+              <m:t>7</m:t>
+            </m:r>
+          </m:sub>
+        </m:sSub>
+      </m:oMath>
+      <w:r>
+        <w:rPr>
+          <w:rtl/>
+        </w:rPr>
+        <w:t xml:space="preserve"> בגודל </w:t>
+      </w:r>
+      <m:oMath>
+        <m:r>
+          <w:rPr>
+            <w:rFonts w:ascii="Cambria Math" w:hAnsi="Cambria Math"/>
+          </w:rPr>
+          <m:t>B=2700</m:t>
+        </m:r>
+      </m:oMath>
+      <w:r>
+        <w:rPr>
+          <w:rtl/>
+        </w:rPr>
+        <w:t>, ונקבע אותה כחלק מהרשת. נגדיר</w:t>
+      </w:r>
+    </w:p>
+    <w:p>
+      <w:pPr>
+        <w:bidi w:val="0"/>
+        <w:spacing w:before="60" w:after="60"/>
+        <w:jc w:val="center"/>
+      </w:pPr>
+      <m:oMathPara>
+        <m:oMathParaPr>
+          <m:jc m:val="center"/>
+        </m:oMathParaPr>
+        <m:oMath>
+          <m:sSub>
+            <m:sSubPr>
+              <m:ctrlPr>
+                <w:rPr>
+                  <w:rFonts w:ascii="Cambria Math" w:hAnsi="Cambria Math"/>
+                </w:rPr>
+              </m:ctrlPr>
+            </m:sSubPr>
+            <m:e>
+              <m:r>
+                <w:rPr>
+                  <w:rFonts w:ascii="Cambria Math" w:hAnsi="Cambria Math"/>
+                </w:rPr>
+                <m:t>F</m:t>
+              </m:r>
+            </m:e>
+            <m:sub>
+              <m:r>
+                <w:rPr>
+                  <w:rFonts w:ascii="Cambria Math" w:hAnsi="Cambria Math"/>
+                </w:rPr>
+                <m:t>P</m:t>
+              </m:r>
+            </m:sub>
+          </m:sSub>
+          <m:r>
+            <w:rPr>
+              <w:rFonts w:ascii="Cambria Math" w:hAnsi="Cambria Math"/>
+            </w:rPr>
+            <m:t>(X)=</m:t>
+          </m:r>
+          <m:f>
+            <m:fPr>
+              <m:ctrlPr>
+                <w:rPr>
+                  <w:rFonts w:ascii="Cambria Math" w:hAnsi="Cambria Math"/>
+                </w:rPr>
+              </m:ctrlPr>
+            </m:fPr>
+            <m:num>
+              <m:r>
+                <w:rPr>
+                  <w:rFonts w:ascii="Cambria Math" w:hAnsi="Cambria Math"/>
+                </w:rPr>
+                <m:t>1</m:t>
+              </m:r>
+            </m:num>
+            <m:den>
+              <m:r>
+                <w:rPr>
+                  <w:rFonts w:ascii="Cambria Math" w:hAnsi="Cambria Math"/>
+                </w:rPr>
+                <m:t>B</m:t>
+              </m:r>
+            </m:den>
+          </m:f>
+          <m:nary>
+            <m:naryPr>
+              <m:chr m:val="∑"/>
+              <m:limLoc m:val="undOvr"/>
+              <m:grow m:val="1"/>
+              <m:supHide m:val="1"/>
+              <m:ctrlPr>
+                <w:rPr>
+                  <w:rFonts w:ascii="Cambria Math" w:hAnsi="Cambria Math"/>
+                </w:rPr>
+              </m:ctrlPr>
+            </m:naryPr>
+            <m:sub>
+              <m:r>
+                <w:rPr>
+                  <w:rFonts w:ascii="Cambria Math" w:hAnsi="Cambria Math"/>
+                </w:rPr>
+                <m:t>π∈P</m:t>
+              </m:r>
+            </m:sub>
+            <m:sup/>
+            <m:e>
+              <m:r>
+                <w:rPr>
+                  <w:rFonts w:ascii="Cambria Math" w:hAnsi="Cambria Math"/>
+                </w:rPr>
+                <m:t>h(π·X).</m:t>
+              </m:r>
+            </m:e>
+          </m:nary>
+        </m:oMath>
+      </m:oMathPara>
+    </w:p>
+    <w:p>
+      <w:r>
+        <w:rPr>
+          <w:rtl/>
+        </w:rPr>
+        <w:t xml:space="preserve">רשת זו אינה אינווריאנטית באופן מדויק. אכן, עבור </w:t>
+      </w:r>
+      <m:oMath>
+        <m:r>
+          <w:rPr>
+            <w:rFonts w:ascii="Cambria Math" w:hAnsi="Cambria Math"/>
+          </w:rPr>
+          <m:t>σ∈</m:t>
+        </m:r>
+        <m:sSub>
+          <m:sSubPr>
+            <m:ctrlPr>
+              <w:rPr>
+                <w:rFonts w:ascii="Cambria Math" w:hAnsi="Cambria Math"/>
+              </w:rPr>
+            </m:ctrlPr>
+          </m:sSubPr>
+          <m:e>
+            <m:r>
+              <w:rPr>
+                <w:rFonts w:ascii="Cambria Math" w:hAnsi="Cambria Math"/>
+              </w:rPr>
+              <m:t>S</m:t>
+            </m:r>
+          </m:e>
+          <m:sub>
+            <m:r>
+              <w:rPr>
+                <w:rFonts w:ascii="Cambria Math" w:hAnsi="Cambria Math"/>
+              </w:rPr>
+              <m:t>7</m:t>
+            </m:r>
+          </m:sub>
+        </m:sSub>
+      </m:oMath>
+      <w:r>
+        <w:rPr>
+          <w:rtl/>
+        </w:rPr>
+        <w:t xml:space="preserve"> מתקיים</w:t>
+      </w:r>
+    </w:p>
+    <w:p>
+      <w:pPr>
+        <w:bidi w:val="0"/>
+        <w:spacing w:before="60" w:after="60"/>
+        <w:jc w:val="center"/>
+      </w:pPr>
+      <m:oMathPara>
+        <m:oMathParaPr>
+          <m:jc m:val="center"/>
+        </m:oMathParaPr>
+        <m:oMath>
+          <m:sSub>
+            <m:sSubPr>
+              <m:ctrlPr>
+                <w:rPr>
+                  <w:rFonts w:ascii="Cambria Math" w:hAnsi="Cambria Math"/>
+                </w:rPr>
+              </m:ctrlPr>
+            </m:sSubPr>
+            <m:e>
+              <m:r>
+                <w:rPr>
+                  <w:rFonts w:ascii="Cambria Math" w:hAnsi="Cambria Math"/>
+                </w:rPr>
+                <m:t>F</m:t>
+              </m:r>
+            </m:e>
+            <m:sub>
+              <m:r>
+                <w:rPr>
+                  <w:rFonts w:ascii="Cambria Math" w:hAnsi="Cambria Math"/>
+                </w:rPr>
+                <m:t>P</m:t>
+              </m:r>
+            </m:sub>
+          </m:sSub>
+          <m:r>
+            <w:rPr>
+              <w:rFonts w:ascii="Cambria Math" w:hAnsi="Cambria Math"/>
+            </w:rPr>
+            <m:t>(σ·X)=</m:t>
+          </m:r>
+          <m:f>
+            <m:fPr>
+              <m:ctrlPr>
+                <w:rPr>
+                  <w:rFonts w:ascii="Cambria Math" w:hAnsi="Cambria Math"/>
+                </w:rPr>
+              </m:ctrlPr>
+            </m:fPr>
+            <m:num>
+              <m:r>
+                <w:rPr>
+                  <w:rFonts w:ascii="Cambria Math" w:hAnsi="Cambria Math"/>
+                </w:rPr>
+                <m:t>1</m:t>
+              </m:r>
+            </m:num>
+            <m:den>
+              <m:r>
+                <w:rPr>
+                  <w:rFonts w:ascii="Cambria Math" w:hAnsi="Cambria Math"/>
+                </w:rPr>
+                <m:t>B</m:t>
+              </m:r>
+            </m:den>
+          </m:f>
+          <m:nary>
+            <m:naryPr>
+              <m:chr m:val="∑"/>
+              <m:limLoc m:val="undOvr"/>
+              <m:grow m:val="1"/>
+              <m:supHide m:val="1"/>
+              <m:ctrlPr>
+                <w:rPr>
+                  <w:rFonts w:ascii="Cambria Math" w:hAnsi="Cambria Math"/>
+                </w:rPr>
+              </m:ctrlPr>
+            </m:naryPr>
+            <m:sub>
+              <m:r>
+                <w:rPr>
+                  <w:rFonts w:ascii="Cambria Math" w:hAnsi="Cambria Math"/>
+                </w:rPr>
+                <m:t>π∈P</m:t>
+              </m:r>
+            </m:sub>
+            <m:sup/>
+            <m:e>
+              <m:r>
+                <w:rPr>
+                  <w:rFonts w:ascii="Cambria Math" w:hAnsi="Cambria Math"/>
+                </w:rPr>
+                <m:t>h((πσ)·X)=</m:t>
+              </m:r>
+            </m:e>
+          </m:nary>
+          <m:f>
+            <m:fPr>
+              <m:ctrlPr>
+                <w:rPr>
+                  <w:rFonts w:ascii="Cambria Math" w:hAnsi="Cambria Math"/>
+                </w:rPr>
+              </m:ctrlPr>
+            </m:fPr>
+            <m:num>
+              <m:r>
+                <w:rPr>
+                  <w:rFonts w:ascii="Cambria Math" w:hAnsi="Cambria Math"/>
+                </w:rPr>
+                <m:t>1</m:t>
+              </m:r>
+            </m:num>
+            <m:den>
+              <m:r>
+                <w:rPr>
+                  <w:rFonts w:ascii="Cambria Math" w:hAnsi="Cambria Math"/>
+                </w:rPr>
+                <m:t>B</m:t>
+              </m:r>
+            </m:den>
+          </m:f>
+          <m:nary>
+            <m:naryPr>
+              <m:chr m:val="∑"/>
+              <m:limLoc m:val="undOvr"/>
+              <m:grow m:val="1"/>
+              <m:supHide m:val="1"/>
+              <m:ctrlPr>
+                <w:rPr>
+                  <w:rFonts w:ascii="Cambria Math" w:hAnsi="Cambria Math"/>
+                </w:rPr>
+              </m:ctrlPr>
+            </m:naryPr>
+            <m:sub>
+              <m:r>
+                <w:rPr>
+                  <w:rFonts w:ascii="Cambria Math" w:hAnsi="Cambria Math"/>
+                </w:rPr>
+                <m:t>ρ∈Pσ</m:t>
+              </m:r>
+            </m:sub>
+            <m:sup/>
+            <m:e>
+              <m:r>
+                <w:rPr>
+                  <w:rFonts w:ascii="Cambria Math" w:hAnsi="Cambria Math"/>
+                </w:rPr>
+                <m:t>h(ρ·X).</m:t>
+              </m:r>
+            </m:e>
+          </m:nary>
+        </m:oMath>
+      </m:oMathPara>
+    </w:p>
+    <w:p>
+      <w:r>
+        <w:rPr>
+          <w:rtl/>
+        </w:rPr>
+        <w:t xml:space="preserve">באופן כללי </w:t>
+      </w:r>
+      <m:oMath>
+        <m:r>
+          <w:rPr>
+            <w:rFonts w:ascii="Cambria Math" w:hAnsi="Cambria Math"/>
+          </w:rPr>
+          <m:t>Pσ≠P</m:t>
+        </m:r>
+      </m:oMath>
+      <w:r>
+        <w:rPr>
+          <w:rtl/>
+        </w:rPr>
+        <w:t>, ולכן לא ניתן לשנות את אינדקס הסכימה ולקבל שוב את אותו הממוצע. עם זאת, מאחר שהתת־קבוצה נדגמת באקראי מתוך החבורה, הממוצע המדוגם הוא אומד מונטה־קרלו של הממוצע על החבורה כולה, ולכן מתקבלת אינווריאנטיות בקירוב.</w:t>
+      </w:r>
+    </w:p>
+    <w:p>
+      <w:r>
+        <w:rPr>
+          <w:rtl/>
+        </w:rPr>
+        <w:t xml:space="preserve">כדי לבחור את </w:t>
+      </w:r>
+      <m:oMath>
+        <m:r>
+          <w:rPr>
+            <w:rFonts w:ascii="Cambria Math" w:hAnsi="Cambria Math"/>
+          </w:rPr>
+          <m:t>B</m:t>
+        </m:r>
+      </m:oMath>
+      <w:r>
+        <w:rPr>
+          <w:rtl/>
+        </w:rPr>
+        <w:t xml:space="preserve">, נסמן </w:t>
+      </w:r>
+      <m:oMath>
+        <m:r>
+          <w:rPr>
+            <w:rFonts w:ascii="Cambria Math" w:hAnsi="Cambria Math"/>
+          </w:rPr>
+          <m:t>N=|</m:t>
+        </m:r>
+        <m:sSub>
+          <m:sSubPr>
+            <m:ctrlPr>
+              <w:rPr>
+                <w:rFonts w:ascii="Cambria Math" w:hAnsi="Cambria Math"/>
+              </w:rPr>
+            </m:ctrlPr>
+          </m:sSubPr>
+          <m:e>
+            <m:r>
+              <w:rPr>
+                <w:rFonts w:ascii="Cambria Math" w:hAnsi="Cambria Math"/>
+              </w:rPr>
+              <m:t>S</m:t>
+            </m:r>
+          </m:e>
+          <m:sub>
+            <m:r>
+              <w:rPr>
+                <w:rFonts w:ascii="Cambria Math" w:hAnsi="Cambria Math"/>
+              </w:rPr>
+              <m:t>7</m:t>
+            </m:r>
+          </m:sub>
+        </m:sSub>
+        <m:r>
+          <w:rPr>
+            <w:rFonts w:ascii="Cambria Math" w:hAnsi="Cambria Math"/>
+          </w:rPr>
+          <m:t>|=7!=5040</m:t>
+        </m:r>
+      </m:oMath>
+      <w:r>
+        <w:rPr>
+          <w:rtl/>
+        </w:rPr>
+        <w:t>. עבור כל קואורדינטת פלט נגדיר את הפרש הפלטים המתאים לפרמוטציה:</w:t>
+      </w:r>
+    </w:p>
+    <w:p>
+      <w:pPr>
+        <w:bidi w:val="0"/>
+        <w:spacing w:before="60" w:after="60"/>
+        <w:jc w:val="center"/>
+      </w:pPr>
+      <m:oMathPara>
+        <m:oMathParaPr>
+          <m:jc m:val="center"/>
+        </m:oMathParaPr>
+        <m:oMath>
+          <m:sSub>
+            <m:sSubPr>
+              <m:ctrlPr>
+                <w:rPr>
+                  <w:rFonts w:ascii="Cambria Math" w:hAnsi="Cambria Math"/>
+                </w:rPr>
+              </m:ctrlPr>
+            </m:sSubPr>
+            <m:e>
+              <m:r>
+                <w:rPr>
+                  <w:rFonts w:ascii="Cambria Math" w:hAnsi="Cambria Math"/>
+                </w:rPr>
+                <m:t>Δ</m:t>
+              </m:r>
+            </m:e>
+            <m:sub>
+              <m:r>
+                <w:rPr>
+                  <w:rFonts w:ascii="Cambria Math" w:hAnsi="Cambria Math"/>
+                </w:rPr>
+                <m:t>π,j</m:t>
+              </m:r>
+            </m:sub>
+          </m:sSub>
+          <m:r>
+            <w:rPr>
+              <w:rFonts w:ascii="Cambria Math" w:hAnsi="Cambria Math"/>
+            </w:rPr>
+            <m:t>=</m:t>
+          </m:r>
+          <m:sSub>
+            <m:sSubPr>
+              <m:ctrlPr>
+                <w:rPr>
+                  <w:rFonts w:ascii="Cambria Math" w:hAnsi="Cambria Math"/>
+                </w:rPr>
+              </m:ctrlPr>
+            </m:sSubPr>
+            <m:e>
+              <m:d>
+                <m:dPr>
+                  <m:begChr m:val="["/>
+                  <m:endChr m:val="]"/>
+                  <m:ctrlPr>
+                    <w:rPr>
+                      <w:rFonts w:ascii="Cambria Math" w:hAnsi="Cambria Math"/>
+                    </w:rPr>
+                  </m:ctrlPr>
+                </m:dPr>
+                <m:e>
+                  <m:r>
+                    <w:rPr>
+                      <w:rFonts w:ascii="Cambria Math" w:hAnsi="Cambria Math"/>
+                    </w:rPr>
+                    <m:t>h(πσ·X)</m:t>
+                  </m:r>
+                </m:e>
+              </m:d>
+            </m:e>
+            <m:sub>
+              <m:r>
+                <w:rPr>
+                  <w:rFonts w:ascii="Cambria Math" w:hAnsi="Cambria Math"/>
+                </w:rPr>
+                <m:t>j</m:t>
+              </m:r>
+            </m:sub>
+          </m:sSub>
+          <m:r>
+            <w:rPr>
+              <w:rFonts w:ascii="Cambria Math" w:hAnsi="Cambria Math"/>
+            </w:rPr>
+            <m:t>-</m:t>
+          </m:r>
+          <m:sSub>
+            <m:sSubPr>
+              <m:ctrlPr>
+                <w:rPr>
+                  <w:rFonts w:ascii="Cambria Math" w:hAnsi="Cambria Math"/>
+                </w:rPr>
+              </m:ctrlPr>
+            </m:sSubPr>
+            <m:e>
+              <m:d>
+                <m:dPr>
+                  <m:begChr m:val="["/>
+                  <m:endChr m:val="]"/>
+                  <m:ctrlPr>
+                    <w:rPr>
+                      <w:rFonts w:ascii="Cambria Math" w:hAnsi="Cambria Math"/>
+                    </w:rPr>
+                  </m:ctrlPr>
+                </m:dPr>
+                <m:e>
+                  <m:r>
+                    <w:rPr>
+                      <w:rFonts w:ascii="Cambria Math" w:hAnsi="Cambria Math"/>
+                    </w:rPr>
+                    <m:t>h(π·X)</m:t>
+                  </m:r>
+                </m:e>
+              </m:d>
+            </m:e>
+            <m:sub>
+              <m:r>
+                <w:rPr>
+                  <w:rFonts w:ascii="Cambria Math" w:hAnsi="Cambria Math"/>
+                </w:rPr>
+                <m:t>j</m:t>
+              </m:r>
+            </m:sub>
+          </m:sSub>
+          <m:r>
+            <w:rPr>
+              <w:rFonts w:ascii="Cambria Math" w:hAnsi="Cambria Math"/>
+            </w:rPr>
+            <m:t>.</m:t>
+          </m:r>
+        </m:oMath>
+      </m:oMathPara>
+    </w:p>
+    <w:p>
+      <w:r>
+        <w:rPr>
+          <w:rtl/>
+        </w:rPr>
+        <w:t>כאשר תת־הקבוצה אחידה ובגודל קבוע, ללא החזרה, נוסחת השונות של אומד מונטה־קרלו היא</w:t>
+      </w:r>
+    </w:p>
+    <w:p>
+      <w:pPr>
+        <w:bidi w:val="0"/>
+        <w:spacing w:before="60" w:after="60"/>
+        <w:jc w:val="center"/>
+      </w:pPr>
+      <m:oMathPara>
+        <m:oMathParaPr>
+          <m:jc m:val="center"/>
+        </m:oMathParaPr>
+        <m:oMath>
+          <m:r>
+            <m:rPr>
+              <m:nor/>
+            </m:rPr>
+            <m:t>Var</m:t>
+          </m:r>
+          <m:r>
+            <w:rPr>
+              <w:rFonts w:ascii="Cambria Math" w:hAnsi="Cambria Math"/>
+            </w:rPr>
+            <m:t>(</m:t>
+          </m:r>
+          <m:sSub>
+            <m:sSubPr>
+              <m:ctrlPr>
+                <w:rPr>
+                  <w:rFonts w:ascii="Cambria Math" w:hAnsi="Cambria Math"/>
+                </w:rPr>
+              </m:ctrlPr>
+            </m:sSubPr>
+            <m:e>
+              <m:d>
+                <m:dPr>
+                  <m:begChr m:val="["/>
+                  <m:endChr m:val="]"/>
+                  <m:ctrlPr>
+                    <w:rPr>
+                      <w:rFonts w:ascii="Cambria Math" w:hAnsi="Cambria Math"/>
+                    </w:rPr>
+                  </m:ctrlPr>
+                </m:dPr>
+                <m:e>
+                  <m:sSub>
+                    <m:sSubPr>
+                      <m:ctrlPr>
+                        <w:rPr>
+                          <w:rFonts w:ascii="Cambria Math" w:hAnsi="Cambria Math"/>
+                        </w:rPr>
+                      </m:ctrlPr>
+                    </m:sSubPr>
+                    <m:e>
+                      <m:r>
+                        <w:rPr>
+                          <w:rFonts w:ascii="Cambria Math" w:hAnsi="Cambria Math"/>
+                        </w:rPr>
+                        <m:t>F</m:t>
+                      </m:r>
+                    </m:e>
+                    <m:sub>
+                      <m:r>
+                        <w:rPr>
+                          <w:rFonts w:ascii="Cambria Math" w:hAnsi="Cambria Math"/>
+                        </w:rPr>
+                        <m:t>P</m:t>
+                      </m:r>
+                    </m:sub>
+                  </m:sSub>
+                  <m:r>
+                    <w:rPr>
+                      <w:rFonts w:ascii="Cambria Math" w:hAnsi="Cambria Math"/>
+                    </w:rPr>
+                    <m:t>(σ·X)-</m:t>
+                  </m:r>
+                  <m:sSub>
+                    <m:sSubPr>
+                      <m:ctrlPr>
+                        <w:rPr>
+                          <w:rFonts w:ascii="Cambria Math" w:hAnsi="Cambria Math"/>
+                        </w:rPr>
+                      </m:ctrlPr>
+                    </m:sSubPr>
+                    <m:e>
+                      <m:r>
+                        <w:rPr>
+                          <w:rFonts w:ascii="Cambria Math" w:hAnsi="Cambria Math"/>
+                        </w:rPr>
+                        <m:t>F</m:t>
+                      </m:r>
+                    </m:e>
+                    <m:sub>
+                      <m:r>
+                        <w:rPr>
+                          <w:rFonts w:ascii="Cambria Math" w:hAnsi="Cambria Math"/>
+                        </w:rPr>
+                        <m:t>P</m:t>
+                      </m:r>
+                    </m:sub>
+                  </m:sSub>
+                  <m:r>
+                    <w:rPr>
+                      <w:rFonts w:ascii="Cambria Math" w:hAnsi="Cambria Math"/>
+                    </w:rPr>
+                    <m:t>(X)</m:t>
+                  </m:r>
+                </m:e>
+              </m:d>
+            </m:e>
+            <m:sub>
+              <m:r>
+                <w:rPr>
+                  <w:rFonts w:ascii="Cambria Math" w:hAnsi="Cambria Math"/>
+                </w:rPr>
+                <m:t>j</m:t>
+              </m:r>
+            </m:sub>
+          </m:sSub>
+          <m:r>
+            <w:rPr>
+              <w:rFonts w:ascii="Cambria Math" w:hAnsi="Cambria Math"/>
+            </w:rPr>
+            <m:t>)=</m:t>
+          </m:r>
+          <m:f>
+            <m:fPr>
+              <m:ctrlPr>
+                <w:rPr>
+                  <w:rFonts w:ascii="Cambria Math" w:hAnsi="Cambria Math"/>
+                </w:rPr>
+              </m:ctrlPr>
+            </m:fPr>
+            <m:num>
+              <m:r>
+                <w:rPr>
+                  <w:rFonts w:ascii="Cambria Math" w:hAnsi="Cambria Math"/>
+                </w:rPr>
+                <m:t>N-B</m:t>
+              </m:r>
+            </m:num>
+            <m:den>
+              <m:r>
+                <w:rPr>
+                  <w:rFonts w:ascii="Cambria Math" w:hAnsi="Cambria Math"/>
+                </w:rPr>
+                <m:t>B(N-1)</m:t>
+              </m:r>
+            </m:den>
+          </m:f>
+          <m:sSubSup>
+            <m:sSubSupPr>
+              <m:ctrlPr>
+                <w:rPr>
+                  <w:rFonts w:ascii="Cambria Math" w:hAnsi="Cambria Math"/>
+                </w:rPr>
+              </m:ctrlPr>
+            </m:sSubSupPr>
+            <m:e>
+              <m:r>
+                <w:rPr>
+                  <w:rFonts w:ascii="Cambria Math" w:hAnsi="Cambria Math"/>
+                </w:rPr>
+                <m:t>s</m:t>
+              </m:r>
+            </m:e>
+            <m:sub>
+              <m:r>
+                <w:rPr>
+                  <w:rFonts w:ascii="Cambria Math" w:hAnsi="Cambria Math"/>
+                </w:rPr>
+                <m:t>Δ,j</m:t>
+              </m:r>
+            </m:sub>
+            <m:sup>
+              <m:r>
+                <w:rPr>
+                  <w:rFonts w:ascii="Cambria Math" w:hAnsi="Cambria Math"/>
+                </w:rPr>
+                <m:t>2</m:t>
+              </m:r>
+            </m:sup>
+          </m:sSubSup>
+          <m:r>
+            <w:rPr>
+              <w:rFonts w:ascii="Cambria Math" w:hAnsi="Cambria Math"/>
+            </w:rPr>
+            <m:t>.</m:t>
+          </m:r>
+        </m:oMath>
+      </m:oMathPara>
+    </w:p>
+    <w:p>
+      <w:r>
+        <w:rPr>
+          <w:rtl/>
+        </w:rPr>
+        <w:t>כאשר המקדם בצד ימין הוא תיקון האוכלוסייה הסופית, ו-</w:t>
+      </w:r>
+      <m:oMath>
+        <m:sSubSup>
+          <m:sSubSupPr>
+            <m:ctrlPr>
+              <w:rPr>
+                <w:rFonts w:ascii="Cambria Math" w:hAnsi="Cambria Math"/>
+              </w:rPr>
+            </m:ctrlPr>
+          </m:sSubSupPr>
+          <m:e>
+            <m:r>
+              <w:rPr>
+                <w:rFonts w:ascii="Cambria Math" w:hAnsi="Cambria Math"/>
+              </w:rPr>
+              <m:t>s</m:t>
+            </m:r>
+          </m:e>
+          <m:sub>
+            <m:r>
+              <w:rPr>
+                <w:rFonts w:ascii="Cambria Math" w:hAnsi="Cambria Math"/>
+              </w:rPr>
+              <m:t>Δ,j</m:t>
+            </m:r>
+          </m:sub>
+          <m:sup>
+            <m:r>
+              <w:rPr>
+                <w:rFonts w:ascii="Cambria Math" w:hAnsi="Cambria Math"/>
+              </w:rPr>
+              <m:t>2</m:t>
+            </m:r>
+          </m:sup>
+        </m:sSubSup>
+      </m:oMath>
+      <w:r>
+        <w:rPr>
+          <w:rtl/>
+        </w:rPr>
+        <w:t xml:space="preserve"> היא שונות האוכלוסייה של הפרשי הפלט. את המקדם המתאים לאחוזון 95% של השגיאה המרבית בארבע קואורדינטות הפלט כיילנו בהרצות המקדימות, וקיבלנו </w:t>
+      </w:r>
+      <m:oMath>
+        <m:sSub>
+          <m:sSubPr>
+            <m:ctrlPr>
+              <w:rPr>
+                <w:rFonts w:ascii="Cambria Math" w:hAnsi="Cambria Math"/>
+              </w:rPr>
+            </m:ctrlPr>
+          </m:sSubPr>
+          <m:e>
+            <m:r>
+              <w:rPr>
+                <w:rFonts w:ascii="Cambria Math" w:hAnsi="Cambria Math"/>
+              </w:rPr>
+              <m:t>C</m:t>
+            </m:r>
+          </m:e>
+          <m:sub>
+            <m:r>
+              <w:rPr>
+                <w:rFonts w:ascii="Cambria Math" w:hAnsi="Cambria Math"/>
+              </w:rPr>
+              <m:t>0.95</m:t>
+            </m:r>
+          </m:sub>
+        </m:sSub>
+        <m:r>
+          <w:rPr>
+            <w:rFonts w:ascii="Cambria Math" w:hAnsi="Cambria Math"/>
+          </w:rPr>
+          <m:t>≈0.761</m:t>
+        </m:r>
+      </m:oMath>
+      <w:r>
+        <w:rPr>
+          <w:rtl/>
+        </w:rPr>
+        <w:t>. לכן אומדן השגיאה הוא</w:t>
+      </w:r>
+    </w:p>
+    <w:p>
+      <w:pPr>
+        <w:bidi w:val="0"/>
+        <w:spacing w:before="60" w:after="60"/>
+        <w:jc w:val="center"/>
+      </w:pPr>
+      <m:oMathPara>
+        <m:oMathParaPr>
+          <m:jc m:val="center"/>
+        </m:oMathParaPr>
+        <m:oMath>
+          <m:sSub>
+            <m:sSubPr>
+              <m:ctrlPr>
+                <w:rPr>
+                  <w:rFonts w:ascii="Cambria Math" w:hAnsi="Cambria Math"/>
+                </w:rPr>
+              </m:ctrlPr>
+            </m:sSubPr>
+            <m:e>
+              <m:r>
+                <w:rPr>
+                  <w:rFonts w:ascii="Cambria Math" w:hAnsi="Cambria Math"/>
+                </w:rPr>
+                <m:t>E</m:t>
+              </m:r>
+            </m:e>
+            <m:sub>
+              <m:r>
+                <w:rPr>
+                  <w:rFonts w:ascii="Cambria Math" w:hAnsi="Cambria Math"/>
+                </w:rPr>
+                <m:t>0.95</m:t>
+              </m:r>
+            </m:sub>
+          </m:sSub>
+          <m:r>
+            <w:rPr>
+              <w:rFonts w:ascii="Cambria Math" w:hAnsi="Cambria Math"/>
+            </w:rPr>
+            <m:t>(B)≈0.761</m:t>
+          </m:r>
+          <m:rad>
+            <m:radPr>
+              <m:degHide m:val="1"/>
+              <m:ctrlPr>
+                <w:rPr>
+                  <w:rFonts w:ascii="Cambria Math" w:hAnsi="Cambria Math"/>
+                </w:rPr>
+              </m:ctrlPr>
+            </m:radPr>
+            <m:deg/>
+            <m:e>
+              <m:f>
+                <m:fPr>
+                  <m:ctrlPr>
+                    <w:rPr>
+                      <w:rFonts w:ascii="Cambria Math" w:hAnsi="Cambria Math"/>
+                    </w:rPr>
+                  </m:ctrlPr>
+                </m:fPr>
+                <m:num>
+                  <m:r>
+                    <w:rPr>
+                      <w:rFonts w:ascii="Cambria Math" w:hAnsi="Cambria Math"/>
+                    </w:rPr>
+                    <m:t>5040-B</m:t>
+                  </m:r>
+                </m:num>
+                <m:den>
+                  <m:r>
+                    <w:rPr>
+                      <w:rFonts w:ascii="Cambria Math" w:hAnsi="Cambria Math"/>
+                    </w:rPr>
+                    <m:t>B·5039</m:t>
+                  </m:r>
+                </m:den>
+              </m:f>
+            </m:e>
+          </m:rad>
+          <m:r>
+            <w:rPr>
+              <w:rFonts w:ascii="Cambria Math" w:hAnsi="Cambria Math"/>
+            </w:rPr>
+            <m:t>.</m:t>
+          </m:r>
+        </m:oMath>
+      </m:oMathPara>
+    </w:p>
+    <w:p>
+      <w:r>
+        <w:rPr>
+          <w:rtl/>
+        </w:rPr>
+        <w:t>כדי להתאים לסף המוחלט שנבחר, נדרוש</w:t>
+      </w:r>
+    </w:p>
+    <w:p>
+      <w:pPr>
+        <w:bidi w:val="0"/>
+        <w:spacing w:before="60" w:after="60"/>
+        <w:jc w:val="center"/>
+      </w:pPr>
+      <m:oMathPara>
+        <m:oMathParaPr>
+          <m:jc m:val="center"/>
+        </m:oMathParaPr>
+        <m:oMath>
+          <m:r>
+            <w:rPr>
+              <w:rFonts w:ascii="Cambria Math" w:hAnsi="Cambria Math"/>
+            </w:rPr>
+            <m:t>0.761</m:t>
+          </m:r>
+          <m:rad>
+            <m:radPr>
+              <m:degHide m:val="1"/>
+              <m:ctrlPr>
+                <w:rPr>
+                  <w:rFonts w:ascii="Cambria Math" w:hAnsi="Cambria Math"/>
+                </w:rPr>
+              </m:ctrlPr>
+            </m:radPr>
+            <m:deg/>
+            <m:e>
+              <m:f>
+                <m:fPr>
+                  <m:ctrlPr>
+                    <w:rPr>
+                      <w:rFonts w:ascii="Cambria Math" w:hAnsi="Cambria Math"/>
+                    </w:rPr>
+                  </m:ctrlPr>
+                </m:fPr>
+                <m:num>
+                  <m:r>
+                    <w:rPr>
+                      <w:rFonts w:ascii="Cambria Math" w:hAnsi="Cambria Math"/>
+                    </w:rPr>
+                    <m:t>5040-B</m:t>
+                  </m:r>
+                </m:num>
+                <m:den>
+                  <m:r>
+                    <w:rPr>
+                      <w:rFonts w:ascii="Cambria Math" w:hAnsi="Cambria Math"/>
+                    </w:rPr>
+                    <m:t>B·5039</m:t>
+                  </m:r>
+                </m:den>
+              </m:f>
+            </m:e>
+          </m:rad>
+          <m:r>
+            <w:rPr>
+              <w:rFonts w:ascii="Cambria Math" w:hAnsi="Cambria Math"/>
+            </w:rPr>
+            <m:t>≤</m:t>
+          </m:r>
+          <m:sSup>
+            <m:sSupPr>
+              <m:ctrlPr>
+                <w:rPr>
+                  <w:rFonts w:ascii="Cambria Math" w:hAnsi="Cambria Math"/>
+                </w:rPr>
+              </m:ctrlPr>
+            </m:sSupPr>
+            <m:e>
+              <m:r>
+                <w:rPr>
+                  <w:rFonts w:ascii="Cambria Math" w:hAnsi="Cambria Math"/>
+                </w:rPr>
+                <m:t>10</m:t>
+              </m:r>
+            </m:e>
+            <m:sup>
+              <m:r>
+                <w:rPr>
+                  <w:rFonts w:ascii="Cambria Math" w:hAnsi="Cambria Math"/>
+                </w:rPr>
+                <m:t>-2</m:t>
+              </m:r>
+            </m:sup>
+          </m:sSup>
+          <m:r>
+            <w:rPr>
+              <w:rFonts w:ascii="Cambria Math" w:hAnsi="Cambria Math"/>
+            </w:rPr>
+            <m:t>.</m:t>
+          </m:r>
+        </m:oMath>
+      </m:oMathPara>
+    </w:p>
+    <w:p>
+      <w:r>
+        <w:rPr>
+          <w:rtl/>
+        </w:rPr>
+        <w:t>פתרון האי־שוויון נותן</w:t>
+      </w:r>
+    </w:p>
+    <w:p>
+      <w:pPr>
+        <w:bidi w:val="0"/>
+        <w:spacing w:before="60" w:after="60"/>
+        <w:jc w:val="center"/>
+      </w:pPr>
+      <m:oMathPara>
+        <m:oMathParaPr>
+          <m:jc m:val="center"/>
+        </m:oMathParaPr>
+        <m:oMath>
+          <m:r>
+            <w:rPr>
+              <w:rFonts w:ascii="Cambria Math" w:hAnsi="Cambria Math"/>
+            </w:rPr>
+            <m:t>B≥</m:t>
+          </m:r>
+          <m:f>
+            <m:fPr>
+              <m:ctrlPr>
+                <w:rPr>
+                  <w:rFonts w:ascii="Cambria Math" w:hAnsi="Cambria Math"/>
+                </w:rPr>
+              </m:ctrlPr>
+            </m:fPr>
+            <m:num>
+              <m:r>
+                <w:rPr>
+                  <w:rFonts w:ascii="Cambria Math" w:hAnsi="Cambria Math"/>
+                </w:rPr>
+                <m:t>5040</m:t>
+              </m:r>
+            </m:num>
+            <m:den>
+              <m:r>
+                <w:rPr>
+                  <w:rFonts w:ascii="Cambria Math" w:hAnsi="Cambria Math"/>
+                </w:rPr>
+                <m:t>1+</m:t>
+              </m:r>
+              <m:sSup>
+                <m:sSupPr>
+                  <m:ctrlPr>
+                    <w:rPr>
+                      <w:rFonts w:ascii="Cambria Math" w:hAnsi="Cambria Math"/>
+                    </w:rPr>
+                  </m:ctrlPr>
+                </m:sSupPr>
+                <m:e>
+                  <m:d>
+                    <m:dPr>
+                      <m:ctrlPr>
+                        <w:rPr>
+                          <w:rFonts w:ascii="Cambria Math" w:hAnsi="Cambria Math"/>
+                        </w:rPr>
+                      </m:ctrlPr>
+                    </m:dPr>
+                    <m:e>
+                      <m:f>
+                        <m:fPr>
+                          <m:ctrlPr>
+                            <w:rPr>
+                              <w:rFonts w:ascii="Cambria Math" w:hAnsi="Cambria Math"/>
+                            </w:rPr>
+                          </m:ctrlPr>
+                        </m:fPr>
+                        <m:num>
+                          <m:sSup>
+                            <m:sSupPr>
+                              <m:ctrlPr>
+                                <w:rPr>
+                                  <w:rFonts w:ascii="Cambria Math" w:hAnsi="Cambria Math"/>
+                                </w:rPr>
+                              </m:ctrlPr>
+                            </m:sSupPr>
+                            <m:e>
+                              <m:r>
+                                <w:rPr>
+                                  <w:rFonts w:ascii="Cambria Math" w:hAnsi="Cambria Math"/>
+                                </w:rPr>
+                                <m:t>10</m:t>
+                              </m:r>
+                            </m:e>
+                            <m:sup>
+                              <m:r>
+                                <w:rPr>
+                                  <w:rFonts w:ascii="Cambria Math" w:hAnsi="Cambria Math"/>
+                                </w:rPr>
+                                <m:t>-2</m:t>
+                              </m:r>
+                            </m:sup>
+                          </m:sSup>
+                        </m:num>
+                        <m:den>
+                          <m:r>
+                            <w:rPr>
+                              <w:rFonts w:ascii="Cambria Math" w:hAnsi="Cambria Math"/>
+                            </w:rPr>
+                            <m:t>0.761</m:t>
+                          </m:r>
+                        </m:den>
+                      </m:f>
+                    </m:e>
+                  </m:d>
+                </m:e>
+                <m:sup>
+                  <m:r>
+                    <w:rPr>
+                      <w:rFonts w:ascii="Cambria Math" w:hAnsi="Cambria Math"/>
+                    </w:rPr>
+                    <m:t>2</m:t>
+                  </m:r>
+                </m:sup>
+              </m:sSup>
+              <m:r>
+                <w:rPr>
+                  <w:rFonts w:ascii="Cambria Math" w:hAnsi="Cambria Math"/>
+                </w:rPr>
+                <m:t>·5039</m:t>
+              </m:r>
+            </m:den>
+          </m:f>
+          <m:r>
+            <w:rPr>
+              <w:rFonts w:ascii="Cambria Math" w:hAnsi="Cambria Math"/>
+            </w:rPr>
+            <m:t>≈2695.3.</m:t>
+          </m:r>
+        </m:oMath>
+      </m:oMathPara>
+    </w:p>
+    <w:p>
+      <w:r>
+        <w:rPr>
+          <w:rtl/>
+        </w:rPr>
+        <w:t xml:space="preserve">לכן הגודל השלם המינימלי המוערך הוא 2696, ובחרנו בערך העגול </w:t>
+      </w:r>
+      <m:oMath>
+        <m:r>
+          <w:rPr>
+            <w:rFonts w:ascii="Cambria Math" w:hAnsi="Cambria Math"/>
+          </w:rPr>
+          <m:t>B=2700</m:t>
+        </m:r>
+      </m:oMath>
+      <w:r>
+        <w:rPr>
+          <w:rtl/>
+        </w:rPr>
+        <w:t>. עבור ערך זה נוסחת מונטה־קרלו חוזה שגיאת אחוזון 95% של כ-</w:t>
+      </w:r>
+      <m:oMath>
+        <m:r>
+          <w:rPr>
+            <w:rFonts w:ascii="Cambria Math" w:hAnsi="Cambria Math"/>
+          </w:rPr>
+          <m:t>9.98·</m:t>
+        </m:r>
+        <m:sSup>
+          <m:sSupPr>
+            <m:ctrlPr>
+              <w:rPr>
+                <w:rFonts w:ascii="Cambria Math" w:hAnsi="Cambria Math"/>
+              </w:rPr>
+            </m:ctrlPr>
+          </m:sSupPr>
+          <m:e>
+            <m:r>
+              <w:rPr>
+                <w:rFonts w:ascii="Cambria Math" w:hAnsi="Cambria Math"/>
+              </w:rPr>
+              <m:t>10</m:t>
+            </m:r>
+          </m:e>
+          <m:sup>
+            <m:r>
+              <w:rPr>
+                <w:rFonts w:ascii="Cambria Math" w:hAnsi="Cambria Math"/>
+              </w:rPr>
+              <m:t>-3</m:t>
+            </m:r>
+          </m:sup>
+        </m:sSup>
+      </m:oMath>
+      <w:r>
+        <w:rPr>
+          <w:rtl/>
+        </w:rPr>
+        <w:t>.</w:t>
+      </w:r>
+    </w:p>
+    <w:p>
+      <w:r>
+        <w:rPr>
+          <w:rtl/>
+        </w:rPr>
+        <w:t>במימוש השתמשנו ב-</w:t>
+      </w:r>
+      <m:oMath>
+        <m:r>
+          <w:rPr>
+            <w:rFonts w:ascii="Cambria Math" w:hAnsi="Cambria Math"/>
+          </w:rPr>
+          <m:t>n=7,d=3,p=4,m=32</m:t>
+        </m:r>
+      </m:oMath>
+      <w:r>
+        <w:rPr>
+          <w:rtl/>
+        </w:rPr>
+        <w:t xml:space="preserve"> וב-</w:t>
+      </w:r>
+      <m:oMath>
+        <m:r>
+          <m:rPr>
+            <m:nor/>
+          </m:rPr>
+          <m:t>seed</m:t>
+        </m:r>
+        <m:r>
+          <w:rPr>
+            <w:rFonts w:ascii="Cambria Math" w:hAnsi="Cambria Math"/>
+          </w:rPr>
+          <m:t>=2319</m:t>
+        </m:r>
+      </m:oMath>
+      <w:r>
+        <w:rPr>
+          <w:rtl/>
+        </w:rPr>
+        <w:t>. מאחר ש-</w:t>
+      </w:r>
+      <m:oMath>
+        <m:f>
+          <m:fPr>
+            <m:ctrlPr>
+              <w:rPr>
+                <w:rFonts w:ascii="Cambria Math" w:hAnsi="Cambria Math"/>
+              </w:rPr>
+            </m:ctrlPr>
+          </m:fPr>
+          <m:num>
+            <m:r>
+              <w:rPr>
+                <w:rFonts w:ascii="Cambria Math" w:hAnsi="Cambria Math"/>
+              </w:rPr>
+              <m:t>B</m:t>
+            </m:r>
+          </m:num>
+          <m:den>
+            <m:d>
+              <m:dPr>
+                <m:begChr m:val="|"/>
+                <m:endChr m:val="|"/>
+                <m:ctrlPr>
+                  <w:rPr>
+                    <w:rFonts w:ascii="Cambria Math" w:hAnsi="Cambria Math"/>
+                  </w:rPr>
+                </m:ctrlPr>
+              </m:dPr>
+              <m:e>
+                <m:r>
+                  <w:rPr>
+                    <w:rFonts w:ascii="Cambria Math" w:hAnsi="Cambria Math"/>
+                  </w:rPr>
+                  <m:t>G</m:t>
+                </m:r>
+              </m:e>
+            </m:d>
+          </m:den>
+        </m:f>
+        <m:r>
+          <w:rPr>
+            <w:rFonts w:ascii="Cambria Math" w:hAnsi="Cambria Math"/>
+          </w:rPr>
+          <m:t>=</m:t>
+        </m:r>
+        <m:f>
+          <m:fPr>
+            <m:ctrlPr>
+              <w:rPr>
+                <w:rFonts w:ascii="Cambria Math" w:hAnsi="Cambria Math"/>
+              </w:rPr>
+            </m:ctrlPr>
+          </m:fPr>
+          <m:num>
+            <m:r>
+              <w:rPr>
+                <w:rFonts w:ascii="Cambria Math" w:hAnsi="Cambria Math"/>
+              </w:rPr>
+              <m:t>2700</m:t>
+            </m:r>
+          </m:num>
+          <m:den>
+            <m:r>
+              <w:rPr>
+                <w:rFonts w:ascii="Cambria Math" w:hAnsi="Cambria Math"/>
+              </w:rPr>
+              <m:t>5040</m:t>
+            </m:r>
+          </m:den>
+        </m:f>
+        <m:r>
+          <w:rPr>
+            <w:rFonts w:ascii="Cambria Math" w:hAnsi="Cambria Math"/>
+          </w:rPr>
+          <m:t>≈0.536</m:t>
+        </m:r>
+      </m:oMath>
+      <w:r>
+        <w:rPr>
+          <w:rtl/>
+        </w:rPr>
+        <w:t xml:space="preserve">, מתקבלת הפחתה חישובית של פי </w:t>
+      </w:r>
+      <m:oMath>
+        <m:f>
+          <m:fPr>
+            <m:ctrlPr>
+              <w:rPr>
+                <w:rFonts w:ascii="Cambria Math" w:hAnsi="Cambria Math"/>
+              </w:rPr>
+            </m:ctrlPr>
+          </m:fPr>
+          <m:num>
+            <m:d>
+              <m:dPr>
+                <m:begChr m:val="|"/>
+                <m:endChr m:val="|"/>
+                <m:ctrlPr>
+                  <w:rPr>
+                    <w:rFonts w:ascii="Cambria Math" w:hAnsi="Cambria Math"/>
+                  </w:rPr>
+                </m:ctrlPr>
+              </m:dPr>
+              <m:e>
+                <m:r>
+                  <w:rPr>
+                    <w:rFonts w:ascii="Cambria Math" w:hAnsi="Cambria Math"/>
+                  </w:rPr>
+                  <m:t>G</m:t>
+                </m:r>
+              </m:e>
+            </m:d>
+          </m:num>
+          <m:den>
+            <m:r>
+              <w:rPr>
+                <w:rFonts w:ascii="Cambria Math" w:hAnsi="Cambria Math"/>
+              </w:rPr>
+              <m:t>B</m:t>
+            </m:r>
+          </m:den>
+        </m:f>
+        <m:r>
+          <w:rPr>
+            <w:rFonts w:ascii="Cambria Math" w:hAnsi="Cambria Math"/>
+          </w:rPr>
+          <m:t>=1.87</m:t>
+        </m:r>
+      </m:oMath>
+      <w:r>
+        <w:rPr>
+          <w:rtl/>
+        </w:rPr>
+        <w:t xml:space="preserve"> ביחס למיצוע המלא.</w:t>
+      </w:r>
+    </w:p>
+    <w:p>
+      <w:r>
+        <w:rPr>
+          <w:rtl/>
+        </w:rPr>
+        <w:t>לצורך הבדיקה דגמנו קלט גאוסי ופרמוטציה אקראית, וחישבנו את שני הפלטים באמצעות אותה תת־קבוצה קבועה. תנאי ההצלחה שנבחר הוא</w:t>
+      </w:r>
+    </w:p>
+    <w:p>
+      <w:pPr>
+        <w:bidi w:val="0"/>
+        <w:spacing w:before="60" w:after="60"/>
+        <w:jc w:val="center"/>
+      </w:pPr>
+      <m:oMathPara>
+        <m:oMathParaPr>
+          <m:jc m:val="center"/>
+        </m:oMathParaPr>
+        <m:oMath>
+          <m:limLow>
+            <m:limLowPr>
+              <m:ctrlPr>
+                <w:rPr>
+                  <w:rFonts w:ascii="Cambria Math" w:hAnsi="Cambria Math"/>
+                </w:rPr>
+              </m:ctrlPr>
+            </m:limLowPr>
+            <m:e>
+              <m:r>
+                <w:rPr>
+                  <w:rFonts w:ascii="Cambria Math" w:hAnsi="Cambria Math"/>
+                </w:rPr>
+                <m:t>max</m:t>
+              </m:r>
+            </m:e>
+            <m:lim>
+              <m:r>
+                <w:rPr>
+                  <w:rFonts w:ascii="Cambria Math" w:hAnsi="Cambria Math"/>
+                </w:rPr>
+                <m:t>1≤j≤4</m:t>
+              </m:r>
+            </m:lim>
+          </m:limLow>
+          <m:r>
+            <w:rPr>
+              <w:rFonts w:ascii="Cambria Math" w:hAnsi="Cambria Math"/>
+            </w:rPr>
+            <m:t>|</m:t>
+          </m:r>
+          <m:sSub>
+            <m:sSubPr>
+              <m:ctrlPr>
+                <w:rPr>
+                  <w:rFonts w:ascii="Cambria Math" w:hAnsi="Cambria Math"/>
+                </w:rPr>
+              </m:ctrlPr>
+            </m:sSubPr>
+            <m:e>
+              <m:d>
+                <m:dPr>
+                  <m:begChr m:val="["/>
+                  <m:endChr m:val="]"/>
+                  <m:ctrlPr>
+                    <w:rPr>
+                      <w:rFonts w:ascii="Cambria Math" w:hAnsi="Cambria Math"/>
+                    </w:rPr>
+                  </m:ctrlPr>
+                </m:dPr>
+                <m:e>
+                  <m:sSub>
+                    <m:sSubPr>
+                      <m:ctrlPr>
+                        <w:rPr>
+                          <w:rFonts w:ascii="Cambria Math" w:hAnsi="Cambria Math"/>
+                        </w:rPr>
+                      </m:ctrlPr>
+                    </m:sSubPr>
+                    <m:e>
+                      <m:r>
+                        <w:rPr>
+                          <w:rFonts w:ascii="Cambria Math" w:hAnsi="Cambria Math"/>
+                        </w:rPr>
+                        <m:t>F</m:t>
+                      </m:r>
+                    </m:e>
+                    <m:sub>
+                      <m:r>
+                        <w:rPr>
+                          <w:rFonts w:ascii="Cambria Math" w:hAnsi="Cambria Math"/>
+                        </w:rPr>
+                        <m:t>P</m:t>
+                      </m:r>
+                    </m:sub>
+                  </m:sSub>
+                  <m:r>
+                    <w:rPr>
+                      <w:rFonts w:ascii="Cambria Math" w:hAnsi="Cambria Math"/>
+                    </w:rPr>
+                    <m:t>(σ·X)</m:t>
+                  </m:r>
+                </m:e>
+              </m:d>
+            </m:e>
+            <m:sub>
+              <m:r>
+                <w:rPr>
+                  <w:rFonts w:ascii="Cambria Math" w:hAnsi="Cambria Math"/>
+                </w:rPr>
+                <m:t>j</m:t>
+              </m:r>
+            </m:sub>
+          </m:sSub>
+          <m:r>
+            <w:rPr>
+              <w:rFonts w:ascii="Cambria Math" w:hAnsi="Cambria Math"/>
+            </w:rPr>
+            <m:t>-</m:t>
+          </m:r>
+          <m:sSub>
+            <m:sSubPr>
+              <m:ctrlPr>
+                <w:rPr>
+                  <w:rFonts w:ascii="Cambria Math" w:hAnsi="Cambria Math"/>
+                </w:rPr>
+              </m:ctrlPr>
+            </m:sSubPr>
+            <m:e>
+              <m:d>
+                <m:dPr>
+                  <m:begChr m:val="["/>
+                  <m:endChr m:val="]"/>
+                  <m:ctrlPr>
+                    <w:rPr>
+                      <w:rFonts w:ascii="Cambria Math" w:hAnsi="Cambria Math"/>
+                    </w:rPr>
+                  </m:ctrlPr>
+                </m:dPr>
+                <m:e>
+                  <m:sSub>
+                    <m:sSubPr>
+                      <m:ctrlPr>
+                        <w:rPr>
+                          <w:rFonts w:ascii="Cambria Math" w:hAnsi="Cambria Math"/>
+                        </w:rPr>
+                      </m:ctrlPr>
+                    </m:sSubPr>
+                    <m:e>
+                      <m:r>
+                        <w:rPr>
+                          <w:rFonts w:ascii="Cambria Math" w:hAnsi="Cambria Math"/>
+                        </w:rPr>
+                        <m:t>F</m:t>
+                      </m:r>
+                    </m:e>
+                    <m:sub>
+                      <m:r>
+                        <w:rPr>
+                          <w:rFonts w:ascii="Cambria Math" w:hAnsi="Cambria Math"/>
+                        </w:rPr>
+                        <m:t>P</m:t>
+                      </m:r>
+                    </m:sub>
+                  </m:sSub>
+                  <m:r>
+                    <w:rPr>
+                      <w:rFonts w:ascii="Cambria Math" w:hAnsi="Cambria Math"/>
+                    </w:rPr>
+                    <m:t>(X)</m:t>
+                  </m:r>
+                </m:e>
+              </m:d>
+            </m:e>
+            <m:sub>
+              <m:r>
+                <w:rPr>
+                  <w:rFonts w:ascii="Cambria Math" w:hAnsi="Cambria Math"/>
+                </w:rPr>
+                <m:t>j</m:t>
+              </m:r>
+            </m:sub>
+          </m:sSub>
+          <m:r>
+            <w:rPr>
+              <w:rFonts w:ascii="Cambria Math" w:hAnsi="Cambria Math"/>
+            </w:rPr>
+            <m:t>|≤</m:t>
+          </m:r>
+          <m:sSup>
+            <m:sSupPr>
+              <m:ctrlPr>
+                <w:rPr>
+                  <w:rFonts w:ascii="Cambria Math" w:hAnsi="Cambria Math"/>
+                </w:rPr>
+              </m:ctrlPr>
+            </m:sSupPr>
+            <m:e>
+              <m:r>
+                <w:rPr>
+                  <w:rFonts w:ascii="Cambria Math" w:hAnsi="Cambria Math"/>
+                </w:rPr>
+                <m:t>10</m:t>
+              </m:r>
+            </m:e>
+            <m:sup>
+              <m:r>
+                <w:rPr>
+                  <w:rFonts w:ascii="Cambria Math" w:hAnsi="Cambria Math"/>
+                </w:rPr>
+                <m:t>-2</m:t>
+              </m:r>
+            </m:sup>
+          </m:sSup>
+          <m:r>
+            <w:rPr>
+              <w:rFonts w:ascii="Cambria Math" w:hAnsi="Cambria Math"/>
+            </w:rPr>
+            <m:t>.</m:t>
+          </m:r>
+        </m:oMath>
+      </m:oMathPara>
+    </w:p>
+    <w:p>
+      <w:r>
+        <w:rPr>
+          <w:rtl/>
+        </w:rPr>
+        <w:t>ההפרש המוחלט המרבי שהתקבל היה</w:t>
+      </w:r>
+    </w:p>
+    <w:p>
+      <w:pPr>
+        <w:bidi w:val="0"/>
+        <w:spacing w:before="60" w:after="60"/>
+        <w:jc w:val="center"/>
+      </w:pPr>
+      <m:oMathPara>
+        <m:oMathParaPr>
+          <m:jc m:val="center"/>
+        </m:oMathParaPr>
+        <m:oMath>
+          <m:r>
+            <w:rPr>
+              <w:rFonts w:ascii="Cambria Math" w:hAnsi="Cambria Math"/>
+            </w:rPr>
+            <m:t>0.00699985&lt;</m:t>
+          </m:r>
+          <m:sSup>
+            <m:sSupPr>
+              <m:ctrlPr>
+                <w:rPr>
+                  <w:rFonts w:ascii="Cambria Math" w:hAnsi="Cambria Math"/>
+                </w:rPr>
+              </m:ctrlPr>
+            </m:sSupPr>
+            <m:e>
+              <m:r>
+                <w:rPr>
+                  <w:rFonts w:ascii="Cambria Math" w:hAnsi="Cambria Math"/>
+                </w:rPr>
+                <m:t>10</m:t>
+              </m:r>
+            </m:e>
+            <m:sup>
+              <m:r>
+                <w:rPr>
+                  <w:rFonts w:ascii="Cambria Math" w:hAnsi="Cambria Math"/>
+                </w:rPr>
+                <m:t>-2</m:t>
+              </m:r>
+            </m:sup>
+          </m:sSup>
+          <m:r>
+            <w:rPr>
+              <w:rFonts w:ascii="Cambria Math" w:hAnsi="Cambria Math"/>
+            </w:rPr>
+            <m:t>.</m:t>
+          </m:r>
+        </m:oMath>
+      </m:oMathPara>
+    </w:p>
+    <w:p>
+      <w:r>
+        <w:rPr>
+          <w:rtl/>
+        </w:rPr>
+        <w:t>ולכן הבדיקה עברה.</w:t>
       </w:r>
     </w:p>
     <w:sectPr>

</xml_diff>

<commit_message>
Unify Question 3 experiments at n=7
</commit_message>
<xml_diff>
--- a/HW4-Solution.docx
+++ b/HW4-Solution.docx
@@ -74,7 +74,7 @@
         </w:rPr>
         <w:fldChar w:fldCharType="separate"/>
       </w:r>
-      <w:hyperlink w:anchor="_Toc236066117" w:history="1">
+      <w:hyperlink w:anchor="_Toc236069312" w:history="1">
         <w:r>
           <w:rPr>
             <w:rStyle w:val="Hyperlink"/>
@@ -102,7 +102,7 @@
             <w:noProof/>
             <w:webHidden/>
           </w:rPr>
-          <w:instrText xml:space="preserve"> PAGEREF _Toc236066117 \h </w:instrText>
+          <w:instrText xml:space="preserve"> PAGEREF _Toc236069312 \h </w:instrText>
         </w:r>
         <w:r>
           <w:rPr>
@@ -146,7 +146,7 @@
           <w14:ligatures w14:val="standardContextual"/>
         </w:rPr>
       </w:pPr>
-      <w:hyperlink w:anchor="_Toc236066118" w:history="1">
+      <w:hyperlink w:anchor="_Toc236069313" w:history="1">
         <w:r>
           <w:rPr>
             <w:rStyle w:val="Hyperlink"/>
@@ -174,7 +174,7 @@
             <w:noProof/>
             <w:webHidden/>
           </w:rPr>
-          <w:instrText xml:space="preserve"> PAGEREF _Toc236066118 \h </w:instrText>
+          <w:instrText xml:space="preserve"> PAGEREF _Toc236069313 \h </w:instrText>
         </w:r>
         <w:r>
           <w:rPr>
@@ -218,7 +218,7 @@
           <w14:ligatures w14:val="standardContextual"/>
         </w:rPr>
       </w:pPr>
-      <w:hyperlink w:anchor="_Toc236066119" w:history="1">
+      <w:hyperlink w:anchor="_Toc236069314" w:history="1">
         <w:r>
           <w:rPr>
             <w:rStyle w:val="Hyperlink"/>
@@ -246,7 +246,7 @@
             <w:noProof/>
             <w:webHidden/>
           </w:rPr>
-          <w:instrText xml:space="preserve"> PAGEREF _Toc236066119 \h </w:instrText>
+          <w:instrText xml:space="preserve"> PAGEREF _Toc236069314 \h </w:instrText>
         </w:r>
         <w:r>
           <w:rPr>
@@ -290,7 +290,7 @@
         </w:rPr>
         <w:fldChar w:fldCharType="end"/>
       </w:r>
-      <w:bookmarkStart w:id="1" w:name="_Toc236066117"/>
+      <w:bookmarkStart w:id="1" w:name="_Toc236069312"/>
       <w:r>
         <w:rPr>
           <w:rtl/>
@@ -6736,7 +6736,7 @@
         </w:rPr>
       </w:pPr>
       <w:bookmarkStart w:id="2" w:name="שאלה-2"/>
-      <w:bookmarkStart w:id="3" w:name="_Toc236066118"/>
+      <w:bookmarkStart w:id="3" w:name="_Toc236069313"/>
       <w:bookmarkEnd w:id="0"/>
       <w:r>
         <w:rPr>
@@ -14910,7 +14910,7 @@
           <w:rtl/>
         </w:rPr>
       </w:pPr>
-      <w:bookmarkStart w:id="4" w:name="_Toc236066119"/>
+      <w:bookmarkStart w:id="4" w:name="_Toc236069314"/>
       <w:r>
         <w:rPr>
           <w:rtl/>
@@ -15322,7 +15322,7 @@
           <w:rPr>
             <w:rFonts w:ascii="Cambria Math" w:hAnsi="Cambria Math" w:cs="Cambria Math"/>
           </w:rPr>
-          <m:t>n = 5</m:t>
+          <m:t>n = 7</m:t>
         </m:r>
       </m:oMath>
       <w:r>
@@ -15538,7 +15538,7 @@
               <w:rPr>
                 <w:rFonts w:ascii="Cambria Math" w:hAnsi="Cambria Math"/>
               </w:rPr>
-              <m:t>5×3</m:t>
+              <m:t>7×3</m:t>
             </m:r>
           </m:sup>
         </m:sSup>
@@ -15602,7 +15602,7 @@
           <w:rPr>
             <w:rFonts w:ascii="Cambria Math" w:hAnsi="Cambria Math"/>
           </w:rPr>
-          <m:t>15</m:t>
+          <m:t>21</m:t>
         </m:r>
       </m:oMath>
       <w:r>
@@ -15666,7 +15666,7 @@
           <w:rPr>
             <w:rFonts w:ascii="Cambria Math" w:hAnsi="Cambria Math"/>
           </w:rPr>
-          <m:t>5!=120</m:t>
+          <m:t>7!=5040</m:t>
         </m:r>
       </m:oMath>
       <w:r>
@@ -15714,7 +15714,7 @@
                 <w:rPr>
                   <w:rFonts w:ascii="Cambria Math" w:hAnsi="Cambria Math"/>
                 </w:rPr>
-                <m:t>5!</m:t>
+                <m:t>7!</m:t>
               </m:r>
             </m:den>
           </m:f>
@@ -15758,7 +15758,7 @@
                     <w:rPr>
                       <w:rFonts w:ascii="Cambria Math" w:hAnsi="Cambria Math"/>
                     </w:rPr>
-                    <m:t>5</m:t>
+                    <m:t>7</m:t>
                   </m:r>
                 </m:sub>
               </m:sSub>
@@ -15811,7 +15811,7 @@
               <w:rPr>
                 <w:rFonts w:ascii="Cambria Math" w:hAnsi="Cambria Math"/>
               </w:rPr>
-              <m:t>5</m:t>
+              <m:t>7</m:t>
             </m:r>
           </m:sub>
         </m:sSub>
@@ -15861,7 +15861,7 @@
                 <w:rPr>
                   <w:rFonts w:ascii="Cambria Math" w:hAnsi="Cambria Math"/>
                 </w:rPr>
-                <m:t>5!</m:t>
+                <m:t>7!</m:t>
               </m:r>
             </m:den>
           </m:f>
@@ -15905,7 +15905,7 @@
                     <w:rPr>
                       <w:rFonts w:ascii="Cambria Math" w:hAnsi="Cambria Math"/>
                     </w:rPr>
-                    <m:t>5</m:t>
+                    <m:t>7</m:t>
                   </m:r>
                 </m:sub>
               </m:sSub>
@@ -15966,7 +15966,7 @@
               <w:rPr>
                 <w:rFonts w:ascii="Cambria Math" w:hAnsi="Cambria Math"/>
               </w:rPr>
-              <m:t>5</m:t>
+              <m:t>7</m:t>
             </m:r>
           </m:sub>
         </m:sSub>
@@ -16055,7 +16055,7 @@
                 <w:rPr>
                   <w:rFonts w:ascii="Cambria Math" w:hAnsi="Cambria Math"/>
                 </w:rPr>
-                <m:t>5!</m:t>
+                <m:t>7!</m:t>
               </m:r>
             </m:den>
           </m:f>
@@ -16099,7 +16099,7 @@
                     <w:rPr>
                       <w:rFonts w:ascii="Cambria Math" w:hAnsi="Cambria Math"/>
                     </w:rPr>
-                    <m:t>5</m:t>
+                    <m:t>7</m:t>
                   </m:r>
                 </m:sub>
               </m:sSub>
@@ -16122,7 +16122,7 @@
         <w:rPr>
           <w:rtl/>
         </w:rPr>
-        <w:t xml:space="preserve">במימוש יצרנו את כל הפרמוטציות של חמש השורות, הפעלנו את </w:t>
+        <w:t xml:space="preserve">במימוש יצרנו את כל הפרמוטציות של שבע השורות, הפעלנו את </w:t>
       </w:r>
       <m:oMath>
         <m:r>
@@ -16143,7 +16143,7 @@
           <w:rPr>
             <w:rFonts w:ascii="Cambria Math" w:hAnsi="Cambria Math"/>
           </w:rPr>
-          <m:t>120</m:t>
+          <m:t>5040</m:t>
         </m:r>
       </m:oMath>
       <w:r>
@@ -16292,7 +16292,7 @@
           <w:rPr>
             <w:rFonts w:ascii="Cambria Math" w:hAnsi="Cambria Math"/>
           </w:rPr>
-          <m:t>2.98·</m:t>
+          <m:t>3.73·</m:t>
         </m:r>
         <m:sSup>
           <m:sSupPr>
@@ -16315,7 +16315,7 @@
               <w:rPr>
                 <w:rFonts w:ascii="Cambria Math" w:hAnsi="Cambria Math"/>
               </w:rPr>
-              <m:t>-8</m:t>
+              <m:t>-9</m:t>
             </m:r>
           </m:sup>
         </m:sSup>

</xml_diff>

<commit_message>
Complete HW4 Question 3(d)
</commit_message>
<xml_diff>
--- a/HW4-Solution.docx
+++ b/HW4-Solution.docx
@@ -74,7 +74,7 @@
         </w:rPr>
         <w:fldChar w:fldCharType="separate"/>
       </w:r>
-      <w:hyperlink w:anchor="_Toc236069312" w:history="1">
+      <w:hyperlink w:anchor="_Toc236071707" w:history="1">
         <w:r>
           <w:rPr>
             <w:rStyle w:val="Hyperlink"/>
@@ -102,7 +102,7 @@
             <w:noProof/>
             <w:webHidden/>
           </w:rPr>
-          <w:instrText xml:space="preserve"> PAGEREF _Toc236069312 \h </w:instrText>
+          <w:instrText xml:space="preserve"> PAGEREF _Toc236071707 \h </w:instrText>
         </w:r>
         <w:r>
           <w:rPr>
@@ -146,7 +146,7 @@
           <w14:ligatures w14:val="standardContextual"/>
         </w:rPr>
       </w:pPr>
-      <w:hyperlink w:anchor="_Toc236069313" w:history="1">
+      <w:hyperlink w:anchor="_Toc236071708" w:history="1">
         <w:r>
           <w:rPr>
             <w:rStyle w:val="Hyperlink"/>
@@ -174,7 +174,7 @@
             <w:noProof/>
             <w:webHidden/>
           </w:rPr>
-          <w:instrText xml:space="preserve"> PAGEREF _Toc236069313 \h </w:instrText>
+          <w:instrText xml:space="preserve"> PAGEREF _Toc236071708 \h </w:instrText>
         </w:r>
         <w:r>
           <w:rPr>
@@ -218,7 +218,7 @@
           <w14:ligatures w14:val="standardContextual"/>
         </w:rPr>
       </w:pPr>
-      <w:hyperlink w:anchor="_Toc236069314" w:history="1">
+      <w:hyperlink w:anchor="_Toc236071709" w:history="1">
         <w:r>
           <w:rPr>
             <w:rStyle w:val="Hyperlink"/>
@@ -246,7 +246,7 @@
             <w:noProof/>
             <w:webHidden/>
           </w:rPr>
-          <w:instrText xml:space="preserve"> PAGEREF _Toc236069314 \h </w:instrText>
+          <w:instrText xml:space="preserve"> PAGEREF _Toc236071709 \h </w:instrText>
         </w:r>
         <w:r>
           <w:rPr>
@@ -290,7 +290,7 @@
         </w:rPr>
         <w:fldChar w:fldCharType="end"/>
       </w:r>
-      <w:bookmarkStart w:id="1" w:name="_Toc236069312"/>
+      <w:bookmarkStart w:id="1" w:name="_Toc236071707"/>
       <w:r>
         <w:rPr>
           <w:rtl/>
@@ -6736,7 +6736,7 @@
         </w:rPr>
       </w:pPr>
       <w:bookmarkStart w:id="2" w:name="שאלה-2"/>
-      <w:bookmarkStart w:id="3" w:name="_Toc236069313"/>
+      <w:bookmarkStart w:id="3" w:name="_Toc236071708"/>
       <w:bookmarkEnd w:id="0"/>
       <w:r>
         <w:rPr>
@@ -14910,7 +14910,7 @@
           <w:rtl/>
         </w:rPr>
       </w:pPr>
-      <w:bookmarkStart w:id="4" w:name="_Toc236069314"/>
+      <w:bookmarkStart w:id="4" w:name="_Toc236071709"/>
       <w:r>
         <w:rPr>
           <w:rtl/>
@@ -16338,7 +16338,7 @@
         <w:rPr>
           <w:rtl/>
         </w:rPr>
-        <w:t>סעיף ג. סימטריזציה מדוגמת.</w:t>
+        <w:t>סעיף ג. סימטריה דגומה.</w:t>
       </w:r>
     </w:p>
     <w:p>
@@ -18068,6 +18068,1662 @@
           <w:rtl/>
         </w:rPr>
         <w:t>ולכן הבדיקה עברה.</w:t>
+      </w:r>
+    </w:p>
+    <w:p>
+      <w:pPr>
+        <w:pStyle w:val="Heading2"/>
+        <w:rPr>
+          <w:rtl/>
+        </w:rPr>
+      </w:pPr>
+      <w:r>
+        <w:rPr>
+          <w:rtl/>
+        </w:rPr>
+        <w:t>סעיף ד. שכבות לינאריות שקולות (DeepSets).</w:t>
+      </w:r>
+    </w:p>
+    <w:p>
+      <w:r>
+        <w:rPr>
+          <w:rtl/>
+        </w:rPr>
+        <w:t xml:space="preserve">בהתאם לחזרה על שכבות לינאריות שקולות בהרצאות שבועות 11-12 (שקופיות 45-46), פעולת </w:t>
+      </w:r>
+      <m:oMath>
+        <m:sSub>
+          <m:sSubPr>
+            <m:ctrlPr>
+              <w:rPr>
+                <w:rFonts w:ascii="Cambria Math" w:hAnsi="Cambria Math"/>
+              </w:rPr>
+            </m:ctrlPr>
+          </m:sSubPr>
+          <m:e>
+            <m:r>
+              <w:rPr>
+                <w:rFonts w:ascii="Cambria Math" w:hAnsi="Cambria Math"/>
+              </w:rPr>
+              <m:t>S</m:t>
+            </m:r>
+          </m:e>
+          <m:sub>
+            <m:r>
+              <w:rPr>
+                <w:rFonts w:ascii="Cambria Math" w:hAnsi="Cambria Math"/>
+              </w:rPr>
+              <m:t>n</m:t>
+            </m:r>
+          </m:sub>
+        </m:sSub>
+      </m:oMath>
+      <w:r>
+        <w:rPr>
+          <w:rtl/>
+        </w:rPr>
+        <w:t xml:space="preserve"> על זוג האינדקסים </w:t>
+      </w:r>
+      <m:oMath>
+        <m:d>
+          <m:dPr>
+            <m:sepChr m:val=","/>
+            <m:ctrlPr>
+              <w:rPr>
+                <w:rFonts w:ascii="Cambria Math" w:hAnsi="Cambria Math"/>
+              </w:rPr>
+            </m:ctrlPr>
+          </m:dPr>
+          <m:e>
+            <m:r>
+              <w:rPr>
+                <w:rFonts w:ascii="Cambria Math" w:hAnsi="Cambria Math"/>
+              </w:rPr>
+              <m:t>i</m:t>
+            </m:r>
+          </m:e>
+          <m:e>
+            <m:r>
+              <w:rPr>
+                <w:rFonts w:ascii="Cambria Math" w:hAnsi="Cambria Math"/>
+              </w:rPr>
+              <m:t>j</m:t>
+            </m:r>
+          </m:e>
+        </m:d>
+      </m:oMath>
+      <w:r>
+        <w:rPr>
+          <w:rtl/>
+        </w:rPr>
+        <w:t xml:space="preserve">, של שורת הפלט ושורת הקלט, יוצרת שני מסלולים בלבד: </w:t>
+      </w:r>
+      <m:oMath>
+        <m:r>
+          <w:rPr>
+            <w:rFonts w:ascii="Cambria Math" w:hAnsi="Cambria Math"/>
+          </w:rPr>
+          <m:t>i=j</m:t>
+        </m:r>
+      </m:oMath>
+      <w:r>
+        <w:rPr>
+          <w:rtl/>
+        </w:rPr>
+        <w:t xml:space="preserve"> ו-</w:t>
+      </w:r>
+      <m:oMath>
+        <m:r>
+          <w:rPr>
+            <w:rFonts w:ascii="Cambria Math" w:hAnsi="Cambria Math"/>
+          </w:rPr>
+          <m:t>i≠j</m:t>
+        </m:r>
+      </m:oMath>
+      <w:r>
+        <w:rPr>
+          <w:rtl/>
+        </w:rPr>
+        <w:t>. לכן לשכבה לינארית שקולה יש שתי מטריצות פרמטרים בלתי־תלויות, והיא נכתבת בצורה</w:t>
+      </w:r>
+    </w:p>
+    <w:p>
+      <w:pPr>
+        <w:bidi w:val="0"/>
+        <w:spacing w:before="60" w:after="60"/>
+        <w:jc w:val="center"/>
+      </w:pPr>
+      <m:oMathPara>
+        <m:oMathParaPr>
+          <m:jc m:val="center"/>
+        </m:oMathParaPr>
+        <m:oMath>
+          <m:sSub>
+            <m:sSubPr>
+              <m:ctrlPr>
+                <w:rPr>
+                  <w:rFonts w:ascii="Cambria Math" w:hAnsi="Cambria Math"/>
+                </w:rPr>
+              </m:ctrlPr>
+            </m:sSubPr>
+            <m:e>
+              <m:r>
+                <w:rPr>
+                  <w:rFonts w:ascii="Cambria Math" w:hAnsi="Cambria Math"/>
+                </w:rPr>
+                <m:t>L(X)</m:t>
+              </m:r>
+            </m:e>
+            <m:sub>
+              <m:r>
+                <w:rPr>
+                  <w:rFonts w:ascii="Cambria Math" w:hAnsi="Cambria Math"/>
+                </w:rPr>
+                <m:t>i</m:t>
+              </m:r>
+            </m:sub>
+          </m:sSub>
+          <m:r>
+            <w:rPr>
+              <w:rFonts w:ascii="Cambria Math" w:hAnsi="Cambria Math"/>
+            </w:rPr>
+            <m:t>=</m:t>
+          </m:r>
+          <m:sSub>
+            <m:sSubPr>
+              <m:ctrlPr>
+                <w:rPr>
+                  <w:rFonts w:ascii="Cambria Math" w:hAnsi="Cambria Math"/>
+                </w:rPr>
+              </m:ctrlPr>
+            </m:sSubPr>
+            <m:e>
+              <m:r>
+                <w:rPr>
+                  <w:rFonts w:ascii="Cambria Math" w:hAnsi="Cambria Math"/>
+                </w:rPr>
+                <m:t>X</m:t>
+              </m:r>
+            </m:e>
+            <m:sub>
+              <m:r>
+                <w:rPr>
+                  <w:rFonts w:ascii="Cambria Math" w:hAnsi="Cambria Math"/>
+                </w:rPr>
+                <m:t>i</m:t>
+              </m:r>
+            </m:sub>
+          </m:sSub>
+          <m:r>
+            <w:rPr>
+              <w:rFonts w:ascii="Cambria Math" w:hAnsi="Cambria Math"/>
+            </w:rPr>
+            <m:t>A+</m:t>
+          </m:r>
+          <m:nary>
+            <m:naryPr>
+              <m:chr m:val="∑"/>
+              <m:limLoc m:val="undOvr"/>
+              <m:grow m:val="1"/>
+              <m:supHide m:val="1"/>
+              <m:ctrlPr>
+                <w:rPr>
+                  <w:rFonts w:ascii="Cambria Math" w:hAnsi="Cambria Math"/>
+                </w:rPr>
+              </m:ctrlPr>
+            </m:naryPr>
+            <m:sub>
+              <m:r>
+                <w:rPr>
+                  <w:rFonts w:ascii="Cambria Math" w:hAnsi="Cambria Math"/>
+                </w:rPr>
+                <m:t>j≠i</m:t>
+              </m:r>
+            </m:sub>
+            <m:sup/>
+            <m:e>
+              <m:sSub>
+                <m:sSubPr>
+                  <m:ctrlPr>
+                    <w:rPr>
+                      <w:rFonts w:ascii="Cambria Math" w:hAnsi="Cambria Math"/>
+                    </w:rPr>
+                  </m:ctrlPr>
+                </m:sSubPr>
+                <m:e>
+                  <m:r>
+                    <w:rPr>
+                      <w:rFonts w:ascii="Cambria Math" w:hAnsi="Cambria Math"/>
+                    </w:rPr>
+                    <m:t>X</m:t>
+                  </m:r>
+                </m:e>
+                <m:sub>
+                  <m:r>
+                    <w:rPr>
+                      <w:rFonts w:ascii="Cambria Math" w:hAnsi="Cambria Math"/>
+                    </w:rPr>
+                    <m:t>j</m:t>
+                  </m:r>
+                </m:sub>
+              </m:sSub>
+            </m:e>
+          </m:nary>
+          <m:r>
+            <w:rPr>
+              <w:rFonts w:ascii="Cambria Math" w:hAnsi="Cambria Math"/>
+            </w:rPr>
+            <m:t>B.</m:t>
+          </m:r>
+        </m:oMath>
+      </m:oMathPara>
+    </w:p>
+    <w:p>
+      <w:r>
+        <w:rPr>
+          <w:rtl/>
+        </w:rPr>
+        <w:t>נסמן את ממוצע השורות ב-</w:t>
+      </w:r>
+      <m:oMath>
+        <m:acc>
+          <m:accPr>
+            <m:chr m:val="̅"/>
+            <m:ctrlPr>
+              <w:rPr>
+                <w:rFonts w:ascii="Cambria Math" w:hAnsi="Cambria Math"/>
+              </w:rPr>
+            </m:ctrlPr>
+          </m:accPr>
+          <m:e>
+            <m:r>
+              <w:rPr>
+                <w:rFonts w:ascii="Cambria Math" w:hAnsi="Cambria Math"/>
+              </w:rPr>
+              <m:t>X</m:t>
+            </m:r>
+          </m:e>
+        </m:acc>
+        <m:r>
+          <w:rPr>
+            <w:rFonts w:ascii="Cambria Math" w:hAnsi="Cambria Math"/>
+          </w:rPr>
+          <m:t>=</m:t>
+        </m:r>
+        <m:f>
+          <m:fPr>
+            <m:ctrlPr>
+              <w:rPr>
+                <w:rFonts w:ascii="Cambria Math" w:hAnsi="Cambria Math"/>
+              </w:rPr>
+            </m:ctrlPr>
+          </m:fPr>
+          <m:num>
+            <m:r>
+              <w:rPr>
+                <w:rFonts w:ascii="Cambria Math" w:hAnsi="Cambria Math"/>
+              </w:rPr>
+              <m:t>1</m:t>
+            </m:r>
+          </m:num>
+          <m:den>
+            <m:r>
+              <w:rPr>
+                <w:rFonts w:ascii="Cambria Math" w:hAnsi="Cambria Math"/>
+              </w:rPr>
+              <m:t>n</m:t>
+            </m:r>
+          </m:den>
+        </m:f>
+        <m:nary>
+          <m:naryPr>
+            <m:chr m:val="∑"/>
+            <m:limLoc m:val="undOvr"/>
+            <m:grow m:val="1"/>
+            <m:supHide m:val="1"/>
+            <m:ctrlPr>
+              <w:rPr>
+                <w:rFonts w:ascii="Cambria Math" w:hAnsi="Cambria Math"/>
+              </w:rPr>
+            </m:ctrlPr>
+          </m:naryPr>
+          <m:sub>
+            <m:r>
+              <w:rPr>
+                <w:rFonts w:ascii="Cambria Math" w:hAnsi="Cambria Math"/>
+              </w:rPr>
+              <m:t>j=1</m:t>
+            </m:r>
+          </m:sub>
+          <m:sup/>
+          <m:e>
+            <m:sSub>
+              <m:sSubPr>
+                <m:ctrlPr>
+                  <w:rPr>
+                    <w:rFonts w:ascii="Cambria Math" w:hAnsi="Cambria Math"/>
+                  </w:rPr>
+                </m:ctrlPr>
+              </m:sSubPr>
+              <m:e>
+                <m:r>
+                  <w:rPr>
+                    <w:rFonts w:ascii="Cambria Math" w:hAnsi="Cambria Math"/>
+                  </w:rPr>
+                  <m:t>X</m:t>
+                </m:r>
+              </m:e>
+              <m:sub>
+                <m:r>
+                  <w:rPr>
+                    <w:rFonts w:ascii="Cambria Math" w:hAnsi="Cambria Math"/>
+                  </w:rPr>
+                  <m:t>j</m:t>
+                </m:r>
+              </m:sub>
+            </m:sSub>
+          </m:e>
+        </m:nary>
+      </m:oMath>
+      <w:r>
+        <w:rPr>
+          <w:rtl/>
+        </w:rPr>
+        <w:t xml:space="preserve">. בבחירה </w:t>
+      </w:r>
+      <m:oMath>
+        <m:sSub>
+          <m:sSubPr>
+            <m:ctrlPr>
+              <w:rPr>
+                <w:rFonts w:ascii="Cambria Math" w:hAnsi="Cambria Math"/>
+              </w:rPr>
+            </m:ctrlPr>
+          </m:sSubPr>
+          <m:e>
+            <m:r>
+              <w:rPr>
+                <w:rFonts w:ascii="Cambria Math" w:hAnsi="Cambria Math"/>
+              </w:rPr>
+              <m:t>W</m:t>
+            </m:r>
+          </m:e>
+          <m:sub>
+            <m:r>
+              <w:rPr>
+                <w:rFonts w:ascii="Cambria Math" w:hAnsi="Cambria Math"/>
+              </w:rPr>
+              <m:t>1</m:t>
+            </m:r>
+          </m:sub>
+        </m:sSub>
+        <m:r>
+          <w:rPr>
+            <w:rFonts w:ascii="Cambria Math" w:hAnsi="Cambria Math"/>
+          </w:rPr>
+          <m:t>=A-B,</m:t>
+        </m:r>
+        <m:sSub>
+          <m:sSubPr>
+            <m:ctrlPr>
+              <w:rPr>
+                <w:rFonts w:ascii="Cambria Math" w:hAnsi="Cambria Math"/>
+              </w:rPr>
+            </m:ctrlPr>
+          </m:sSubPr>
+          <m:e>
+            <m:r>
+              <w:rPr>
+                <w:rFonts w:ascii="Cambria Math" w:hAnsi="Cambria Math"/>
+              </w:rPr>
+              <m:t>W</m:t>
+            </m:r>
+          </m:e>
+          <m:sub>
+            <m:r>
+              <w:rPr>
+                <w:rFonts w:ascii="Cambria Math" w:hAnsi="Cambria Math"/>
+              </w:rPr>
+              <m:t>2</m:t>
+            </m:r>
+          </m:sub>
+        </m:sSub>
+        <m:r>
+          <w:rPr>
+            <w:rFonts w:ascii="Cambria Math" w:hAnsi="Cambria Math"/>
+          </w:rPr>
+          <m:t>=nB</m:t>
+        </m:r>
+      </m:oMath>
+      <w:r>
+        <w:rPr>
+          <w:rtl/>
+        </w:rPr>
+        <w:t xml:space="preserve"> מתקבלת בדיוק הנוסחה שבשאלה, וההטיה </w:t>
+      </w:r>
+      <m:oMath>
+        <m:r>
+          <w:rPr>
+            <w:rFonts w:ascii="Cambria Math" w:hAnsi="Cambria Math"/>
+          </w:rPr>
+          <m:t>b</m:t>
+        </m:r>
+      </m:oMath>
+      <w:r>
+        <w:rPr>
+          <w:rtl/>
+        </w:rPr>
+        <w:t xml:space="preserve"> משותפת לכל השורות. נגדיר </w:t>
+      </w:r>
+      <m:oMath>
+        <m:sSub>
+          <m:sSubPr>
+            <m:ctrlPr>
+              <w:rPr>
+                <w:rFonts w:ascii="Cambria Math" w:hAnsi="Cambria Math"/>
+              </w:rPr>
+            </m:ctrlPr>
+          </m:sSubPr>
+          <m:e>
+            <m:d>
+              <m:dPr>
+                <m:sepChr m:val="·"/>
+                <m:ctrlPr>
+                  <w:rPr>
+                    <w:rFonts w:ascii="Cambria Math" w:hAnsi="Cambria Math"/>
+                  </w:rPr>
+                </m:ctrlPr>
+              </m:dPr>
+              <m:e>
+                <m:r>
+                  <w:rPr>
+                    <w:rFonts w:ascii="Cambria Math" w:hAnsi="Cambria Math"/>
+                  </w:rPr>
+                  <m:t>π</m:t>
+                </m:r>
+              </m:e>
+              <m:e>
+                <m:r>
+                  <w:rPr>
+                    <w:rFonts w:ascii="Cambria Math" w:hAnsi="Cambria Math"/>
+                  </w:rPr>
+                  <m:t>X</m:t>
+                </m:r>
+              </m:e>
+            </m:d>
+          </m:e>
+          <m:sub>
+            <m:r>
+              <w:rPr>
+                <w:rFonts w:ascii="Cambria Math" w:hAnsi="Cambria Math"/>
+              </w:rPr>
+              <m:t>i</m:t>
+            </m:r>
+          </m:sub>
+        </m:sSub>
+        <m:r>
+          <w:rPr>
+            <w:rFonts w:ascii="Cambria Math" w:hAnsi="Cambria Math"/>
+          </w:rPr>
+          <m:t>=</m:t>
+        </m:r>
+        <m:sSub>
+          <m:sSubPr>
+            <m:ctrlPr>
+              <w:rPr>
+                <w:rFonts w:ascii="Cambria Math" w:hAnsi="Cambria Math"/>
+              </w:rPr>
+            </m:ctrlPr>
+          </m:sSubPr>
+          <m:e>
+            <m:r>
+              <w:rPr>
+                <w:rFonts w:ascii="Cambria Math" w:hAnsi="Cambria Math"/>
+              </w:rPr>
+              <m:t>X</m:t>
+            </m:r>
+          </m:e>
+          <m:sub>
+            <m:sSup>
+              <m:sSupPr>
+                <m:ctrlPr>
+                  <w:rPr>
+                    <w:rFonts w:ascii="Cambria Math" w:hAnsi="Cambria Math"/>
+                  </w:rPr>
+                </m:ctrlPr>
+              </m:sSupPr>
+              <m:e>
+                <m:r>
+                  <w:rPr>
+                    <w:rFonts w:ascii="Cambria Math" w:hAnsi="Cambria Math"/>
+                  </w:rPr>
+                  <m:t>π</m:t>
+                </m:r>
+              </m:e>
+              <m:sup>
+                <m:r>
+                  <w:rPr>
+                    <w:rFonts w:ascii="Cambria Math" w:hAnsi="Cambria Math"/>
+                  </w:rPr>
+                  <m:t>-1</m:t>
+                </m:r>
+              </m:sup>
+            </m:sSup>
+            <m:r>
+              <w:rPr>
+                <w:rFonts w:ascii="Cambria Math" w:hAnsi="Cambria Math"/>
+              </w:rPr>
+              <m:t>(i)</m:t>
+            </m:r>
+          </m:sub>
+        </m:sSub>
+      </m:oMath>
+      <w:r>
+        <w:rPr>
+          <w:rtl/>
+        </w:rPr>
+        <w:t xml:space="preserve">. מאחר שהתמורה חח״ע ועל, היא רק מסדרת מחדש את איברי הממוצע, ולכן </w:t>
+      </w:r>
+      <m:oMath>
+        <m:acc>
+          <m:accPr>
+            <m:chr m:val="̅"/>
+            <m:ctrlPr>
+              <w:rPr>
+                <w:rFonts w:ascii="Cambria Math" w:hAnsi="Cambria Math"/>
+              </w:rPr>
+            </m:ctrlPr>
+          </m:accPr>
+          <m:e>
+            <m:r>
+              <w:rPr>
+                <w:rFonts w:ascii="Cambria Math" w:hAnsi="Cambria Math"/>
+              </w:rPr>
+              <m:t>π·X</m:t>
+            </m:r>
+          </m:e>
+        </m:acc>
+        <m:r>
+          <w:rPr>
+            <w:rFonts w:ascii="Cambria Math" w:hAnsi="Cambria Math"/>
+          </w:rPr>
+          <m:t>=</m:t>
+        </m:r>
+        <m:acc>
+          <m:accPr>
+            <m:chr m:val="̅"/>
+            <m:ctrlPr>
+              <w:rPr>
+                <w:rFonts w:ascii="Cambria Math" w:hAnsi="Cambria Math"/>
+              </w:rPr>
+            </m:ctrlPr>
+          </m:accPr>
+          <m:e>
+            <m:r>
+              <w:rPr>
+                <w:rFonts w:ascii="Cambria Math" w:hAnsi="Cambria Math"/>
+              </w:rPr>
+              <m:t>X</m:t>
+            </m:r>
+          </m:e>
+        </m:acc>
+      </m:oMath>
+      <w:r>
+        <w:rPr>
+          <w:rtl/>
+        </w:rPr>
+        <w:t>. מכאן</w:t>
+      </w:r>
+    </w:p>
+    <w:p>
+      <w:pPr>
+        <w:bidi w:val="0"/>
+        <w:spacing w:before="60" w:after="60"/>
+        <w:jc w:val="center"/>
+      </w:pPr>
+      <m:oMathPara>
+        <m:oMathParaPr>
+          <m:jc m:val="center"/>
+        </m:oMathParaPr>
+        <m:oMath>
+          <m:sSub>
+            <m:sSubPr>
+              <m:ctrlPr>
+                <w:rPr>
+                  <w:rFonts w:ascii="Cambria Math" w:hAnsi="Cambria Math"/>
+                </w:rPr>
+              </m:ctrlPr>
+            </m:sSubPr>
+            <m:e>
+              <m:r>
+                <w:rPr>
+                  <w:rFonts w:ascii="Cambria Math" w:hAnsi="Cambria Math"/>
+                </w:rPr>
+                <m:t>L(π·X)</m:t>
+              </m:r>
+            </m:e>
+            <m:sub>
+              <m:r>
+                <w:rPr>
+                  <w:rFonts w:ascii="Cambria Math" w:hAnsi="Cambria Math"/>
+                </w:rPr>
+                <m:t>i</m:t>
+              </m:r>
+            </m:sub>
+          </m:sSub>
+          <m:r>
+            <w:rPr>
+              <w:rFonts w:ascii="Cambria Math" w:hAnsi="Cambria Math"/>
+            </w:rPr>
+            <m:t>=</m:t>
+          </m:r>
+          <m:sSub>
+            <m:sSubPr>
+              <m:ctrlPr>
+                <w:rPr>
+                  <w:rFonts w:ascii="Cambria Math" w:hAnsi="Cambria Math"/>
+                </w:rPr>
+              </m:ctrlPr>
+            </m:sSubPr>
+            <m:e>
+              <m:r>
+                <w:rPr>
+                  <w:rFonts w:ascii="Cambria Math" w:hAnsi="Cambria Math"/>
+                </w:rPr>
+                <m:t>X</m:t>
+              </m:r>
+            </m:e>
+            <m:sub>
+              <m:sSup>
+                <m:sSupPr>
+                  <m:ctrlPr>
+                    <w:rPr>
+                      <w:rFonts w:ascii="Cambria Math" w:hAnsi="Cambria Math"/>
+                    </w:rPr>
+                  </m:ctrlPr>
+                </m:sSupPr>
+                <m:e>
+                  <m:r>
+                    <w:rPr>
+                      <w:rFonts w:ascii="Cambria Math" w:hAnsi="Cambria Math"/>
+                    </w:rPr>
+                    <m:t>π</m:t>
+                  </m:r>
+                </m:e>
+                <m:sup>
+                  <m:r>
+                    <w:rPr>
+                      <w:rFonts w:ascii="Cambria Math" w:hAnsi="Cambria Math"/>
+                    </w:rPr>
+                    <m:t>-1</m:t>
+                  </m:r>
+                </m:sup>
+              </m:sSup>
+              <m:r>
+                <w:rPr>
+                  <w:rFonts w:ascii="Cambria Math" w:hAnsi="Cambria Math"/>
+                </w:rPr>
+                <m:t>(i)</m:t>
+              </m:r>
+            </m:sub>
+          </m:sSub>
+          <m:sSub>
+            <m:sSubPr>
+              <m:ctrlPr>
+                <w:rPr>
+                  <w:rFonts w:ascii="Cambria Math" w:hAnsi="Cambria Math"/>
+                </w:rPr>
+              </m:ctrlPr>
+            </m:sSubPr>
+            <m:e>
+              <m:r>
+                <w:rPr>
+                  <w:rFonts w:ascii="Cambria Math" w:hAnsi="Cambria Math"/>
+                </w:rPr>
+                <m:t>W</m:t>
+              </m:r>
+            </m:e>
+            <m:sub>
+              <m:r>
+                <w:rPr>
+                  <w:rFonts w:ascii="Cambria Math" w:hAnsi="Cambria Math"/>
+                </w:rPr>
+                <m:t>1</m:t>
+              </m:r>
+            </m:sub>
+          </m:sSub>
+          <m:r>
+            <w:rPr>
+              <w:rFonts w:ascii="Cambria Math" w:hAnsi="Cambria Math"/>
+            </w:rPr>
+            <m:t>+</m:t>
+          </m:r>
+          <m:acc>
+            <m:accPr>
+              <m:chr m:val="̅"/>
+              <m:ctrlPr>
+                <w:rPr>
+                  <w:rFonts w:ascii="Cambria Math" w:hAnsi="Cambria Math"/>
+                </w:rPr>
+              </m:ctrlPr>
+            </m:accPr>
+            <m:e>
+              <m:r>
+                <w:rPr>
+                  <w:rFonts w:ascii="Cambria Math" w:hAnsi="Cambria Math"/>
+                </w:rPr>
+                <m:t>X</m:t>
+              </m:r>
+            </m:e>
+          </m:acc>
+          <m:sSub>
+            <m:sSubPr>
+              <m:ctrlPr>
+                <w:rPr>
+                  <w:rFonts w:ascii="Cambria Math" w:hAnsi="Cambria Math"/>
+                </w:rPr>
+              </m:ctrlPr>
+            </m:sSubPr>
+            <m:e>
+              <m:r>
+                <w:rPr>
+                  <w:rFonts w:ascii="Cambria Math" w:hAnsi="Cambria Math"/>
+                </w:rPr>
+                <m:t>W</m:t>
+              </m:r>
+            </m:e>
+            <m:sub>
+              <m:r>
+                <w:rPr>
+                  <w:rFonts w:ascii="Cambria Math" w:hAnsi="Cambria Math"/>
+                </w:rPr>
+                <m:t>2</m:t>
+              </m:r>
+            </m:sub>
+          </m:sSub>
+          <m:r>
+            <w:rPr>
+              <w:rFonts w:ascii="Cambria Math" w:hAnsi="Cambria Math"/>
+            </w:rPr>
+            <m:t>+b=</m:t>
+          </m:r>
+          <m:sSub>
+            <m:sSubPr>
+              <m:ctrlPr>
+                <w:rPr>
+                  <w:rFonts w:ascii="Cambria Math" w:hAnsi="Cambria Math"/>
+                </w:rPr>
+              </m:ctrlPr>
+            </m:sSubPr>
+            <m:e>
+              <m:r>
+                <w:rPr>
+                  <w:rFonts w:ascii="Cambria Math" w:hAnsi="Cambria Math"/>
+                </w:rPr>
+                <m:t>L(X)</m:t>
+              </m:r>
+            </m:e>
+            <m:sub>
+              <m:sSup>
+                <m:sSupPr>
+                  <m:ctrlPr>
+                    <w:rPr>
+                      <w:rFonts w:ascii="Cambria Math" w:hAnsi="Cambria Math"/>
+                    </w:rPr>
+                  </m:ctrlPr>
+                </m:sSupPr>
+                <m:e>
+                  <m:r>
+                    <w:rPr>
+                      <w:rFonts w:ascii="Cambria Math" w:hAnsi="Cambria Math"/>
+                    </w:rPr>
+                    <m:t>π</m:t>
+                  </m:r>
+                </m:e>
+                <m:sup>
+                  <m:r>
+                    <w:rPr>
+                      <w:rFonts w:ascii="Cambria Math" w:hAnsi="Cambria Math"/>
+                    </w:rPr>
+                    <m:t>-1</m:t>
+                  </m:r>
+                </m:sup>
+              </m:sSup>
+              <m:r>
+                <w:rPr>
+                  <w:rFonts w:ascii="Cambria Math" w:hAnsi="Cambria Math"/>
+                </w:rPr>
+                <m:t>(i)</m:t>
+              </m:r>
+            </m:sub>
+          </m:sSub>
+          <m:r>
+            <w:rPr>
+              <w:rFonts w:ascii="Cambria Math" w:hAnsi="Cambria Math"/>
+            </w:rPr>
+            <m:t>=</m:t>
+          </m:r>
+          <m:sSub>
+            <m:sSubPr>
+              <m:ctrlPr>
+                <w:rPr>
+                  <w:rFonts w:ascii="Cambria Math" w:hAnsi="Cambria Math"/>
+                </w:rPr>
+              </m:ctrlPr>
+            </m:sSubPr>
+            <m:e>
+              <m:d>
+                <m:dPr>
+                  <m:ctrlPr>
+                    <w:rPr>
+                      <w:rFonts w:ascii="Cambria Math" w:hAnsi="Cambria Math"/>
+                    </w:rPr>
+                  </m:ctrlPr>
+                </m:dPr>
+                <m:e>
+                  <m:r>
+                    <w:rPr>
+                      <w:rFonts w:ascii="Cambria Math" w:hAnsi="Cambria Math"/>
+                    </w:rPr>
+                    <m:t>π·L(X)</m:t>
+                  </m:r>
+                </m:e>
+              </m:d>
+            </m:e>
+            <m:sub>
+              <m:r>
+                <w:rPr>
+                  <w:rFonts w:ascii="Cambria Math" w:hAnsi="Cambria Math"/>
+                </w:rPr>
+                <m:t>i</m:t>
+              </m:r>
+            </m:sub>
+          </m:sSub>
+          <m:r>
+            <w:rPr>
+              <w:rFonts w:ascii="Cambria Math" w:hAnsi="Cambria Math"/>
+            </w:rPr>
+            <m:t>.</m:t>
+          </m:r>
+        </m:oMath>
+      </m:oMathPara>
+    </w:p>
+    <w:p>
+      <w:r>
+        <w:rPr>
+          <w:rtl/>
+        </w:rPr>
+        <w:t xml:space="preserve">ולכן השכבה שקולה. בנינו את </w:t>
+      </w:r>
+      <m:oMath>
+        <m:r>
+          <w:rPr>
+            <w:rFonts w:ascii="Cambria Math" w:hAnsi="Cambria Math"/>
+          </w:rPr>
+          <m:t>H=</m:t>
+        </m:r>
+        <m:sSub>
+          <m:sSubPr>
+            <m:ctrlPr>
+              <w:rPr>
+                <w:rFonts w:ascii="Cambria Math" w:hAnsi="Cambria Math"/>
+              </w:rPr>
+            </m:ctrlPr>
+          </m:sSubPr>
+          <m:e>
+            <m:r>
+              <w:rPr>
+                <w:rFonts w:ascii="Cambria Math" w:hAnsi="Cambria Math"/>
+              </w:rPr>
+              <m:t>L</m:t>
+            </m:r>
+          </m:e>
+          <m:sub>
+            <m:r>
+              <w:rPr>
+                <w:rFonts w:ascii="Cambria Math" w:hAnsi="Cambria Math"/>
+              </w:rPr>
+              <m:t>2</m:t>
+            </m:r>
+          </m:sub>
+        </m:sSub>
+        <m:r>
+          <w:rPr>
+            <w:rFonts w:ascii="Cambria Math" w:hAnsi="Cambria Math"/>
+          </w:rPr>
+          <m:t>∘</m:t>
+        </m:r>
+        <m:r>
+          <m:rPr>
+            <m:nor/>
+          </m:rPr>
+          <m:t>ReLU</m:t>
+        </m:r>
+        <m:r>
+          <w:rPr>
+            <w:rFonts w:ascii="Cambria Math" w:hAnsi="Cambria Math"/>
+          </w:rPr>
+          <m:t>∘</m:t>
+        </m:r>
+        <m:sSub>
+          <m:sSubPr>
+            <m:ctrlPr>
+              <w:rPr>
+                <w:rFonts w:ascii="Cambria Math" w:hAnsi="Cambria Math"/>
+              </w:rPr>
+            </m:ctrlPr>
+          </m:sSubPr>
+          <m:e>
+            <m:r>
+              <w:rPr>
+                <w:rFonts w:ascii="Cambria Math" w:hAnsi="Cambria Math"/>
+              </w:rPr>
+              <m:t>L</m:t>
+            </m:r>
+          </m:e>
+          <m:sub>
+            <m:r>
+              <w:rPr>
+                <w:rFonts w:ascii="Cambria Math" w:hAnsi="Cambria Math"/>
+              </w:rPr>
+              <m:t>1</m:t>
+            </m:r>
+          </m:sub>
+        </m:sSub>
+      </m:oMath>
+      <w:r>
+        <w:rPr>
+          <w:rtl/>
+        </w:rPr>
+        <w:t xml:space="preserve"> במבנה </w:t>
+      </w:r>
+      <m:oMath>
+        <m:r>
+          <w:rPr>
+            <w:rFonts w:ascii="Cambria Math" w:hAnsi="Cambria Math"/>
+          </w:rPr>
+          <m:t>3→55→4</m:t>
+        </m:r>
+      </m:oMath>
+      <w:r>
+        <w:rPr>
+          <w:rtl/>
+        </w:rPr>
+        <w:t xml:space="preserve">. ReLU פועלת בנפרד על כל שורה ורכיב ולכן מתחלפת עם תמורות השורות; מכאן שגם </w:t>
+      </w:r>
+      <m:oMath>
+        <m:r>
+          <w:rPr>
+            <w:rFonts w:ascii="Cambria Math" w:hAnsi="Cambria Math"/>
+          </w:rPr>
+          <m:t>H</m:t>
+        </m:r>
+      </m:oMath>
+      <w:r>
+        <w:rPr>
+          <w:rtl/>
+        </w:rPr>
+        <w:t xml:space="preserve"> שקולה. לבסוף ביצענו מיצוע על השורות; שינוי אינדקס בסכום מוכיח שהפלט אינווריאנטי:</w:t>
+      </w:r>
+    </w:p>
+    <w:p>
+      <w:pPr>
+        <w:bidi w:val="0"/>
+        <w:spacing w:before="60" w:after="60"/>
+        <w:jc w:val="center"/>
+      </w:pPr>
+      <m:oMathPara>
+        <m:oMathParaPr>
+          <m:jc m:val="center"/>
+        </m:oMathParaPr>
+        <m:oMath>
+          <m:r>
+            <w:rPr>
+              <w:rFonts w:ascii="Cambria Math" w:hAnsi="Cambria Math"/>
+            </w:rPr>
+            <m:t>F(X)=</m:t>
+          </m:r>
+          <m:f>
+            <m:fPr>
+              <m:ctrlPr>
+                <w:rPr>
+                  <w:rFonts w:ascii="Cambria Math" w:hAnsi="Cambria Math"/>
+                </w:rPr>
+              </m:ctrlPr>
+            </m:fPr>
+            <m:num>
+              <m:r>
+                <w:rPr>
+                  <w:rFonts w:ascii="Cambria Math" w:hAnsi="Cambria Math"/>
+                </w:rPr>
+                <m:t>1</m:t>
+              </m:r>
+            </m:num>
+            <m:den>
+              <m:r>
+                <w:rPr>
+                  <w:rFonts w:ascii="Cambria Math" w:hAnsi="Cambria Math"/>
+                </w:rPr>
+                <m:t>n</m:t>
+              </m:r>
+            </m:den>
+          </m:f>
+          <m:nary>
+            <m:naryPr>
+              <m:chr m:val="∑"/>
+              <m:limLoc m:val="undOvr"/>
+              <m:grow m:val="1"/>
+              <m:supHide m:val="1"/>
+              <m:ctrlPr>
+                <w:rPr>
+                  <w:rFonts w:ascii="Cambria Math" w:hAnsi="Cambria Math"/>
+                </w:rPr>
+              </m:ctrlPr>
+            </m:naryPr>
+            <m:sub>
+              <m:r>
+                <w:rPr>
+                  <w:rFonts w:ascii="Cambria Math" w:hAnsi="Cambria Math"/>
+                </w:rPr>
+                <m:t>i=1</m:t>
+              </m:r>
+            </m:sub>
+            <m:sup/>
+            <m:e>
+              <m:sSub>
+                <m:sSubPr>
+                  <m:ctrlPr>
+                    <w:rPr>
+                      <w:rFonts w:ascii="Cambria Math" w:hAnsi="Cambria Math"/>
+                    </w:rPr>
+                  </m:ctrlPr>
+                </m:sSubPr>
+                <m:e>
+                  <m:r>
+                    <w:rPr>
+                      <w:rFonts w:ascii="Cambria Math" w:hAnsi="Cambria Math"/>
+                    </w:rPr>
+                    <m:t>H(X)</m:t>
+                  </m:r>
+                </m:e>
+                <m:sub>
+                  <m:r>
+                    <w:rPr>
+                      <w:rFonts w:ascii="Cambria Math" w:hAnsi="Cambria Math"/>
+                    </w:rPr>
+                    <m:t>i</m:t>
+                  </m:r>
+                </m:sub>
+              </m:sSub>
+            </m:e>
+          </m:nary>
+          <m:r>
+            <w:rPr>
+              <w:rFonts w:ascii="Cambria Math" w:hAnsi="Cambria Math"/>
+            </w:rPr>
+            <m:t>,F(π·X)=</m:t>
+          </m:r>
+          <m:f>
+            <m:fPr>
+              <m:ctrlPr>
+                <w:rPr>
+                  <w:rFonts w:ascii="Cambria Math" w:hAnsi="Cambria Math"/>
+                </w:rPr>
+              </m:ctrlPr>
+            </m:fPr>
+            <m:num>
+              <m:r>
+                <w:rPr>
+                  <w:rFonts w:ascii="Cambria Math" w:hAnsi="Cambria Math"/>
+                </w:rPr>
+                <m:t>1</m:t>
+              </m:r>
+            </m:num>
+            <m:den>
+              <m:r>
+                <w:rPr>
+                  <w:rFonts w:ascii="Cambria Math" w:hAnsi="Cambria Math"/>
+                </w:rPr>
+                <m:t>n</m:t>
+              </m:r>
+            </m:den>
+          </m:f>
+          <m:nary>
+            <m:naryPr>
+              <m:chr m:val="∑"/>
+              <m:limLoc m:val="undOvr"/>
+              <m:grow m:val="1"/>
+              <m:supHide m:val="1"/>
+              <m:ctrlPr>
+                <w:rPr>
+                  <w:rFonts w:ascii="Cambria Math" w:hAnsi="Cambria Math"/>
+                </w:rPr>
+              </m:ctrlPr>
+            </m:naryPr>
+            <m:sub>
+              <m:r>
+                <w:rPr>
+                  <w:rFonts w:ascii="Cambria Math" w:hAnsi="Cambria Math"/>
+                </w:rPr>
+                <m:t>i=1</m:t>
+              </m:r>
+            </m:sub>
+            <m:sup/>
+            <m:e>
+              <m:sSub>
+                <m:sSubPr>
+                  <m:ctrlPr>
+                    <w:rPr>
+                      <w:rFonts w:ascii="Cambria Math" w:hAnsi="Cambria Math"/>
+                    </w:rPr>
+                  </m:ctrlPr>
+                </m:sSubPr>
+                <m:e>
+                  <m:r>
+                    <w:rPr>
+                      <w:rFonts w:ascii="Cambria Math" w:hAnsi="Cambria Math"/>
+                    </w:rPr>
+                    <m:t>H(X)</m:t>
+                  </m:r>
+                </m:e>
+                <m:sub>
+                  <m:sSup>
+                    <m:sSupPr>
+                      <m:ctrlPr>
+                        <w:rPr>
+                          <w:rFonts w:ascii="Cambria Math" w:hAnsi="Cambria Math"/>
+                        </w:rPr>
+                      </m:ctrlPr>
+                    </m:sSupPr>
+                    <m:e>
+                      <m:r>
+                        <w:rPr>
+                          <w:rFonts w:ascii="Cambria Math" w:hAnsi="Cambria Math"/>
+                        </w:rPr>
+                        <m:t>π</m:t>
+                      </m:r>
+                    </m:e>
+                    <m:sup>
+                      <m:r>
+                        <w:rPr>
+                          <w:rFonts w:ascii="Cambria Math" w:hAnsi="Cambria Math"/>
+                        </w:rPr>
+                        <m:t>-1</m:t>
+                      </m:r>
+                    </m:sup>
+                  </m:sSup>
+                  <m:r>
+                    <w:rPr>
+                      <w:rFonts w:ascii="Cambria Math" w:hAnsi="Cambria Math"/>
+                    </w:rPr>
+                    <m:t>(i)</m:t>
+                  </m:r>
+                </m:sub>
+              </m:sSub>
+            </m:e>
+          </m:nary>
+          <m:r>
+            <w:rPr>
+              <w:rFonts w:ascii="Cambria Math" w:hAnsi="Cambria Math"/>
+            </w:rPr>
+            <m:t>=F(X).</m:t>
+          </m:r>
+        </m:oMath>
+      </m:oMathPara>
+    </w:p>
+    <w:p>
+      <w:r>
+        <w:rPr>
+          <w:rtl/>
+        </w:rPr>
+        <w:t>מספר הפרמטרים נספר לפי הנוסחה שבשאלה, כולל ההטיות. למיצוע אין פרמטרים, והרוחב 55 נבחר כדי להתאים בקירוב למספר הפרמטרים של ה-MLP מסעיפים א-ג:</w:t>
+      </w:r>
+    </w:p>
+    <w:p>
+      <w:pPr>
+        <w:bidi w:val="0"/>
+        <w:spacing w:before="60" w:after="60"/>
+        <w:jc w:val="center"/>
+      </w:pPr>
+      <m:oMathPara>
+        <m:oMathParaPr>
+          <m:jc m:val="center"/>
+        </m:oMathParaPr>
+        <m:oMath>
+          <m:m>
+            <m:mPr>
+              <m:plcHide m:val="1"/>
+              <m:mcs>
+                <m:mc>
+                  <m:mcPr>
+                    <m:count m:val="2"/>
+                    <m:mcJc m:val="center"/>
+                  </m:mcPr>
+                </m:mc>
+              </m:mcs>
+              <m:ctrlPr>
+                <w:rPr>
+                  <w:rFonts w:ascii="Cambria Math" w:hAnsi="Cambria Math"/>
+                </w:rPr>
+              </m:ctrlPr>
+            </m:mPr>
+            <m:mr>
+              <m:e>
+                <m:sSub>
+                  <m:sSubPr>
+                    <m:ctrlPr>
+                      <w:rPr>
+                        <w:rFonts w:ascii="Cambria Math" w:hAnsi="Cambria Math"/>
+                      </w:rPr>
+                    </m:ctrlPr>
+                  </m:sSubPr>
+                  <m:e>
+                    <m:r>
+                      <w:rPr>
+                        <w:rFonts w:ascii="Cambria Math" w:hAnsi="Cambria Math"/>
+                      </w:rPr>
+                      <m:t>N</m:t>
+                    </m:r>
+                  </m:e>
+                  <m:sub>
+                    <m:r>
+                      <m:rPr>
+                        <m:nor/>
+                      </m:rPr>
+                      <m:t>DeepSets</m:t>
+                    </m:r>
+                  </m:sub>
+                </m:sSub>
+              </m:e>
+              <m:e>
+                <m:r>
+                  <w:rPr>
+                    <w:rFonts w:ascii="Cambria Math" w:hAnsi="Cambria Math"/>
+                  </w:rPr>
+                  <m:t>=(2·3·55+55)+(2·55·4+4)=829,</m:t>
+                </m:r>
+              </m:e>
+            </m:mr>
+            <m:mr>
+              <m:e>
+                <m:sSub>
+                  <m:sSubPr>
+                    <m:ctrlPr>
+                      <w:rPr>
+                        <w:rFonts w:ascii="Cambria Math" w:hAnsi="Cambria Math"/>
+                      </w:rPr>
+                    </m:ctrlPr>
+                  </m:sSubPr>
+                  <m:e>
+                    <m:r>
+                      <w:rPr>
+                        <w:rFonts w:ascii="Cambria Math" w:hAnsi="Cambria Math"/>
+                      </w:rPr>
+                      <m:t>N</m:t>
+                    </m:r>
+                  </m:e>
+                  <m:sub>
+                    <m:r>
+                      <m:rPr>
+                        <m:nor/>
+                      </m:rPr>
+                      <m:t>MLP</m:t>
+                    </m:r>
+                  </m:sub>
+                </m:sSub>
+              </m:e>
+              <m:e>
+                <m:r>
+                  <w:rPr>
+                    <w:rFonts w:ascii="Cambria Math" w:hAnsi="Cambria Math"/>
+                  </w:rPr>
+                  <m:t>=(21·32+32)+(32·4+4)=836.</m:t>
+                </m:r>
+              </m:e>
+            </m:mr>
+          </m:m>
+        </m:oMath>
+      </m:oMathPara>
+    </w:p>
+    <w:p>
+      <w:r>
+        <w:rPr>
+          <w:rtl/>
+        </w:rPr>
+        <w:t>במימוש השתמשנו ב-</w:t>
+      </w:r>
+      <m:oMath>
+        <m:r>
+          <w:rPr>
+            <w:rFonts w:ascii="Cambria Math" w:hAnsi="Cambria Math"/>
+          </w:rPr>
+          <m:t>n=7,d=3,p=4,</m:t>
+        </m:r>
+        <m:r>
+          <m:rPr>
+            <m:nor/>
+          </m:rPr>
+          <m:t>seed</m:t>
+        </m:r>
+        <m:r>
+          <w:rPr>
+            <w:rFonts w:ascii="Cambria Math" w:hAnsi="Cambria Math"/>
+          </w:rPr>
+          <m:t>=2319</m:t>
+        </m:r>
+      </m:oMath>
+      <w:r>
+        <w:rPr>
+          <w:rtl/>
+        </w:rPr>
+        <w:t xml:space="preserve">. דגמנו קלט גאוסי ופרמוטציה אקראית, ובדקנו בנפרד את שקילות השכבה, את שקילות הרשת ואת האינווריאנטיות לאחר המיצוע באמצעות </w:t>
+      </w:r>
+      <m:oMath>
+        <m:r>
+          <m:rPr>
+            <m:nor/>
+          </m:rPr>
+          <m:t>atol</m:t>
+        </m:r>
+        <m:r>
+          <w:rPr>
+            <w:rFonts w:ascii="Cambria Math" w:hAnsi="Cambria Math"/>
+          </w:rPr>
+          <m:t>=</m:t>
+        </m:r>
+        <m:sSup>
+          <m:sSupPr>
+            <m:ctrlPr>
+              <w:rPr>
+                <w:rFonts w:ascii="Cambria Math" w:hAnsi="Cambria Math"/>
+              </w:rPr>
+            </m:ctrlPr>
+          </m:sSupPr>
+          <m:e>
+            <m:r>
+              <w:rPr>
+                <w:rFonts w:ascii="Cambria Math" w:hAnsi="Cambria Math"/>
+              </w:rPr>
+              <m:t>10</m:t>
+            </m:r>
+          </m:e>
+          <m:sup>
+            <m:r>
+              <w:rPr>
+                <w:rFonts w:ascii="Cambria Math" w:hAnsi="Cambria Math"/>
+              </w:rPr>
+              <m:t>-5</m:t>
+            </m:r>
+          </m:sup>
+        </m:sSup>
+        <m:r>
+          <w:rPr>
+            <w:rFonts w:ascii="Cambria Math" w:hAnsi="Cambria Math"/>
+          </w:rPr>
+          <m:t>,</m:t>
+        </m:r>
+        <m:r>
+          <m:rPr>
+            <m:nor/>
+          </m:rPr>
+          <m:t>rtol</m:t>
+        </m:r>
+        <m:r>
+          <w:rPr>
+            <w:rFonts w:ascii="Cambria Math" w:hAnsi="Cambria Math"/>
+          </w:rPr>
+          <m:t>=0</m:t>
+        </m:r>
+      </m:oMath>
+      <w:r>
+        <w:rPr>
+          <w:rtl/>
+        </w:rPr>
+        <w:t>. השגיאות המוחלטות המרביות היו</w:t>
+      </w:r>
+    </w:p>
+    <w:p>
+      <w:pPr>
+        <w:bidi w:val="0"/>
+        <w:spacing w:before="60" w:after="60"/>
+        <w:jc w:val="center"/>
+      </w:pPr>
+      <m:oMathPara>
+        <m:oMathParaPr>
+          <m:jc m:val="center"/>
+        </m:oMathParaPr>
+        <m:oMath>
+          <m:m>
+            <m:mPr>
+              <m:plcHide m:val="1"/>
+              <m:mcs>
+                <m:mc>
+                  <m:mcPr>
+                    <m:count m:val="2"/>
+                    <m:mcJc m:val="center"/>
+                  </m:mcPr>
+                </m:mc>
+              </m:mcs>
+              <m:ctrlPr>
+                <w:rPr>
+                  <w:rFonts w:ascii="Cambria Math" w:hAnsi="Cambria Math"/>
+                </w:rPr>
+              </m:ctrlPr>
+            </m:mPr>
+            <m:mr>
+              <m:e>
+                <m:sSub>
+                  <m:sSubPr>
+                    <m:ctrlPr>
+                      <w:rPr>
+                        <w:rFonts w:ascii="Cambria Math" w:hAnsi="Cambria Math"/>
+                      </w:rPr>
+                    </m:ctrlPr>
+                  </m:sSubPr>
+                  <m:e>
+                    <m:r>
+                      <w:rPr>
+                        <w:rFonts w:ascii="Cambria Math" w:hAnsi="Cambria Math"/>
+                      </w:rPr>
+                      <m:t>ε</m:t>
+                    </m:r>
+                  </m:e>
+                  <m:sub>
+                    <m:r>
+                      <w:rPr>
+                        <w:rFonts w:ascii="Cambria Math" w:hAnsi="Cambria Math"/>
+                      </w:rPr>
+                      <m:t>L</m:t>
+                    </m:r>
+                  </m:sub>
+                </m:sSub>
+              </m:e>
+              <m:e>
+                <m:r>
+                  <w:rPr>
+                    <w:rFonts w:ascii="Cambria Math" w:hAnsi="Cambria Math"/>
+                  </w:rPr>
+                  <m:t>=1.1921·</m:t>
+                </m:r>
+                <m:sSup>
+                  <m:sSupPr>
+                    <m:ctrlPr>
+                      <w:rPr>
+                        <w:rFonts w:ascii="Cambria Math" w:hAnsi="Cambria Math"/>
+                      </w:rPr>
+                    </m:ctrlPr>
+                  </m:sSupPr>
+                  <m:e>
+                    <m:r>
+                      <w:rPr>
+                        <w:rFonts w:ascii="Cambria Math" w:hAnsi="Cambria Math"/>
+                      </w:rPr>
+                      <m:t>10</m:t>
+                    </m:r>
+                  </m:e>
+                  <m:sup>
+                    <m:r>
+                      <w:rPr>
+                        <w:rFonts w:ascii="Cambria Math" w:hAnsi="Cambria Math"/>
+                      </w:rPr>
+                      <m:t>-7</m:t>
+                    </m:r>
+                  </m:sup>
+                </m:sSup>
+                <m:r>
+                  <w:rPr>
+                    <w:rFonts w:ascii="Cambria Math" w:hAnsi="Cambria Math"/>
+                  </w:rPr>
+                  <m:t>,</m:t>
+                </m:r>
+              </m:e>
+            </m:mr>
+            <m:mr>
+              <m:e>
+                <m:sSub>
+                  <m:sSubPr>
+                    <m:ctrlPr>
+                      <w:rPr>
+                        <w:rFonts w:ascii="Cambria Math" w:hAnsi="Cambria Math"/>
+                      </w:rPr>
+                    </m:ctrlPr>
+                  </m:sSubPr>
+                  <m:e>
+                    <m:r>
+                      <w:rPr>
+                        <w:rFonts w:ascii="Cambria Math" w:hAnsi="Cambria Math"/>
+                      </w:rPr>
+                      <m:t>ε</m:t>
+                    </m:r>
+                  </m:e>
+                  <m:sub>
+                    <m:r>
+                      <w:rPr>
+                        <w:rFonts w:ascii="Cambria Math" w:hAnsi="Cambria Math"/>
+                      </w:rPr>
+                      <m:t>H</m:t>
+                    </m:r>
+                  </m:sub>
+                </m:sSub>
+              </m:e>
+              <m:e>
+                <m:r>
+                  <w:rPr>
+                    <w:rFonts w:ascii="Cambria Math" w:hAnsi="Cambria Math"/>
+                  </w:rPr>
+                  <m:t>=7.4506·</m:t>
+                </m:r>
+                <m:sSup>
+                  <m:sSupPr>
+                    <m:ctrlPr>
+                      <w:rPr>
+                        <w:rFonts w:ascii="Cambria Math" w:hAnsi="Cambria Math"/>
+                      </w:rPr>
+                    </m:ctrlPr>
+                  </m:sSupPr>
+                  <m:e>
+                    <m:r>
+                      <w:rPr>
+                        <w:rFonts w:ascii="Cambria Math" w:hAnsi="Cambria Math"/>
+                      </w:rPr>
+                      <m:t>10</m:t>
+                    </m:r>
+                  </m:e>
+                  <m:sup>
+                    <m:r>
+                      <w:rPr>
+                        <w:rFonts w:ascii="Cambria Math" w:hAnsi="Cambria Math"/>
+                      </w:rPr>
+                      <m:t>-8</m:t>
+                    </m:r>
+                  </m:sup>
+                </m:sSup>
+                <m:r>
+                  <w:rPr>
+                    <w:rFonts w:ascii="Cambria Math" w:hAnsi="Cambria Math"/>
+                  </w:rPr>
+                  <m:t>,</m:t>
+                </m:r>
+              </m:e>
+            </m:mr>
+            <m:mr>
+              <m:e>
+                <m:sSub>
+                  <m:sSubPr>
+                    <m:ctrlPr>
+                      <w:rPr>
+                        <w:rFonts w:ascii="Cambria Math" w:hAnsi="Cambria Math"/>
+                      </w:rPr>
+                    </m:ctrlPr>
+                  </m:sSubPr>
+                  <m:e>
+                    <m:r>
+                      <w:rPr>
+                        <w:rFonts w:ascii="Cambria Math" w:hAnsi="Cambria Math"/>
+                      </w:rPr>
+                      <m:t>ε</m:t>
+                    </m:r>
+                  </m:e>
+                  <m:sub>
+                    <m:r>
+                      <w:rPr>
+                        <w:rFonts w:ascii="Cambria Math" w:hAnsi="Cambria Math"/>
+                      </w:rPr>
+                      <m:t>F</m:t>
+                    </m:r>
+                  </m:sub>
+                </m:sSub>
+              </m:e>
+              <m:e>
+                <m:r>
+                  <w:rPr>
+                    <w:rFonts w:ascii="Cambria Math" w:hAnsi="Cambria Math"/>
+                  </w:rPr>
+                  <m:t>=2.9802·</m:t>
+                </m:r>
+                <m:sSup>
+                  <m:sSupPr>
+                    <m:ctrlPr>
+                      <w:rPr>
+                        <w:rFonts w:ascii="Cambria Math" w:hAnsi="Cambria Math"/>
+                      </w:rPr>
+                    </m:ctrlPr>
+                  </m:sSupPr>
+                  <m:e>
+                    <m:r>
+                      <w:rPr>
+                        <w:rFonts w:ascii="Cambria Math" w:hAnsi="Cambria Math"/>
+                      </w:rPr>
+                      <m:t>10</m:t>
+                    </m:r>
+                  </m:e>
+                  <m:sup>
+                    <m:r>
+                      <w:rPr>
+                        <w:rFonts w:ascii="Cambria Math" w:hAnsi="Cambria Math"/>
+                      </w:rPr>
+                      <m:t>-8</m:t>
+                    </m:r>
+                  </m:sup>
+                </m:sSup>
+                <m:r>
+                  <w:rPr>
+                    <w:rFonts w:ascii="Cambria Math" w:hAnsi="Cambria Math"/>
+                  </w:rPr>
+                  <m:t>.</m:t>
+                </m:r>
+              </m:e>
+            </m:mr>
+          </m:m>
+        </m:oMath>
+      </m:oMathPara>
+    </w:p>
+    <w:p>
+      <w:r>
+        <w:rPr>
+          <w:rtl/>
+        </w:rPr>
+        <w:t>שלוש השגיאות קטנות מן הסבילות, ולכן כל הבדיקות עברו. גם הגרדיאנטים ביחס לקלט ולפרמטרים היו סופיים.</w:t>
       </w:r>
     </w:p>
     <w:sectPr>

</xml_diff>

<commit_message>
Unify Question 3 output dimensions
</commit_message>
<xml_diff>
--- a/HW4-Solution.docx
+++ b/HW4-Solution.docx
@@ -74,7 +74,7 @@
         </w:rPr>
         <w:fldChar w:fldCharType="separate"/>
       </w:r>
-      <w:hyperlink w:anchor="_Toc236071707" w:history="1">
+      <w:hyperlink w:anchor="_Toc236318301" w:history="1">
         <w:r>
           <w:rPr>
             <w:rStyle w:val="Hyperlink"/>
@@ -102,7 +102,7 @@
             <w:noProof/>
             <w:webHidden/>
           </w:rPr>
-          <w:instrText xml:space="preserve"> PAGEREF _Toc236071707 \h </w:instrText>
+          <w:instrText xml:space="preserve"> PAGEREF _Toc236318301 \h </w:instrText>
         </w:r>
         <w:r>
           <w:rPr>
@@ -146,7 +146,7 @@
           <w14:ligatures w14:val="standardContextual"/>
         </w:rPr>
       </w:pPr>
-      <w:hyperlink w:anchor="_Toc236071708" w:history="1">
+      <w:hyperlink w:anchor="_Toc236318302" w:history="1">
         <w:r>
           <w:rPr>
             <w:rStyle w:val="Hyperlink"/>
@@ -174,7 +174,7 @@
             <w:noProof/>
             <w:webHidden/>
           </w:rPr>
-          <w:instrText xml:space="preserve"> PAGEREF _Toc236071708 \h </w:instrText>
+          <w:instrText xml:space="preserve"> PAGEREF _Toc236318302 \h </w:instrText>
         </w:r>
         <w:r>
           <w:rPr>
@@ -218,7 +218,7 @@
           <w14:ligatures w14:val="standardContextual"/>
         </w:rPr>
       </w:pPr>
-      <w:hyperlink w:anchor="_Toc236071709" w:history="1">
+      <w:hyperlink w:anchor="_Toc236318303" w:history="1">
         <w:r>
           <w:rPr>
             <w:rStyle w:val="Hyperlink"/>
@@ -246,7 +246,7 @@
             <w:noProof/>
             <w:webHidden/>
           </w:rPr>
-          <w:instrText xml:space="preserve"> PAGEREF _Toc236071709 \h </w:instrText>
+          <w:instrText xml:space="preserve"> PAGEREF _Toc236318303 \h </w:instrText>
         </w:r>
         <w:r>
           <w:rPr>
@@ -290,7 +290,7 @@
         </w:rPr>
         <w:fldChar w:fldCharType="end"/>
       </w:r>
-      <w:bookmarkStart w:id="1" w:name="_Toc236071707"/>
+      <w:bookmarkStart w:id="1" w:name="_Toc236318301"/>
       <w:r>
         <w:rPr>
           <w:rtl/>
@@ -5158,6 +5158,7 @@
             <w:rPr>
               <w:rFonts w:ascii="Cambria Math" w:hAnsi="Cambria Math"/>
             </w:rPr>
+            <w:lastRenderedPageBreak/>
             <m:t>⟨</m:t>
           </m:r>
           <m:sSub>
@@ -6736,12 +6737,13 @@
         </w:rPr>
       </w:pPr>
       <w:bookmarkStart w:id="2" w:name="שאלה-2"/>
-      <w:bookmarkStart w:id="3" w:name="_Toc236071708"/>
+      <w:bookmarkStart w:id="3" w:name="_Toc236318302"/>
       <w:bookmarkEnd w:id="0"/>
       <w:r>
         <w:rPr>
           <w:rtl/>
         </w:rPr>
+        <w:lastRenderedPageBreak/>
         <w:t>שאלה 2</w:t>
       </w:r>
       <w:bookmarkEnd w:id="3"/>
@@ -7532,6 +7534,7 @@
         <w:rPr>
           <w:rtl/>
         </w:rPr>
+        <w:lastRenderedPageBreak/>
         <w:t>סעיף א. חבורת הסימטריה.</w:t>
       </w:r>
     </w:p>
@@ -10730,6 +10733,7 @@
         <w:rPr>
           <w:rtl/>
         </w:rPr>
+        <w:lastRenderedPageBreak/>
         <w:t xml:space="preserve">כעת ההטיה. הצבת </w:t>
       </w:r>
       <m:oMath>
@@ -13293,6 +13297,7 @@
         <w:rPr>
           <w:noProof/>
         </w:rPr>
+        <w:lastRenderedPageBreak/>
         <w:drawing>
           <wp:inline distT="0" distB="0" distL="0" distR="0" wp14:anchorId="4BF4112C" wp14:editId="6D43A830">
             <wp:extent cx="5806440" cy="3483864"/>
@@ -13490,6 +13495,7 @@
         <w:rPr>
           <w:rtl/>
         </w:rPr>
+        <w:lastRenderedPageBreak/>
         <w:t>סעיף ד. שכבה לינארית אינווריאנטית.</w:t>
       </w:r>
     </w:p>
@@ -14798,6 +14804,7 @@
         <w:rPr>
           <w:rtl/>
         </w:rPr>
+        <w:lastRenderedPageBreak/>
         <w:t>סעיף ה. טנזורים תלת-ממדיים.</w:t>
       </w:r>
     </w:p>
@@ -14910,11 +14917,12 @@
           <w:rtl/>
         </w:rPr>
       </w:pPr>
-      <w:bookmarkStart w:id="4" w:name="_Toc236071709"/>
-      <w:r>
-        <w:rPr>
-          <w:rtl/>
-        </w:rPr>
+      <w:bookmarkStart w:id="4" w:name="_Toc236318303"/>
+      <w:r>
+        <w:rPr>
+          <w:rtl/>
+        </w:rPr>
+        <w:lastRenderedPageBreak/>
         <w:t>שאלה 3</w:t>
       </w:r>
       <w:bookmarkEnd w:id="4"/>
@@ -14996,6 +15004,7 @@
         <w:rPr>
           <w:noProof/>
         </w:rPr>
+        <w:lastRenderedPageBreak/>
         <w:drawing>
           <wp:inline distT="0" distB="0" distL="0" distR="0" wp14:anchorId="7920EF46" wp14:editId="7F8840BE">
             <wp:extent cx="5532120" cy="829138"/>
@@ -15350,7 +15359,7 @@
           <w:rPr>
             <w:rFonts w:ascii="Cambria Math" w:hAnsi="Cambria Math" w:cs="Cambria Math"/>
           </w:rPr>
-          <m:t>p = 4</m:t>
+          <m:t>p = 3</m:t>
         </m:r>
       </m:oMath>
       <w:r>
@@ -15572,7 +15581,7 @@
               <w:rPr>
                 <w:rFonts w:ascii="Cambria Math" w:hAnsi="Cambria Math"/>
               </w:rPr>
-              <m:t>4</m:t>
+              <m:t>3</m:t>
             </m:r>
           </m:sup>
         </m:sSup>
@@ -15644,7 +15653,7 @@
           <w:rPr>
             <w:rFonts w:ascii="Cambria Math" w:hAnsi="Cambria Math"/>
           </w:rPr>
-          <m:t>4</m:t>
+          <m:t>3</m:t>
         </m:r>
       </m:oMath>
       <w:r>
@@ -16122,6 +16131,7 @@
         <w:rPr>
           <w:rtl/>
         </w:rPr>
+        <w:lastRenderedPageBreak/>
         <w:t xml:space="preserve">במימוש יצרנו את כל הפרמוטציות של שבע השורות, הפעלנו את </w:t>
       </w:r>
       <m:oMath>
@@ -16292,7 +16302,7 @@
           <w:rPr>
             <w:rFonts w:ascii="Cambria Math" w:hAnsi="Cambria Math"/>
           </w:rPr>
-          <m:t>3.73·</m:t>
+          <m:t>2.98·</m:t>
         </m:r>
         <m:sSup>
           <m:sSupPr>
@@ -16315,7 +16325,7 @@
               <w:rPr>
                 <w:rFonts w:ascii="Cambria Math" w:hAnsi="Cambria Math"/>
               </w:rPr>
-              <m:t>-9</m:t>
+              <m:t>-8</m:t>
             </m:r>
           </m:sup>
         </m:sSup>
@@ -17170,7 +17180,7 @@
         <w:rPr>
           <w:rtl/>
         </w:rPr>
-        <w:t xml:space="preserve"> היא שונות האוכלוסייה של הפרשי הפלט. את המקדם המתאים לאחוזון 95% של השגיאה המרבית בארבע קואורדינטות הפלט כיילנו בהרצות המקדימות, וקיבלנו </w:t>
+        <w:t xml:space="preserve"> היא שונות האוכלוסייה של הפרשי הפלט. את המקדם המתאים לאחוזון 95% של השגיאה המרבית בשלוש קואורדינטות הפלט כיילנו בהרצות המקדימות, וקיבלנו </w:t>
       </w:r>
       <m:oMath>
         <m:sSub>
@@ -17202,7 +17212,7 @@
           <w:rPr>
             <w:rFonts w:ascii="Cambria Math" w:hAnsi="Cambria Math"/>
           </w:rPr>
-          <m:t>≈0.761</m:t>
+          <m:t>≈0.7618</m:t>
         </m:r>
       </m:oMath>
       <w:r>
@@ -17252,7 +17262,7 @@
             <w:rPr>
               <w:rFonts w:ascii="Cambria Math" w:hAnsi="Cambria Math"/>
             </w:rPr>
-            <m:t>(B)≈0.761</m:t>
+            <m:t>(B)≈0.7618</m:t>
           </m:r>
           <m:rad>
             <m:radPr>
@@ -17324,7 +17334,7 @@
             <w:rPr>
               <w:rFonts w:ascii="Cambria Math" w:hAnsi="Cambria Math"/>
             </w:rPr>
-            <m:t>0.761</m:t>
+            <m:t>0.7618</m:t>
           </m:r>
           <m:rad>
             <m:radPr>
@@ -17510,7 +17520,7 @@
                             <w:rPr>
                               <w:rFonts w:ascii="Cambria Math" w:hAnsi="Cambria Math"/>
                             </w:rPr>
-                            <m:t>0.761</m:t>
+                            <m:t>0.7618</m:t>
                           </m:r>
                         </m:den>
                       </m:f>
@@ -17538,7 +17548,7 @@
             <w:rPr>
               <w:rFonts w:ascii="Cambria Math" w:hAnsi="Cambria Math"/>
             </w:rPr>
-            <m:t>≈2695.3.</m:t>
+            <m:t>≈2697.7.</m:t>
           </m:r>
         </m:oMath>
       </m:oMathPara>
@@ -17548,7 +17558,7 @@
         <w:rPr>
           <w:rtl/>
         </w:rPr>
-        <w:t xml:space="preserve">לכן הגודל השלם המינימלי המוערך הוא 2696, ובחרנו בערך העגול </w:t>
+        <w:t xml:space="preserve">לכן הגודל השלם המינימלי המוערך הוא 2698, ובחרנו בערך העגול </w:t>
       </w:r>
       <m:oMath>
         <m:r>
@@ -17569,7 +17579,7 @@
           <w:rPr>
             <w:rFonts w:ascii="Cambria Math" w:hAnsi="Cambria Math"/>
           </w:rPr>
-          <m:t>9.98·</m:t>
+          <m:t>9.99·</m:t>
         </m:r>
         <m:sSup>
           <m:sSupPr>
@@ -17609,6 +17619,7 @@
         <w:rPr>
           <w:rtl/>
         </w:rPr>
+        <w:lastRenderedPageBreak/>
         <w:t>במימוש השתמשנו ב-</w:t>
       </w:r>
       <m:oMath>
@@ -17616,7 +17627,7 @@
           <w:rPr>
             <w:rFonts w:ascii="Cambria Math" w:hAnsi="Cambria Math"/>
           </w:rPr>
-          <m:t>n=7,d=3,p=4,m=32</m:t>
+          <m:t>n=7,d=3,p=3,m=32</m:t>
         </m:r>
       </m:oMath>
       <w:r>
@@ -17821,7 +17832,7 @@
                 <w:rPr>
                   <w:rFonts w:ascii="Cambria Math" w:hAnsi="Cambria Math"/>
                 </w:rPr>
-                <m:t>1≤j≤4</m:t>
+                <m:t>1≤j≤3</m:t>
               </m:r>
             </m:lim>
           </m:limLow>
@@ -18026,7 +18037,7 @@
             <w:rPr>
               <w:rFonts w:ascii="Cambria Math" w:hAnsi="Cambria Math"/>
             </w:rPr>
-            <m:t>0.00699985&lt;</m:t>
+            <m:t>0.00395261&lt;</m:t>
           </m:r>
           <m:sSup>
             <m:sSupPr>
@@ -19042,7 +19053,7 @@
           <w:rPr>
             <w:rFonts w:ascii="Cambria Math" w:hAnsi="Cambria Math"/>
           </w:rPr>
-          <m:t>3→55→4</m:t>
+          <m:t>3→62→3</m:t>
         </m:r>
       </m:oMath>
       <w:r>
@@ -19276,7 +19287,7 @@
         <w:rPr>
           <w:rtl/>
         </w:rPr>
-        <w:t>מספר הפרמטרים נספר לפי הנוסחה שבשאלה, כולל ההטיות. למיצוע אין פרמטרים, והרוחב 55 נבחר כדי להתאים בקירוב למספר הפרמטרים של ה-MLP מסעיפים א-ג:</w:t>
+        <w:t>מספר הפרמטרים נספר לפי הנוסחה שבשאלה, כולל ההטיות. למיצוע אין פרמטרים, והרוחב 62 נבחר כדי להתאים בקירוב למספר הפרמטרים של ה-MLP מסעיפים א-ג:</w:t>
       </w:r>
     </w:p>
     <w:p>
@@ -19340,7 +19351,7 @@
                   <w:rPr>
                     <w:rFonts w:ascii="Cambria Math" w:hAnsi="Cambria Math"/>
                   </w:rPr>
-                  <m:t>=(2·3·55+55)+(2·55·4+4)=829,</m:t>
+                  <m:t>=(2·3·62+62)+(2·62·3+3)=809,</m:t>
                 </m:r>
               </m:e>
             </m:mr>
@@ -19377,7 +19388,7 @@
                   <w:rPr>
                     <w:rFonts w:ascii="Cambria Math" w:hAnsi="Cambria Math"/>
                   </w:rPr>
-                  <m:t>=(21·32+32)+(32·4+4)=836.</m:t>
+                  <m:t>=(21·32+32)+(32·3+3)=803.</m:t>
                 </m:r>
               </m:e>
             </m:mr>
@@ -19397,7 +19408,7 @@
           <w:rPr>
             <w:rFonts w:ascii="Cambria Math" w:hAnsi="Cambria Math"/>
           </w:rPr>
-          <m:t>n=7,d=3,p=4,</m:t>
+          <m:t>n=7,d=3,p=3,</m:t>
         </m:r>
         <m:r>
           <m:rPr>
@@ -19611,7 +19622,7 @@
                   <w:rPr>
                     <w:rFonts w:ascii="Cambria Math" w:hAnsi="Cambria Math"/>
                   </w:rPr>
-                  <m:t>=7.4506·</m:t>
+                  <m:t>=1.1921·</m:t>
                 </m:r>
                 <m:sSup>
                   <m:sSupPr>
@@ -19634,7 +19645,7 @@
                       <w:rPr>
                         <w:rFonts w:ascii="Cambria Math" w:hAnsi="Cambria Math"/>
                       </w:rPr>
-                      <m:t>-8</m:t>
+                      <m:t>-7</m:t>
                     </m:r>
                   </m:sup>
                 </m:sSup>
@@ -19679,38 +19690,7 @@
                   <w:rPr>
                     <w:rFonts w:ascii="Cambria Math" w:hAnsi="Cambria Math"/>
                   </w:rPr>
-                  <m:t>=2.9802·</m:t>
-                </m:r>
-                <m:sSup>
-                  <m:sSupPr>
-                    <m:ctrlPr>
-                      <w:rPr>
-                        <w:rFonts w:ascii="Cambria Math" w:hAnsi="Cambria Math"/>
-                      </w:rPr>
-                    </m:ctrlPr>
-                  </m:sSupPr>
-                  <m:e>
-                    <m:r>
-                      <w:rPr>
-                        <w:rFonts w:ascii="Cambria Math" w:hAnsi="Cambria Math"/>
-                      </w:rPr>
-                      <m:t>10</m:t>
-                    </m:r>
-                  </m:e>
-                  <m:sup>
-                    <m:r>
-                      <w:rPr>
-                        <w:rFonts w:ascii="Cambria Math" w:hAnsi="Cambria Math"/>
-                      </w:rPr>
-                      <m:t>-8</m:t>
-                    </m:r>
-                  </m:sup>
-                </m:sSup>
-                <m:r>
-                  <w:rPr>
-                    <w:rFonts w:ascii="Cambria Math" w:hAnsi="Cambria Math"/>
-                  </w:rPr>
-                  <m:t>.</m:t>
+                  <m:t>=0.</m:t>
                 </m:r>
               </m:e>
             </m:mr>

</xml_diff>

<commit_message>
Complete and document HW4 question 3e
</commit_message>
<xml_diff>
--- a/HW4-Solution.docx
+++ b/HW4-Solution.docx
@@ -74,7 +74,7 @@
         </w:rPr>
         <w:fldChar w:fldCharType="separate"/>
       </w:r>
-      <w:hyperlink w:anchor="_Toc236318301" w:history="1">
+      <w:hyperlink w:anchor="_Toc236426194" w:history="1">
         <w:r>
           <w:rPr>
             <w:rStyle w:val="Hyperlink"/>
@@ -102,7 +102,7 @@
             <w:noProof/>
             <w:webHidden/>
           </w:rPr>
-          <w:instrText xml:space="preserve"> PAGEREF _Toc236318301 \h </w:instrText>
+          <w:instrText xml:space="preserve"> PAGEREF _Toc236426194 \h </w:instrText>
         </w:r>
         <w:r>
           <w:rPr>
@@ -146,7 +146,7 @@
           <w14:ligatures w14:val="standardContextual"/>
         </w:rPr>
       </w:pPr>
-      <w:hyperlink w:anchor="_Toc236318302" w:history="1">
+      <w:hyperlink w:anchor="_Toc236426195" w:history="1">
         <w:r>
           <w:rPr>
             <w:rStyle w:val="Hyperlink"/>
@@ -174,7 +174,7 @@
             <w:noProof/>
             <w:webHidden/>
           </w:rPr>
-          <w:instrText xml:space="preserve"> PAGEREF _Toc236318302 \h </w:instrText>
+          <w:instrText xml:space="preserve"> PAGEREF _Toc236426195 \h </w:instrText>
         </w:r>
         <w:r>
           <w:rPr>
@@ -218,7 +218,7 @@
           <w14:ligatures w14:val="standardContextual"/>
         </w:rPr>
       </w:pPr>
-      <w:hyperlink w:anchor="_Toc236318303" w:history="1">
+      <w:hyperlink w:anchor="_Toc236426196" w:history="1">
         <w:r>
           <w:rPr>
             <w:rStyle w:val="Hyperlink"/>
@@ -246,7 +246,7 @@
             <w:noProof/>
             <w:webHidden/>
           </w:rPr>
-          <w:instrText xml:space="preserve"> PAGEREF _Toc236318303 \h </w:instrText>
+          <w:instrText xml:space="preserve"> PAGEREF _Toc236426196 \h </w:instrText>
         </w:r>
         <w:r>
           <w:rPr>
@@ -290,7 +290,7 @@
         </w:rPr>
         <w:fldChar w:fldCharType="end"/>
       </w:r>
-      <w:bookmarkStart w:id="1" w:name="_Toc236318301"/>
+      <w:bookmarkStart w:id="1" w:name="_Toc236426194"/>
       <w:r>
         <w:rPr>
           <w:rtl/>
@@ -5158,7 +5158,6 @@
             <w:rPr>
               <w:rFonts w:ascii="Cambria Math" w:hAnsi="Cambria Math"/>
             </w:rPr>
-            <w:lastRenderedPageBreak/>
             <m:t>⟨</m:t>
           </m:r>
           <m:sSub>
@@ -6737,13 +6736,12 @@
         </w:rPr>
       </w:pPr>
       <w:bookmarkStart w:id="2" w:name="שאלה-2"/>
-      <w:bookmarkStart w:id="3" w:name="_Toc236318302"/>
+      <w:bookmarkStart w:id="3" w:name="_Toc236426195"/>
       <w:bookmarkEnd w:id="0"/>
       <w:r>
         <w:rPr>
           <w:rtl/>
         </w:rPr>
-        <w:lastRenderedPageBreak/>
         <w:t>שאלה 2</w:t>
       </w:r>
       <w:bookmarkEnd w:id="3"/>
@@ -7534,7 +7532,6 @@
         <w:rPr>
           <w:rtl/>
         </w:rPr>
-        <w:lastRenderedPageBreak/>
         <w:t>סעיף א. חבורת הסימטריה.</w:t>
       </w:r>
     </w:p>
@@ -10733,7 +10730,6 @@
         <w:rPr>
           <w:rtl/>
         </w:rPr>
-        <w:lastRenderedPageBreak/>
         <w:t xml:space="preserve">כעת ההטיה. הצבת </w:t>
       </w:r>
       <m:oMath>
@@ -13297,7 +13293,6 @@
         <w:rPr>
           <w:noProof/>
         </w:rPr>
-        <w:lastRenderedPageBreak/>
         <w:drawing>
           <wp:inline distT="0" distB="0" distL="0" distR="0" wp14:anchorId="4BF4112C" wp14:editId="6D43A830">
             <wp:extent cx="5806440" cy="3483864"/>
@@ -13495,7 +13490,6 @@
         <w:rPr>
           <w:rtl/>
         </w:rPr>
-        <w:lastRenderedPageBreak/>
         <w:t>סעיף ד. שכבה לינארית אינווריאנטית.</w:t>
       </w:r>
     </w:p>
@@ -14804,7 +14798,6 @@
         <w:rPr>
           <w:rtl/>
         </w:rPr>
-        <w:lastRenderedPageBreak/>
         <w:t>סעיף ה. טנזורים תלת-ממדיים.</w:t>
       </w:r>
     </w:p>
@@ -14917,12 +14910,11 @@
           <w:rtl/>
         </w:rPr>
       </w:pPr>
-      <w:bookmarkStart w:id="4" w:name="_Toc236318303"/>
-      <w:r>
-        <w:rPr>
-          <w:rtl/>
-        </w:rPr>
-        <w:lastRenderedPageBreak/>
+      <w:bookmarkStart w:id="4" w:name="_Toc236426196"/>
+      <w:r>
+        <w:rPr>
+          <w:rtl/>
+        </w:rPr>
         <w:t>שאלה 3</w:t>
       </w:r>
       <w:bookmarkEnd w:id="4"/>
@@ -15004,7 +14996,6 @@
         <w:rPr>
           <w:noProof/>
         </w:rPr>
-        <w:lastRenderedPageBreak/>
         <w:drawing>
           <wp:inline distT="0" distB="0" distL="0" distR="0" wp14:anchorId="7920EF46" wp14:editId="7F8840BE">
             <wp:extent cx="5532120" cy="829138"/>
@@ -16131,7 +16122,6 @@
         <w:rPr>
           <w:rtl/>
         </w:rPr>
-        <w:lastRenderedPageBreak/>
         <w:t xml:space="preserve">במימוש יצרנו את כל הפרמוטציות של שבע השורות, הפעלנו את </w:t>
       </w:r>
       <m:oMath>
@@ -17619,7 +17609,6 @@
         <w:rPr>
           <w:rtl/>
         </w:rPr>
-        <w:lastRenderedPageBreak/>
         <w:t>במימוש השתמשנו ב-</w:t>
       </w:r>
       <m:oMath>
@@ -19706,13 +19695,1327 @@
         <w:t>שלוש השגיאות קטנות מן הסבילות, ולכן כל הבדיקות עברו. גם הגרדיאנטים ביחס לקלט ולפרמטרים היו סופיים.</w:t>
       </w:r>
     </w:p>
+    <w:p>
+      <w:pPr>
+        <w:pStyle w:val="Heading2"/>
+        <w:rPr>
+          <w:rtl/>
+        </w:rPr>
+      </w:pPr>
+      <w:r>
+        <w:rPr>
+          <w:rtl/>
+        </w:rPr>
+        <w:t>סעיף ה. הגדלת נתונים באמצעות תמורות.</w:t>
+      </w:r>
+    </w:p>
+    <w:p>
+      <w:pPr>
+        <w:keepLines/>
+      </w:pPr>
+      <w:r>
+        <w:rPr>
+          <w:rtl/>
+        </w:rPr>
+        <w:t xml:space="preserve">בחרנו ב-MLP רגיל שאינו אינווריאנטי לפי המבנה שלו. הקלט </w:t>
+      </w:r>
+      <m:oMath>
+        <m:r>
+          <w:rPr>
+            <w:rFonts w:ascii="Cambria Math" w:hAnsi="Cambria Math"/>
+          </w:rPr>
+          <m:t>X∈</m:t>
+        </m:r>
+        <m:sSup>
+          <m:sSupPr>
+            <m:ctrlPr>
+              <w:rPr>
+                <w:rFonts w:ascii="Cambria Math" w:hAnsi="Cambria Math"/>
+              </w:rPr>
+            </m:ctrlPr>
+          </m:sSupPr>
+          <m:e>
+            <m:r>
+              <m:rPr>
+                <m:scr m:val="double-struck"/>
+              </m:rPr>
+              <w:rPr>
+                <w:rFonts w:ascii="Cambria Math" w:hAnsi="Cambria Math"/>
+              </w:rPr>
+              <m:t>R</m:t>
+            </m:r>
+          </m:e>
+          <m:sup>
+            <m:r>
+              <w:rPr>
+                <w:rFonts w:ascii="Cambria Math" w:hAnsi="Cambria Math"/>
+              </w:rPr>
+              <m:t>7×3</m:t>
+            </m:r>
+          </m:sup>
+        </m:sSup>
+      </m:oMath>
+      <w:r>
+        <w:rPr>
+          <w:rtl/>
+        </w:rPr>
+        <w:t xml:space="preserve"> משוטח לווקטור באורך 21, והרשת היא במבנה</w:t>
+      </w:r>
+    </w:p>
+    <w:p>
+      <w:pPr>
+        <w:bidi w:val="0"/>
+        <w:spacing w:before="60" w:after="60"/>
+        <w:jc w:val="center"/>
+      </w:pPr>
+      <m:oMathPara>
+        <m:oMathParaPr>
+          <m:jc m:val="center"/>
+        </m:oMathParaPr>
+        <m:oMath>
+          <m:r>
+            <w:rPr>
+              <w:rFonts w:ascii="Cambria Math" w:hAnsi="Cambria Math"/>
+            </w:rPr>
+            <m:t>21→32→3</m:t>
+          </m:r>
+        </m:oMath>
+      </m:oMathPara>
+    </w:p>
+    <w:p>
+      <w:r>
+        <w:rPr>
+          <w:rtl/>
+        </w:rPr>
+        <w:t xml:space="preserve">עם ReLU בין שתי השכבות הלינאריות. יצרנו 1,000 דוגמאות בלתי־תלויות וחילקנו אותן ביחס 700/150/150 לקבוצות </w:t>
+      </w:r>
+      <w:r>
+        <w:t>train, validation, and test</w:t>
+      </w:r>
+      <w:r>
+        <w:rPr>
+          <w:rtl/>
+        </w:rPr>
+        <w:t>, בהתאמה. לכל דוגמה דגמנו תוחלת ושונות חדשות, ולאחר מכן דגמנו את שבע שורות הקלט לפי</w:t>
+      </w:r>
+    </w:p>
+    <w:p>
+      <w:pPr>
+        <w:bidi w:val="0"/>
+        <w:spacing w:before="60" w:after="60"/>
+        <w:jc w:val="center"/>
+      </w:pPr>
+      <m:oMathPara>
+        <m:oMathParaPr>
+          <m:jc m:val="center"/>
+        </m:oMathParaPr>
+        <m:oMath>
+          <m:m>
+            <m:mPr>
+              <m:plcHide m:val="1"/>
+              <m:mcs>
+                <m:mc>
+                  <m:mcPr>
+                    <m:count m:val="2"/>
+                    <m:mcJc m:val="center"/>
+                  </m:mcPr>
+                </m:mc>
+              </m:mcs>
+              <m:ctrlPr>
+                <w:rPr>
+                  <w:rFonts w:ascii="Cambria Math" w:hAnsi="Cambria Math"/>
+                </w:rPr>
+              </m:ctrlPr>
+            </m:mPr>
+            <m:mr>
+              <m:e>
+                <m:sSup>
+                  <m:sSupPr>
+                    <m:ctrlPr>
+                      <w:rPr>
+                        <w:rFonts w:ascii="Cambria Math" w:hAnsi="Cambria Math"/>
+                      </w:rPr>
+                    </m:ctrlPr>
+                  </m:sSupPr>
+                  <m:e>
+                    <m:r>
+                      <w:rPr>
+                        <w:rFonts w:ascii="Cambria Math" w:hAnsi="Cambria Math"/>
+                      </w:rPr>
+                      <m:t>μ</m:t>
+                    </m:r>
+                  </m:e>
+                  <m:sup>
+                    <m:d>
+                      <m:dPr>
+                        <m:ctrlPr>
+                          <w:rPr>
+                            <w:rFonts w:ascii="Cambria Math" w:hAnsi="Cambria Math"/>
+                          </w:rPr>
+                        </m:ctrlPr>
+                      </m:dPr>
+                      <m:e>
+                        <m:r>
+                          <w:rPr>
+                            <w:rFonts w:ascii="Cambria Math" w:hAnsi="Cambria Math"/>
+                          </w:rPr>
+                          <m:t>r</m:t>
+                        </m:r>
+                      </m:e>
+                    </m:d>
+                  </m:sup>
+                </m:sSup>
+              </m:e>
+              <m:e>
+                <m:r>
+                  <w:rPr>
+                    <w:rFonts w:ascii="Cambria Math" w:hAnsi="Cambria Math"/>
+                  </w:rPr>
+                  <m:t>∼</m:t>
+                </m:r>
+                <m:r>
+                  <m:rPr>
+                    <m:sty m:val="p"/>
+                  </m:rPr>
+                  <w:rPr>
+                    <w:rFonts w:ascii="Cambria Math" w:hAnsi="Cambria Math"/>
+                  </w:rPr>
+                  <m:t>N</m:t>
+                </m:r>
+                <m:r>
+                  <w:rPr>
+                    <w:rFonts w:ascii="Cambria Math" w:hAnsi="Cambria Math"/>
+                  </w:rPr>
+                  <m:t>(0,</m:t>
+                </m:r>
+                <m:sSub>
+                  <m:sSubPr>
+                    <m:ctrlPr>
+                      <w:rPr>
+                        <w:rFonts w:ascii="Cambria Math" w:hAnsi="Cambria Math"/>
+                      </w:rPr>
+                    </m:ctrlPr>
+                  </m:sSubPr>
+                  <m:e>
+                    <m:r>
+                      <w:rPr>
+                        <w:rFonts w:ascii="Cambria Math" w:hAnsi="Cambria Math"/>
+                      </w:rPr>
+                      <m:t>I</m:t>
+                    </m:r>
+                  </m:e>
+                  <m:sub>
+                    <m:r>
+                      <w:rPr>
+                        <w:rFonts w:ascii="Cambria Math" w:hAnsi="Cambria Math"/>
+                      </w:rPr>
+                      <m:t>3</m:t>
+                    </m:r>
+                  </m:sub>
+                </m:sSub>
+                <m:r>
+                  <w:rPr>
+                    <w:rFonts w:ascii="Cambria Math" w:hAnsi="Cambria Math"/>
+                  </w:rPr>
+                  <m:t>),</m:t>
+                </m:r>
+              </m:e>
+            </m:mr>
+            <m:mr>
+              <m:e>
+                <m:sSubSup>
+                  <m:sSubSupPr>
+                    <m:ctrlPr>
+                      <w:rPr>
+                        <w:rFonts w:ascii="Cambria Math" w:hAnsi="Cambria Math"/>
+                      </w:rPr>
+                    </m:ctrlPr>
+                  </m:sSubSupPr>
+                  <m:e>
+                    <m:r>
+                      <w:rPr>
+                        <w:rFonts w:ascii="Cambria Math" w:hAnsi="Cambria Math"/>
+                      </w:rPr>
+                      <m:t>v</m:t>
+                    </m:r>
+                  </m:e>
+                  <m:sub>
+                    <m:r>
+                      <w:rPr>
+                        <w:rFonts w:ascii="Cambria Math" w:hAnsi="Cambria Math"/>
+                      </w:rPr>
+                      <m:t>c</m:t>
+                    </m:r>
+                  </m:sub>
+                  <m:sup>
+                    <m:d>
+                      <m:dPr>
+                        <m:ctrlPr>
+                          <w:rPr>
+                            <w:rFonts w:ascii="Cambria Math" w:hAnsi="Cambria Math"/>
+                          </w:rPr>
+                        </m:ctrlPr>
+                      </m:dPr>
+                      <m:e>
+                        <m:r>
+                          <w:rPr>
+                            <w:rFonts w:ascii="Cambria Math" w:hAnsi="Cambria Math"/>
+                          </w:rPr>
+                          <m:t>r</m:t>
+                        </m:r>
+                      </m:e>
+                    </m:d>
+                  </m:sup>
+                </m:sSubSup>
+              </m:e>
+              <m:e>
+                <m:r>
+                  <w:rPr>
+                    <w:rFonts w:ascii="Cambria Math" w:hAnsi="Cambria Math"/>
+                  </w:rPr>
+                  <m:t>∼</m:t>
+                </m:r>
+                <m:r>
+                  <m:rPr>
+                    <m:nor/>
+                  </m:rPr>
+                  <m:t>Rayleigh</m:t>
+                </m:r>
+                <m:r>
+                  <w:rPr>
+                    <w:rFonts w:ascii="Cambria Math" w:hAnsi="Cambria Math"/>
+                  </w:rPr>
+                  <m:t>(1),</m:t>
+                </m:r>
+              </m:e>
+            </m:mr>
+            <m:mr>
+              <m:e>
+                <m:sSubSup>
+                  <m:sSubSupPr>
+                    <m:ctrlPr>
+                      <w:rPr>
+                        <w:rFonts w:ascii="Cambria Math" w:hAnsi="Cambria Math"/>
+                      </w:rPr>
+                    </m:ctrlPr>
+                  </m:sSubSupPr>
+                  <m:e>
+                    <m:r>
+                      <w:rPr>
+                        <w:rFonts w:ascii="Cambria Math" w:hAnsi="Cambria Math"/>
+                      </w:rPr>
+                      <m:t>X</m:t>
+                    </m:r>
+                  </m:e>
+                  <m:sub>
+                    <m:r>
+                      <w:rPr>
+                        <w:rFonts w:ascii="Cambria Math" w:hAnsi="Cambria Math"/>
+                      </w:rPr>
+                      <m:t>i</m:t>
+                    </m:r>
+                  </m:sub>
+                  <m:sup>
+                    <m:d>
+                      <m:dPr>
+                        <m:ctrlPr>
+                          <w:rPr>
+                            <w:rFonts w:ascii="Cambria Math" w:hAnsi="Cambria Math"/>
+                          </w:rPr>
+                        </m:ctrlPr>
+                      </m:dPr>
+                      <m:e>
+                        <m:r>
+                          <w:rPr>
+                            <w:rFonts w:ascii="Cambria Math" w:hAnsi="Cambria Math"/>
+                          </w:rPr>
+                          <m:t>r</m:t>
+                        </m:r>
+                      </m:e>
+                    </m:d>
+                  </m:sup>
+                </m:sSubSup>
+              </m:e>
+              <m:e>
+                <m:r>
+                  <w:rPr>
+                    <w:rFonts w:ascii="Cambria Math" w:hAnsi="Cambria Math"/>
+                  </w:rPr>
+                  <m:t>∼</m:t>
+                </m:r>
+                <m:r>
+                  <m:rPr>
+                    <m:sty m:val="p"/>
+                  </m:rPr>
+                  <w:rPr>
+                    <w:rFonts w:ascii="Cambria Math" w:hAnsi="Cambria Math"/>
+                  </w:rPr>
+                  <m:t>N</m:t>
+                </m:r>
+                <m:r>
+                  <w:rPr>
+                    <w:rFonts w:ascii="Cambria Math" w:hAnsi="Cambria Math"/>
+                  </w:rPr>
+                  <m:t>(</m:t>
+                </m:r>
+                <m:sSup>
+                  <m:sSupPr>
+                    <m:ctrlPr>
+                      <w:rPr>
+                        <w:rFonts w:ascii="Cambria Math" w:hAnsi="Cambria Math"/>
+                      </w:rPr>
+                    </m:ctrlPr>
+                  </m:sSupPr>
+                  <m:e>
+                    <m:r>
+                      <w:rPr>
+                        <w:rFonts w:ascii="Cambria Math" w:hAnsi="Cambria Math"/>
+                      </w:rPr>
+                      <m:t>μ</m:t>
+                    </m:r>
+                  </m:e>
+                  <m:sup>
+                    <m:d>
+                      <m:dPr>
+                        <m:ctrlPr>
+                          <w:rPr>
+                            <w:rFonts w:ascii="Cambria Math" w:hAnsi="Cambria Math"/>
+                          </w:rPr>
+                        </m:ctrlPr>
+                      </m:dPr>
+                      <m:e>
+                        <m:r>
+                          <w:rPr>
+                            <w:rFonts w:ascii="Cambria Math" w:hAnsi="Cambria Math"/>
+                          </w:rPr>
+                          <m:t>r</m:t>
+                        </m:r>
+                      </m:e>
+                    </m:d>
+                  </m:sup>
+                </m:sSup>
+                <m:r>
+                  <w:rPr>
+                    <w:rFonts w:ascii="Cambria Math" w:hAnsi="Cambria Math"/>
+                  </w:rPr>
+                  <m:t>,</m:t>
+                </m:r>
+                <m:r>
+                  <m:rPr>
+                    <m:nor/>
+                  </m:rPr>
+                  <m:t>diag</m:t>
+                </m:r>
+                <m:r>
+                  <w:rPr>
+                    <w:rFonts w:ascii="Cambria Math" w:hAnsi="Cambria Math"/>
+                  </w:rPr>
+                  <m:t>(</m:t>
+                </m:r>
+                <m:sSup>
+                  <m:sSupPr>
+                    <m:ctrlPr>
+                      <w:rPr>
+                        <w:rFonts w:ascii="Cambria Math" w:hAnsi="Cambria Math"/>
+                      </w:rPr>
+                    </m:ctrlPr>
+                  </m:sSupPr>
+                  <m:e>
+                    <m:r>
+                      <w:rPr>
+                        <w:rFonts w:ascii="Cambria Math" w:hAnsi="Cambria Math"/>
+                      </w:rPr>
+                      <m:t>v</m:t>
+                    </m:r>
+                  </m:e>
+                  <m:sup>
+                    <m:d>
+                      <m:dPr>
+                        <m:ctrlPr>
+                          <w:rPr>
+                            <w:rFonts w:ascii="Cambria Math" w:hAnsi="Cambria Math"/>
+                          </w:rPr>
+                        </m:ctrlPr>
+                      </m:dPr>
+                      <m:e>
+                        <m:r>
+                          <w:rPr>
+                            <w:rFonts w:ascii="Cambria Math" w:hAnsi="Cambria Math"/>
+                          </w:rPr>
+                          <m:t>r</m:t>
+                        </m:r>
+                      </m:e>
+                    </m:d>
+                  </m:sup>
+                </m:sSup>
+                <m:r>
+                  <w:rPr>
+                    <w:rFonts w:ascii="Cambria Math" w:hAnsi="Cambria Math"/>
+                  </w:rPr>
+                  <m:t>)).</m:t>
+                </m:r>
+              </m:e>
+            </m:mr>
+          </m:m>
+        </m:oMath>
+      </m:oMathPara>
+    </w:p>
+    <w:p>
+      <w:r>
+        <w:rPr>
+          <w:rtl/>
+        </w:rPr>
+        <w:t xml:space="preserve">מטרת הרגרסיה חושבה ישירות מן הקבוצה באמצעות השונות האמפירית עם מחלק </w:t>
+      </w:r>
+      <m:oMath>
+        <m:r>
+          <w:rPr>
+            <w:rFonts w:ascii="Cambria Math" w:hAnsi="Cambria Math"/>
+          </w:rPr>
+          <m:t>n</m:t>
+        </m:r>
+      </m:oMath>
+      <w:r>
+        <w:rPr>
+          <w:rtl/>
+        </w:rPr>
+        <w:t xml:space="preserve"> (unbiased=False). בכל פעם שדוגמת אימון הוצגה למודל עם הגדלת נתונים, דגמנו תמורה חדשה ואחידה מתוך </w:t>
+      </w:r>
+      <m:oMath>
+        <m:sSub>
+          <m:sSubPr>
+            <m:ctrlPr>
+              <w:rPr>
+                <w:rFonts w:ascii="Cambria Math" w:hAnsi="Cambria Math"/>
+              </w:rPr>
+            </m:ctrlPr>
+          </m:sSubPr>
+          <m:e>
+            <m:r>
+              <w:rPr>
+                <w:rFonts w:ascii="Cambria Math" w:hAnsi="Cambria Math"/>
+              </w:rPr>
+              <m:t>S</m:t>
+            </m:r>
+          </m:e>
+          <m:sub>
+            <m:r>
+              <w:rPr>
+                <w:rFonts w:ascii="Cambria Math" w:hAnsi="Cambria Math"/>
+              </w:rPr>
+              <m:t>7</m:t>
+            </m:r>
+          </m:sub>
+        </m:sSub>
+      </m:oMath>
+      <w:r>
+        <w:rPr>
+          <w:rtl/>
+        </w:rPr>
+        <w:t xml:space="preserve"> והפעלנו אותה על שורות הקלט. מודל הביקורת היה זהה לחלוטין, אך אומן ללא תמורות. שני המודלים התחילו מאותם משקלים והשתמשו באותה חלוקת נתונים ובאותו </w:t>
+      </w:r>
+      <w:r>
+        <w:t>batch order</w:t>
+      </w:r>
+      <w:r>
+        <w:rPr>
+          <w:rtl/>
+        </w:rPr>
+        <w:t>.</w:t>
+      </w:r>
+    </w:p>
+    <w:p>
+      <w:r>
+        <w:rPr>
+          <w:rtl/>
+        </w:rPr>
+        <w:t xml:space="preserve">אימנו באמצעות </w:t>
+      </w:r>
+      <w:r>
+        <w:t>MSELoss</w:t>
+      </w:r>
+      <w:r>
+        <w:rPr>
+          <w:rtl/>
+        </w:rPr>
+        <w:t xml:space="preserve"> ו-</w:t>
+      </w:r>
+      <w:r>
+        <w:t>Adam</w:t>
+      </w:r>
+      <w:r>
+        <w:rPr>
+          <w:rtl/>
+        </w:rPr>
+        <w:t xml:space="preserve">. ערכי ההיפרפרמטרים היו </w:t>
+      </w:r>
+      <w:r>
+        <w:t>learning rate = 1e-4, batch size = 64, seed = 2319, epochs = 2,000, patience = 100 epochs</w:t>
+      </w:r>
+      <w:r>
+        <w:rPr>
+          <w:rtl/>
+        </w:rPr>
+        <w:t>. בסיום שחזרנו את המשקלים שבהם התקבל ה-</w:t>
+      </w:r>
+      <w:r>
+        <w:t>validation loss</w:t>
+      </w:r>
+      <w:r>
+        <w:rPr>
+          <w:rtl/>
+        </w:rPr>
+        <w:t xml:space="preserve"> הנמוך ביותר. </w:t>
+      </w:r>
+      <w:r>
+        <w:t>Best epoch</w:t>
+      </w:r>
+      <w:r>
+        <w:rPr>
+          <w:rtl/>
+        </w:rPr>
+        <w:t xml:space="preserve"> היה 1968 למודל עם הגדלת הנתונים ו-1999 למודל הביקורת.</w:t>
+      </w:r>
+    </w:p>
+    <w:p>
+      <w:r>
+        <w:rPr>
+          <w:rtl/>
+        </w:rPr>
+        <w:t>שגיאת הקירוב נמדדה באמצעות MSE על קבוצת הבדיקה. שגיאת האינווריאנטיות נמדדה לאחר האימון על אותן 150 דוגמאות ובאמצעות אותה תמורה קבועה לכל דוגמה:</w:t>
+      </w:r>
+    </w:p>
+    <w:p>
+      <w:pPr>
+        <w:bidi w:val="0"/>
+        <w:spacing w:before="60" w:after="60"/>
+        <w:jc w:val="center"/>
+      </w:pPr>
+      <m:oMathPara>
+        <m:oMathParaPr>
+          <m:jc m:val="center"/>
+        </m:oMathParaPr>
+        <m:oMath>
+          <m:sSub>
+            <m:sSubPr>
+              <m:ctrlPr>
+                <w:rPr>
+                  <w:rFonts w:ascii="Cambria Math" w:hAnsi="Cambria Math"/>
+                </w:rPr>
+              </m:ctrlPr>
+            </m:sSubPr>
+            <m:e>
+              <m:r>
+                <w:rPr>
+                  <w:rFonts w:ascii="Cambria Math" w:hAnsi="Cambria Math"/>
+                </w:rPr>
+                <m:t>E</m:t>
+              </m:r>
+            </m:e>
+            <m:sub>
+              <m:r>
+                <m:rPr>
+                  <m:nor/>
+                </m:rPr>
+                <m:t>inv</m:t>
+              </m:r>
+            </m:sub>
+          </m:sSub>
+          <m:r>
+            <w:rPr>
+              <w:rFonts w:ascii="Cambria Math" w:hAnsi="Cambria Math"/>
+            </w:rPr>
+            <m:t>=</m:t>
+          </m:r>
+          <m:f>
+            <m:fPr>
+              <m:ctrlPr>
+                <w:rPr>
+                  <w:rFonts w:ascii="Cambria Math" w:hAnsi="Cambria Math"/>
+                </w:rPr>
+              </m:ctrlPr>
+            </m:fPr>
+            <m:num>
+              <m:r>
+                <w:rPr>
+                  <w:rFonts w:ascii="Cambria Math" w:hAnsi="Cambria Math"/>
+                </w:rPr>
+                <m:t>1</m:t>
+              </m:r>
+            </m:num>
+            <m:den>
+              <m:r>
+                <w:rPr>
+                  <w:rFonts w:ascii="Cambria Math" w:hAnsi="Cambria Math"/>
+                </w:rPr>
+                <m:t>150</m:t>
+              </m:r>
+            </m:den>
+          </m:f>
+          <m:nary>
+            <m:naryPr>
+              <m:chr m:val="∑"/>
+              <m:limLoc m:val="undOvr"/>
+              <m:grow m:val="1"/>
+              <m:supHide m:val="1"/>
+              <m:ctrlPr>
+                <w:rPr>
+                  <w:rFonts w:ascii="Cambria Math" w:hAnsi="Cambria Math"/>
+                </w:rPr>
+              </m:ctrlPr>
+            </m:naryPr>
+            <m:sub>
+              <m:r>
+                <w:rPr>
+                  <w:rFonts w:ascii="Cambria Math" w:hAnsi="Cambria Math"/>
+                </w:rPr>
+                <m:t>r=1</m:t>
+              </m:r>
+            </m:sub>
+            <m:sup/>
+            <m:e>
+              <m:sSub>
+                <m:sSubPr>
+                  <m:ctrlPr>
+                    <w:rPr>
+                      <w:rFonts w:ascii="Cambria Math" w:hAnsi="Cambria Math"/>
+                    </w:rPr>
+                  </m:ctrlPr>
+                </m:sSubPr>
+                <m:e>
+                  <m:d>
+                    <m:dPr>
+                      <m:begChr m:val="‖"/>
+                      <m:endChr m:val="‖"/>
+                      <m:ctrlPr>
+                        <w:rPr>
+                          <w:rFonts w:ascii="Cambria Math" w:hAnsi="Cambria Math"/>
+                        </w:rPr>
+                      </m:ctrlPr>
+                    </m:dPr>
+                    <m:e>
+                      <m:r>
+                        <w:rPr>
+                          <w:rFonts w:ascii="Cambria Math" w:hAnsi="Cambria Math"/>
+                        </w:rPr>
+                        <m:t>F(</m:t>
+                      </m:r>
+                      <m:sSub>
+                        <m:sSubPr>
+                          <m:ctrlPr>
+                            <w:rPr>
+                              <w:rFonts w:ascii="Cambria Math" w:hAnsi="Cambria Math"/>
+                            </w:rPr>
+                          </m:ctrlPr>
+                        </m:sSubPr>
+                        <m:e>
+                          <m:r>
+                            <w:rPr>
+                              <w:rFonts w:ascii="Cambria Math" w:hAnsi="Cambria Math"/>
+                            </w:rPr>
+                            <m:t>π</m:t>
+                          </m:r>
+                        </m:e>
+                        <m:sub>
+                          <m:r>
+                            <w:rPr>
+                              <w:rFonts w:ascii="Cambria Math" w:hAnsi="Cambria Math"/>
+                            </w:rPr>
+                            <m:t>r</m:t>
+                          </m:r>
+                        </m:sub>
+                      </m:sSub>
+                      <m:r>
+                        <w:rPr>
+                          <w:rFonts w:ascii="Cambria Math" w:hAnsi="Cambria Math"/>
+                        </w:rPr>
+                        <m:t>·</m:t>
+                      </m:r>
+                      <m:sSup>
+                        <m:sSupPr>
+                          <m:ctrlPr>
+                            <w:rPr>
+                              <w:rFonts w:ascii="Cambria Math" w:hAnsi="Cambria Math"/>
+                            </w:rPr>
+                          </m:ctrlPr>
+                        </m:sSupPr>
+                        <m:e>
+                          <m:r>
+                            <w:rPr>
+                              <w:rFonts w:ascii="Cambria Math" w:hAnsi="Cambria Math"/>
+                            </w:rPr>
+                            <m:t>X</m:t>
+                          </m:r>
+                        </m:e>
+                        <m:sup>
+                          <m:d>
+                            <m:dPr>
+                              <m:ctrlPr>
+                                <w:rPr>
+                                  <w:rFonts w:ascii="Cambria Math" w:hAnsi="Cambria Math"/>
+                                </w:rPr>
+                              </m:ctrlPr>
+                            </m:dPr>
+                            <m:e>
+                              <m:r>
+                                <w:rPr>
+                                  <w:rFonts w:ascii="Cambria Math" w:hAnsi="Cambria Math"/>
+                                </w:rPr>
+                                <m:t>r</m:t>
+                              </m:r>
+                            </m:e>
+                          </m:d>
+                        </m:sup>
+                      </m:sSup>
+                      <m:r>
+                        <w:rPr>
+                          <w:rFonts w:ascii="Cambria Math" w:hAnsi="Cambria Math"/>
+                        </w:rPr>
+                        <m:t>)-F(</m:t>
+                      </m:r>
+                      <m:sSup>
+                        <m:sSupPr>
+                          <m:ctrlPr>
+                            <w:rPr>
+                              <w:rFonts w:ascii="Cambria Math" w:hAnsi="Cambria Math"/>
+                            </w:rPr>
+                          </m:ctrlPr>
+                        </m:sSupPr>
+                        <m:e>
+                          <m:r>
+                            <w:rPr>
+                              <w:rFonts w:ascii="Cambria Math" w:hAnsi="Cambria Math"/>
+                            </w:rPr>
+                            <m:t>X</m:t>
+                          </m:r>
+                        </m:e>
+                        <m:sup>
+                          <m:d>
+                            <m:dPr>
+                              <m:ctrlPr>
+                                <w:rPr>
+                                  <w:rFonts w:ascii="Cambria Math" w:hAnsi="Cambria Math"/>
+                                </w:rPr>
+                              </m:ctrlPr>
+                            </m:dPr>
+                            <m:e>
+                              <m:r>
+                                <w:rPr>
+                                  <w:rFonts w:ascii="Cambria Math" w:hAnsi="Cambria Math"/>
+                                </w:rPr>
+                                <m:t>r</m:t>
+                              </m:r>
+                            </m:e>
+                          </m:d>
+                        </m:sup>
+                      </m:sSup>
+                      <m:r>
+                        <w:rPr>
+                          <w:rFonts w:ascii="Cambria Math" w:hAnsi="Cambria Math"/>
+                        </w:rPr>
+                        <m:t>)</m:t>
+                      </m:r>
+                    </m:e>
+                  </m:d>
+                </m:e>
+                <m:sub>
+                  <m:r>
+                    <w:rPr>
+                      <w:rFonts w:ascii="Cambria Math" w:hAnsi="Cambria Math"/>
+                    </w:rPr>
+                    <m:t>2</m:t>
+                  </m:r>
+                </m:sub>
+              </m:sSub>
+            </m:e>
+          </m:nary>
+          <m:r>
+            <w:rPr>
+              <w:rFonts w:ascii="Cambria Math" w:hAnsi="Cambria Math"/>
+            </w:rPr>
+            <m:t>.</m:t>
+          </m:r>
+        </m:oMath>
+      </m:oMathPara>
+    </w:p>
+    <w:p>
+      <w:r>
+        <w:rPr>
+          <w:rtl/>
+        </w:rPr>
+        <w:t xml:space="preserve">להלן הגרפים עבור </w:t>
+      </w:r>
+      <w:r>
+        <w:t>training loss and validation loss</w:t>
+      </w:r>
+      <w:r>
+        <w:rPr>
+          <w:rtl/>
+        </w:rPr>
+        <w:t>:</w:t>
+      </w:r>
+    </w:p>
+    <w:p>
+      <w:pPr>
+        <w:pStyle w:val="BodyText"/>
+        <w:keepLines/>
+        <w:spacing w:before="0" w:after="160"/>
+        <w:jc w:val="center"/>
+      </w:pPr>
+      <w:r>
+        <w:rPr>
+          <w:noProof/>
+        </w:rPr>
+        <w:drawing>
+          <wp:inline distT="0" distB="0" distL="0" distR="0" wp14:anchorId="165A70AA" wp14:editId="26A0EFD1">
+            <wp:extent cx="4754880" cy="1897508"/>
+            <wp:effectExtent l="0" t="0" r="0" b="0"/>
+            <wp:docPr id="28" name="Picture 28" descr="Question 3(e) training and validation MSE for augmented and control models"/>
+            <wp:cNvGraphicFramePr>
+              <a:graphicFrameLocks xmlns:a="http://schemas.openxmlformats.org/drawingml/2006/main" noChangeAspect="1"/>
+            </wp:cNvGraphicFramePr>
+            <a:graphic xmlns:a="http://schemas.openxmlformats.org/drawingml/2006/main">
+              <a:graphicData uri="http://schemas.openxmlformats.org/drawingml/2006/picture">
+                <pic:pic xmlns:pic="http://schemas.openxmlformats.org/drawingml/2006/picture">
+                  <pic:nvPicPr>
+                    <pic:cNvPr id="0" name="q3e_training_curves.png"/>
+                    <pic:cNvPicPr/>
+                  </pic:nvPicPr>
+                  <pic:blipFill>
+                    <a:blip r:embed="rId12"/>
+                    <a:stretch>
+                      <a:fillRect/>
+                    </a:stretch>
+                  </pic:blipFill>
+                  <pic:spPr>
+                    <a:xfrm>
+                      <a:off x="0" y="0"/>
+                      <a:ext cx="4754880" cy="1897508"/>
+                    </a:xfrm>
+                    <a:prstGeom prst="rect">
+                      <a:avLst/>
+                    </a:prstGeom>
+                  </pic:spPr>
+                </pic:pic>
+              </a:graphicData>
+            </a:graphic>
+          </wp:inline>
+        </w:drawing>
+      </w:r>
+    </w:p>
+    <w:p>
+      <w:r>
+        <w:rPr>
+          <w:rtl/>
+        </w:rPr>
+        <w:t xml:space="preserve">בנוסף חישבנו את הפרש הקואורדינטה המוחלט המרבי, לשם השוואה לסף </w:t>
+      </w:r>
+      <m:oMath>
+        <m:sSup>
+          <m:sSupPr>
+            <m:ctrlPr>
+              <w:rPr>
+                <w:rFonts w:ascii="Cambria Math" w:hAnsi="Cambria Math"/>
+              </w:rPr>
+            </m:ctrlPr>
+          </m:sSupPr>
+          <m:e>
+            <m:r>
+              <w:rPr>
+                <w:rFonts w:ascii="Cambria Math" w:hAnsi="Cambria Math"/>
+              </w:rPr>
+              <m:t>10</m:t>
+            </m:r>
+          </m:e>
+          <m:sup>
+            <m:r>
+              <w:rPr>
+                <w:rFonts w:ascii="Cambria Math" w:hAnsi="Cambria Math"/>
+              </w:rPr>
+              <m:t>-2</m:t>
+            </m:r>
+          </m:sup>
+        </m:sSup>
+      </m:oMath>
+      <w:r>
+        <w:rPr>
+          <w:rtl/>
+        </w:rPr>
+        <w:t xml:space="preserve"> ששימש בסעיף ג. התוצאות היו</w:t>
+      </w:r>
+    </w:p>
+    <w:tbl>
+      <w:tblPr>
+        <w:tblW w:w="0" w:type="auto"/>
+        <w:jc w:val="center"/>
+        <w:tblBorders>
+          <w:top w:val="single" w:sz="4" w:space="0" w:color="B7C9DC"/>
+          <w:left w:val="single" w:sz="4" w:space="0" w:color="B7C9DC"/>
+          <w:bottom w:val="single" w:sz="4" w:space="0" w:color="B7C9DC"/>
+          <w:right w:val="single" w:sz="4" w:space="0" w:color="B7C9DC"/>
+          <w:insideH w:val="single" w:sz="4" w:space="0" w:color="B7C9DC"/>
+          <w:insideV w:val="single" w:sz="4" w:space="0" w:color="B7C9DC"/>
+        </w:tblBorders>
+        <w:tblLayout w:type="fixed"/>
+        <w:tblLook w:val="04A0" w:firstRow="1" w:lastRow="0" w:firstColumn="1" w:lastColumn="0" w:noHBand="0" w:noVBand="1"/>
+      </w:tblPr>
+      <w:tblGrid>
+        <w:gridCol w:w="4032"/>
+        <w:gridCol w:w="2448"/>
+        <w:gridCol w:w="2448"/>
+      </w:tblGrid>
+      <w:tr>
+        <w:trPr>
+          <w:cantSplit/>
+          <w:jc w:val="center"/>
+        </w:trPr>
+        <w:tc>
+          <w:tcPr>
+            <w:tcW w:w="4032" w:type="dxa"/>
+            <w:shd w:val="clear" w:color="auto" w:fill="D9EAF7"/>
+            <w:tcMar>
+              <w:top w:w="60" w:type="dxa"/>
+              <w:left w:w="60" w:type="dxa"/>
+              <w:bottom w:w="60" w:type="dxa"/>
+              <w:right w:w="60" w:type="dxa"/>
+            </w:tcMar>
+            <w:vAlign w:val="center"/>
+          </w:tcPr>
+          <w:p>
+            <w:pPr>
+              <w:bidi w:val="0"/>
+              <w:spacing w:after="0"/>
+              <w:jc w:val="center"/>
+            </w:pPr>
+            <w:r>
+              <w:rPr>
+                <w:b/>
+                <w:color w:val="365F91"/>
+              </w:rPr>
+              <w:t>Metric</w:t>
+            </w:r>
+          </w:p>
+        </w:tc>
+        <w:tc>
+          <w:tcPr>
+            <w:tcW w:w="2448" w:type="dxa"/>
+            <w:shd w:val="clear" w:color="auto" w:fill="D9EAF7"/>
+            <w:tcMar>
+              <w:top w:w="60" w:type="dxa"/>
+              <w:left w:w="60" w:type="dxa"/>
+              <w:bottom w:w="60" w:type="dxa"/>
+              <w:right w:w="60" w:type="dxa"/>
+            </w:tcMar>
+            <w:vAlign w:val="center"/>
+          </w:tcPr>
+          <w:p>
+            <w:pPr>
+              <w:bidi w:val="0"/>
+              <w:spacing w:after="0"/>
+              <w:jc w:val="center"/>
+            </w:pPr>
+            <w:r>
+              <w:rPr>
+                <w:b/>
+                <w:color w:val="365F91"/>
+              </w:rPr>
+              <w:t>Augmented</w:t>
+            </w:r>
+          </w:p>
+        </w:tc>
+        <w:tc>
+          <w:tcPr>
+            <w:tcW w:w="2448" w:type="dxa"/>
+            <w:shd w:val="clear" w:color="auto" w:fill="D9EAF7"/>
+            <w:tcMar>
+              <w:top w:w="60" w:type="dxa"/>
+              <w:left w:w="60" w:type="dxa"/>
+              <w:bottom w:w="60" w:type="dxa"/>
+              <w:right w:w="60" w:type="dxa"/>
+            </w:tcMar>
+            <w:vAlign w:val="center"/>
+          </w:tcPr>
+          <w:p>
+            <w:pPr>
+              <w:bidi w:val="0"/>
+              <w:spacing w:after="0"/>
+              <w:jc w:val="center"/>
+            </w:pPr>
+            <w:r>
+              <w:rPr>
+                <w:b/>
+                <w:color w:val="365F91"/>
+              </w:rPr>
+              <w:t>Control</w:t>
+            </w:r>
+          </w:p>
+        </w:tc>
+      </w:tr>
+      <w:tr>
+        <w:trPr>
+          <w:cantSplit/>
+          <w:jc w:val="center"/>
+        </w:trPr>
+        <w:tc>
+          <w:tcPr>
+            <w:tcW w:w="4032" w:type="dxa"/>
+            <w:tcMar>
+              <w:top w:w="60" w:type="dxa"/>
+              <w:left w:w="60" w:type="dxa"/>
+              <w:bottom w:w="60" w:type="dxa"/>
+              <w:right w:w="60" w:type="dxa"/>
+            </w:tcMar>
+            <w:vAlign w:val="center"/>
+          </w:tcPr>
+          <w:p>
+            <w:pPr>
+              <w:bidi w:val="0"/>
+              <w:spacing w:after="0"/>
+              <w:jc w:val="center"/>
+            </w:pPr>
+            <w:r>
+              <w:t>Test MSE</w:t>
+            </w:r>
+          </w:p>
+        </w:tc>
+        <w:tc>
+          <w:tcPr>
+            <w:tcW w:w="2448" w:type="dxa"/>
+            <w:tcMar>
+              <w:top w:w="60" w:type="dxa"/>
+              <w:left w:w="60" w:type="dxa"/>
+              <w:bottom w:w="60" w:type="dxa"/>
+              <w:right w:w="60" w:type="dxa"/>
+            </w:tcMar>
+            <w:vAlign w:val="center"/>
+          </w:tcPr>
+          <w:p>
+            <w:pPr>
+              <w:bidi w:val="0"/>
+              <w:spacing w:after="0"/>
+              <w:jc w:val="center"/>
+            </w:pPr>
+            <w:r>
+              <w:t>0.082402</w:t>
+            </w:r>
+          </w:p>
+        </w:tc>
+        <w:tc>
+          <w:tcPr>
+            <w:tcW w:w="2448" w:type="dxa"/>
+            <w:tcMar>
+              <w:top w:w="60" w:type="dxa"/>
+              <w:left w:w="60" w:type="dxa"/>
+              <w:bottom w:w="60" w:type="dxa"/>
+              <w:right w:w="60" w:type="dxa"/>
+            </w:tcMar>
+            <w:vAlign w:val="center"/>
+          </w:tcPr>
+          <w:p>
+            <w:pPr>
+              <w:bidi w:val="0"/>
+              <w:spacing w:after="0"/>
+              <w:jc w:val="center"/>
+            </w:pPr>
+            <w:r>
+              <w:t>0.135498</w:t>
+            </w:r>
+          </w:p>
+        </w:tc>
+      </w:tr>
+      <w:tr>
+        <w:trPr>
+          <w:cantSplit/>
+          <w:jc w:val="center"/>
+        </w:trPr>
+        <w:tc>
+          <w:tcPr>
+            <w:tcW w:w="4032" w:type="dxa"/>
+            <w:tcMar>
+              <w:top w:w="60" w:type="dxa"/>
+              <w:left w:w="60" w:type="dxa"/>
+              <w:bottom w:w="60" w:type="dxa"/>
+              <w:right w:w="60" w:type="dxa"/>
+            </w:tcMar>
+            <w:vAlign w:val="center"/>
+          </w:tcPr>
+          <w:p>
+            <w:pPr>
+              <w:bidi w:val="0"/>
+              <w:spacing w:after="0"/>
+              <w:jc w:val="center"/>
+            </w:pPr>
+            <w:r>
+              <w:t>Mean error (E_inv)</w:t>
+            </w:r>
+          </w:p>
+        </w:tc>
+        <w:tc>
+          <w:tcPr>
+            <w:tcW w:w="2448" w:type="dxa"/>
+            <w:tcMar>
+              <w:top w:w="60" w:type="dxa"/>
+              <w:left w:w="60" w:type="dxa"/>
+              <w:bottom w:w="60" w:type="dxa"/>
+              <w:right w:w="60" w:type="dxa"/>
+            </w:tcMar>
+            <w:vAlign w:val="center"/>
+          </w:tcPr>
+          <w:p>
+            <w:pPr>
+              <w:bidi w:val="0"/>
+              <w:spacing w:after="0"/>
+              <w:jc w:val="center"/>
+            </w:pPr>
+            <w:r>
+              <w:t>0.392815</w:t>
+            </w:r>
+          </w:p>
+        </w:tc>
+        <w:tc>
+          <w:tcPr>
+            <w:tcW w:w="2448" w:type="dxa"/>
+            <w:tcMar>
+              <w:top w:w="60" w:type="dxa"/>
+              <w:left w:w="60" w:type="dxa"/>
+              <w:bottom w:w="60" w:type="dxa"/>
+              <w:right w:w="60" w:type="dxa"/>
+            </w:tcMar>
+            <w:vAlign w:val="center"/>
+          </w:tcPr>
+          <w:p>
+            <w:pPr>
+              <w:bidi w:val="0"/>
+              <w:spacing w:after="0"/>
+              <w:jc w:val="center"/>
+            </w:pPr>
+            <w:r>
+              <w:t>0.645611</w:t>
+            </w:r>
+          </w:p>
+        </w:tc>
+      </w:tr>
+      <w:tr>
+        <w:trPr>
+          <w:cantSplit/>
+          <w:jc w:val="center"/>
+        </w:trPr>
+        <w:tc>
+          <w:tcPr>
+            <w:tcW w:w="4032" w:type="dxa"/>
+            <w:tcMar>
+              <w:top w:w="60" w:type="dxa"/>
+              <w:left w:w="60" w:type="dxa"/>
+              <w:bottom w:w="60" w:type="dxa"/>
+              <w:right w:w="60" w:type="dxa"/>
+            </w:tcMar>
+            <w:vAlign w:val="center"/>
+          </w:tcPr>
+          <w:p>
+            <w:pPr>
+              <w:bidi w:val="0"/>
+              <w:spacing w:after="0"/>
+              <w:jc w:val="center"/>
+            </w:pPr>
+            <w:r>
+              <w:t>Max difference (E_max)</w:t>
+            </w:r>
+          </w:p>
+        </w:tc>
+        <w:tc>
+          <w:tcPr>
+            <w:tcW w:w="2448" w:type="dxa"/>
+            <w:tcMar>
+              <w:top w:w="60" w:type="dxa"/>
+              <w:left w:w="60" w:type="dxa"/>
+              <w:bottom w:w="60" w:type="dxa"/>
+              <w:right w:w="60" w:type="dxa"/>
+            </w:tcMar>
+            <w:vAlign w:val="center"/>
+          </w:tcPr>
+          <w:p>
+            <w:pPr>
+              <w:bidi w:val="0"/>
+              <w:spacing w:after="0"/>
+              <w:jc w:val="center"/>
+            </w:pPr>
+            <w:r>
+              <w:t>1.435731</w:t>
+            </w:r>
+          </w:p>
+        </w:tc>
+        <w:tc>
+          <w:tcPr>
+            <w:tcW w:w="2448" w:type="dxa"/>
+            <w:tcMar>
+              <w:top w:w="60" w:type="dxa"/>
+              <w:left w:w="60" w:type="dxa"/>
+              <w:bottom w:w="60" w:type="dxa"/>
+              <w:right w:w="60" w:type="dxa"/>
+            </w:tcMar>
+            <w:vAlign w:val="center"/>
+          </w:tcPr>
+          <w:p>
+            <w:pPr>
+              <w:bidi w:val="0"/>
+              <w:spacing w:after="0"/>
+              <w:jc w:val="center"/>
+            </w:pPr>
+            <w:r>
+              <w:t>1.362356</w:t>
+            </w:r>
+          </w:p>
+        </w:tc>
+      </w:tr>
+    </w:tbl>
+    <w:p>
+      <w:r>
+        <w:rPr>
+          <w:rtl/>
+        </w:rPr>
+        <w:t xml:space="preserve">בהשוואה למודל הביקורת, הגדלת הנתונים הפחיתה בכ-39% את שגיאת הקירוב ואת שגיאת האינווריאנטיות הממוצעת, ולכן שיפרה את ההכללה. עם זאת, השיטה אינה כופה אינווריאנטיות או חסם אחיד: שני המודלים נכשלו בבדיקת ההפרש המרבי מול הסף </w:t>
+      </w:r>
+      <m:oMath>
+        <m:sSup>
+          <m:sSupPr>
+            <m:ctrlPr>
+              <w:rPr>
+                <w:rFonts w:ascii="Cambria Math" w:hAnsi="Cambria Math"/>
+              </w:rPr>
+            </m:ctrlPr>
+          </m:sSupPr>
+          <m:e>
+            <m:r>
+              <w:rPr>
+                <w:rFonts w:ascii="Cambria Math" w:hAnsi="Cambria Math"/>
+              </w:rPr>
+              <m:t>10</m:t>
+            </m:r>
+          </m:e>
+          <m:sup>
+            <m:r>
+              <w:rPr>
+                <w:rFonts w:ascii="Cambria Math" w:hAnsi="Cambria Math"/>
+              </w:rPr>
+              <m:t>-2</m:t>
+            </m:r>
+          </m:sup>
+        </m:sSup>
+      </m:oMath>
+      <w:r>
+        <w:rPr>
+          <w:rtl/>
+        </w:rPr>
+        <w:t>.</w:t>
+      </w:r>
+    </w:p>
     <w:sectPr>
-      <w:headerReference w:type="even" r:id="rId12"/>
-      <w:headerReference w:type="default" r:id="rId13"/>
-      <w:footerReference w:type="even" r:id="rId14"/>
-      <w:footerReference w:type="default" r:id="rId15"/>
-      <w:headerReference w:type="first" r:id="rId16"/>
-      <w:footerReference w:type="first" r:id="rId17"/>
+      <w:headerReference w:type="even" r:id="rId13"/>
+      <w:headerReference w:type="default" r:id="rId14"/>
+      <w:footerReference w:type="even" r:id="rId15"/>
+      <w:footerReference w:type="default" r:id="rId16"/>
+      <w:headerReference w:type="first" r:id="rId17"/>
+      <w:footerReference w:type="first" r:id="rId18"/>
       <w:pgSz w:w="11906" w:h="16838"/>
       <w:pgMar w:top="1134" w:right="1247" w:bottom="1134" w:left="1247" w:header="652" w:footer="652" w:gutter="0"/>
       <w:cols w:space="720"/>

</xml_diff>

<commit_message>
Promote HW4 question 4 mandatory benchmark
</commit_message>
<xml_diff>
--- a/HW4-Solution.docx
+++ b/HW4-Solution.docx
@@ -74,7 +74,7 @@
         </w:rPr>
         <w:fldChar w:fldCharType="separate"/>
       </w:r>
-      <w:hyperlink w:anchor="_Toc236481854" w:history="1">
+      <w:hyperlink w:anchor="_Toc236499055" w:history="1">
         <w:r>
           <w:rPr>
             <w:rStyle w:val="Hyperlink"/>
@@ -102,7 +102,7 @@
             <w:noProof/>
             <w:webHidden/>
           </w:rPr>
-          <w:instrText xml:space="preserve"> PAGEREF _Toc236481854 \h </w:instrText>
+          <w:instrText xml:space="preserve"> PAGEREF _Toc236499055 \h </w:instrText>
         </w:r>
         <w:r>
           <w:rPr>
@@ -146,7 +146,7 @@
           <w14:ligatures w14:val="standardContextual"/>
         </w:rPr>
       </w:pPr>
-      <w:hyperlink w:anchor="_Toc236481855" w:history="1">
+      <w:hyperlink w:anchor="_Toc236499056" w:history="1">
         <w:r>
           <w:rPr>
             <w:rStyle w:val="Hyperlink"/>
@@ -252,7 +252,7 @@
             <w:noProof/>
             <w:webHidden/>
           </w:rPr>
-          <w:instrText xml:space="preserve"> PAGEREF _Toc236481855 \h </w:instrText>
+          <w:instrText xml:space="preserve"> PAGEREF _Toc236499056 \h </w:instrText>
         </w:r>
         <w:r>
           <w:rPr>
@@ -296,7 +296,7 @@
           <w14:ligatures w14:val="standardContextual"/>
         </w:rPr>
       </w:pPr>
-      <w:hyperlink w:anchor="_Toc236481856" w:history="1">
+      <w:hyperlink w:anchor="_Toc236499057" w:history="1">
         <w:r>
           <w:rPr>
             <w:rStyle w:val="Hyperlink"/>
@@ -324,7 +324,7 @@
             <w:noProof/>
             <w:webHidden/>
           </w:rPr>
-          <w:instrText xml:space="preserve"> PAGEREF _Toc236481856 \h </w:instrText>
+          <w:instrText xml:space="preserve"> PAGEREF _Toc236499057 \h </w:instrText>
         </w:r>
         <w:r>
           <w:rPr>
@@ -368,7 +368,7 @@
           <w14:ligatures w14:val="standardContextual"/>
         </w:rPr>
       </w:pPr>
-      <w:hyperlink w:anchor="_Toc236481857" w:history="1">
+      <w:hyperlink w:anchor="_Toc236499058" w:history="1">
         <w:r>
           <w:rPr>
             <w:rStyle w:val="Hyperlink"/>
@@ -396,7 +396,7 @@
             <w:noProof/>
             <w:webHidden/>
           </w:rPr>
-          <w:instrText xml:space="preserve"> PAGEREF _Toc236481857 \h </w:instrText>
+          <w:instrText xml:space="preserve"> PAGEREF _Toc236499058 \h </w:instrText>
         </w:r>
         <w:r>
           <w:rPr>
@@ -440,7 +440,7 @@
           <w14:ligatures w14:val="standardContextual"/>
         </w:rPr>
       </w:pPr>
-      <w:hyperlink w:anchor="_Toc236481858" w:history="1">
+      <w:hyperlink w:anchor="_Toc236499059" w:history="1">
         <w:r>
           <w:rPr>
             <w:rStyle w:val="Hyperlink"/>
@@ -468,7 +468,7 @@
             <w:noProof/>
             <w:webHidden/>
           </w:rPr>
-          <w:instrText xml:space="preserve"> PAGEREF _Toc236481858 \h </w:instrText>
+          <w:instrText xml:space="preserve"> PAGEREF _Toc236499059 \h </w:instrText>
         </w:r>
         <w:r>
           <w:rPr>
@@ -512,7 +512,7 @@
           <w14:ligatures w14:val="standardContextual"/>
         </w:rPr>
       </w:pPr>
-      <w:hyperlink w:anchor="_Toc236481859" w:history="1">
+      <w:hyperlink w:anchor="_Toc236499060" w:history="1">
         <w:r>
           <w:rPr>
             <w:rStyle w:val="Hyperlink"/>
@@ -540,7 +540,7 @@
             <w:noProof/>
             <w:webHidden/>
           </w:rPr>
-          <w:instrText xml:space="preserve"> PAGEREF _Toc236481859 \h </w:instrText>
+          <w:instrText xml:space="preserve"> PAGEREF _Toc236499060 \h </w:instrText>
         </w:r>
         <w:r>
           <w:rPr>
@@ -584,7 +584,7 @@
           <w14:ligatures w14:val="standardContextual"/>
         </w:rPr>
       </w:pPr>
-      <w:hyperlink w:anchor="_Toc236481860" w:history="1">
+      <w:hyperlink w:anchor="_Toc236499061" w:history="1">
         <w:r>
           <w:rPr>
             <w:rStyle w:val="Hyperlink"/>
@@ -612,7 +612,7 @@
             <w:noProof/>
             <w:webHidden/>
           </w:rPr>
-          <w:instrText xml:space="preserve"> PAGEREF _Toc236481860 \h </w:instrText>
+          <w:instrText xml:space="preserve"> PAGEREF _Toc236499061 \h </w:instrText>
         </w:r>
         <w:r>
           <w:rPr>
@@ -656,7 +656,7 @@
           <w14:ligatures w14:val="standardContextual"/>
         </w:rPr>
       </w:pPr>
-      <w:hyperlink w:anchor="_Toc236481861" w:history="1">
+      <w:hyperlink w:anchor="_Toc236499062" w:history="1">
         <w:r>
           <w:rPr>
             <w:rStyle w:val="Hyperlink"/>
@@ -684,7 +684,7 @@
             <w:noProof/>
             <w:webHidden/>
           </w:rPr>
-          <w:instrText xml:space="preserve"> PAGEREF _Toc236481861 \h </w:instrText>
+          <w:instrText xml:space="preserve"> PAGEREF _Toc236499062 \h </w:instrText>
         </w:r>
         <w:r>
           <w:rPr>
@@ -728,7 +728,7 @@
           <w14:ligatures w14:val="standardContextual"/>
         </w:rPr>
       </w:pPr>
-      <w:hyperlink w:anchor="_Toc236481862" w:history="1">
+      <w:hyperlink w:anchor="_Toc236499063" w:history="1">
         <w:r>
           <w:rPr>
             <w:rStyle w:val="Hyperlink"/>
@@ -756,7 +756,7 @@
             <w:noProof/>
             <w:webHidden/>
           </w:rPr>
-          <w:instrText xml:space="preserve"> PAGEREF _Toc236481862 \h </w:instrText>
+          <w:instrText xml:space="preserve"> PAGEREF _Toc236499063 \h </w:instrText>
         </w:r>
         <w:r>
           <w:rPr>
@@ -800,7 +800,7 @@
           <w14:ligatures w14:val="standardContextual"/>
         </w:rPr>
       </w:pPr>
-      <w:hyperlink w:anchor="_Toc236481863" w:history="1">
+      <w:hyperlink w:anchor="_Toc236499064" w:history="1">
         <w:r>
           <w:rPr>
             <w:rStyle w:val="Hyperlink"/>
@@ -828,7 +828,7 @@
             <w:noProof/>
             <w:webHidden/>
           </w:rPr>
-          <w:instrText xml:space="preserve"> PAGEREF _Toc236481863 \h </w:instrText>
+          <w:instrText xml:space="preserve"> PAGEREF _Toc236499064 \h </w:instrText>
         </w:r>
         <w:r>
           <w:rPr>
@@ -872,7 +872,7 @@
           <w14:ligatures w14:val="standardContextual"/>
         </w:rPr>
       </w:pPr>
-      <w:hyperlink w:anchor="_Toc236481864" w:history="1">
+      <w:hyperlink w:anchor="_Toc236499065" w:history="1">
         <w:r>
           <w:rPr>
             <w:rStyle w:val="Hyperlink"/>
@@ -900,7 +900,7 @@
             <w:noProof/>
             <w:webHidden/>
           </w:rPr>
-          <w:instrText xml:space="preserve"> PAGEREF _Toc236481864 \h </w:instrText>
+          <w:instrText xml:space="preserve"> PAGEREF _Toc236499065 \h </w:instrText>
         </w:r>
         <w:r>
           <w:rPr>
@@ -944,7 +944,7 @@
           <w14:ligatures w14:val="standardContextual"/>
         </w:rPr>
       </w:pPr>
-      <w:hyperlink w:anchor="_Toc236481865" w:history="1">
+      <w:hyperlink w:anchor="_Toc236499066" w:history="1">
         <w:r>
           <w:rPr>
             <w:rStyle w:val="Hyperlink"/>
@@ -972,7 +972,7 @@
             <w:noProof/>
             <w:webHidden/>
           </w:rPr>
-          <w:instrText xml:space="preserve"> PAGEREF _Toc236481865 \h </w:instrText>
+          <w:instrText xml:space="preserve"> PAGEREF _Toc236499066 \h </w:instrText>
         </w:r>
         <w:r>
           <w:rPr>
@@ -1016,7 +1016,7 @@
           <w14:ligatures w14:val="standardContextual"/>
         </w:rPr>
       </w:pPr>
-      <w:hyperlink w:anchor="_Toc236481866" w:history="1">
+      <w:hyperlink w:anchor="_Toc236499067" w:history="1">
         <w:r>
           <w:rPr>
             <w:rStyle w:val="Hyperlink"/>
@@ -1044,7 +1044,7 @@
             <w:noProof/>
             <w:webHidden/>
           </w:rPr>
-          <w:instrText xml:space="preserve"> PAGEREF _Toc236481866 \h </w:instrText>
+          <w:instrText xml:space="preserve"> PAGEREF _Toc236499067 \h </w:instrText>
         </w:r>
         <w:r>
           <w:rPr>
@@ -1088,7 +1088,7 @@
           <w14:ligatures w14:val="standardContextual"/>
         </w:rPr>
       </w:pPr>
-      <w:hyperlink w:anchor="_Toc236481867" w:history="1">
+      <w:hyperlink w:anchor="_Toc236499068" w:history="1">
         <w:r>
           <w:rPr>
             <w:rStyle w:val="Hyperlink"/>
@@ -1116,7 +1116,7 @@
             <w:noProof/>
             <w:webHidden/>
           </w:rPr>
-          <w:instrText xml:space="preserve"> PAGEREF _Toc236481867 \h </w:instrText>
+          <w:instrText xml:space="preserve"> PAGEREF _Toc236499068 \h </w:instrText>
         </w:r>
         <w:r>
           <w:rPr>
@@ -1160,7 +1160,7 @@
           <w14:ligatures w14:val="standardContextual"/>
         </w:rPr>
       </w:pPr>
-      <w:hyperlink w:anchor="_Toc236481868" w:history="1">
+      <w:hyperlink w:anchor="_Toc236499069" w:history="1">
         <w:r>
           <w:rPr>
             <w:rStyle w:val="Hyperlink"/>
@@ -1188,7 +1188,7 @@
             <w:noProof/>
             <w:webHidden/>
           </w:rPr>
-          <w:instrText xml:space="preserve"> PAGEREF _Toc236481868 \h </w:instrText>
+          <w:instrText xml:space="preserve"> PAGEREF _Toc236499069 \h </w:instrText>
         </w:r>
         <w:r>
           <w:rPr>
@@ -1232,7 +1232,7 @@
           <w14:ligatures w14:val="standardContextual"/>
         </w:rPr>
       </w:pPr>
-      <w:hyperlink w:anchor="_Toc236481869" w:history="1">
+      <w:hyperlink w:anchor="_Toc236499070" w:history="1">
         <w:r>
           <w:rPr>
             <w:rStyle w:val="Hyperlink"/>
@@ -1260,7 +1260,7 @@
             <w:noProof/>
             <w:webHidden/>
           </w:rPr>
-          <w:instrText xml:space="preserve"> PAGEREF _Toc236481869 \h </w:instrText>
+          <w:instrText xml:space="preserve"> PAGEREF _Toc236499070 \h </w:instrText>
         </w:r>
         <w:r>
           <w:rPr>
@@ -1304,7 +1304,7 @@
           <w14:ligatures w14:val="standardContextual"/>
         </w:rPr>
       </w:pPr>
-      <w:hyperlink w:anchor="_Toc236481870" w:history="1">
+      <w:hyperlink w:anchor="_Toc236499071" w:history="1">
         <w:r>
           <w:rPr>
             <w:rStyle w:val="Hyperlink"/>
@@ -1332,7 +1332,7 @@
             <w:noProof/>
             <w:webHidden/>
           </w:rPr>
-          <w:instrText xml:space="preserve"> PAGEREF _Toc236481870 \h </w:instrText>
+          <w:instrText xml:space="preserve"> PAGEREF _Toc236499071 \h </w:instrText>
         </w:r>
         <w:r>
           <w:rPr>
@@ -1376,14 +1376,23 @@
           <w14:ligatures w14:val="standardContextual"/>
         </w:rPr>
       </w:pPr>
-      <w:hyperlink w:anchor="_Toc236481871" w:history="1">
+      <w:hyperlink w:anchor="_Toc236499072" w:history="1">
         <w:r>
           <w:rPr>
             <w:rStyle w:val="Hyperlink"/>
             <w:noProof/>
             <w:rtl/>
           </w:rPr>
-          <w:t>סעיף ה. הגדלת נתונים באמצעות תמורות.</w:t>
+          <w:t>סעיף ה. הגדלת נתונים באמצעות תמורות</w:t>
+        </w:r>
+        <w:r>
+          <w:rPr>
+            <w:rStyle w:val="Hyperlink"/>
+            <w:noProof/>
+            <w:rtl/>
+          </w:rPr>
+          <w:lastRenderedPageBreak/>
+          <w:t>.</w:t>
         </w:r>
         <w:r>
           <w:rPr>
@@ -1404,7 +1413,7 @@
             <w:noProof/>
             <w:webHidden/>
           </w:rPr>
-          <w:instrText xml:space="preserve"> PAGEREF _Toc236481871 \h </w:instrText>
+          <w:instrText xml:space="preserve"> PAGEREF _Toc236499072 \h </w:instrText>
         </w:r>
         <w:r>
           <w:rPr>
@@ -1425,6 +1434,582 @@
             <w:webHidden/>
           </w:rPr>
           <w:t>16</w:t>
+        </w:r>
+        <w:r>
+          <w:rPr>
+            <w:noProof/>
+            <w:webHidden/>
+          </w:rPr>
+          <w:fldChar w:fldCharType="end"/>
+        </w:r>
+      </w:hyperlink>
+    </w:p>
+    <w:p>
+      <w:pPr>
+        <w:pStyle w:val="TOC1"/>
+        <w:tabs>
+          <w:tab w:val="right" w:leader="dot" w:pos="9402"/>
+        </w:tabs>
+        <w:rPr>
+          <w:rFonts w:asciiTheme="minorHAnsi" w:eastAsiaTheme="minorEastAsia" w:hAnsiTheme="minorHAnsi" w:cstheme="minorBidi"/>
+          <w:noProof/>
+          <w:kern w:val="2"/>
+          <w14:ligatures w14:val="standardContextual"/>
+        </w:rPr>
+      </w:pPr>
+      <w:hyperlink w:anchor="_Toc236499073" w:history="1">
+        <w:r>
+          <w:rPr>
+            <w:rStyle w:val="Hyperlink"/>
+            <w:noProof/>
+            <w:rtl/>
+          </w:rPr>
+          <w:t>שאלה 4</w:t>
+        </w:r>
+        <w:r>
+          <w:rPr>
+            <w:noProof/>
+            <w:webHidden/>
+          </w:rPr>
+          <w:tab/>
+        </w:r>
+        <w:r>
+          <w:rPr>
+            <w:noProof/>
+            <w:webHidden/>
+          </w:rPr>
+          <w:fldChar w:fldCharType="begin"/>
+        </w:r>
+        <w:r>
+          <w:rPr>
+            <w:noProof/>
+            <w:webHidden/>
+          </w:rPr>
+          <w:instrText xml:space="preserve"> PAGEREF _Toc236499073 \h </w:instrText>
+        </w:r>
+        <w:r>
+          <w:rPr>
+            <w:noProof/>
+            <w:webHidden/>
+          </w:rPr>
+        </w:r>
+        <w:r>
+          <w:rPr>
+            <w:noProof/>
+            <w:webHidden/>
+          </w:rPr>
+          <w:fldChar w:fldCharType="separate"/>
+        </w:r>
+        <w:r>
+          <w:rPr>
+            <w:noProof/>
+            <w:webHidden/>
+          </w:rPr>
+          <w:t>19</w:t>
+        </w:r>
+        <w:r>
+          <w:rPr>
+            <w:noProof/>
+            <w:webHidden/>
+          </w:rPr>
+          <w:fldChar w:fldCharType="end"/>
+        </w:r>
+      </w:hyperlink>
+    </w:p>
+    <w:p>
+      <w:pPr>
+        <w:pStyle w:val="TOC2"/>
+        <w:tabs>
+          <w:tab w:val="right" w:leader="dot" w:pos="9402"/>
+        </w:tabs>
+        <w:rPr>
+          <w:rFonts w:asciiTheme="minorHAnsi" w:eastAsiaTheme="minorEastAsia" w:hAnsiTheme="minorHAnsi" w:cstheme="minorBidi"/>
+          <w:noProof/>
+          <w:kern w:val="2"/>
+          <w14:ligatures w14:val="standardContextual"/>
+        </w:rPr>
+      </w:pPr>
+      <w:hyperlink w:anchor="_Toc236499074" w:history="1">
+        <w:r>
+          <w:rPr>
+            <w:rStyle w:val="Hyperlink"/>
+            <w:noProof/>
+            <w:rtl/>
+          </w:rPr>
+          <w:t>מסגרת משותפת לשאלה 4.</w:t>
+        </w:r>
+        <w:r>
+          <w:rPr>
+            <w:noProof/>
+            <w:webHidden/>
+          </w:rPr>
+          <w:tab/>
+        </w:r>
+        <w:r>
+          <w:rPr>
+            <w:noProof/>
+            <w:webHidden/>
+          </w:rPr>
+          <w:fldChar w:fldCharType="begin"/>
+        </w:r>
+        <w:r>
+          <w:rPr>
+            <w:noProof/>
+            <w:webHidden/>
+          </w:rPr>
+          <w:instrText xml:space="preserve"> PAGEREF _Toc236499074 \h </w:instrText>
+        </w:r>
+        <w:r>
+          <w:rPr>
+            <w:noProof/>
+            <w:webHidden/>
+          </w:rPr>
+        </w:r>
+        <w:r>
+          <w:rPr>
+            <w:noProof/>
+            <w:webHidden/>
+          </w:rPr>
+          <w:fldChar w:fldCharType="separate"/>
+        </w:r>
+        <w:r>
+          <w:rPr>
+            <w:noProof/>
+            <w:webHidden/>
+          </w:rPr>
+          <w:t>20</w:t>
+        </w:r>
+        <w:r>
+          <w:rPr>
+            <w:noProof/>
+            <w:webHidden/>
+          </w:rPr>
+          <w:fldChar w:fldCharType="end"/>
+        </w:r>
+      </w:hyperlink>
+    </w:p>
+    <w:p>
+      <w:pPr>
+        <w:pStyle w:val="TOC2"/>
+        <w:tabs>
+          <w:tab w:val="right" w:leader="dot" w:pos="9402"/>
+        </w:tabs>
+        <w:rPr>
+          <w:rFonts w:asciiTheme="minorHAnsi" w:eastAsiaTheme="minorEastAsia" w:hAnsiTheme="minorHAnsi" w:cstheme="minorBidi"/>
+          <w:noProof/>
+          <w:kern w:val="2"/>
+          <w14:ligatures w14:val="standardContextual"/>
+        </w:rPr>
+      </w:pPr>
+      <w:hyperlink w:anchor="_Toc236499075" w:history="1">
+        <w:r>
+          <w:rPr>
+            <w:rStyle w:val="Hyperlink"/>
+            <w:noProof/>
+            <w:rtl/>
+          </w:rPr>
+          <w:t>סעיף א. Canonization-based network.</w:t>
+        </w:r>
+        <w:r>
+          <w:rPr>
+            <w:noProof/>
+            <w:webHidden/>
+          </w:rPr>
+          <w:tab/>
+        </w:r>
+        <w:r>
+          <w:rPr>
+            <w:noProof/>
+            <w:webHidden/>
+          </w:rPr>
+          <w:fldChar w:fldCharType="begin"/>
+        </w:r>
+        <w:r>
+          <w:rPr>
+            <w:noProof/>
+            <w:webHidden/>
+          </w:rPr>
+          <w:instrText xml:space="preserve"> PAGEREF _Toc236499075 \h </w:instrText>
+        </w:r>
+        <w:r>
+          <w:rPr>
+            <w:noProof/>
+            <w:webHidden/>
+          </w:rPr>
+        </w:r>
+        <w:r>
+          <w:rPr>
+            <w:noProof/>
+            <w:webHidden/>
+          </w:rPr>
+          <w:fldChar w:fldCharType="separate"/>
+        </w:r>
+        <w:r>
+          <w:rPr>
+            <w:noProof/>
+            <w:webHidden/>
+          </w:rPr>
+          <w:t>21</w:t>
+        </w:r>
+        <w:r>
+          <w:rPr>
+            <w:noProof/>
+            <w:webHidden/>
+          </w:rPr>
+          <w:fldChar w:fldCharType="end"/>
+        </w:r>
+      </w:hyperlink>
+    </w:p>
+    <w:p>
+      <w:pPr>
+        <w:pStyle w:val="TOC2"/>
+        <w:tabs>
+          <w:tab w:val="right" w:leader="dot" w:pos="9402"/>
+        </w:tabs>
+        <w:rPr>
+          <w:rFonts w:asciiTheme="minorHAnsi" w:eastAsiaTheme="minorEastAsia" w:hAnsiTheme="minorHAnsi" w:cstheme="minorBidi"/>
+          <w:noProof/>
+          <w:kern w:val="2"/>
+          <w14:ligatures w14:val="standardContextual"/>
+        </w:rPr>
+      </w:pPr>
+      <w:hyperlink w:anchor="_Toc236499076" w:history="1">
+        <w:r>
+          <w:rPr>
+            <w:rStyle w:val="Hyperlink"/>
+            <w:noProof/>
+            <w:rtl/>
+          </w:rPr>
+          <w:t>סעיף ב. Full symmetrization network.</w:t>
+        </w:r>
+        <w:r>
+          <w:rPr>
+            <w:noProof/>
+            <w:webHidden/>
+          </w:rPr>
+          <w:tab/>
+        </w:r>
+        <w:r>
+          <w:rPr>
+            <w:noProof/>
+            <w:webHidden/>
+          </w:rPr>
+          <w:fldChar w:fldCharType="begin"/>
+        </w:r>
+        <w:r>
+          <w:rPr>
+            <w:noProof/>
+            <w:webHidden/>
+          </w:rPr>
+          <w:instrText xml:space="preserve"> PAGEREF _Toc236499076 \h </w:instrText>
+        </w:r>
+        <w:r>
+          <w:rPr>
+            <w:noProof/>
+            <w:webHidden/>
+          </w:rPr>
+        </w:r>
+        <w:r>
+          <w:rPr>
+            <w:noProof/>
+            <w:webHidden/>
+          </w:rPr>
+          <w:fldChar w:fldCharType="separate"/>
+        </w:r>
+        <w:r>
+          <w:rPr>
+            <w:noProof/>
+            <w:webHidden/>
+          </w:rPr>
+          <w:t>21</w:t>
+        </w:r>
+        <w:r>
+          <w:rPr>
+            <w:noProof/>
+            <w:webHidden/>
+          </w:rPr>
+          <w:fldChar w:fldCharType="end"/>
+        </w:r>
+      </w:hyperlink>
+    </w:p>
+    <w:p>
+      <w:pPr>
+        <w:pStyle w:val="TOC2"/>
+        <w:tabs>
+          <w:tab w:val="right" w:leader="dot" w:pos="9402"/>
+        </w:tabs>
+        <w:rPr>
+          <w:rFonts w:asciiTheme="minorHAnsi" w:eastAsiaTheme="minorEastAsia" w:hAnsiTheme="minorHAnsi" w:cstheme="minorBidi"/>
+          <w:noProof/>
+          <w:kern w:val="2"/>
+          <w14:ligatures w14:val="standardContextual"/>
+        </w:rPr>
+      </w:pPr>
+      <w:hyperlink w:anchor="_Toc236499077" w:history="1">
+        <w:r>
+          <w:rPr>
+            <w:rStyle w:val="Hyperlink"/>
+            <w:noProof/>
+            <w:rtl/>
+          </w:rPr>
+          <w:t>סעיף ג. Sampled-symmetrization network.</w:t>
+        </w:r>
+        <w:r>
+          <w:rPr>
+            <w:noProof/>
+            <w:webHidden/>
+          </w:rPr>
+          <w:tab/>
+        </w:r>
+        <w:r>
+          <w:rPr>
+            <w:noProof/>
+            <w:webHidden/>
+          </w:rPr>
+          <w:fldChar w:fldCharType="begin"/>
+        </w:r>
+        <w:r>
+          <w:rPr>
+            <w:noProof/>
+            <w:webHidden/>
+          </w:rPr>
+          <w:instrText xml:space="preserve"> PAGEREF _Toc236499077 \h </w:instrText>
+        </w:r>
+        <w:r>
+          <w:rPr>
+            <w:noProof/>
+            <w:webHidden/>
+          </w:rPr>
+        </w:r>
+        <w:r>
+          <w:rPr>
+            <w:noProof/>
+            <w:webHidden/>
+          </w:rPr>
+          <w:fldChar w:fldCharType="separate"/>
+        </w:r>
+        <w:r>
+          <w:rPr>
+            <w:noProof/>
+            <w:webHidden/>
+          </w:rPr>
+          <w:t>21</w:t>
+        </w:r>
+        <w:r>
+          <w:rPr>
+            <w:noProof/>
+            <w:webHidden/>
+          </w:rPr>
+          <w:fldChar w:fldCharType="end"/>
+        </w:r>
+      </w:hyperlink>
+    </w:p>
+    <w:p>
+      <w:pPr>
+        <w:pStyle w:val="TOC2"/>
+        <w:tabs>
+          <w:tab w:val="right" w:leader="dot" w:pos="9402"/>
+        </w:tabs>
+        <w:rPr>
+          <w:rFonts w:asciiTheme="minorHAnsi" w:eastAsiaTheme="minorEastAsia" w:hAnsiTheme="minorHAnsi" w:cstheme="minorBidi"/>
+          <w:noProof/>
+          <w:kern w:val="2"/>
+          <w14:ligatures w14:val="standardContextual"/>
+        </w:rPr>
+      </w:pPr>
+      <w:hyperlink w:anchor="_Toc236499078" w:history="1">
+        <w:r>
+          <w:rPr>
+            <w:rStyle w:val="Hyperlink"/>
+            <w:noProof/>
+            <w:rtl/>
+          </w:rPr>
+          <w:t>סעיף ד. Linear equivariant layers with mean pooling.</w:t>
+        </w:r>
+        <w:r>
+          <w:rPr>
+            <w:noProof/>
+            <w:webHidden/>
+          </w:rPr>
+          <w:tab/>
+        </w:r>
+        <w:r>
+          <w:rPr>
+            <w:noProof/>
+            <w:webHidden/>
+          </w:rPr>
+          <w:fldChar w:fldCharType="begin"/>
+        </w:r>
+        <w:r>
+          <w:rPr>
+            <w:noProof/>
+            <w:webHidden/>
+          </w:rPr>
+          <w:instrText xml:space="preserve"> PAGEREF _Toc236499078 \h </w:instrText>
+        </w:r>
+        <w:r>
+          <w:rPr>
+            <w:noProof/>
+            <w:webHidden/>
+          </w:rPr>
+        </w:r>
+        <w:r>
+          <w:rPr>
+            <w:noProof/>
+            <w:webHidden/>
+          </w:rPr>
+          <w:fldChar w:fldCharType="separate"/>
+        </w:r>
+        <w:r>
+          <w:rPr>
+            <w:noProof/>
+            <w:webHidden/>
+          </w:rPr>
+          <w:t>22</w:t>
+        </w:r>
+        <w:r>
+          <w:rPr>
+            <w:noProof/>
+            <w:webHidden/>
+          </w:rPr>
+          <w:fldChar w:fldCharType="end"/>
+        </w:r>
+      </w:hyperlink>
+    </w:p>
+    <w:p>
+      <w:pPr>
+        <w:pStyle w:val="TOC2"/>
+        <w:tabs>
+          <w:tab w:val="right" w:leader="dot" w:pos="9402"/>
+        </w:tabs>
+        <w:rPr>
+          <w:rFonts w:asciiTheme="minorHAnsi" w:eastAsiaTheme="minorEastAsia" w:hAnsiTheme="minorHAnsi" w:cstheme="minorBidi"/>
+          <w:noProof/>
+          <w:kern w:val="2"/>
+          <w14:ligatures w14:val="standardContextual"/>
+        </w:rPr>
+      </w:pPr>
+      <w:hyperlink w:anchor="_Toc236499079" w:history="1">
+        <w:r>
+          <w:rPr>
+            <w:rStyle w:val="Hyperlink"/>
+            <w:noProof/>
+            <w:rtl/>
+          </w:rPr>
+          <w:t>סעיף ה. Data augmentation with permutations.</w:t>
+        </w:r>
+        <w:r>
+          <w:rPr>
+            <w:noProof/>
+            <w:webHidden/>
+          </w:rPr>
+          <w:tab/>
+        </w:r>
+        <w:r>
+          <w:rPr>
+            <w:noProof/>
+            <w:webHidden/>
+          </w:rPr>
+          <w:fldChar w:fldCharType="begin"/>
+        </w:r>
+        <w:r>
+          <w:rPr>
+            <w:noProof/>
+            <w:webHidden/>
+          </w:rPr>
+          <w:instrText xml:space="preserve"> PAGEREF _Toc236499079 \h </w:instrText>
+        </w:r>
+        <w:r>
+          <w:rPr>
+            <w:noProof/>
+            <w:webHidden/>
+          </w:rPr>
+        </w:r>
+        <w:r>
+          <w:rPr>
+            <w:noProof/>
+            <w:webHidden/>
+          </w:rPr>
+          <w:fldChar w:fldCharType="separate"/>
+        </w:r>
+        <w:r>
+          <w:rPr>
+            <w:noProof/>
+            <w:webHidden/>
+          </w:rPr>
+          <w:t>22</w:t>
+        </w:r>
+        <w:r>
+          <w:rPr>
+            <w:noProof/>
+            <w:webHidden/>
+          </w:rPr>
+          <w:fldChar w:fldCharType="end"/>
+        </w:r>
+      </w:hyperlink>
+    </w:p>
+    <w:p>
+      <w:pPr>
+        <w:pStyle w:val="TOC2"/>
+        <w:tabs>
+          <w:tab w:val="right" w:leader="dot" w:pos="9402"/>
+        </w:tabs>
+        <w:rPr>
+          <w:rFonts w:asciiTheme="minorHAnsi" w:eastAsiaTheme="minorEastAsia" w:hAnsiTheme="minorHAnsi" w:cstheme="minorBidi"/>
+          <w:noProof/>
+          <w:kern w:val="2"/>
+          <w14:ligatures w14:val="standardContextual"/>
+        </w:rPr>
+      </w:pPr>
+      <w:hyperlink w:anchor="_Toc236499080" w:history="1">
+        <w:r>
+          <w:rPr>
+            <w:rStyle w:val="Hyperlink"/>
+            <w:noProof/>
+            <w:rtl/>
+          </w:rPr>
+          <w:t>תוצאות, ניתוח והמלצה.</w:t>
+        </w:r>
+        <w:r>
+          <w:rPr>
+            <w:noProof/>
+            <w:webHidden/>
+          </w:rPr>
+          <w:tab/>
+        </w:r>
+        <w:r>
+          <w:rPr>
+            <w:noProof/>
+            <w:webHidden/>
+          </w:rPr>
+          <w:fldChar w:fldCharType="begin"/>
+        </w:r>
+        <w:r>
+          <w:rPr>
+            <w:noProof/>
+            <w:webHidden/>
+          </w:rPr>
+          <w:instrText xml:space="preserve"> PAGEREF _Toc236499080 \h </w:instrText>
+        </w:r>
+        <w:r>
+          <w:rPr>
+            <w:noProof/>
+            <w:webHidden/>
+          </w:rPr>
+        </w:r>
+        <w:r>
+          <w:rPr>
+            <w:noProof/>
+            <w:webHidden/>
+          </w:rPr>
+          <w:fldChar w:fldCharType="separate"/>
+        </w:r>
+        <w:r>
+          <w:rPr>
+            <w:noProof/>
+            <w:webHidden/>
+          </w:rPr>
+          <w:t>22</w:t>
         </w:r>
         <w:r>
           <w:rPr>
@@ -1452,7 +2037,7 @@
         </w:rPr>
         <w:fldChar w:fldCharType="end"/>
       </w:r>
-      <w:bookmarkStart w:id="1" w:name="_Toc236481854"/>
+      <w:bookmarkStart w:id="1" w:name="_Toc236499055"/>
       <w:r>
         <w:rPr>
           <w:rtl/>
@@ -2419,12 +3004,11 @@
           <w:rtl/>
         </w:rPr>
       </w:pPr>
-      <w:bookmarkStart w:id="2" w:name="_Toc236481855"/>
-      <w:r>
-        <w:rPr>
-          <w:rtl/>
-        </w:rPr>
-        <w:lastRenderedPageBreak/>
+      <w:bookmarkStart w:id="2" w:name="_Toc236499056"/>
+      <w:r>
+        <w:rPr>
+          <w:rtl/>
+        </w:rPr>
         <w:t xml:space="preserve">המרחב </w:t>
       </w:r>
       <m:oMath>
@@ -4138,7 +4722,7 @@
           <w:rtl/>
         </w:rPr>
       </w:pPr>
-      <w:bookmarkStart w:id="3" w:name="_Toc236481856"/>
+      <w:bookmarkStart w:id="3" w:name="_Toc236499057"/>
       <w:r>
         <w:rPr>
           <w:rtl/>
@@ -5735,7 +6319,7 @@
           <w:rtl/>
         </w:rPr>
       </w:pPr>
-      <w:bookmarkStart w:id="4" w:name="_Toc236481857"/>
+      <w:bookmarkStart w:id="4" w:name="_Toc236499058"/>
       <w:r>
         <w:rPr>
           <w:rtl/>
@@ -7319,7 +7903,7 @@
           <w:rtl/>
         </w:rPr>
       </w:pPr>
-      <w:bookmarkStart w:id="5" w:name="_Toc236481858"/>
+      <w:bookmarkStart w:id="5" w:name="_Toc236499059"/>
       <w:r>
         <w:rPr>
           <w:rtl/>
@@ -7906,7 +8490,7 @@
         </w:rPr>
       </w:pPr>
       <w:bookmarkStart w:id="6" w:name="שאלה-2"/>
-      <w:bookmarkStart w:id="7" w:name="_Toc236481859"/>
+      <w:bookmarkStart w:id="7" w:name="_Toc236499060"/>
       <w:bookmarkEnd w:id="0"/>
       <w:r>
         <w:rPr>
@@ -8698,7 +9282,7 @@
           <w:rtl/>
         </w:rPr>
       </w:pPr>
-      <w:bookmarkStart w:id="8" w:name="_Toc236481860"/>
+      <w:bookmarkStart w:id="8" w:name="_Toc236499061"/>
       <w:r>
         <w:rPr>
           <w:rtl/>
@@ -9911,7 +10495,7 @@
           <w:rtl/>
         </w:rPr>
       </w:pPr>
-      <w:bookmarkStart w:id="9" w:name="_Toc236481861"/>
+      <w:bookmarkStart w:id="9" w:name="_Toc236499062"/>
       <w:r>
         <w:rPr>
           <w:rtl/>
@@ -13304,7 +13888,7 @@
           <w:rtl/>
         </w:rPr>
       </w:pPr>
-      <w:bookmarkStart w:id="10" w:name="_Toc236481862"/>
+      <w:bookmarkStart w:id="10" w:name="_Toc236499063"/>
       <w:r>
         <w:rPr>
           <w:rtl/>
@@ -14662,7 +15246,7 @@
           <w:rtl/>
         </w:rPr>
       </w:pPr>
-      <w:bookmarkStart w:id="11" w:name="_Toc236481863"/>
+      <w:bookmarkStart w:id="11" w:name="_Toc236499064"/>
       <w:r>
         <w:rPr>
           <w:rtl/>
@@ -15972,7 +16556,7 @@
           <w:rtl/>
         </w:rPr>
       </w:pPr>
-      <w:bookmarkStart w:id="12" w:name="_Toc236481864"/>
+      <w:bookmarkStart w:id="12" w:name="_Toc236499065"/>
       <w:r>
         <w:rPr>
           <w:rtl/>
@@ -16090,7 +16674,7 @@
           <w:rtl/>
         </w:rPr>
       </w:pPr>
-      <w:bookmarkStart w:id="13" w:name="_Toc236481865"/>
+      <w:bookmarkStart w:id="13" w:name="_Toc236499066"/>
       <w:r>
         <w:rPr>
           <w:rtl/>
@@ -16220,7 +16804,7 @@
           <w:rtl/>
         </w:rPr>
       </w:pPr>
-      <w:bookmarkStart w:id="14" w:name="_Toc236481866"/>
+      <w:bookmarkStart w:id="14" w:name="_Toc236499067"/>
       <w:r>
         <w:rPr>
           <w:rtl/>
@@ -16816,7 +17400,7 @@
           <w:rtl/>
         </w:rPr>
       </w:pPr>
-      <w:bookmarkStart w:id="15" w:name="_Toc236481867"/>
+      <w:bookmarkStart w:id="15" w:name="_Toc236499068"/>
       <w:r>
         <w:rPr>
           <w:rtl/>
@@ -17752,7 +18336,7 @@
           <w:rtl/>
         </w:rPr>
       </w:pPr>
-      <w:bookmarkStart w:id="16" w:name="_Toc236481868"/>
+      <w:bookmarkStart w:id="16" w:name="_Toc236499069"/>
       <w:r>
         <w:rPr>
           <w:rtl/>
@@ -19052,7 +19636,7 @@
           <w:rtl/>
         </w:rPr>
       </w:pPr>
-      <w:bookmarkStart w:id="17" w:name="_Toc236481869"/>
+      <w:bookmarkStart w:id="17" w:name="_Toc236499070"/>
       <w:r>
         <w:rPr>
           <w:rtl/>
@@ -21134,7 +21718,7 @@
           <w:rtl/>
         </w:rPr>
       </w:pPr>
-      <w:bookmarkStart w:id="18" w:name="_Toc236481870"/>
+      <w:bookmarkStart w:id="18" w:name="_Toc236499071"/>
       <w:r>
         <w:rPr>
           <w:rtl/>
@@ -22732,7 +23316,7 @@
           <w:rtl/>
         </w:rPr>
       </w:pPr>
-      <w:bookmarkStart w:id="19" w:name="_Toc236481871"/>
+      <w:bookmarkStart w:id="19" w:name="_Toc236499072"/>
       <w:r>
         <w:rPr>
           <w:rtl/>
@@ -26340,13 +26924,3545 @@
         <w:t xml:space="preserve"> התמורות מסביר חלק מרכזי מן התוצאה בניסוי הגדול.</w:t>
       </w:r>
     </w:p>
+    <w:p>
+      <w:pPr>
+        <w:pStyle w:val="Heading1"/>
+        <w:rPr>
+          <w:rtl/>
+        </w:rPr>
+      </w:pPr>
+      <w:bookmarkStart w:id="20" w:name="_Toc236499073"/>
+      <w:r>
+        <w:rPr>
+          <w:rtl/>
+        </w:rPr>
+        <w:t>שאלה 4</w:t>
+      </w:r>
+      <w:bookmarkEnd w:id="20"/>
+    </w:p>
+    <w:p>
+      <w:pPr>
+        <w:pStyle w:val="BodyText"/>
+        <w:keepLines/>
+        <w:spacing w:before="0" w:after="160"/>
+        <w:jc w:val="center"/>
+      </w:pPr>
+      <w:r>
+        <w:rPr>
+          <w:noProof/>
+        </w:rPr>
+        <w:drawing>
+          <wp:inline distT="0" distB="0" distL="0" distR="0" wp14:anchorId="182F4A53" wp14:editId="694318CF">
+            <wp:extent cx="5669280" cy="7789499"/>
+            <wp:effectExtent l="0" t="0" r="0" b="0"/>
+            <wp:docPr id="29" name="Picture 29" descr="Question 4 source excerpt, first page"/>
+            <wp:cNvGraphicFramePr>
+              <a:graphicFrameLocks xmlns:a="http://schemas.openxmlformats.org/drawingml/2006/main" noChangeAspect="1"/>
+            </wp:cNvGraphicFramePr>
+            <a:graphic xmlns:a="http://schemas.openxmlformats.org/drawingml/2006/main">
+              <a:graphicData uri="http://schemas.openxmlformats.org/drawingml/2006/picture">
+                <pic:pic xmlns:pic="http://schemas.openxmlformats.org/drawingml/2006/picture">
+                  <pic:nvPicPr>
+                    <pic:cNvPr id="0" name="q4-prompt-page-1.png"/>
+                    <pic:cNvPicPr/>
+                  </pic:nvPicPr>
+                  <pic:blipFill>
+                    <a:blip r:embed="rId13"/>
+                    <a:stretch>
+                      <a:fillRect/>
+                    </a:stretch>
+                  </pic:blipFill>
+                  <pic:spPr>
+                    <a:xfrm>
+                      <a:off x="0" y="0"/>
+                      <a:ext cx="5669280" cy="7789499"/>
+                    </a:xfrm>
+                    <a:prstGeom prst="rect">
+                      <a:avLst/>
+                    </a:prstGeom>
+                  </pic:spPr>
+                </pic:pic>
+              </a:graphicData>
+            </a:graphic>
+          </wp:inline>
+        </w:drawing>
+      </w:r>
+    </w:p>
+    <w:p>
+      <w:pPr>
+        <w:pStyle w:val="BodyText"/>
+        <w:keepLines/>
+        <w:spacing w:before="0" w:after="160"/>
+        <w:jc w:val="center"/>
+      </w:pPr>
+      <w:r>
+        <w:rPr>
+          <w:noProof/>
+        </w:rPr>
+        <w:drawing>
+          <wp:inline distT="0" distB="0" distL="0" distR="0" wp14:anchorId="4E1BA20D" wp14:editId="1524B94C">
+            <wp:extent cx="5669280" cy="3595153"/>
+            <wp:effectExtent l="0" t="0" r="0" b="0"/>
+            <wp:docPr id="30" name="Picture 30" descr="Question 4 source excerpt, second page"/>
+            <wp:cNvGraphicFramePr>
+              <a:graphicFrameLocks xmlns:a="http://schemas.openxmlformats.org/drawingml/2006/main" noChangeAspect="1"/>
+            </wp:cNvGraphicFramePr>
+            <a:graphic xmlns:a="http://schemas.openxmlformats.org/drawingml/2006/main">
+              <a:graphicData uri="http://schemas.openxmlformats.org/drawingml/2006/picture">
+                <pic:pic xmlns:pic="http://schemas.openxmlformats.org/drawingml/2006/picture">
+                  <pic:nvPicPr>
+                    <pic:cNvPr id="0" name="q4-prompt-page-2.png"/>
+                    <pic:cNvPicPr/>
+                  </pic:nvPicPr>
+                  <pic:blipFill>
+                    <a:blip r:embed="rId14"/>
+                    <a:stretch>
+                      <a:fillRect/>
+                    </a:stretch>
+                  </pic:blipFill>
+                  <pic:spPr>
+                    <a:xfrm>
+                      <a:off x="0" y="0"/>
+                      <a:ext cx="5669280" cy="3595153"/>
+                    </a:xfrm>
+                    <a:prstGeom prst="rect">
+                      <a:avLst/>
+                    </a:prstGeom>
+                  </pic:spPr>
+                </pic:pic>
+              </a:graphicData>
+            </a:graphic>
+          </wp:inline>
+        </w:drawing>
+      </w:r>
+    </w:p>
+    <w:p>
+      <w:pPr>
+        <w:pStyle w:val="Heading2"/>
+        <w:rPr>
+          <w:rtl/>
+        </w:rPr>
+      </w:pPr>
+      <w:bookmarkStart w:id="21" w:name="_Toc236499074"/>
+      <w:r>
+        <w:rPr>
+          <w:rtl/>
+        </w:rPr>
+        <w:t>מסגרת משותפת לשאלה 4.</w:t>
+      </w:r>
+      <w:bookmarkEnd w:id="21"/>
+    </w:p>
+    <w:p>
+      <w:r>
+        <w:rPr>
+          <w:rtl/>
+        </w:rPr>
+        <w:t xml:space="preserve">המשימה היא סיווג ענני נקודות תלת-ממדיים מתוך ModelNet40 לאחת מ-40 מחלקות. כל דוגמה מיוצגת כמטריצה </w:t>
+      </w:r>
+      <m:oMath>
+        <m:r>
+          <w:rPr>
+            <w:rFonts w:ascii="Cambria Math" w:hAnsi="Cambria Math"/>
+          </w:rPr>
+          <m:t>X∈</m:t>
+        </m:r>
+        <m:sSup>
+          <m:sSupPr>
+            <m:ctrlPr>
+              <w:rPr>
+                <w:rFonts w:ascii="Cambria Math" w:hAnsi="Cambria Math"/>
+              </w:rPr>
+            </m:ctrlPr>
+          </m:sSupPr>
+          <m:e>
+            <m:r>
+              <m:rPr>
+                <m:scr m:val="double-struck"/>
+              </m:rPr>
+              <w:rPr>
+                <w:rFonts w:ascii="Cambria Math" w:hAnsi="Cambria Math"/>
+              </w:rPr>
+              <m:t>R</m:t>
+            </m:r>
+          </m:e>
+          <m:sup>
+            <m:r>
+              <w:rPr>
+                <w:rFonts w:ascii="Cambria Math" w:hAnsi="Cambria Math"/>
+              </w:rPr>
+              <m:t>n×3</m:t>
+            </m:r>
+          </m:sup>
+        </m:sSup>
+      </m:oMath>
+      <w:r>
+        <w:rPr>
+          <w:rtl/>
+        </w:rPr>
+        <w:t xml:space="preserve">, והסימטריה הרלוונטית היא שינוי סדר השורות על ידי </w:t>
+      </w:r>
+      <m:oMath>
+        <m:sSub>
+          <m:sSubPr>
+            <m:ctrlPr>
+              <w:rPr>
+                <w:rFonts w:ascii="Cambria Math" w:hAnsi="Cambria Math"/>
+              </w:rPr>
+            </m:ctrlPr>
+          </m:sSubPr>
+          <m:e>
+            <m:r>
+              <w:rPr>
+                <w:rFonts w:ascii="Cambria Math" w:hAnsi="Cambria Math"/>
+              </w:rPr>
+              <m:t>S</m:t>
+            </m:r>
+          </m:e>
+          <m:sub>
+            <m:r>
+              <w:rPr>
+                <w:rFonts w:ascii="Cambria Math" w:hAnsi="Cambria Math"/>
+              </w:rPr>
+              <m:t>n</m:t>
+            </m:r>
+          </m:sub>
+        </m:sSub>
+      </m:oMath>
+      <w:r>
+        <w:rPr>
+          <w:rtl/>
+        </w:rPr>
+        <w:t>. השתמשנו במהדורת ModelNet40 normal resampled מן הקישור בשאלה, בשלוש קואורדינטות XYZ הראשונות וב-256 הנקודות הראשונות בכל ענן, ללא הנורמלים, מרכוז או שינוי קנה מידה.</w:t>
+      </w:r>
+    </w:p>
+    <w:p>
+      <w:r>
+        <w:rPr>
+          <w:rtl/>
+        </w:rPr>
+        <w:t>בדיקת הסבירות הבאה מציגה את 256 הנקודות הראשונות מדוגמאות של airplane ושל chair. המבנים הגאומטריים ניתנים לזיהוי והטווחים סופיים, ולכן טעינת הנתונים תקינה.</w:t>
+      </w:r>
+    </w:p>
+    <w:p>
+      <w:pPr>
+        <w:pStyle w:val="BodyText"/>
+        <w:keepLines/>
+        <w:spacing w:before="0" w:after="160"/>
+        <w:jc w:val="center"/>
+      </w:pPr>
+      <w:r>
+        <w:rPr>
+          <w:noProof/>
+        </w:rPr>
+        <w:drawing>
+          <wp:inline distT="0" distB="0" distL="0" distR="0" wp14:anchorId="3CE553A7" wp14:editId="44C70C9A">
+            <wp:extent cx="5394960" cy="2870068"/>
+            <wp:effectExtent l="0" t="0" r="0" b="0"/>
+            <wp:docPr id="31" name="Picture 31" descr="ModelNet40 sanity check for airplane and chair point clouds"/>
+            <wp:cNvGraphicFramePr>
+              <a:graphicFrameLocks xmlns:a="http://schemas.openxmlformats.org/drawingml/2006/main" noChangeAspect="1"/>
+            </wp:cNvGraphicFramePr>
+            <a:graphic xmlns:a="http://schemas.openxmlformats.org/drawingml/2006/main">
+              <a:graphicData uri="http://schemas.openxmlformats.org/drawingml/2006/picture">
+                <pic:pic xmlns:pic="http://schemas.openxmlformats.org/drawingml/2006/picture">
+                  <pic:nvPicPr>
+                    <pic:cNvPr id="0" name="modelnet40_sanity.png"/>
+                    <pic:cNvPicPr/>
+                  </pic:nvPicPr>
+                  <pic:blipFill>
+                    <a:blip r:embed="rId15"/>
+                    <a:stretch>
+                      <a:fillRect/>
+                    </a:stretch>
+                  </pic:blipFill>
+                  <pic:spPr>
+                    <a:xfrm>
+                      <a:off x="0" y="0"/>
+                      <a:ext cx="5394960" cy="2870068"/>
+                    </a:xfrm>
+                    <a:prstGeom prst="rect">
+                      <a:avLst/>
+                    </a:prstGeom>
+                  </pic:spPr>
+                </pic:pic>
+              </a:graphicData>
+            </a:graphic>
+          </wp:inline>
+        </w:drawing>
+      </w:r>
+    </w:p>
+    <w:p>
+      <w:r>
+        <w:rPr>
+          <w:rtl/>
+        </w:rPr>
+        <w:t xml:space="preserve">קבענו seed 2319 ובנינו לכל מחלקה מאגר מדורג ומשותף של 5, 10 ו-50 דוגמאות. מכל חמישייה הוקצו ארבע דוגמאות עבור training ואחת עבור validation, ולכן התקבלו בהתאמה 4/1, 8/2 ו-40/10 דוגמאות למחלקה. קבוצת test הרשמית, הכוללת 2,468 דוגמאות, לא השתתפה בבחירת המודל. כל הארכיטקטורות קיבלו אותם פיצולים ואותו </w:t>
+      </w:r>
+      <w:r>
+        <w:t>batch order</w:t>
+      </w:r>
+      <w:r>
+        <w:rPr>
+          <w:rtl/>
+        </w:rPr>
+        <w:t>, ומשקלי ההתחלה הותאמו כאשר מבנה MLP הבסיסי היה זהה.</w:t>
+      </w:r>
+    </w:p>
+    <w:tbl>
+      <w:tblPr>
+        <w:bidiVisual/>
+        <w:tblW w:w="8856" w:type="dxa"/>
+        <w:jc w:val="center"/>
+        <w:tblBorders>
+          <w:top w:val="single" w:sz="4" w:space="0" w:color="B7C9DC"/>
+          <w:left w:val="single" w:sz="4" w:space="0" w:color="B7C9DC"/>
+          <w:bottom w:val="single" w:sz="4" w:space="0" w:color="B7C9DC"/>
+          <w:right w:val="single" w:sz="4" w:space="0" w:color="B7C9DC"/>
+          <w:insideH w:val="single" w:sz="4" w:space="0" w:color="B7C9DC"/>
+          <w:insideV w:val="single" w:sz="4" w:space="0" w:color="B7C9DC"/>
+        </w:tblBorders>
+        <w:tblLayout w:type="fixed"/>
+        <w:tblLook w:val="04A0" w:firstRow="1" w:lastRow="0" w:firstColumn="1" w:lastColumn="0" w:noHBand="0" w:noVBand="1"/>
+      </w:tblPr>
+      <w:tblGrid>
+        <w:gridCol w:w="3744"/>
+        <w:gridCol w:w="5112"/>
+      </w:tblGrid>
+      <w:tr>
+        <w:trPr>
+          <w:cantSplit/>
+          <w:tblHeader/>
+          <w:jc w:val="center"/>
+        </w:trPr>
+        <w:tc>
+          <w:tcPr>
+            <w:tcW w:w="3744" w:type="dxa"/>
+            <w:shd w:val="clear" w:color="auto" w:fill="D9EAF7"/>
+            <w:tcMar>
+              <w:top w:w="70" w:type="dxa"/>
+              <w:left w:w="70" w:type="dxa"/>
+              <w:bottom w:w="70" w:type="dxa"/>
+              <w:right w:w="70" w:type="dxa"/>
+            </w:tcMar>
+            <w:vAlign w:val="center"/>
+          </w:tcPr>
+          <w:p>
+            <w:pPr>
+              <w:keepNext/>
+              <w:keepLines/>
+              <w:spacing w:after="0"/>
+              <w:jc w:val="center"/>
+            </w:pPr>
+            <w:r>
+              <w:rPr>
+                <w:b/>
+                <w:color w:val="365F91"/>
+                <w:rtl/>
+              </w:rPr>
+              <w:t>היפרפרמטר או בחירת מימוש</w:t>
+            </w:r>
+          </w:p>
+        </w:tc>
+        <w:tc>
+          <w:tcPr>
+            <w:tcW w:w="5112" w:type="dxa"/>
+            <w:shd w:val="clear" w:color="auto" w:fill="D9EAF7"/>
+            <w:tcMar>
+              <w:top w:w="70" w:type="dxa"/>
+              <w:left w:w="70" w:type="dxa"/>
+              <w:bottom w:w="70" w:type="dxa"/>
+              <w:right w:w="70" w:type="dxa"/>
+            </w:tcMar>
+            <w:vAlign w:val="center"/>
+          </w:tcPr>
+          <w:p>
+            <w:pPr>
+              <w:keepNext/>
+              <w:keepLines/>
+              <w:spacing w:after="0"/>
+              <w:jc w:val="center"/>
+            </w:pPr>
+            <w:r>
+              <w:rPr>
+                <w:b/>
+                <w:color w:val="365F91"/>
+                <w:rtl/>
+              </w:rPr>
+              <w:t>ערך</w:t>
+            </w:r>
+          </w:p>
+        </w:tc>
+      </w:tr>
+      <w:tr>
+        <w:trPr>
+          <w:cantSplit/>
+          <w:jc w:val="center"/>
+        </w:trPr>
+        <w:tc>
+          <w:tcPr>
+            <w:tcW w:w="3744" w:type="dxa"/>
+            <w:tcMar>
+              <w:top w:w="70" w:type="dxa"/>
+              <w:left w:w="70" w:type="dxa"/>
+              <w:bottom w:w="70" w:type="dxa"/>
+              <w:right w:w="70" w:type="dxa"/>
+            </w:tcMar>
+            <w:vAlign w:val="center"/>
+          </w:tcPr>
+          <w:p>
+            <w:pPr>
+              <w:keepNext/>
+              <w:keepLines/>
+              <w:spacing w:after="0"/>
+              <w:jc w:val="center"/>
+            </w:pPr>
+            <w:r>
+              <w:rPr>
+                <w:rtl/>
+              </w:rPr>
+              <w:t>מקור הנתונים</w:t>
+            </w:r>
+          </w:p>
+        </w:tc>
+        <w:tc>
+          <w:tcPr>
+            <w:tcW w:w="5112" w:type="dxa"/>
+            <w:tcMar>
+              <w:top w:w="70" w:type="dxa"/>
+              <w:left w:w="70" w:type="dxa"/>
+              <w:bottom w:w="70" w:type="dxa"/>
+              <w:right w:w="70" w:type="dxa"/>
+            </w:tcMar>
+            <w:vAlign w:val="center"/>
+          </w:tcPr>
+          <w:p>
+            <w:pPr>
+              <w:keepNext/>
+              <w:keepLines/>
+              <w:bidi w:val="0"/>
+              <w:spacing w:after="0"/>
+              <w:jc w:val="center"/>
+            </w:pPr>
+            <w:r>
+              <w:t>ModelNet40 normal resampled</w:t>
+            </w:r>
+          </w:p>
+        </w:tc>
+      </w:tr>
+      <w:tr>
+        <w:trPr>
+          <w:cantSplit/>
+          <w:jc w:val="center"/>
+        </w:trPr>
+        <w:tc>
+          <w:tcPr>
+            <w:tcW w:w="3744" w:type="dxa"/>
+            <w:tcMar>
+              <w:top w:w="70" w:type="dxa"/>
+              <w:left w:w="70" w:type="dxa"/>
+              <w:bottom w:w="70" w:type="dxa"/>
+              <w:right w:w="70" w:type="dxa"/>
+            </w:tcMar>
+            <w:vAlign w:val="center"/>
+          </w:tcPr>
+          <w:p>
+            <w:pPr>
+              <w:keepNext/>
+              <w:keepLines/>
+              <w:bidi w:val="0"/>
+              <w:spacing w:after="0"/>
+              <w:jc w:val="center"/>
+            </w:pPr>
+            <w:r>
+              <w:t>seed</w:t>
+            </w:r>
+          </w:p>
+        </w:tc>
+        <w:tc>
+          <w:tcPr>
+            <w:tcW w:w="5112" w:type="dxa"/>
+            <w:tcMar>
+              <w:top w:w="70" w:type="dxa"/>
+              <w:left w:w="70" w:type="dxa"/>
+              <w:bottom w:w="70" w:type="dxa"/>
+              <w:right w:w="70" w:type="dxa"/>
+            </w:tcMar>
+            <w:vAlign w:val="center"/>
+          </w:tcPr>
+          <w:p>
+            <w:pPr>
+              <w:keepNext/>
+              <w:keepLines/>
+              <w:bidi w:val="0"/>
+              <w:spacing w:after="0"/>
+              <w:jc w:val="center"/>
+            </w:pPr>
+            <w:r>
+              <w:t>2319</w:t>
+            </w:r>
+          </w:p>
+        </w:tc>
+      </w:tr>
+      <w:tr>
+        <w:trPr>
+          <w:cantSplit/>
+          <w:jc w:val="center"/>
+        </w:trPr>
+        <w:tc>
+          <w:tcPr>
+            <w:tcW w:w="3744" w:type="dxa"/>
+            <w:tcMar>
+              <w:top w:w="70" w:type="dxa"/>
+              <w:left w:w="70" w:type="dxa"/>
+              <w:bottom w:w="70" w:type="dxa"/>
+              <w:right w:w="70" w:type="dxa"/>
+            </w:tcMar>
+            <w:vAlign w:val="center"/>
+          </w:tcPr>
+          <w:p>
+            <w:pPr>
+              <w:keepNext/>
+              <w:keepLines/>
+              <w:spacing w:after="0"/>
+              <w:jc w:val="center"/>
+            </w:pPr>
+            <w:r>
+              <w:rPr>
+                <w:rtl/>
+              </w:rPr>
+              <w:t>דוגמאות שנבחרו למחלקה</w:t>
+            </w:r>
+          </w:p>
+        </w:tc>
+        <w:tc>
+          <w:tcPr>
+            <w:tcW w:w="5112" w:type="dxa"/>
+            <w:tcMar>
+              <w:top w:w="70" w:type="dxa"/>
+              <w:left w:w="70" w:type="dxa"/>
+              <w:bottom w:w="70" w:type="dxa"/>
+              <w:right w:w="70" w:type="dxa"/>
+            </w:tcMar>
+            <w:vAlign w:val="center"/>
+          </w:tcPr>
+          <w:p>
+            <w:pPr>
+              <w:keepNext/>
+              <w:keepLines/>
+              <w:bidi w:val="0"/>
+              <w:spacing w:after="0"/>
+              <w:jc w:val="center"/>
+            </w:pPr>
+            <w:r>
+              <w:t>5, 10, 50</w:t>
+            </w:r>
+          </w:p>
+        </w:tc>
+      </w:tr>
+      <w:tr>
+        <w:trPr>
+          <w:cantSplit/>
+          <w:jc w:val="center"/>
+        </w:trPr>
+        <w:tc>
+          <w:tcPr>
+            <w:tcW w:w="3744" w:type="dxa"/>
+            <w:tcMar>
+              <w:top w:w="70" w:type="dxa"/>
+              <w:left w:w="70" w:type="dxa"/>
+              <w:bottom w:w="70" w:type="dxa"/>
+              <w:right w:w="70" w:type="dxa"/>
+            </w:tcMar>
+            <w:vAlign w:val="center"/>
+          </w:tcPr>
+          <w:p>
+            <w:pPr>
+              <w:keepNext/>
+              <w:keepLines/>
+              <w:spacing w:after="0"/>
+              <w:jc w:val="center"/>
+            </w:pPr>
+            <w:r>
+              <w:rPr>
+                <w:rtl/>
+              </w:rPr>
+              <w:t>training/validation למחלקה</w:t>
+            </w:r>
+          </w:p>
+        </w:tc>
+        <w:tc>
+          <w:tcPr>
+            <w:tcW w:w="5112" w:type="dxa"/>
+            <w:tcMar>
+              <w:top w:w="70" w:type="dxa"/>
+              <w:left w:w="70" w:type="dxa"/>
+              <w:bottom w:w="70" w:type="dxa"/>
+              <w:right w:w="70" w:type="dxa"/>
+            </w:tcMar>
+            <w:vAlign w:val="center"/>
+          </w:tcPr>
+          <w:p>
+            <w:pPr>
+              <w:keepNext/>
+              <w:keepLines/>
+              <w:bidi w:val="0"/>
+              <w:spacing w:after="0"/>
+              <w:jc w:val="center"/>
+            </w:pPr>
+            <w:r>
+              <w:t>4/1, 8/2, 40/10</w:t>
+            </w:r>
+          </w:p>
+        </w:tc>
+      </w:tr>
+      <w:tr>
+        <w:trPr>
+          <w:cantSplit/>
+          <w:jc w:val="center"/>
+        </w:trPr>
+        <w:tc>
+          <w:tcPr>
+            <w:tcW w:w="3744" w:type="dxa"/>
+            <w:tcMar>
+              <w:top w:w="70" w:type="dxa"/>
+              <w:left w:w="70" w:type="dxa"/>
+              <w:bottom w:w="70" w:type="dxa"/>
+              <w:right w:w="70" w:type="dxa"/>
+            </w:tcMar>
+            <w:vAlign w:val="center"/>
+          </w:tcPr>
+          <w:p>
+            <w:pPr>
+              <w:keepNext/>
+              <w:keepLines/>
+              <w:spacing w:after="0"/>
+              <w:jc w:val="center"/>
+            </w:pPr>
+            <w:r>
+              <w:rPr>
+                <w:rtl/>
+              </w:rPr>
+              <w:t>פונקציית הפסד</w:t>
+            </w:r>
+          </w:p>
+        </w:tc>
+        <w:tc>
+          <w:tcPr>
+            <w:tcW w:w="5112" w:type="dxa"/>
+            <w:tcMar>
+              <w:top w:w="70" w:type="dxa"/>
+              <w:left w:w="70" w:type="dxa"/>
+              <w:bottom w:w="70" w:type="dxa"/>
+              <w:right w:w="70" w:type="dxa"/>
+            </w:tcMar>
+            <w:vAlign w:val="center"/>
+          </w:tcPr>
+          <w:p>
+            <w:pPr>
+              <w:keepNext/>
+              <w:keepLines/>
+              <w:bidi w:val="0"/>
+              <w:spacing w:after="0"/>
+              <w:jc w:val="center"/>
+            </w:pPr>
+            <w:r>
+              <w:t>CrossEntropyLoss</w:t>
+            </w:r>
+          </w:p>
+        </w:tc>
+      </w:tr>
+      <w:tr>
+        <w:trPr>
+          <w:cantSplit/>
+          <w:jc w:val="center"/>
+        </w:trPr>
+        <w:tc>
+          <w:tcPr>
+            <w:tcW w:w="3744" w:type="dxa"/>
+            <w:tcMar>
+              <w:top w:w="70" w:type="dxa"/>
+              <w:left w:w="70" w:type="dxa"/>
+              <w:bottom w:w="70" w:type="dxa"/>
+              <w:right w:w="70" w:type="dxa"/>
+            </w:tcMar>
+            <w:vAlign w:val="center"/>
+          </w:tcPr>
+          <w:p>
+            <w:pPr>
+              <w:keepNext/>
+              <w:keepLines/>
+              <w:bidi w:val="0"/>
+              <w:spacing w:after="0"/>
+              <w:jc w:val="center"/>
+            </w:pPr>
+            <w:r>
+              <w:t>optimizer</w:t>
+            </w:r>
+          </w:p>
+        </w:tc>
+        <w:tc>
+          <w:tcPr>
+            <w:tcW w:w="5112" w:type="dxa"/>
+            <w:tcMar>
+              <w:top w:w="70" w:type="dxa"/>
+              <w:left w:w="70" w:type="dxa"/>
+              <w:bottom w:w="70" w:type="dxa"/>
+              <w:right w:w="70" w:type="dxa"/>
+            </w:tcMar>
+            <w:vAlign w:val="center"/>
+          </w:tcPr>
+          <w:p>
+            <w:pPr>
+              <w:keepNext/>
+              <w:keepLines/>
+              <w:bidi w:val="0"/>
+              <w:spacing w:after="0"/>
+              <w:jc w:val="center"/>
+            </w:pPr>
+            <w:r>
+              <w:t>Adam</w:t>
+            </w:r>
+          </w:p>
+        </w:tc>
+      </w:tr>
+      <w:tr>
+        <w:trPr>
+          <w:cantSplit/>
+          <w:jc w:val="center"/>
+        </w:trPr>
+        <w:tc>
+          <w:tcPr>
+            <w:tcW w:w="3744" w:type="dxa"/>
+            <w:tcMar>
+              <w:top w:w="70" w:type="dxa"/>
+              <w:left w:w="70" w:type="dxa"/>
+              <w:bottom w:w="70" w:type="dxa"/>
+              <w:right w:w="70" w:type="dxa"/>
+            </w:tcMar>
+            <w:vAlign w:val="center"/>
+          </w:tcPr>
+          <w:p>
+            <w:pPr>
+              <w:keepNext/>
+              <w:keepLines/>
+              <w:bidi w:val="0"/>
+              <w:spacing w:after="0"/>
+              <w:jc w:val="center"/>
+            </w:pPr>
+            <w:r>
+              <w:t>learning rate</w:t>
+            </w:r>
+          </w:p>
+        </w:tc>
+        <w:tc>
+          <w:tcPr>
+            <w:tcW w:w="5112" w:type="dxa"/>
+            <w:tcMar>
+              <w:top w:w="70" w:type="dxa"/>
+              <w:left w:w="70" w:type="dxa"/>
+              <w:bottom w:w="70" w:type="dxa"/>
+              <w:right w:w="70" w:type="dxa"/>
+            </w:tcMar>
+            <w:vAlign w:val="center"/>
+          </w:tcPr>
+          <w:p>
+            <w:pPr>
+              <w:keepNext/>
+              <w:keepLines/>
+              <w:bidi w:val="0"/>
+              <w:spacing w:after="0"/>
+              <w:jc w:val="center"/>
+            </w:pPr>
+            <w:r>
+              <w:t>1e-4</w:t>
+            </w:r>
+          </w:p>
+        </w:tc>
+      </w:tr>
+      <w:tr>
+        <w:trPr>
+          <w:cantSplit/>
+          <w:jc w:val="center"/>
+        </w:trPr>
+        <w:tc>
+          <w:tcPr>
+            <w:tcW w:w="3744" w:type="dxa"/>
+            <w:tcMar>
+              <w:top w:w="70" w:type="dxa"/>
+              <w:left w:w="70" w:type="dxa"/>
+              <w:bottom w:w="70" w:type="dxa"/>
+              <w:right w:w="70" w:type="dxa"/>
+            </w:tcMar>
+            <w:vAlign w:val="center"/>
+          </w:tcPr>
+          <w:p>
+            <w:pPr>
+              <w:keepNext/>
+              <w:keepLines/>
+              <w:bidi w:val="0"/>
+              <w:spacing w:after="0"/>
+              <w:jc w:val="center"/>
+            </w:pPr>
+            <w:r>
+              <w:t>weight decay</w:t>
+            </w:r>
+          </w:p>
+        </w:tc>
+        <w:tc>
+          <w:tcPr>
+            <w:tcW w:w="5112" w:type="dxa"/>
+            <w:tcMar>
+              <w:top w:w="70" w:type="dxa"/>
+              <w:left w:w="70" w:type="dxa"/>
+              <w:bottom w:w="70" w:type="dxa"/>
+              <w:right w:w="70" w:type="dxa"/>
+            </w:tcMar>
+            <w:vAlign w:val="center"/>
+          </w:tcPr>
+          <w:p>
+            <w:pPr>
+              <w:keepNext/>
+              <w:keepLines/>
+              <w:bidi w:val="0"/>
+              <w:spacing w:after="0"/>
+              <w:jc w:val="center"/>
+            </w:pPr>
+            <w:r>
+              <w:t>1e-4</w:t>
+            </w:r>
+          </w:p>
+        </w:tc>
+      </w:tr>
+      <w:tr>
+        <w:trPr>
+          <w:cantSplit/>
+          <w:jc w:val="center"/>
+        </w:trPr>
+        <w:tc>
+          <w:tcPr>
+            <w:tcW w:w="3744" w:type="dxa"/>
+            <w:tcMar>
+              <w:top w:w="70" w:type="dxa"/>
+              <w:left w:w="70" w:type="dxa"/>
+              <w:bottom w:w="70" w:type="dxa"/>
+              <w:right w:w="70" w:type="dxa"/>
+            </w:tcMar>
+            <w:vAlign w:val="center"/>
+          </w:tcPr>
+          <w:p>
+            <w:pPr>
+              <w:keepNext/>
+              <w:keepLines/>
+              <w:bidi w:val="0"/>
+              <w:spacing w:after="0"/>
+              <w:jc w:val="center"/>
+            </w:pPr>
+            <w:r>
+              <w:t>batch size</w:t>
+            </w:r>
+          </w:p>
+        </w:tc>
+        <w:tc>
+          <w:tcPr>
+            <w:tcW w:w="5112" w:type="dxa"/>
+            <w:tcMar>
+              <w:top w:w="70" w:type="dxa"/>
+              <w:left w:w="70" w:type="dxa"/>
+              <w:bottom w:w="70" w:type="dxa"/>
+              <w:right w:w="70" w:type="dxa"/>
+            </w:tcMar>
+            <w:vAlign w:val="center"/>
+          </w:tcPr>
+          <w:p>
+            <w:pPr>
+              <w:keepNext/>
+              <w:keepLines/>
+              <w:bidi w:val="0"/>
+              <w:spacing w:after="0"/>
+              <w:jc w:val="center"/>
+            </w:pPr>
+            <w:r>
+              <w:t>64</w:t>
+            </w:r>
+          </w:p>
+        </w:tc>
+      </w:tr>
+      <w:tr>
+        <w:trPr>
+          <w:cantSplit/>
+          <w:jc w:val="center"/>
+        </w:trPr>
+        <w:tc>
+          <w:tcPr>
+            <w:tcW w:w="3744" w:type="dxa"/>
+            <w:tcMar>
+              <w:top w:w="70" w:type="dxa"/>
+              <w:left w:w="70" w:type="dxa"/>
+              <w:bottom w:w="70" w:type="dxa"/>
+              <w:right w:w="70" w:type="dxa"/>
+            </w:tcMar>
+            <w:vAlign w:val="center"/>
+          </w:tcPr>
+          <w:p>
+            <w:pPr>
+              <w:keepNext/>
+              <w:keepLines/>
+              <w:spacing w:after="0"/>
+              <w:jc w:val="center"/>
+            </w:pPr>
+            <w:r>
+              <w:rPr>
+                <w:rtl/>
+              </w:rPr>
+              <w:t>מספר epochs מרבי</w:t>
+            </w:r>
+          </w:p>
+        </w:tc>
+        <w:tc>
+          <w:tcPr>
+            <w:tcW w:w="5112" w:type="dxa"/>
+            <w:tcMar>
+              <w:top w:w="70" w:type="dxa"/>
+              <w:left w:w="70" w:type="dxa"/>
+              <w:bottom w:w="70" w:type="dxa"/>
+              <w:right w:w="70" w:type="dxa"/>
+            </w:tcMar>
+            <w:vAlign w:val="center"/>
+          </w:tcPr>
+          <w:p>
+            <w:pPr>
+              <w:keepNext/>
+              <w:keepLines/>
+              <w:bidi w:val="0"/>
+              <w:spacing w:after="0"/>
+              <w:jc w:val="center"/>
+            </w:pPr>
+            <w:r>
+              <w:t>2,000</w:t>
+            </w:r>
+          </w:p>
+        </w:tc>
+      </w:tr>
+      <w:tr>
+        <w:trPr>
+          <w:cantSplit/>
+          <w:jc w:val="center"/>
+        </w:trPr>
+        <w:tc>
+          <w:tcPr>
+            <w:tcW w:w="3744" w:type="dxa"/>
+            <w:tcMar>
+              <w:top w:w="70" w:type="dxa"/>
+              <w:left w:w="70" w:type="dxa"/>
+              <w:bottom w:w="70" w:type="dxa"/>
+              <w:right w:w="70" w:type="dxa"/>
+            </w:tcMar>
+            <w:vAlign w:val="center"/>
+          </w:tcPr>
+          <w:p>
+            <w:pPr>
+              <w:keepNext/>
+              <w:keepLines/>
+              <w:bidi w:val="0"/>
+              <w:spacing w:after="0"/>
+              <w:jc w:val="center"/>
+            </w:pPr>
+            <w:r>
+              <w:t>early-stopping patience</w:t>
+            </w:r>
+          </w:p>
+        </w:tc>
+        <w:tc>
+          <w:tcPr>
+            <w:tcW w:w="5112" w:type="dxa"/>
+            <w:tcMar>
+              <w:top w:w="70" w:type="dxa"/>
+              <w:left w:w="70" w:type="dxa"/>
+              <w:bottom w:w="70" w:type="dxa"/>
+              <w:right w:w="70" w:type="dxa"/>
+            </w:tcMar>
+            <w:vAlign w:val="center"/>
+          </w:tcPr>
+          <w:p>
+            <w:pPr>
+              <w:keepNext/>
+              <w:keepLines/>
+              <w:bidi w:val="0"/>
+              <w:spacing w:after="0"/>
+              <w:jc w:val="center"/>
+            </w:pPr>
+            <w:r>
+              <w:t>100</w:t>
+            </w:r>
+          </w:p>
+        </w:tc>
+      </w:tr>
+      <w:tr>
+        <w:trPr>
+          <w:cantSplit/>
+          <w:jc w:val="center"/>
+        </w:trPr>
+        <w:tc>
+          <w:tcPr>
+            <w:tcW w:w="3744" w:type="dxa"/>
+            <w:tcMar>
+              <w:top w:w="70" w:type="dxa"/>
+              <w:left w:w="70" w:type="dxa"/>
+              <w:bottom w:w="70" w:type="dxa"/>
+              <w:right w:w="70" w:type="dxa"/>
+            </w:tcMar>
+            <w:vAlign w:val="center"/>
+          </w:tcPr>
+          <w:p>
+            <w:pPr>
+              <w:keepNext/>
+              <w:keepLines/>
+              <w:spacing w:after="0"/>
+              <w:jc w:val="center"/>
+            </w:pPr>
+            <w:r>
+              <w:rPr>
+                <w:rtl/>
+              </w:rPr>
+              <w:t>מגבלת זמן לניסוי</w:t>
+            </w:r>
+          </w:p>
+        </w:tc>
+        <w:tc>
+          <w:tcPr>
+            <w:tcW w:w="5112" w:type="dxa"/>
+            <w:tcMar>
+              <w:top w:w="70" w:type="dxa"/>
+              <w:left w:w="70" w:type="dxa"/>
+              <w:bottom w:w="70" w:type="dxa"/>
+              <w:right w:w="70" w:type="dxa"/>
+            </w:tcMar>
+            <w:vAlign w:val="center"/>
+          </w:tcPr>
+          <w:p>
+            <w:pPr>
+              <w:keepNext/>
+              <w:keepLines/>
+              <w:bidi w:val="0"/>
+              <w:spacing w:after="0"/>
+              <w:jc w:val="center"/>
+            </w:pPr>
+            <w:r>
+              <w:t>1,800 seconds</w:t>
+            </w:r>
+          </w:p>
+        </w:tc>
+      </w:tr>
+      <w:tr>
+        <w:trPr>
+          <w:cantSplit/>
+          <w:jc w:val="center"/>
+        </w:trPr>
+        <w:tc>
+          <w:tcPr>
+            <w:tcW w:w="3744" w:type="dxa"/>
+            <w:tcMar>
+              <w:top w:w="70" w:type="dxa"/>
+              <w:left w:w="70" w:type="dxa"/>
+              <w:bottom w:w="70" w:type="dxa"/>
+              <w:right w:w="70" w:type="dxa"/>
+            </w:tcMar>
+            <w:vAlign w:val="center"/>
+          </w:tcPr>
+          <w:p>
+            <w:pPr>
+              <w:keepNext/>
+              <w:keepLines/>
+              <w:bidi w:val="0"/>
+              <w:spacing w:after="0"/>
+              <w:jc w:val="center"/>
+            </w:pPr>
+            <w:r>
+              <w:t>dropout / scheduler</w:t>
+            </w:r>
+          </w:p>
+        </w:tc>
+        <w:tc>
+          <w:tcPr>
+            <w:tcW w:w="5112" w:type="dxa"/>
+            <w:tcMar>
+              <w:top w:w="70" w:type="dxa"/>
+              <w:left w:w="70" w:type="dxa"/>
+              <w:bottom w:w="70" w:type="dxa"/>
+              <w:right w:w="70" w:type="dxa"/>
+            </w:tcMar>
+            <w:vAlign w:val="center"/>
+          </w:tcPr>
+          <w:p>
+            <w:pPr>
+              <w:keepNext/>
+              <w:keepLines/>
+              <w:bidi w:val="0"/>
+              <w:spacing w:after="0"/>
+              <w:jc w:val="center"/>
+            </w:pPr>
+            <w:r>
+              <w:t>none / none</w:t>
+            </w:r>
+          </w:p>
+        </w:tc>
+      </w:tr>
+      <w:tr>
+        <w:trPr>
+          <w:cantSplit/>
+          <w:jc w:val="center"/>
+        </w:trPr>
+        <w:tc>
+          <w:tcPr>
+            <w:tcW w:w="3744" w:type="dxa"/>
+            <w:tcMar>
+              <w:top w:w="70" w:type="dxa"/>
+              <w:left w:w="70" w:type="dxa"/>
+              <w:bottom w:w="70" w:type="dxa"/>
+              <w:right w:w="70" w:type="dxa"/>
+            </w:tcMar>
+            <w:vAlign w:val="center"/>
+          </w:tcPr>
+          <w:p>
+            <w:pPr>
+              <w:keepLines/>
+              <w:spacing w:after="0"/>
+              <w:jc w:val="center"/>
+            </w:pPr>
+            <w:r>
+              <w:rPr>
+                <w:rtl/>
+              </w:rPr>
+              <w:t>חומרה</w:t>
+            </w:r>
+          </w:p>
+        </w:tc>
+        <w:tc>
+          <w:tcPr>
+            <w:tcW w:w="5112" w:type="dxa"/>
+            <w:tcMar>
+              <w:top w:w="70" w:type="dxa"/>
+              <w:left w:w="70" w:type="dxa"/>
+              <w:bottom w:w="70" w:type="dxa"/>
+              <w:right w:w="70" w:type="dxa"/>
+            </w:tcMar>
+            <w:vAlign w:val="center"/>
+          </w:tcPr>
+          <w:p>
+            <w:pPr>
+              <w:keepLines/>
+              <w:bidi w:val="0"/>
+              <w:spacing w:after="0"/>
+              <w:jc w:val="center"/>
+            </w:pPr>
+            <w:r>
+              <w:t>NVIDIA GeForce RTX 3080</w:t>
+            </w:r>
+          </w:p>
+        </w:tc>
+      </w:tr>
+    </w:tbl>
+    <w:p>
+      <w:r>
+        <w:rPr>
+          <w:rtl/>
+        </w:rPr>
+        <w:t>המודלים תוכננו בתקציב משותף של כ-56,000 פרמטרים כדי שההשוואה לא תשקף הבדל שרירותי בקיבולת. כל החישובים בוצעו באמצעות PyTorch על NVIDIA GeForce RTX 3080. בניסויי full symmetrization וכן sampled symmetrization השתמשנו ב-</w:t>
+      </w:r>
+      <m:oMath>
+        <m:r>
+          <w:rPr>
+            <w:rFonts w:ascii="Cambria Math" w:hAnsi="Cambria Math"/>
+          </w:rPr>
+          <m:t>n=7</m:t>
+        </m:r>
+      </m:oMath>
+      <w:r>
+        <w:rPr>
+          <w:rtl/>
+        </w:rPr>
+        <w:t>: שיטת full symmetrization אינה ישימה עבור 256 נקודות, והבחירה הזהה בסעיפים ב-ג מאפשרת לבודד את השפעת הדגימה. משום כך, בהשוואה למודל equivariant network ולמודל canonization-based network יש גם הבדל בכמות המידע בקלט, ולא רק בארכיטקטורה.</w:t>
+      </w:r>
+    </w:p>
+    <w:p>
+      <w:pPr>
+        <w:pStyle w:val="Heading2"/>
+        <w:rPr>
+          <w:rtl/>
+        </w:rPr>
+      </w:pPr>
+      <w:bookmarkStart w:id="22" w:name="_Toc236499075"/>
+      <w:r>
+        <w:rPr>
+          <w:rtl/>
+        </w:rPr>
+        <w:t>סעיף א. Canonization-based network.</w:t>
+      </w:r>
+      <w:bookmarkEnd w:id="22"/>
+    </w:p>
+    <w:p>
+      <w:r>
+        <w:rPr>
+          <w:rtl/>
+        </w:rPr>
+        <w:t xml:space="preserve">מיינו את 256 השורות בסדר lexicographic יציב, שיטחנו את המטריצה והעברנו אותה דרך MLP במבנה </w:t>
+      </w:r>
+      <w:r>
+        <w:t>768 → 64 → 64 → 40</w:t>
+      </w:r>
+      <w:r>
+        <w:rPr>
+          <w:rtl/>
+        </w:rPr>
+        <w:t xml:space="preserve"> עם ReLU. לרשת 55,976 פרמטרים. אם </w:t>
+      </w:r>
+      <m:oMath>
+        <m:r>
+          <w:rPr>
+            <w:rFonts w:ascii="Cambria Math" w:hAnsi="Cambria Math"/>
+          </w:rPr>
+          <m:t>c</m:t>
+        </m:r>
+      </m:oMath>
+      <w:r>
+        <w:rPr>
+          <w:rtl/>
+        </w:rPr>
+        <w:t xml:space="preserve"> היא פעולת canonization, אז לכל תמורה </w:t>
+      </w:r>
+      <m:oMath>
+        <m:r>
+          <w:rPr>
+            <w:rFonts w:ascii="Cambria Math" w:hAnsi="Cambria Math"/>
+          </w:rPr>
+          <m:t>π</m:t>
+        </m:r>
+      </m:oMath>
+      <w:r>
+        <w:rPr>
+          <w:rtl/>
+        </w:rPr>
+        <w:t xml:space="preserve"> מתקיים </w:t>
+      </w:r>
+      <m:oMath>
+        <m:r>
+          <w:rPr>
+            <w:rFonts w:ascii="Cambria Math" w:hAnsi="Cambria Math"/>
+          </w:rPr>
+          <m:t>c(πX)=c(X)</m:t>
+        </m:r>
+      </m:oMath>
+      <w:r>
+        <w:rPr>
+          <w:rtl/>
+        </w:rPr>
+        <w:t>, ולכן מתקבלת exact invariance ללא תלות במשקלי MLP.</w:t>
+      </w:r>
+    </w:p>
+    <w:p>
+      <w:pPr>
+        <w:pStyle w:val="Heading2"/>
+        <w:rPr>
+          <w:rtl/>
+        </w:rPr>
+      </w:pPr>
+      <w:bookmarkStart w:id="23" w:name="_Toc236499076"/>
+      <w:r>
+        <w:rPr>
+          <w:rtl/>
+        </w:rPr>
+        <w:t>סעיף ב. Full symmetrization network.</w:t>
+      </w:r>
+      <w:bookmarkEnd w:id="23"/>
+    </w:p>
+    <w:p>
+      <w:r>
+        <w:rPr>
+          <w:rtl/>
+        </w:rPr>
+        <w:t xml:space="preserve">עבור שבע הנקודות הראשונות השתמשנו במודל MLP בסיסי במבנה </w:t>
+      </w:r>
+      <w:r>
+        <w:t>21 → 207 → 207 → 40</w:t>
+      </w:r>
+      <w:r>
+        <w:rPr>
+          <w:rtl/>
+        </w:rPr>
+        <w:t xml:space="preserve"> וב-55,930 פרמטרים. לכל קלט חישבנו logits עבור כל </w:t>
+      </w:r>
+      <m:oMath>
+        <m:r>
+          <w:rPr>
+            <w:rFonts w:ascii="Cambria Math" w:hAnsi="Cambria Math"/>
+          </w:rPr>
+          <m:t>7!=5040</m:t>
+        </m:r>
+      </m:oMath>
+      <w:r>
+        <w:rPr>
+          <w:rtl/>
+        </w:rPr>
+        <w:t xml:space="preserve"> התמורות ומיצענו אותם לפני חישוב loss. הממוצע על החבורה המלאה מבטיח exact invariance, אך העלות הפקטוריאלית מגבילה את השיטה לקבוצות קטנות.</w:t>
+      </w:r>
+    </w:p>
+    <w:p>
+      <w:pPr>
+        <w:pStyle w:val="Heading2"/>
+        <w:rPr>
+          <w:rtl/>
+        </w:rPr>
+      </w:pPr>
+      <w:bookmarkStart w:id="24" w:name="_Toc236499077"/>
+      <w:r>
+        <w:rPr>
+          <w:rtl/>
+        </w:rPr>
+        <w:t>סעיף ג. Sampled-symmetrization network.</w:t>
+      </w:r>
+      <w:bookmarkEnd w:id="24"/>
+    </w:p>
+    <w:p>
+      <w:r>
+        <w:rPr>
+          <w:rtl/>
+        </w:rPr>
+        <w:t xml:space="preserve">השתמשנו באותו MLP בסיסי ובאותן שבע נקודות, אך דגמנו פעם אחת ללא החזרה תת-קבוצה קבועה של </w:t>
+      </w:r>
+      <m:oMath>
+        <m:r>
+          <w:rPr>
+            <w:rFonts w:ascii="Cambria Math" w:hAnsi="Cambria Math"/>
+          </w:rPr>
+          <m:t>B=252</m:t>
+        </m:r>
+      </m:oMath>
+      <w:r>
+        <w:rPr>
+          <w:rtl/>
+        </w:rPr>
+        <w:t xml:space="preserve"> תמורות, כלומר 5% מתוך </w:t>
+      </w:r>
+      <m:oMath>
+        <m:sSub>
+          <m:sSubPr>
+            <m:ctrlPr>
+              <w:rPr>
+                <w:rFonts w:ascii="Cambria Math" w:hAnsi="Cambria Math"/>
+              </w:rPr>
+            </m:ctrlPr>
+          </m:sSubPr>
+          <m:e>
+            <m:r>
+              <w:rPr>
+                <w:rFonts w:ascii="Cambria Math" w:hAnsi="Cambria Math"/>
+              </w:rPr>
+              <m:t>S</m:t>
+            </m:r>
+          </m:e>
+          <m:sub>
+            <m:r>
+              <w:rPr>
+                <w:rFonts w:ascii="Cambria Math" w:hAnsi="Cambria Math"/>
+              </w:rPr>
+              <m:t>7</m:t>
+            </m:r>
+          </m:sub>
+        </m:sSub>
+      </m:oMath>
+      <w:r>
+        <w:rPr>
+          <w:rtl/>
+        </w:rPr>
+        <w:t>. מיצוע logits על אותה תת-קבוצה בכל החישובים נותן Monte Carlo approximation למיצוע המלא והפחתה תאורטית של פי 20 במספר הערכות MLP, אך אינו מבטיח exact invariance.</w:t>
+      </w:r>
+    </w:p>
+    <w:p>
+      <w:pPr>
+        <w:pStyle w:val="Heading2"/>
+        <w:rPr>
+          <w:rtl/>
+        </w:rPr>
+      </w:pPr>
+      <w:bookmarkStart w:id="25" w:name="_Toc236499078"/>
+      <w:r>
+        <w:rPr>
+          <w:rtl/>
+        </w:rPr>
+        <w:t>סעיף ד. Linear equivariant layers with mean pooling.</w:t>
+      </w:r>
+      <w:bookmarkEnd w:id="25"/>
+    </w:p>
+    <w:p>
+      <w:pPr>
+        <w:keepNext/>
+        <w:keepLines/>
+      </w:pPr>
+      <w:r>
+        <w:rPr>
+          <w:rtl/>
+        </w:rPr>
+        <w:t>אופרטור ההטלה על מרחב equivariant maps הוא</w:t>
+      </w:r>
+    </w:p>
+    <w:p>
+      <w:pPr>
+        <w:bidi w:val="0"/>
+        <w:spacing w:before="60" w:after="60"/>
+        <w:jc w:val="center"/>
+      </w:pPr>
+      <m:oMathPara>
+        <m:oMathParaPr>
+          <m:jc m:val="center"/>
+        </m:oMathParaPr>
+        <m:oMath>
+          <m:r>
+            <w:rPr>
+              <w:rFonts w:ascii="Cambria Math" w:hAnsi="Cambria Math"/>
+            </w:rPr>
+            <m:t>P(W)=</m:t>
+          </m:r>
+          <m:f>
+            <m:fPr>
+              <m:ctrlPr>
+                <w:rPr>
+                  <w:rFonts w:ascii="Cambria Math" w:hAnsi="Cambria Math"/>
+                </w:rPr>
+              </m:ctrlPr>
+            </m:fPr>
+            <m:num>
+              <m:r>
+                <w:rPr>
+                  <w:rFonts w:ascii="Cambria Math" w:hAnsi="Cambria Math"/>
+                </w:rPr>
+                <m:t>1</m:t>
+              </m:r>
+            </m:num>
+            <m:den>
+              <m:d>
+                <m:dPr>
+                  <m:begChr m:val="|"/>
+                  <m:endChr m:val="|"/>
+                  <m:ctrlPr>
+                    <w:rPr>
+                      <w:rFonts w:ascii="Cambria Math" w:hAnsi="Cambria Math"/>
+                    </w:rPr>
+                  </m:ctrlPr>
+                </m:dPr>
+                <m:e>
+                  <m:r>
+                    <w:rPr>
+                      <w:rFonts w:ascii="Cambria Math" w:hAnsi="Cambria Math"/>
+                    </w:rPr>
+                    <m:t>G</m:t>
+                  </m:r>
+                </m:e>
+              </m:d>
+            </m:den>
+          </m:f>
+          <m:nary>
+            <m:naryPr>
+              <m:chr m:val="∑"/>
+              <m:limLoc m:val="undOvr"/>
+              <m:grow m:val="1"/>
+              <m:supHide m:val="1"/>
+              <m:ctrlPr>
+                <w:rPr>
+                  <w:rFonts w:ascii="Cambria Math" w:hAnsi="Cambria Math"/>
+                </w:rPr>
+              </m:ctrlPr>
+            </m:naryPr>
+            <m:sub>
+              <m:r>
+                <w:rPr>
+                  <w:rFonts w:ascii="Cambria Math" w:hAnsi="Cambria Math"/>
+                </w:rPr>
+                <m:t>g∈G</m:t>
+              </m:r>
+            </m:sub>
+            <m:sup/>
+            <m:e>
+              <m:sSub>
+                <m:sSubPr>
+                  <m:ctrlPr>
+                    <w:rPr>
+                      <w:rFonts w:ascii="Cambria Math" w:hAnsi="Cambria Math"/>
+                    </w:rPr>
+                  </m:ctrlPr>
+                </m:sSubPr>
+                <m:e>
+                  <m:r>
+                    <w:rPr>
+                      <w:rFonts w:ascii="Cambria Math" w:hAnsi="Cambria Math"/>
+                    </w:rPr>
+                    <m:t>ρ</m:t>
+                  </m:r>
+                </m:e>
+                <m:sub>
+                  <m:r>
+                    <m:rPr>
+                      <m:sty m:val="p"/>
+                    </m:rPr>
+                    <w:rPr>
+                      <w:rFonts w:ascii="Cambria Math" w:hAnsi="Cambria Math"/>
+                    </w:rPr>
+                    <m:t>out</m:t>
+                  </m:r>
+                </m:sub>
+              </m:sSub>
+            </m:e>
+          </m:nary>
+          <m:r>
+            <w:rPr>
+              <w:rFonts w:ascii="Cambria Math" w:hAnsi="Cambria Math"/>
+            </w:rPr>
+            <m:t>(</m:t>
+          </m:r>
+          <m:sSup>
+            <m:sSupPr>
+              <m:ctrlPr>
+                <w:rPr>
+                  <w:rFonts w:ascii="Cambria Math" w:hAnsi="Cambria Math"/>
+                </w:rPr>
+              </m:ctrlPr>
+            </m:sSupPr>
+            <m:e>
+              <m:r>
+                <w:rPr>
+                  <w:rFonts w:ascii="Cambria Math" w:hAnsi="Cambria Math"/>
+                </w:rPr>
+                <m:t>g</m:t>
+              </m:r>
+            </m:e>
+            <m:sup>
+              <m:r>
+                <w:rPr>
+                  <w:rFonts w:ascii="Cambria Math" w:hAnsi="Cambria Math"/>
+                </w:rPr>
+                <m:t>-1</m:t>
+              </m:r>
+            </m:sup>
+          </m:sSup>
+          <m:r>
+            <w:rPr>
+              <w:rFonts w:ascii="Cambria Math" w:hAnsi="Cambria Math"/>
+            </w:rPr>
+            <m:t>)W</m:t>
+          </m:r>
+          <m:sSub>
+            <m:sSubPr>
+              <m:ctrlPr>
+                <w:rPr>
+                  <w:rFonts w:ascii="Cambria Math" w:hAnsi="Cambria Math"/>
+                </w:rPr>
+              </m:ctrlPr>
+            </m:sSubPr>
+            <m:e>
+              <m:r>
+                <w:rPr>
+                  <w:rFonts w:ascii="Cambria Math" w:hAnsi="Cambria Math"/>
+                </w:rPr>
+                <m:t>ρ</m:t>
+              </m:r>
+            </m:e>
+            <m:sub>
+              <m:r>
+                <m:rPr>
+                  <m:sty m:val="p"/>
+                </m:rPr>
+                <w:rPr>
+                  <w:rFonts w:ascii="Cambria Math" w:hAnsi="Cambria Math"/>
+                </w:rPr>
+                <m:t>in</m:t>
+              </m:r>
+            </m:sub>
+          </m:sSub>
+          <m:r>
+            <w:rPr>
+              <w:rFonts w:ascii="Cambria Math" w:hAnsi="Cambria Math"/>
+            </w:rPr>
+            <m:t>(g).</m:t>
+          </m:r>
+        </m:oMath>
+      </m:oMathPara>
+    </w:p>
+    <w:p>
+      <w:r>
+        <w:rPr>
+          <w:rtl/>
+        </w:rPr>
+        <w:t xml:space="preserve">עבור פעולת התמורות על אינדקסי הנקודות קיימים שני orbits של זוגות אינדקסים: </w:t>
+      </w:r>
+      <m:oMath>
+        <m:r>
+          <w:rPr>
+            <w:rFonts w:ascii="Cambria Math" w:hAnsi="Cambria Math"/>
+          </w:rPr>
+          <m:t>i=j</m:t>
+        </m:r>
+      </m:oMath>
+      <w:r>
+        <w:rPr>
+          <w:rtl/>
+        </w:rPr>
+        <w:t xml:space="preserve"> ו-</w:t>
+      </w:r>
+      <m:oMath>
+        <m:r>
+          <w:rPr>
+            <w:rFonts w:ascii="Cambria Math" w:hAnsi="Cambria Math"/>
+          </w:rPr>
+          <m:t>i≠j</m:t>
+        </m:r>
+      </m:oMath>
+      <w:r>
+        <w:rPr>
+          <w:rtl/>
+        </w:rPr>
+        <w:t>. לכן פרמטרנו ישירות את תמונת ההטלה באמצעות שני בלוקי פרמטרים משותפים:</w:t>
+      </w:r>
+    </w:p>
+    <w:p>
+      <w:pPr>
+        <w:bidi w:val="0"/>
+        <w:spacing w:before="60" w:after="60"/>
+        <w:jc w:val="center"/>
+      </w:pPr>
+      <m:oMathPara>
+        <m:oMathParaPr>
+          <m:jc m:val="center"/>
+        </m:oMathParaPr>
+        <m:oMath>
+          <m:sSub>
+            <m:sSubPr>
+              <m:ctrlPr>
+                <w:rPr>
+                  <w:rFonts w:ascii="Cambria Math" w:hAnsi="Cambria Math"/>
+                </w:rPr>
+              </m:ctrlPr>
+            </m:sSubPr>
+            <m:e>
+              <m:r>
+                <w:rPr>
+                  <w:rFonts w:ascii="Cambria Math" w:hAnsi="Cambria Math"/>
+                </w:rPr>
+                <m:t>y</m:t>
+              </m:r>
+            </m:e>
+            <m:sub>
+              <m:r>
+                <w:rPr>
+                  <w:rFonts w:ascii="Cambria Math" w:hAnsi="Cambria Math"/>
+                </w:rPr>
+                <m:t>i</m:t>
+              </m:r>
+            </m:sub>
+          </m:sSub>
+          <m:r>
+            <w:rPr>
+              <w:rFonts w:ascii="Cambria Math" w:hAnsi="Cambria Math"/>
+            </w:rPr>
+            <m:t>=A</m:t>
+          </m:r>
+          <m:sSub>
+            <m:sSubPr>
+              <m:ctrlPr>
+                <w:rPr>
+                  <w:rFonts w:ascii="Cambria Math" w:hAnsi="Cambria Math"/>
+                </w:rPr>
+              </m:ctrlPr>
+            </m:sSubPr>
+            <m:e>
+              <m:r>
+                <w:rPr>
+                  <w:rFonts w:ascii="Cambria Math" w:hAnsi="Cambria Math"/>
+                </w:rPr>
+                <m:t>x</m:t>
+              </m:r>
+            </m:e>
+            <m:sub>
+              <m:r>
+                <w:rPr>
+                  <w:rFonts w:ascii="Cambria Math" w:hAnsi="Cambria Math"/>
+                </w:rPr>
+                <m:t>i</m:t>
+              </m:r>
+            </m:sub>
+          </m:sSub>
+          <m:r>
+            <w:rPr>
+              <w:rFonts w:ascii="Cambria Math" w:hAnsi="Cambria Math"/>
+            </w:rPr>
+            <m:t>+B</m:t>
+          </m:r>
+          <m:nary>
+            <m:naryPr>
+              <m:chr m:val="∑"/>
+              <m:limLoc m:val="undOvr"/>
+              <m:grow m:val="1"/>
+              <m:supHide m:val="1"/>
+              <m:ctrlPr>
+                <w:rPr>
+                  <w:rFonts w:ascii="Cambria Math" w:hAnsi="Cambria Math"/>
+                </w:rPr>
+              </m:ctrlPr>
+            </m:naryPr>
+            <m:sub>
+              <m:r>
+                <w:rPr>
+                  <w:rFonts w:ascii="Cambria Math" w:hAnsi="Cambria Math"/>
+                </w:rPr>
+                <m:t>j</m:t>
+              </m:r>
+            </m:sub>
+            <m:sup/>
+            <m:e>
+              <m:sSub>
+                <m:sSubPr>
+                  <m:ctrlPr>
+                    <w:rPr>
+                      <w:rFonts w:ascii="Cambria Math" w:hAnsi="Cambria Math"/>
+                    </w:rPr>
+                  </m:ctrlPr>
+                </m:sSubPr>
+                <m:e>
+                  <m:r>
+                    <w:rPr>
+                      <w:rFonts w:ascii="Cambria Math" w:hAnsi="Cambria Math"/>
+                    </w:rPr>
+                    <m:t>x</m:t>
+                  </m:r>
+                </m:e>
+                <m:sub>
+                  <m:r>
+                    <w:rPr>
+                      <w:rFonts w:ascii="Cambria Math" w:hAnsi="Cambria Math"/>
+                    </w:rPr>
+                    <m:t>j</m:t>
+                  </m:r>
+                </m:sub>
+              </m:sSub>
+            </m:e>
+          </m:nary>
+          <m:r>
+            <w:rPr>
+              <w:rFonts w:ascii="Cambria Math" w:hAnsi="Cambria Math"/>
+            </w:rPr>
+            <m:t>.</m:t>
+          </m:r>
+        </m:oMath>
+      </m:oMathPara>
+    </w:p>
+    <w:p>
+      <w:r>
+        <w:rPr>
+          <w:rtl/>
+        </w:rPr>
+        <w:t xml:space="preserve">מימשנו שתי linear equivariant layers ברוחבים </w:t>
+      </w:r>
+      <w:r>
+        <w:t>3 → 128 → 128</w:t>
+      </w:r>
+      <w:r>
+        <w:rPr>
+          <w:rtl/>
+        </w:rPr>
+        <w:t xml:space="preserve"> עם pointwise ReLU, לאחריהן mean pooling וראש סיווג </w:t>
+      </w:r>
+      <w:r>
+        <w:t>128 → 128 → 40</w:t>
+      </w:r>
+      <w:r>
+        <w:rPr>
+          <w:rtl/>
+        </w:rPr>
+        <w:t>. למודל equivariant network יש 55,464 פרמטרים. השכבות הפנימיות הן equivariant לכל תמורה לפי הבנייה, ופעולת mean pooling יוצרת invariant output.</w:t>
+      </w:r>
+    </w:p>
+    <w:p>
+      <w:pPr>
+        <w:pStyle w:val="Heading2"/>
+        <w:rPr>
+          <w:rtl/>
+        </w:rPr>
+      </w:pPr>
+      <w:bookmarkStart w:id="26" w:name="_Toc236499079"/>
+      <w:r>
+        <w:rPr>
+          <w:rtl/>
+        </w:rPr>
+        <w:t>סעיף ה. Data augmentation with permutations.</w:t>
+      </w:r>
+      <w:bookmarkEnd w:id="26"/>
+    </w:p>
+    <w:p>
+      <w:r>
+        <w:rPr>
+          <w:rtl/>
+        </w:rPr>
+        <w:t xml:space="preserve">השתמשנו במודל standard non-invariant MLP במבנה </w:t>
+      </w:r>
+      <w:r>
+        <w:t>768 → 64 → 64 → 40</w:t>
+      </w:r>
+      <w:r>
+        <w:rPr>
+          <w:rtl/>
+        </w:rPr>
+        <w:t xml:space="preserve"> וב-55,976 פרמטרים. לפני כל הצגה של דוגמה באימון דגמנו תמורת שורות חדשה ובלתי-תלויה; בתוך batch כל דוגמה קיבלה תמורה אחרת. כך האימון מעודד invariance, אך מרחב הפונקציות של הרשת נשאר תלוי-סדר ואין ערובה להתנהגות על תמורות שלא נצפו.</w:t>
+      </w:r>
+    </w:p>
+    <w:p>
+      <w:pPr>
+        <w:pStyle w:val="Heading2"/>
+        <w:rPr>
+          <w:rtl/>
+        </w:rPr>
+      </w:pPr>
+      <w:bookmarkStart w:id="27" w:name="_Toc236499080"/>
+      <w:r>
+        <w:rPr>
+          <w:rtl/>
+        </w:rPr>
+        <w:t>תוצאות, ניתוח והמלצה.</w:t>
+      </w:r>
+      <w:bookmarkEnd w:id="27"/>
+    </w:p>
+    <w:p>
+      <w:pPr>
+        <w:pStyle w:val="Heading3"/>
+        <w:rPr>
+          <w:rtl/>
+        </w:rPr>
+      </w:pPr>
+      <w:r>
+        <w:rPr>
+          <w:rtl/>
+        </w:rPr>
+        <w:t>1. Test accuracy כתלות במספר דוגמאות האימון.</w:t>
+      </w:r>
+    </w:p>
+    <w:p>
+      <w:r>
+        <w:rPr>
+          <w:rtl/>
+        </w:rPr>
+        <w:t>כל 15 הניסויים הסתיימו לפני מגבלת 30 הדקות. הגרף הבא מציג test accuracy על קבוצת test הרשמית כתלות במספר הדוגמאות שנבחרו לכל מחלקה, עם עקומה נפרדת לכל ארכיטקטורה.</w:t>
+      </w:r>
+    </w:p>
+    <w:p>
+      <w:pPr>
+        <w:pStyle w:val="BodyText"/>
+        <w:keepLines/>
+        <w:spacing w:before="0" w:after="160"/>
+        <w:jc w:val="center"/>
+      </w:pPr>
+      <w:r>
+        <w:rPr>
+          <w:noProof/>
+        </w:rPr>
+        <w:drawing>
+          <wp:inline distT="0" distB="0" distL="0" distR="0" wp14:anchorId="233B4F1B" wp14:editId="35568C83">
+            <wp:extent cx="5532120" cy="3469850"/>
+            <wp:effectExtent l="0" t="0" r="0" b="0"/>
+            <wp:docPr id="32" name="Picture 32" descr="ModelNet40 test accuracy by selected examples per class"/>
+            <wp:cNvGraphicFramePr>
+              <a:graphicFrameLocks xmlns:a="http://schemas.openxmlformats.org/drawingml/2006/main" noChangeAspect="1"/>
+            </wp:cNvGraphicFramePr>
+            <a:graphic xmlns:a="http://schemas.openxmlformats.org/drawingml/2006/main">
+              <a:graphicData uri="http://schemas.openxmlformats.org/drawingml/2006/picture">
+                <pic:pic xmlns:pic="http://schemas.openxmlformats.org/drawingml/2006/picture">
+                  <pic:nvPicPr>
+                    <pic:cNvPr id="0" name="modelnet40_accuracy.png"/>
+                    <pic:cNvPicPr/>
+                  </pic:nvPicPr>
+                  <pic:blipFill>
+                    <a:blip r:embed="rId16"/>
+                    <a:stretch>
+                      <a:fillRect/>
+                    </a:stretch>
+                  </pic:blipFill>
+                  <pic:spPr>
+                    <a:xfrm>
+                      <a:off x="0" y="0"/>
+                      <a:ext cx="5532120" cy="3469850"/>
+                    </a:xfrm>
+                    <a:prstGeom prst="rect">
+                      <a:avLst/>
+                    </a:prstGeom>
+                  </pic:spPr>
+                </pic:pic>
+              </a:graphicData>
+            </a:graphic>
+          </wp:inline>
+        </w:drawing>
+      </w:r>
+    </w:p>
+    <w:p>
+      <w:r>
+        <w:rPr>
+          <w:rtl/>
+        </w:rPr>
+        <w:t>בטבלת הדיוק כל תא מציג overall accuracy ולאחריו mean-class accuracy. המדד הראשון הוא מדד ההכרעה הראשי.</w:t>
+      </w:r>
+    </w:p>
+    <w:tbl>
+      <w:tblPr>
+        <w:bidiVisual/>
+        <w:tblW w:w="8856" w:type="dxa"/>
+        <w:jc w:val="center"/>
+        <w:tblBorders>
+          <w:top w:val="single" w:sz="4" w:space="0" w:color="B7C9DC"/>
+          <w:left w:val="single" w:sz="4" w:space="0" w:color="B7C9DC"/>
+          <w:bottom w:val="single" w:sz="4" w:space="0" w:color="B7C9DC"/>
+          <w:right w:val="single" w:sz="4" w:space="0" w:color="B7C9DC"/>
+          <w:insideH w:val="single" w:sz="4" w:space="0" w:color="B7C9DC"/>
+          <w:insideV w:val="single" w:sz="4" w:space="0" w:color="B7C9DC"/>
+        </w:tblBorders>
+        <w:tblLayout w:type="fixed"/>
+        <w:tblLook w:val="04A0" w:firstRow="1" w:lastRow="0" w:firstColumn="1" w:lastColumn="0" w:noHBand="0" w:noVBand="1"/>
+      </w:tblPr>
+      <w:tblGrid>
+        <w:gridCol w:w="3672"/>
+        <w:gridCol w:w="1728"/>
+        <w:gridCol w:w="1728"/>
+        <w:gridCol w:w="1728"/>
+      </w:tblGrid>
+      <w:tr>
+        <w:trPr>
+          <w:cantSplit/>
+          <w:tblHeader/>
+          <w:jc w:val="center"/>
+        </w:trPr>
+        <w:tc>
+          <w:tcPr>
+            <w:tcW w:w="3672" w:type="dxa"/>
+            <w:shd w:val="clear" w:color="auto" w:fill="D9EAF7"/>
+            <w:tcMar>
+              <w:top w:w="70" w:type="dxa"/>
+              <w:left w:w="70" w:type="dxa"/>
+              <w:bottom w:w="70" w:type="dxa"/>
+              <w:right w:w="70" w:type="dxa"/>
+            </w:tcMar>
+            <w:vAlign w:val="center"/>
+          </w:tcPr>
+          <w:p>
+            <w:pPr>
+              <w:keepNext/>
+              <w:keepLines/>
+              <w:spacing w:after="0"/>
+              <w:jc w:val="center"/>
+            </w:pPr>
+            <w:r>
+              <w:rPr>
+                <w:b/>
+                <w:color w:val="365F91"/>
+                <w:rtl/>
+              </w:rPr>
+              <w:t>ארכיטקטורה</w:t>
+            </w:r>
+          </w:p>
+        </w:tc>
+        <w:tc>
+          <w:tcPr>
+            <w:tcW w:w="1728" w:type="dxa"/>
+            <w:shd w:val="clear" w:color="auto" w:fill="D9EAF7"/>
+            <w:tcMar>
+              <w:top w:w="70" w:type="dxa"/>
+              <w:left w:w="70" w:type="dxa"/>
+              <w:bottom w:w="70" w:type="dxa"/>
+              <w:right w:w="70" w:type="dxa"/>
+            </w:tcMar>
+            <w:vAlign w:val="center"/>
+          </w:tcPr>
+          <w:p>
+            <w:pPr>
+              <w:keepNext/>
+              <w:keepLines/>
+              <w:bidi w:val="0"/>
+              <w:spacing w:after="0"/>
+              <w:jc w:val="center"/>
+            </w:pPr>
+            <w:r>
+              <w:rPr>
+                <w:b/>
+                <w:color w:val="365F91"/>
+              </w:rPr>
+              <w:t>5</w:t>
+            </w:r>
+          </w:p>
+        </w:tc>
+        <w:tc>
+          <w:tcPr>
+            <w:tcW w:w="1728" w:type="dxa"/>
+            <w:shd w:val="clear" w:color="auto" w:fill="D9EAF7"/>
+            <w:tcMar>
+              <w:top w:w="70" w:type="dxa"/>
+              <w:left w:w="70" w:type="dxa"/>
+              <w:bottom w:w="70" w:type="dxa"/>
+              <w:right w:w="70" w:type="dxa"/>
+            </w:tcMar>
+            <w:vAlign w:val="center"/>
+          </w:tcPr>
+          <w:p>
+            <w:pPr>
+              <w:keepNext/>
+              <w:keepLines/>
+              <w:bidi w:val="0"/>
+              <w:spacing w:after="0"/>
+              <w:jc w:val="center"/>
+            </w:pPr>
+            <w:r>
+              <w:rPr>
+                <w:b/>
+                <w:color w:val="365F91"/>
+              </w:rPr>
+              <w:t>10</w:t>
+            </w:r>
+          </w:p>
+        </w:tc>
+        <w:tc>
+          <w:tcPr>
+            <w:tcW w:w="1728" w:type="dxa"/>
+            <w:shd w:val="clear" w:color="auto" w:fill="D9EAF7"/>
+            <w:tcMar>
+              <w:top w:w="70" w:type="dxa"/>
+              <w:left w:w="70" w:type="dxa"/>
+              <w:bottom w:w="70" w:type="dxa"/>
+              <w:right w:w="70" w:type="dxa"/>
+            </w:tcMar>
+            <w:vAlign w:val="center"/>
+          </w:tcPr>
+          <w:p>
+            <w:pPr>
+              <w:keepNext/>
+              <w:keepLines/>
+              <w:bidi w:val="0"/>
+              <w:spacing w:after="0"/>
+              <w:jc w:val="center"/>
+            </w:pPr>
+            <w:r>
+              <w:rPr>
+                <w:b/>
+                <w:color w:val="365F91"/>
+              </w:rPr>
+              <w:t>50</w:t>
+            </w:r>
+          </w:p>
+        </w:tc>
+      </w:tr>
+      <w:tr>
+        <w:trPr>
+          <w:cantSplit/>
+          <w:jc w:val="center"/>
+        </w:trPr>
+        <w:tc>
+          <w:tcPr>
+            <w:tcW w:w="3672" w:type="dxa"/>
+            <w:tcMar>
+              <w:top w:w="70" w:type="dxa"/>
+              <w:left w:w="70" w:type="dxa"/>
+              <w:bottom w:w="70" w:type="dxa"/>
+              <w:right w:w="70" w:type="dxa"/>
+            </w:tcMar>
+            <w:vAlign w:val="center"/>
+          </w:tcPr>
+          <w:p>
+            <w:pPr>
+              <w:keepNext/>
+              <w:keepLines/>
+              <w:bidi w:val="0"/>
+              <w:spacing w:after="0"/>
+              <w:jc w:val="center"/>
+            </w:pPr>
+            <w:r>
+              <w:t>Canonization</w:t>
+            </w:r>
+          </w:p>
+        </w:tc>
+        <w:tc>
+          <w:tcPr>
+            <w:tcW w:w="1728" w:type="dxa"/>
+            <w:tcMar>
+              <w:top w:w="70" w:type="dxa"/>
+              <w:left w:w="70" w:type="dxa"/>
+              <w:bottom w:w="70" w:type="dxa"/>
+              <w:right w:w="70" w:type="dxa"/>
+            </w:tcMar>
+            <w:vAlign w:val="center"/>
+          </w:tcPr>
+          <w:p>
+            <w:pPr>
+              <w:keepNext/>
+              <w:keepLines/>
+              <w:bidi w:val="0"/>
+              <w:spacing w:after="0"/>
+              <w:jc w:val="center"/>
+            </w:pPr>
+            <w:r>
+              <w:t>13.98% / 13.58%</w:t>
+            </w:r>
+          </w:p>
+        </w:tc>
+        <w:tc>
+          <w:tcPr>
+            <w:tcW w:w="1728" w:type="dxa"/>
+            <w:tcMar>
+              <w:top w:w="70" w:type="dxa"/>
+              <w:left w:w="70" w:type="dxa"/>
+              <w:bottom w:w="70" w:type="dxa"/>
+              <w:right w:w="70" w:type="dxa"/>
+            </w:tcMar>
+            <w:vAlign w:val="center"/>
+          </w:tcPr>
+          <w:p>
+            <w:pPr>
+              <w:keepNext/>
+              <w:keepLines/>
+              <w:bidi w:val="0"/>
+              <w:spacing w:after="0"/>
+              <w:jc w:val="center"/>
+            </w:pPr>
+            <w:r>
+              <w:t>21.27% / 19.12%</w:t>
+            </w:r>
+          </w:p>
+        </w:tc>
+        <w:tc>
+          <w:tcPr>
+            <w:tcW w:w="1728" w:type="dxa"/>
+            <w:tcMar>
+              <w:top w:w="70" w:type="dxa"/>
+              <w:left w:w="70" w:type="dxa"/>
+              <w:bottom w:w="70" w:type="dxa"/>
+              <w:right w:w="70" w:type="dxa"/>
+            </w:tcMar>
+            <w:vAlign w:val="center"/>
+          </w:tcPr>
+          <w:p>
+            <w:pPr>
+              <w:keepNext/>
+              <w:keepLines/>
+              <w:bidi w:val="0"/>
+              <w:spacing w:after="0"/>
+              <w:jc w:val="center"/>
+            </w:pPr>
+            <w:r>
+              <w:t>33.27% / 31.25%</w:t>
+            </w:r>
+          </w:p>
+        </w:tc>
+      </w:tr>
+      <w:tr>
+        <w:trPr>
+          <w:cantSplit/>
+          <w:jc w:val="center"/>
+        </w:trPr>
+        <w:tc>
+          <w:tcPr>
+            <w:tcW w:w="3672" w:type="dxa"/>
+            <w:tcMar>
+              <w:top w:w="70" w:type="dxa"/>
+              <w:left w:w="70" w:type="dxa"/>
+              <w:bottom w:w="70" w:type="dxa"/>
+              <w:right w:w="70" w:type="dxa"/>
+            </w:tcMar>
+            <w:vAlign w:val="center"/>
+          </w:tcPr>
+          <w:p>
+            <w:pPr>
+              <w:keepNext/>
+              <w:keepLines/>
+              <w:bidi w:val="0"/>
+              <w:spacing w:after="0"/>
+              <w:jc w:val="center"/>
+            </w:pPr>
+            <w:r>
+              <w:t>Full symmetrization</w:t>
+            </w:r>
+          </w:p>
+        </w:tc>
+        <w:tc>
+          <w:tcPr>
+            <w:tcW w:w="1728" w:type="dxa"/>
+            <w:tcMar>
+              <w:top w:w="70" w:type="dxa"/>
+              <w:left w:w="70" w:type="dxa"/>
+              <w:bottom w:w="70" w:type="dxa"/>
+              <w:right w:w="70" w:type="dxa"/>
+            </w:tcMar>
+            <w:vAlign w:val="center"/>
+          </w:tcPr>
+          <w:p>
+            <w:pPr>
+              <w:keepNext/>
+              <w:keepLines/>
+              <w:bidi w:val="0"/>
+              <w:spacing w:after="0"/>
+              <w:jc w:val="center"/>
+            </w:pPr>
+            <w:r>
+              <w:t>10.98% / 11.61%</w:t>
+            </w:r>
+          </w:p>
+        </w:tc>
+        <w:tc>
+          <w:tcPr>
+            <w:tcW w:w="1728" w:type="dxa"/>
+            <w:tcMar>
+              <w:top w:w="70" w:type="dxa"/>
+              <w:left w:w="70" w:type="dxa"/>
+              <w:bottom w:w="70" w:type="dxa"/>
+              <w:right w:w="70" w:type="dxa"/>
+            </w:tcMar>
+            <w:vAlign w:val="center"/>
+          </w:tcPr>
+          <w:p>
+            <w:pPr>
+              <w:keepNext/>
+              <w:keepLines/>
+              <w:bidi w:val="0"/>
+              <w:spacing w:after="0"/>
+              <w:jc w:val="center"/>
+            </w:pPr>
+            <w:r>
+              <w:t>23.42% / 21.83%</w:t>
+            </w:r>
+          </w:p>
+        </w:tc>
+        <w:tc>
+          <w:tcPr>
+            <w:tcW w:w="1728" w:type="dxa"/>
+            <w:tcMar>
+              <w:top w:w="70" w:type="dxa"/>
+              <w:left w:w="70" w:type="dxa"/>
+              <w:bottom w:w="70" w:type="dxa"/>
+              <w:right w:w="70" w:type="dxa"/>
+            </w:tcMar>
+            <w:vAlign w:val="center"/>
+          </w:tcPr>
+          <w:p>
+            <w:pPr>
+              <w:keepNext/>
+              <w:keepLines/>
+              <w:bidi w:val="0"/>
+              <w:spacing w:after="0"/>
+              <w:jc w:val="center"/>
+            </w:pPr>
+            <w:r>
+              <w:t>41.98% / 41.84%</w:t>
+            </w:r>
+          </w:p>
+        </w:tc>
+      </w:tr>
+      <w:tr>
+        <w:trPr>
+          <w:cantSplit/>
+          <w:jc w:val="center"/>
+        </w:trPr>
+        <w:tc>
+          <w:tcPr>
+            <w:tcW w:w="3672" w:type="dxa"/>
+            <w:tcMar>
+              <w:top w:w="70" w:type="dxa"/>
+              <w:left w:w="70" w:type="dxa"/>
+              <w:bottom w:w="70" w:type="dxa"/>
+              <w:right w:w="70" w:type="dxa"/>
+            </w:tcMar>
+            <w:vAlign w:val="center"/>
+          </w:tcPr>
+          <w:p>
+            <w:pPr>
+              <w:keepNext/>
+              <w:keepLines/>
+              <w:bidi w:val="0"/>
+              <w:spacing w:after="0"/>
+              <w:jc w:val="center"/>
+            </w:pPr>
+            <w:r>
+              <w:t>Sampled symmetrization</w:t>
+            </w:r>
+          </w:p>
+        </w:tc>
+        <w:tc>
+          <w:tcPr>
+            <w:tcW w:w="1728" w:type="dxa"/>
+            <w:tcMar>
+              <w:top w:w="70" w:type="dxa"/>
+              <w:left w:w="70" w:type="dxa"/>
+              <w:bottom w:w="70" w:type="dxa"/>
+              <w:right w:w="70" w:type="dxa"/>
+            </w:tcMar>
+            <w:vAlign w:val="center"/>
+          </w:tcPr>
+          <w:p>
+            <w:pPr>
+              <w:keepNext/>
+              <w:keepLines/>
+              <w:bidi w:val="0"/>
+              <w:spacing w:after="0"/>
+              <w:jc w:val="center"/>
+            </w:pPr>
+            <w:r>
+              <w:t>10.53% / 11.43%</w:t>
+            </w:r>
+          </w:p>
+        </w:tc>
+        <w:tc>
+          <w:tcPr>
+            <w:tcW w:w="1728" w:type="dxa"/>
+            <w:tcMar>
+              <w:top w:w="70" w:type="dxa"/>
+              <w:left w:w="70" w:type="dxa"/>
+              <w:bottom w:w="70" w:type="dxa"/>
+              <w:right w:w="70" w:type="dxa"/>
+            </w:tcMar>
+            <w:vAlign w:val="center"/>
+          </w:tcPr>
+          <w:p>
+            <w:pPr>
+              <w:keepNext/>
+              <w:keepLines/>
+              <w:bidi w:val="0"/>
+              <w:spacing w:after="0"/>
+              <w:jc w:val="center"/>
+            </w:pPr>
+            <w:r>
+              <w:t>24.23% / 22.16%</w:t>
+            </w:r>
+          </w:p>
+        </w:tc>
+        <w:tc>
+          <w:tcPr>
+            <w:tcW w:w="1728" w:type="dxa"/>
+            <w:tcMar>
+              <w:top w:w="70" w:type="dxa"/>
+              <w:left w:w="70" w:type="dxa"/>
+              <w:bottom w:w="70" w:type="dxa"/>
+              <w:right w:w="70" w:type="dxa"/>
+            </w:tcMar>
+            <w:vAlign w:val="center"/>
+          </w:tcPr>
+          <w:p>
+            <w:pPr>
+              <w:keepNext/>
+              <w:keepLines/>
+              <w:bidi w:val="0"/>
+              <w:spacing w:after="0"/>
+              <w:jc w:val="center"/>
+            </w:pPr>
+            <w:r>
+              <w:t>41.98% / 40.79%</w:t>
+            </w:r>
+          </w:p>
+        </w:tc>
+      </w:tr>
+      <w:tr>
+        <w:trPr>
+          <w:cantSplit/>
+          <w:jc w:val="center"/>
+        </w:trPr>
+        <w:tc>
+          <w:tcPr>
+            <w:tcW w:w="3672" w:type="dxa"/>
+            <w:tcMar>
+              <w:top w:w="70" w:type="dxa"/>
+              <w:left w:w="70" w:type="dxa"/>
+              <w:bottom w:w="70" w:type="dxa"/>
+              <w:right w:w="70" w:type="dxa"/>
+            </w:tcMar>
+            <w:vAlign w:val="center"/>
+          </w:tcPr>
+          <w:p>
+            <w:pPr>
+              <w:keepNext/>
+              <w:keepLines/>
+              <w:bidi w:val="0"/>
+              <w:spacing w:after="0"/>
+              <w:jc w:val="center"/>
+            </w:pPr>
+            <w:r>
+              <w:t>Equivariant network</w:t>
+            </w:r>
+          </w:p>
+        </w:tc>
+        <w:tc>
+          <w:tcPr>
+            <w:tcW w:w="1728" w:type="dxa"/>
+            <w:tcMar>
+              <w:top w:w="70" w:type="dxa"/>
+              <w:left w:w="70" w:type="dxa"/>
+              <w:bottom w:w="70" w:type="dxa"/>
+              <w:right w:w="70" w:type="dxa"/>
+            </w:tcMar>
+            <w:vAlign w:val="center"/>
+          </w:tcPr>
+          <w:p>
+            <w:pPr>
+              <w:keepNext/>
+              <w:keepLines/>
+              <w:bidi w:val="0"/>
+              <w:spacing w:after="0"/>
+              <w:jc w:val="center"/>
+            </w:pPr>
+            <w:r>
+              <w:t>13.98% / 14.91%</w:t>
+            </w:r>
+          </w:p>
+        </w:tc>
+        <w:tc>
+          <w:tcPr>
+            <w:tcW w:w="1728" w:type="dxa"/>
+            <w:tcMar>
+              <w:top w:w="70" w:type="dxa"/>
+              <w:left w:w="70" w:type="dxa"/>
+              <w:bottom w:w="70" w:type="dxa"/>
+              <w:right w:w="70" w:type="dxa"/>
+            </w:tcMar>
+            <w:vAlign w:val="center"/>
+          </w:tcPr>
+          <w:p>
+            <w:pPr>
+              <w:keepNext/>
+              <w:keepLines/>
+              <w:bidi w:val="0"/>
+              <w:spacing w:after="0"/>
+              <w:jc w:val="center"/>
+            </w:pPr>
+            <w:r>
+              <w:t>27.71% / 26.83%</w:t>
+            </w:r>
+          </w:p>
+        </w:tc>
+        <w:tc>
+          <w:tcPr>
+            <w:tcW w:w="1728" w:type="dxa"/>
+            <w:tcMar>
+              <w:top w:w="70" w:type="dxa"/>
+              <w:left w:w="70" w:type="dxa"/>
+              <w:bottom w:w="70" w:type="dxa"/>
+              <w:right w:w="70" w:type="dxa"/>
+            </w:tcMar>
+            <w:vAlign w:val="center"/>
+          </w:tcPr>
+          <w:p>
+            <w:pPr>
+              <w:keepNext/>
+              <w:keepLines/>
+              <w:bidi w:val="0"/>
+              <w:spacing w:after="0"/>
+              <w:jc w:val="center"/>
+            </w:pPr>
+            <w:r>
+              <w:t>58.31% / 55.82%</w:t>
+            </w:r>
+          </w:p>
+        </w:tc>
+      </w:tr>
+      <w:tr>
+        <w:trPr>
+          <w:cantSplit/>
+          <w:jc w:val="center"/>
+        </w:trPr>
+        <w:tc>
+          <w:tcPr>
+            <w:tcW w:w="3672" w:type="dxa"/>
+            <w:tcMar>
+              <w:top w:w="70" w:type="dxa"/>
+              <w:left w:w="70" w:type="dxa"/>
+              <w:bottom w:w="70" w:type="dxa"/>
+              <w:right w:w="70" w:type="dxa"/>
+            </w:tcMar>
+            <w:vAlign w:val="center"/>
+          </w:tcPr>
+          <w:p>
+            <w:pPr>
+              <w:keepLines/>
+              <w:bidi w:val="0"/>
+              <w:spacing w:after="0"/>
+              <w:jc w:val="center"/>
+            </w:pPr>
+            <w:r>
+              <w:t>Data augmentation</w:t>
+            </w:r>
+          </w:p>
+        </w:tc>
+        <w:tc>
+          <w:tcPr>
+            <w:tcW w:w="1728" w:type="dxa"/>
+            <w:tcMar>
+              <w:top w:w="70" w:type="dxa"/>
+              <w:left w:w="70" w:type="dxa"/>
+              <w:bottom w:w="70" w:type="dxa"/>
+              <w:right w:w="70" w:type="dxa"/>
+            </w:tcMar>
+            <w:vAlign w:val="center"/>
+          </w:tcPr>
+          <w:p>
+            <w:pPr>
+              <w:keepLines/>
+              <w:bidi w:val="0"/>
+              <w:spacing w:after="0"/>
+              <w:jc w:val="center"/>
+            </w:pPr>
+            <w:r>
+              <w:t>2.11% / 5.40%</w:t>
+            </w:r>
+          </w:p>
+        </w:tc>
+        <w:tc>
+          <w:tcPr>
+            <w:tcW w:w="1728" w:type="dxa"/>
+            <w:tcMar>
+              <w:top w:w="70" w:type="dxa"/>
+              <w:left w:w="70" w:type="dxa"/>
+              <w:bottom w:w="70" w:type="dxa"/>
+              <w:right w:w="70" w:type="dxa"/>
+            </w:tcMar>
+            <w:vAlign w:val="center"/>
+          </w:tcPr>
+          <w:p>
+            <w:pPr>
+              <w:keepLines/>
+              <w:bidi w:val="0"/>
+              <w:spacing w:after="0"/>
+              <w:jc w:val="center"/>
+            </w:pPr>
+            <w:r>
+              <w:t>5.11% / 7.86%</w:t>
+            </w:r>
+          </w:p>
+        </w:tc>
+        <w:tc>
+          <w:tcPr>
+            <w:tcW w:w="1728" w:type="dxa"/>
+            <w:tcMar>
+              <w:top w:w="70" w:type="dxa"/>
+              <w:left w:w="70" w:type="dxa"/>
+              <w:bottom w:w="70" w:type="dxa"/>
+              <w:right w:w="70" w:type="dxa"/>
+            </w:tcMar>
+            <w:vAlign w:val="center"/>
+          </w:tcPr>
+          <w:p>
+            <w:pPr>
+              <w:keepLines/>
+              <w:bidi w:val="0"/>
+              <w:spacing w:after="0"/>
+              <w:jc w:val="center"/>
+            </w:pPr>
+            <w:r>
+              <w:t>24.68% / 20.77%</w:t>
+            </w:r>
+          </w:p>
+        </w:tc>
+      </w:tr>
+    </w:tbl>
+    <w:p>
+      <w:pPr>
+        <w:pStyle w:val="Heading3"/>
+        <w:rPr>
+          <w:rtl/>
+        </w:rPr>
+      </w:pPr>
+      <w:r>
+        <w:rPr>
+          <w:rtl/>
+        </w:rPr>
+        <w:t>2. Wall-clock runtime.</w:t>
+      </w:r>
+    </w:p>
+    <w:p>
+      <w:r>
+        <w:rPr>
+          <w:rtl/>
+        </w:rPr>
+        <w:t>זמני wall-clock של training וכן validation, בשניות, מוצגים בטבלה הבאה:</w:t>
+      </w:r>
+    </w:p>
+    <w:tbl>
+      <w:tblPr>
+        <w:bidiVisual/>
+        <w:tblW w:w="8856" w:type="dxa"/>
+        <w:jc w:val="center"/>
+        <w:tblBorders>
+          <w:top w:val="single" w:sz="4" w:space="0" w:color="B7C9DC"/>
+          <w:left w:val="single" w:sz="4" w:space="0" w:color="B7C9DC"/>
+          <w:bottom w:val="single" w:sz="4" w:space="0" w:color="B7C9DC"/>
+          <w:right w:val="single" w:sz="4" w:space="0" w:color="B7C9DC"/>
+          <w:insideH w:val="single" w:sz="4" w:space="0" w:color="B7C9DC"/>
+          <w:insideV w:val="single" w:sz="4" w:space="0" w:color="B7C9DC"/>
+        </w:tblBorders>
+        <w:tblLayout w:type="fixed"/>
+        <w:tblLook w:val="04A0" w:firstRow="1" w:lastRow="0" w:firstColumn="1" w:lastColumn="0" w:noHBand="0" w:noVBand="1"/>
+      </w:tblPr>
+      <w:tblGrid>
+        <w:gridCol w:w="3672"/>
+        <w:gridCol w:w="1728"/>
+        <w:gridCol w:w="1728"/>
+        <w:gridCol w:w="1728"/>
+      </w:tblGrid>
+      <w:tr>
+        <w:trPr>
+          <w:cantSplit/>
+          <w:tblHeader/>
+          <w:jc w:val="center"/>
+        </w:trPr>
+        <w:tc>
+          <w:tcPr>
+            <w:tcW w:w="3672" w:type="dxa"/>
+            <w:shd w:val="clear" w:color="auto" w:fill="D9EAF7"/>
+            <w:tcMar>
+              <w:top w:w="70" w:type="dxa"/>
+              <w:left w:w="70" w:type="dxa"/>
+              <w:bottom w:w="70" w:type="dxa"/>
+              <w:right w:w="70" w:type="dxa"/>
+            </w:tcMar>
+            <w:vAlign w:val="center"/>
+          </w:tcPr>
+          <w:p>
+            <w:pPr>
+              <w:keepNext/>
+              <w:keepLines/>
+              <w:spacing w:after="0"/>
+              <w:jc w:val="center"/>
+            </w:pPr>
+            <w:r>
+              <w:rPr>
+                <w:b/>
+                <w:color w:val="365F91"/>
+                <w:rtl/>
+              </w:rPr>
+              <w:t>ארכיטקטורה</w:t>
+            </w:r>
+          </w:p>
+        </w:tc>
+        <w:tc>
+          <w:tcPr>
+            <w:tcW w:w="1728" w:type="dxa"/>
+            <w:shd w:val="clear" w:color="auto" w:fill="D9EAF7"/>
+            <w:tcMar>
+              <w:top w:w="70" w:type="dxa"/>
+              <w:left w:w="70" w:type="dxa"/>
+              <w:bottom w:w="70" w:type="dxa"/>
+              <w:right w:w="70" w:type="dxa"/>
+            </w:tcMar>
+            <w:vAlign w:val="center"/>
+          </w:tcPr>
+          <w:p>
+            <w:pPr>
+              <w:keepNext/>
+              <w:keepLines/>
+              <w:bidi w:val="0"/>
+              <w:spacing w:after="0"/>
+              <w:jc w:val="center"/>
+            </w:pPr>
+            <w:r>
+              <w:rPr>
+                <w:b/>
+                <w:color w:val="365F91"/>
+              </w:rPr>
+              <w:t>5</w:t>
+            </w:r>
+          </w:p>
+        </w:tc>
+        <w:tc>
+          <w:tcPr>
+            <w:tcW w:w="1728" w:type="dxa"/>
+            <w:shd w:val="clear" w:color="auto" w:fill="D9EAF7"/>
+            <w:tcMar>
+              <w:top w:w="70" w:type="dxa"/>
+              <w:left w:w="70" w:type="dxa"/>
+              <w:bottom w:w="70" w:type="dxa"/>
+              <w:right w:w="70" w:type="dxa"/>
+            </w:tcMar>
+            <w:vAlign w:val="center"/>
+          </w:tcPr>
+          <w:p>
+            <w:pPr>
+              <w:keepNext/>
+              <w:keepLines/>
+              <w:bidi w:val="0"/>
+              <w:spacing w:after="0"/>
+              <w:jc w:val="center"/>
+            </w:pPr>
+            <w:r>
+              <w:rPr>
+                <w:b/>
+                <w:color w:val="365F91"/>
+              </w:rPr>
+              <w:t>10</w:t>
+            </w:r>
+          </w:p>
+        </w:tc>
+        <w:tc>
+          <w:tcPr>
+            <w:tcW w:w="1728" w:type="dxa"/>
+            <w:shd w:val="clear" w:color="auto" w:fill="D9EAF7"/>
+            <w:tcMar>
+              <w:top w:w="70" w:type="dxa"/>
+              <w:left w:w="70" w:type="dxa"/>
+              <w:bottom w:w="70" w:type="dxa"/>
+              <w:right w:w="70" w:type="dxa"/>
+            </w:tcMar>
+            <w:vAlign w:val="center"/>
+          </w:tcPr>
+          <w:p>
+            <w:pPr>
+              <w:keepNext/>
+              <w:keepLines/>
+              <w:bidi w:val="0"/>
+              <w:spacing w:after="0"/>
+              <w:jc w:val="center"/>
+            </w:pPr>
+            <w:r>
+              <w:rPr>
+                <w:b/>
+                <w:color w:val="365F91"/>
+              </w:rPr>
+              <w:t>50</w:t>
+            </w:r>
+          </w:p>
+        </w:tc>
+      </w:tr>
+      <w:tr>
+        <w:trPr>
+          <w:cantSplit/>
+          <w:jc w:val="center"/>
+        </w:trPr>
+        <w:tc>
+          <w:tcPr>
+            <w:tcW w:w="3672" w:type="dxa"/>
+            <w:tcMar>
+              <w:top w:w="70" w:type="dxa"/>
+              <w:left w:w="70" w:type="dxa"/>
+              <w:bottom w:w="70" w:type="dxa"/>
+              <w:right w:w="70" w:type="dxa"/>
+            </w:tcMar>
+            <w:vAlign w:val="center"/>
+          </w:tcPr>
+          <w:p>
+            <w:pPr>
+              <w:keepNext/>
+              <w:keepLines/>
+              <w:bidi w:val="0"/>
+              <w:spacing w:after="0"/>
+              <w:jc w:val="center"/>
+            </w:pPr>
+            <w:r>
+              <w:t>Canonization</w:t>
+            </w:r>
+          </w:p>
+        </w:tc>
+        <w:tc>
+          <w:tcPr>
+            <w:tcW w:w="1728" w:type="dxa"/>
+            <w:tcMar>
+              <w:top w:w="70" w:type="dxa"/>
+              <w:left w:w="70" w:type="dxa"/>
+              <w:bottom w:w="70" w:type="dxa"/>
+              <w:right w:w="70" w:type="dxa"/>
+            </w:tcMar>
+            <w:vAlign w:val="center"/>
+          </w:tcPr>
+          <w:p>
+            <w:pPr>
+              <w:keepNext/>
+              <w:keepLines/>
+              <w:bidi w:val="0"/>
+              <w:spacing w:after="0"/>
+              <w:jc w:val="center"/>
+            </w:pPr>
+            <w:r>
+              <w:t>3.94</w:t>
+            </w:r>
+          </w:p>
+        </w:tc>
+        <w:tc>
+          <w:tcPr>
+            <w:tcW w:w="1728" w:type="dxa"/>
+            <w:tcMar>
+              <w:top w:w="70" w:type="dxa"/>
+              <w:left w:w="70" w:type="dxa"/>
+              <w:bottom w:w="70" w:type="dxa"/>
+              <w:right w:w="70" w:type="dxa"/>
+            </w:tcMar>
+            <w:vAlign w:val="center"/>
+          </w:tcPr>
+          <w:p>
+            <w:pPr>
+              <w:keepNext/>
+              <w:keepLines/>
+              <w:bidi w:val="0"/>
+              <w:spacing w:after="0"/>
+              <w:jc w:val="center"/>
+            </w:pPr>
+            <w:r>
+              <w:t>4.95</w:t>
+            </w:r>
+          </w:p>
+        </w:tc>
+        <w:tc>
+          <w:tcPr>
+            <w:tcW w:w="1728" w:type="dxa"/>
+            <w:tcMar>
+              <w:top w:w="70" w:type="dxa"/>
+              <w:left w:w="70" w:type="dxa"/>
+              <w:bottom w:w="70" w:type="dxa"/>
+              <w:right w:w="70" w:type="dxa"/>
+            </w:tcMar>
+            <w:vAlign w:val="center"/>
+          </w:tcPr>
+          <w:p>
+            <w:pPr>
+              <w:keepNext/>
+              <w:keepLines/>
+              <w:bidi w:val="0"/>
+              <w:spacing w:after="0"/>
+              <w:jc w:val="center"/>
+            </w:pPr>
+            <w:r>
+              <w:t>17.32</w:t>
+            </w:r>
+          </w:p>
+        </w:tc>
+      </w:tr>
+      <w:tr>
+        <w:trPr>
+          <w:cantSplit/>
+          <w:jc w:val="center"/>
+        </w:trPr>
+        <w:tc>
+          <w:tcPr>
+            <w:tcW w:w="3672" w:type="dxa"/>
+            <w:tcMar>
+              <w:top w:w="70" w:type="dxa"/>
+              <w:left w:w="70" w:type="dxa"/>
+              <w:bottom w:w="70" w:type="dxa"/>
+              <w:right w:w="70" w:type="dxa"/>
+            </w:tcMar>
+            <w:vAlign w:val="center"/>
+          </w:tcPr>
+          <w:p>
+            <w:pPr>
+              <w:keepNext/>
+              <w:keepLines/>
+              <w:bidi w:val="0"/>
+              <w:spacing w:after="0"/>
+              <w:jc w:val="center"/>
+            </w:pPr>
+            <w:r>
+              <w:t>Full symmetrization</w:t>
+            </w:r>
+          </w:p>
+        </w:tc>
+        <w:tc>
+          <w:tcPr>
+            <w:tcW w:w="1728" w:type="dxa"/>
+            <w:tcMar>
+              <w:top w:w="70" w:type="dxa"/>
+              <w:left w:w="70" w:type="dxa"/>
+              <w:bottom w:w="70" w:type="dxa"/>
+              <w:right w:w="70" w:type="dxa"/>
+            </w:tcMar>
+            <w:vAlign w:val="center"/>
+          </w:tcPr>
+          <w:p>
+            <w:pPr>
+              <w:keepNext/>
+              <w:keepLines/>
+              <w:bidi w:val="0"/>
+              <w:spacing w:after="0"/>
+              <w:jc w:val="center"/>
+            </w:pPr>
+            <w:r>
+              <w:t>28.47</w:t>
+            </w:r>
+          </w:p>
+        </w:tc>
+        <w:tc>
+          <w:tcPr>
+            <w:tcW w:w="1728" w:type="dxa"/>
+            <w:tcMar>
+              <w:top w:w="70" w:type="dxa"/>
+              <w:left w:w="70" w:type="dxa"/>
+              <w:bottom w:w="70" w:type="dxa"/>
+              <w:right w:w="70" w:type="dxa"/>
+            </w:tcMar>
+            <w:vAlign w:val="center"/>
+          </w:tcPr>
+          <w:p>
+            <w:pPr>
+              <w:keepNext/>
+              <w:keepLines/>
+              <w:bidi w:val="0"/>
+              <w:spacing w:after="0"/>
+              <w:jc w:val="center"/>
+            </w:pPr>
+            <w:r>
+              <w:t>146.84</w:t>
+            </w:r>
+          </w:p>
+        </w:tc>
+        <w:tc>
+          <w:tcPr>
+            <w:tcW w:w="1728" w:type="dxa"/>
+            <w:tcMar>
+              <w:top w:w="70" w:type="dxa"/>
+              <w:left w:w="70" w:type="dxa"/>
+              <w:bottom w:w="70" w:type="dxa"/>
+              <w:right w:w="70" w:type="dxa"/>
+            </w:tcMar>
+            <w:vAlign w:val="center"/>
+          </w:tcPr>
+          <w:p>
+            <w:pPr>
+              <w:keepNext/>
+              <w:keepLines/>
+              <w:bidi w:val="0"/>
+              <w:spacing w:after="0"/>
+              <w:jc w:val="center"/>
+            </w:pPr>
+            <w:r>
+              <w:t>751.42</w:t>
+            </w:r>
+          </w:p>
+        </w:tc>
+      </w:tr>
+      <w:tr>
+        <w:trPr>
+          <w:cantSplit/>
+          <w:jc w:val="center"/>
+        </w:trPr>
+        <w:tc>
+          <w:tcPr>
+            <w:tcW w:w="3672" w:type="dxa"/>
+            <w:tcMar>
+              <w:top w:w="70" w:type="dxa"/>
+              <w:left w:w="70" w:type="dxa"/>
+              <w:bottom w:w="70" w:type="dxa"/>
+              <w:right w:w="70" w:type="dxa"/>
+            </w:tcMar>
+            <w:vAlign w:val="center"/>
+          </w:tcPr>
+          <w:p>
+            <w:pPr>
+              <w:keepNext/>
+              <w:keepLines/>
+              <w:bidi w:val="0"/>
+              <w:spacing w:after="0"/>
+              <w:jc w:val="center"/>
+            </w:pPr>
+            <w:r>
+              <w:t>Sampled symmetrization</w:t>
+            </w:r>
+          </w:p>
+        </w:tc>
+        <w:tc>
+          <w:tcPr>
+            <w:tcW w:w="1728" w:type="dxa"/>
+            <w:tcMar>
+              <w:top w:w="70" w:type="dxa"/>
+              <w:left w:w="70" w:type="dxa"/>
+              <w:bottom w:w="70" w:type="dxa"/>
+              <w:right w:w="70" w:type="dxa"/>
+            </w:tcMar>
+            <w:vAlign w:val="center"/>
+          </w:tcPr>
+          <w:p>
+            <w:pPr>
+              <w:keepNext/>
+              <w:keepLines/>
+              <w:bidi w:val="0"/>
+              <w:spacing w:after="0"/>
+              <w:jc w:val="center"/>
+            </w:pPr>
+            <w:r>
+              <w:t>5.93</w:t>
+            </w:r>
+          </w:p>
+        </w:tc>
+        <w:tc>
+          <w:tcPr>
+            <w:tcW w:w="1728" w:type="dxa"/>
+            <w:tcMar>
+              <w:top w:w="70" w:type="dxa"/>
+              <w:left w:w="70" w:type="dxa"/>
+              <w:bottom w:w="70" w:type="dxa"/>
+              <w:right w:w="70" w:type="dxa"/>
+            </w:tcMar>
+            <w:vAlign w:val="center"/>
+          </w:tcPr>
+          <w:p>
+            <w:pPr>
+              <w:keepNext/>
+              <w:keepLines/>
+              <w:bidi w:val="0"/>
+              <w:spacing w:after="0"/>
+              <w:jc w:val="center"/>
+            </w:pPr>
+            <w:r>
+              <w:t>32.26</w:t>
+            </w:r>
+          </w:p>
+        </w:tc>
+        <w:tc>
+          <w:tcPr>
+            <w:tcW w:w="1728" w:type="dxa"/>
+            <w:tcMar>
+              <w:top w:w="70" w:type="dxa"/>
+              <w:left w:w="70" w:type="dxa"/>
+              <w:bottom w:w="70" w:type="dxa"/>
+              <w:right w:w="70" w:type="dxa"/>
+            </w:tcMar>
+            <w:vAlign w:val="center"/>
+          </w:tcPr>
+          <w:p>
+            <w:pPr>
+              <w:keepNext/>
+              <w:keepLines/>
+              <w:bidi w:val="0"/>
+              <w:spacing w:after="0"/>
+              <w:jc w:val="center"/>
+            </w:pPr>
+            <w:r>
+              <w:t>134.91</w:t>
+            </w:r>
+          </w:p>
+        </w:tc>
+      </w:tr>
+      <w:tr>
+        <w:trPr>
+          <w:cantSplit/>
+          <w:jc w:val="center"/>
+        </w:trPr>
+        <w:tc>
+          <w:tcPr>
+            <w:tcW w:w="3672" w:type="dxa"/>
+            <w:tcMar>
+              <w:top w:w="70" w:type="dxa"/>
+              <w:left w:w="70" w:type="dxa"/>
+              <w:bottom w:w="70" w:type="dxa"/>
+              <w:right w:w="70" w:type="dxa"/>
+            </w:tcMar>
+            <w:vAlign w:val="center"/>
+          </w:tcPr>
+          <w:p>
+            <w:pPr>
+              <w:keepNext/>
+              <w:keepLines/>
+              <w:bidi w:val="0"/>
+              <w:spacing w:after="0"/>
+              <w:jc w:val="center"/>
+            </w:pPr>
+            <w:r>
+              <w:t>Equivariant network</w:t>
+            </w:r>
+          </w:p>
+        </w:tc>
+        <w:tc>
+          <w:tcPr>
+            <w:tcW w:w="1728" w:type="dxa"/>
+            <w:tcMar>
+              <w:top w:w="70" w:type="dxa"/>
+              <w:left w:w="70" w:type="dxa"/>
+              <w:bottom w:w="70" w:type="dxa"/>
+              <w:right w:w="70" w:type="dxa"/>
+            </w:tcMar>
+            <w:vAlign w:val="center"/>
+          </w:tcPr>
+          <w:p>
+            <w:pPr>
+              <w:keepNext/>
+              <w:keepLines/>
+              <w:bidi w:val="0"/>
+              <w:spacing w:after="0"/>
+              <w:jc w:val="center"/>
+            </w:pPr>
+            <w:r>
+              <w:t>6.82</w:t>
+            </w:r>
+          </w:p>
+        </w:tc>
+        <w:tc>
+          <w:tcPr>
+            <w:tcW w:w="1728" w:type="dxa"/>
+            <w:tcMar>
+              <w:top w:w="70" w:type="dxa"/>
+              <w:left w:w="70" w:type="dxa"/>
+              <w:bottom w:w="70" w:type="dxa"/>
+              <w:right w:w="70" w:type="dxa"/>
+            </w:tcMar>
+            <w:vAlign w:val="center"/>
+          </w:tcPr>
+          <w:p>
+            <w:pPr>
+              <w:keepNext/>
+              <w:keepLines/>
+              <w:bidi w:val="0"/>
+              <w:spacing w:after="0"/>
+              <w:jc w:val="center"/>
+            </w:pPr>
+            <w:r>
+              <w:t>13.36</w:t>
+            </w:r>
+          </w:p>
+        </w:tc>
+        <w:tc>
+          <w:tcPr>
+            <w:tcW w:w="1728" w:type="dxa"/>
+            <w:tcMar>
+              <w:top w:w="70" w:type="dxa"/>
+              <w:left w:w="70" w:type="dxa"/>
+              <w:bottom w:w="70" w:type="dxa"/>
+              <w:right w:w="70" w:type="dxa"/>
+            </w:tcMar>
+            <w:vAlign w:val="center"/>
+          </w:tcPr>
+          <w:p>
+            <w:pPr>
+              <w:keepNext/>
+              <w:keepLines/>
+              <w:bidi w:val="0"/>
+              <w:spacing w:after="0"/>
+              <w:jc w:val="center"/>
+            </w:pPr>
+            <w:r>
+              <w:t>147.82</w:t>
+            </w:r>
+          </w:p>
+        </w:tc>
+      </w:tr>
+      <w:tr>
+        <w:trPr>
+          <w:cantSplit/>
+          <w:jc w:val="center"/>
+        </w:trPr>
+        <w:tc>
+          <w:tcPr>
+            <w:tcW w:w="3672" w:type="dxa"/>
+            <w:tcMar>
+              <w:top w:w="70" w:type="dxa"/>
+              <w:left w:w="70" w:type="dxa"/>
+              <w:bottom w:w="70" w:type="dxa"/>
+              <w:right w:w="70" w:type="dxa"/>
+            </w:tcMar>
+            <w:vAlign w:val="center"/>
+          </w:tcPr>
+          <w:p>
+            <w:pPr>
+              <w:keepLines/>
+              <w:bidi w:val="0"/>
+              <w:spacing w:after="0"/>
+              <w:jc w:val="center"/>
+            </w:pPr>
+            <w:r>
+              <w:t>Data augmentation</w:t>
+            </w:r>
+          </w:p>
+        </w:tc>
+        <w:tc>
+          <w:tcPr>
+            <w:tcW w:w="1728" w:type="dxa"/>
+            <w:tcMar>
+              <w:top w:w="70" w:type="dxa"/>
+              <w:left w:w="70" w:type="dxa"/>
+              <w:bottom w:w="70" w:type="dxa"/>
+              <w:right w:w="70" w:type="dxa"/>
+            </w:tcMar>
+            <w:vAlign w:val="center"/>
+          </w:tcPr>
+          <w:p>
+            <w:pPr>
+              <w:keepLines/>
+              <w:bidi w:val="0"/>
+              <w:spacing w:after="0"/>
+              <w:jc w:val="center"/>
+            </w:pPr>
+            <w:r>
+              <w:t>3.75</w:t>
+            </w:r>
+          </w:p>
+        </w:tc>
+        <w:tc>
+          <w:tcPr>
+            <w:tcW w:w="1728" w:type="dxa"/>
+            <w:tcMar>
+              <w:top w:w="70" w:type="dxa"/>
+              <w:left w:w="70" w:type="dxa"/>
+              <w:bottom w:w="70" w:type="dxa"/>
+              <w:right w:w="70" w:type="dxa"/>
+            </w:tcMar>
+            <w:vAlign w:val="center"/>
+          </w:tcPr>
+          <w:p>
+            <w:pPr>
+              <w:keepLines/>
+              <w:bidi w:val="0"/>
+              <w:spacing w:after="0"/>
+              <w:jc w:val="center"/>
+            </w:pPr>
+            <w:r>
+              <w:t>5.51</w:t>
+            </w:r>
+          </w:p>
+        </w:tc>
+        <w:tc>
+          <w:tcPr>
+            <w:tcW w:w="1728" w:type="dxa"/>
+            <w:tcMar>
+              <w:top w:w="70" w:type="dxa"/>
+              <w:left w:w="70" w:type="dxa"/>
+              <w:bottom w:w="70" w:type="dxa"/>
+              <w:right w:w="70" w:type="dxa"/>
+            </w:tcMar>
+            <w:vAlign w:val="center"/>
+          </w:tcPr>
+          <w:p>
+            <w:pPr>
+              <w:keepLines/>
+              <w:bidi w:val="0"/>
+              <w:spacing w:after="0"/>
+              <w:jc w:val="center"/>
+            </w:pPr>
+            <w:r>
+              <w:t>68.17</w:t>
+            </w:r>
+          </w:p>
+        </w:tc>
+      </w:tr>
+    </w:tbl>
+    <w:p>
+      <w:pPr>
+        <w:pStyle w:val="Heading3"/>
+        <w:rPr>
+          <w:rtl/>
+        </w:rPr>
+      </w:pPr>
+      <w:r>
+        <w:rPr>
+          <w:rtl/>
+        </w:rPr>
+        <w:t>3. Trade-offs בין הגישות.</w:t>
+      </w:r>
+    </w:p>
+    <w:p>
+      <w:r>
+        <w:rPr>
+          <w:rtl/>
+        </w:rPr>
+        <w:t>מבחינת accuracy, המודל מסוג equivariant network השיג את התוצאה הגבוהה ביותר: תיקו עם המודל canonization-based network ב-5 דוגמאות למחלקה, ויתרון ברור ב-10 וב-50 דוגמאות. עבור 50 דוגמאות הוא הגיע ל-58.31%, לעומת 41.98% בשיטת full symmetrization ובשיטת sampled symmetrization, 33.27% במודל canonization-based network ו-24.68% בניסוי data augmentation. ב-5 דוגמאות התקבל תיקו של 13.98% עבור overall accuracy, אך למודל equivariant network היה mean-class accuracy גבוה יותר, 14.91% לעומת 13.58%.</w:t>
+      </w:r>
+    </w:p>
+    <w:p>
+      <w:r>
+        <w:rPr>
+          <w:rtl/>
+        </w:rPr>
+        <w:t>יש לסייג את יתרון המודל equivariant network מול שיטות symmetrization: הוא קיבל 256 נקודות, ואילו full symmetrization וכן sampled symmetrization קיבלו שבע בלבד. שיטת full symmetrization אינה ניתנת להרחבה ל-256 נקודות, ושיטת sampled symmetrization נשמרה על שבע נקודות כדי לאפשר השוואה ישירה לסעיף ב. לכן הפער משקף גם יתרון ארכיטקטוני וגם מידע רב יותר בקלט; המסקנה הבטוחה היא שהמודל equivariant network נותן את יחס הדיוק-חישוב הטוב ביותר בתנאים המעשיים שנבדקו.</w:t>
+      </w:r>
+    </w:p>
+    <w:p>
+      <w:r>
+        <w:rPr>
+          <w:rtl/>
+        </w:rPr>
+        <w:t>המודל מסוג canonization-based network מבטיח exact invariance, אך אינו מספק internal weight sharing. השכבה הראשונה של flattened MLP לומדת משקלים נפרדים לכל קואורדינטה ולכל מיקום בסדר הקנוני, ושינוי קטן בקואורדינטות עלול להחליף את מיקומן של שתי נקודות בסדר lexicographic. בניסוי של 50 דוגמאות ערך training cross-entropy היה 1.4985 בנקודת checkpoint שנבחרה, לעומת validation cross-entropy של 2.6025, ולכן ניכרת overfitting.</w:t>
+      </w:r>
+    </w:p>
+    <w:p>
+      <w:r>
+        <w:rPr>
+          <w:rtl/>
+        </w:rPr>
+        <w:t xml:space="preserve">בניסוי data augmentation התקבלו לפני ואחרי תמורה קבועה הדיוקים 2.11%/2.35%, 5.11%/5.63% ו-24.68%/25.32%. קרבת המספרים מעידה רק שערך aggregate accuracy כמעט לא השתנה; היא אינה מוכיחה שהתחזיות הזוגיות או וקטורי logits נשמרו. בדיקת invariance ישירה הייתה צריכה למדוד, לכל דוגמה, את </w:t>
+      </w:r>
+      <m:oMath>
+        <m:r>
+          <w:rPr>
+            <w:rFonts w:ascii="Cambria Math" w:hAnsi="Cambria Math"/>
+          </w:rPr>
+          <m:t>∥F(πX)-F(X)∥</m:t>
+        </m:r>
+      </m:oMath>
+      <w:r>
+        <w:rPr>
+          <w:rtl/>
+        </w:rPr>
+        <w:t xml:space="preserve"> או את שיעור התחזיות שלא השתנו.</w:t>
+      </w:r>
+    </w:p>
+    <w:p>
+      <w:r>
+        <w:rPr>
+          <w:rtl/>
+        </w:rPr>
+        <w:t>מבחינת computational efficiency, שיטת sampled symmetrization שמרה היטב על איכות המיצוע המלא. ב-50 דוגמאות שתי שיטות symmetrization הגיעו ל-41.98%, וב-5 וב-10 דוגמאות הפער היה קטן מאחוז אחד. אין להסיק מכך שווקטורי logits זהים: נותר Monte Carlo error, אך ברוב הדוגמאות הוא קטן ביחס לפער בין המחלקה המובילה למתחרות ולכן אינו משנה את הכרעת argmax. זמן האימון התקצר פי 4.55-5.57.</w:t>
+      </w:r>
+    </w:p>
+    <w:p>
+      <w:r>
+        <w:rPr>
+          <w:rtl/>
+        </w:rPr>
+        <w:t>ההאצה קטנה מן ההפחתה התאורטית פי 20 משום שרק חלק מן זמן הריצה תלוי במספר התמורות. לפי חוק Amdahl,</w:t>
+      </w:r>
+    </w:p>
+    <w:p>
+      <w:pPr>
+        <w:bidi w:val="0"/>
+        <w:spacing w:before="60" w:after="60"/>
+        <w:jc w:val="center"/>
+      </w:pPr>
+      <m:oMathPara>
+        <m:oMathParaPr>
+          <m:jc m:val="center"/>
+        </m:oMathParaPr>
+        <m:oMath>
+          <m:r>
+            <w:rPr>
+              <w:rFonts w:ascii="Cambria Math" w:hAnsi="Cambria Math"/>
+            </w:rPr>
+            <m:t>S=</m:t>
+          </m:r>
+          <m:f>
+            <m:fPr>
+              <m:ctrlPr>
+                <w:rPr>
+                  <w:rFonts w:ascii="Cambria Math" w:hAnsi="Cambria Math"/>
+                </w:rPr>
+              </m:ctrlPr>
+            </m:fPr>
+            <m:num>
+              <m:r>
+                <w:rPr>
+                  <w:rFonts w:ascii="Cambria Math" w:hAnsi="Cambria Math"/>
+                </w:rPr>
+                <m:t>1</m:t>
+              </m:r>
+            </m:num>
+            <m:den>
+              <m:r>
+                <w:rPr>
+                  <w:rFonts w:ascii="Cambria Math" w:hAnsi="Cambria Math"/>
+                </w:rPr>
+                <m:t>(1-p)+</m:t>
+              </m:r>
+              <m:f>
+                <m:fPr>
+                  <m:ctrlPr>
+                    <w:rPr>
+                      <w:rFonts w:ascii="Cambria Math" w:hAnsi="Cambria Math"/>
+                    </w:rPr>
+                  </m:ctrlPr>
+                </m:fPr>
+                <m:num>
+                  <m:r>
+                    <w:rPr>
+                      <w:rFonts w:ascii="Cambria Math" w:hAnsi="Cambria Math"/>
+                    </w:rPr>
+                    <m:t>p</m:t>
+                  </m:r>
+                </m:num>
+                <m:den>
+                  <m:r>
+                    <w:rPr>
+                      <w:rFonts w:ascii="Cambria Math" w:hAnsi="Cambria Math"/>
+                    </w:rPr>
+                    <m:t>20</m:t>
+                  </m:r>
+                </m:den>
+              </m:f>
+            </m:den>
+          </m:f>
+          <m:r>
+            <w:rPr>
+              <w:rFonts w:ascii="Cambria Math" w:hAnsi="Cambria Math"/>
+            </w:rPr>
+            <m:t>,</m:t>
+          </m:r>
+        </m:oMath>
+      </m:oMathPara>
+    </w:p>
+    <w:p>
+      <w:r>
+        <w:rPr>
+          <w:rtl/>
+        </w:rPr>
+        <w:t>והמהירויות שנמדדו מתאימות בקירוב ל-</w:t>
+      </w:r>
+      <m:oMath>
+        <m:r>
+          <w:rPr>
+            <w:rFonts w:ascii="Cambria Math" w:hAnsi="Cambria Math"/>
+          </w:rPr>
+          <m:t>p≈0.82-0.86</m:t>
+        </m:r>
+      </m:oMath>
+      <w:r>
+        <w:rPr>
+          <w:rtl/>
+        </w:rPr>
+        <w:t xml:space="preserve">. שאר הזמן מוקדש להעברת </w:t>
+      </w:r>
+      <w:r>
+        <w:t>batches</w:t>
+      </w:r>
+      <w:r>
+        <w:rPr>
+          <w:rtl/>
+        </w:rPr>
+        <w:t xml:space="preserve">, עדכוני optimizer, validation ותקורת Python/CUDA. נוסף על כך, המיצוע המלא מנצל </w:t>
+      </w:r>
+      <w:r>
+        <w:t>batches</w:t>
+      </w:r>
+      <w:r>
+        <w:rPr>
+          <w:rtl/>
+        </w:rPr>
+        <w:t xml:space="preserve"> גדולים יותר ולכן כל הערכת תמורה זולה יותר בממוצע על GPU.</w:t>
+      </w:r>
+    </w:p>
+    <w:p>
+      <w:r>
+        <w:rPr>
+          <w:rtl/>
+        </w:rPr>
+        <w:t>מבחינת scalability עבור set size ועבור feature dimension, הקלט של flattened MLP גדל כ-</w:t>
+      </w:r>
+      <m:oMath>
+        <m:r>
+          <w:rPr>
+            <w:rFonts w:ascii="Cambria Math" w:hAnsi="Cambria Math"/>
+          </w:rPr>
+          <m:t>nd</m:t>
+        </m:r>
+      </m:oMath>
+      <w:r>
+        <w:rPr>
+          <w:rtl/>
+        </w:rPr>
+        <w:t xml:space="preserve"> ואינו מבצע weight sharing בין נקודות. Full symmetrization גדלה כ-</w:t>
+      </w:r>
+      <m:oMath>
+        <m:r>
+          <w:rPr>
+            <w:rFonts w:ascii="Cambria Math" w:hAnsi="Cambria Math"/>
+          </w:rPr>
+          <m:t>n!</m:t>
+        </m:r>
+      </m:oMath>
+      <w:r>
+        <w:rPr>
+          <w:rtl/>
+        </w:rPr>
+        <w:t xml:space="preserve"> ולכן אינה מעשית לקבוצות גדולות. Sampled symmetrization מחליפה את התלות הפקטוריאלית במספר דגימות שנבחר מראש, במחיר approximation error. לעומתן, זמן הריצה של linear equivariant layers לינארי ב-</w:t>
+      </w:r>
+      <m:oMath>
+        <m:r>
+          <w:rPr>
+            <w:rFonts w:ascii="Cambria Math" w:hAnsi="Cambria Math"/>
+          </w:rPr>
+          <m:t>n</m:t>
+        </m:r>
+      </m:oMath>
+      <w:r>
+        <w:rPr>
+          <w:rtl/>
+        </w:rPr>
+        <w:t>, ומספר הפרמטרים נקבע על ידי ממדי input features וממדי output features של שני בלוקי המשקלים ואינו תלוי במספר הנקודות.</w:t>
+      </w:r>
+    </w:p>
+    <w:p>
+      <w:r>
+        <w:rPr>
+          <w:rtl/>
+        </w:rPr>
+        <w:t>מבחינת ease of implementation, canonization וכן data augmentation הן הגישות הפשוטות ביותר. Full symmetrization פשוטה אלגברית אך דורשת enumeration יקרה; sampled symmetrization דורשת ניהול תת-קבוצה קבועה ושחזורית; linear equivariant layers דורשות מימוש ייעודי של שני בלוקי המשקלים, אך לאחר מכן אינן דורשות מיצוע על permutations בזמן האימון או בזמן inference.</w:t>
+      </w:r>
+    </w:p>
+    <w:p>
+      <w:pPr>
+        <w:pStyle w:val="Heading3"/>
+        <w:rPr>
+          <w:rtl/>
+        </w:rPr>
+      </w:pPr>
+      <w:r>
+        <w:rPr>
+          <w:rtl/>
+        </w:rPr>
+        <w:t>4. אתגרי המימוש והניסוי.</w:t>
+      </w:r>
+    </w:p>
+    <w:p>
+      <w:r>
+        <w:rPr>
+          <w:rtl/>
+        </w:rPr>
+        <w:t>האתגרים המרכזיים היו התאמת מספרי הפרמטרים בין ארכיטקטורות שונות, בניית פיצולים מדורגים ומאוזנים עם validation נפרד, מיצוע 5,040 permutations ללא חריגה מזיכרון GPU, ושמירת אותה תת-קבוצה בניסוי sampled symmetrization. התמורות עובדו באמצעות CUDA chunks של 1,024, וכל 15 הניסויים הסתיימו לפני מגבלת חצי השעה.</w:t>
+      </w:r>
+    </w:p>
+    <w:p>
+      <w:pPr>
+        <w:pStyle w:val="Heading3"/>
+        <w:rPr>
+          <w:rtl/>
+        </w:rPr>
+      </w:pPr>
+      <w:r>
+        <w:rPr>
+          <w:rtl/>
+        </w:rPr>
+        <w:t>5. Recommendation לפי תרחיש.</w:t>
+      </w:r>
+    </w:p>
+    <w:p>
+      <w:r>
+        <w:rPr>
+          <w:rtl/>
+        </w:rPr>
+        <w:t>כאשר accuracy הוא השיקול המרכזי או כאשר מדובר במקרה של set גדול, נבחר במודל equivariant network עם mean pooling: הוא היה הטוב ביותר או בתיקו בכל גודלי האימון, וב-50 דוגמאות הוסיף 16.33 נקודות אחוז לעומת sampled symmetrization במחיר זמן קטן בלבד, 147.82 לעומת 134.91 שניות. עבור set קטן מאוד ודרישת exact invariance ניתן להשתמש בשיטת full symmetrization אם החישוב זמין. כאשר נדרש חיסכון משמעותי בחישוב תוך שמירה על איכות קרובה למיצוע המלא, שיטת sampled symmetrization היא הבחירה המתאימה. המודל canonization-based network הוא baseline פשוט, ושיטת data augmentation מתאימה בעיקר כאשר רוצים לשמור ארכיטקטורה קיימת ויש נתונים רבים, אך שתיהן פחות sample-efficient ואינן הבחירה המועדפת כאן.</w:t>
+      </w:r>
+    </w:p>
+    <w:p>
+      <w:pPr>
+        <w:pStyle w:val="Heading3"/>
+        <w:rPr>
+          <w:rtl/>
+        </w:rPr>
+      </w:pPr>
+      <w:r>
+        <w:rPr>
+          <w:rtl/>
+        </w:rPr>
+        <w:t>6. מדוע linear equivariant layers מתאימות במיוחד.</w:t>
+      </w:r>
+    </w:p>
+    <w:p>
+      <w:r>
+        <w:rPr>
+          <w:rtl/>
+        </w:rPr>
+        <w:t>כפי שנגזר בסעיף ד, linear equivariant layers מפרמטרות ישירות את תמונת אופרטור ההטלה: שני orbits של זוגות אינדקסים נותנים שני בלוקי משקלים משותפים. לכן כל שכבה היא equivariant by design, ופעולת mean pooling נותנת invariant output ללא צורך לעבור על permutations וללא צורך ללמוד את הסימטריה מן הנתונים. מנגנון weight sharing מצמצם את מרחב הפונקציות ומשפר sample efficiency, בעוד שמספר הפרמטרים אינו תלוי במספר הנקודות.</w:t>
+      </w:r>
+    </w:p>
+    <w:p>
+      <w:r>
+        <w:rPr>
+          <w:rtl/>
+        </w:rPr>
+        <w:t>בהשוואה לכך, המודל canonization-based network מבטיח invariance רק לאחר מיון אך אינו משתף משקלים בין מיקומי הקלט ורגיש לחילופים בסדר lexicographic; full symmetrization מדויקת אך בעלת עלות פקטוריאלית; sampled symmetrization חוסכת חישוב במחיר approximation error; ושיטת data augmentation משאירה במודל רכיב non-invariant שעליו ללמוד לדכא. משום כך linear equivariant layers מתאימות במיוחד לענני נקודות גדולים, והתוצאות שנמדדו תואמות את היתרון התאורטי הזה.</w:t>
+      </w:r>
+    </w:p>
     <w:sectPr>
-      <w:headerReference w:type="even" r:id="rId13"/>
-      <w:headerReference w:type="default" r:id="rId14"/>
-      <w:footerReference w:type="even" r:id="rId15"/>
-      <w:footerReference w:type="default" r:id="rId16"/>
-      <w:headerReference w:type="first" r:id="rId17"/>
-      <w:footerReference w:type="first" r:id="rId18"/>
+      <w:headerReference w:type="even" r:id="rId17"/>
+      <w:headerReference w:type="default" r:id="rId18"/>
+      <w:footerReference w:type="even" r:id="rId19"/>
+      <w:footerReference w:type="default" r:id="rId20"/>
+      <w:headerReference w:type="first" r:id="rId21"/>
+      <w:footerReference w:type="first" r:id="rId22"/>
       <w:pgSz w:w="11906" w:h="16838"/>
       <w:pgMar w:top="1134" w:right="1247" w:bottom="1134" w:left="1247" w:header="652" w:footer="652" w:gutter="0"/>
       <w:cols w:space="720"/>

</xml_diff>

<commit_message>
Add Q4 surface-normal bonus results
</commit_message>
<xml_diff>
--- a/HW4-Solution.docx
+++ b/HW4-Solution.docx
@@ -74,7 +74,7 @@
         </w:rPr>
         <w:fldChar w:fldCharType="separate"/>
       </w:r>
-      <w:hyperlink w:anchor="_Toc236499055" w:history="1">
+      <w:hyperlink w:anchor="_Toc236509044" w:history="1">
         <w:r>
           <w:rPr>
             <w:rStyle w:val="Hyperlink"/>
@@ -102,7 +102,7 @@
             <w:noProof/>
             <w:webHidden/>
           </w:rPr>
-          <w:instrText xml:space="preserve"> PAGEREF _Toc236499055 \h </w:instrText>
+          <w:instrText xml:space="preserve"> PAGEREF _Toc236509044 \h </w:instrText>
         </w:r>
         <w:r>
           <w:rPr>
@@ -146,7 +146,7 @@
           <w14:ligatures w14:val="standardContextual"/>
         </w:rPr>
       </w:pPr>
-      <w:hyperlink w:anchor="_Toc236499056" w:history="1">
+      <w:hyperlink w:anchor="_Toc236509045" w:history="1">
         <w:r>
           <w:rPr>
             <w:rStyle w:val="Hyperlink"/>
@@ -252,7 +252,7 @@
             <w:noProof/>
             <w:webHidden/>
           </w:rPr>
-          <w:instrText xml:space="preserve"> PAGEREF _Toc236499056 \h </w:instrText>
+          <w:instrText xml:space="preserve"> PAGEREF _Toc236509045 \h </w:instrText>
         </w:r>
         <w:r>
           <w:rPr>
@@ -296,7 +296,7 @@
           <w14:ligatures w14:val="standardContextual"/>
         </w:rPr>
       </w:pPr>
-      <w:hyperlink w:anchor="_Toc236499057" w:history="1">
+      <w:hyperlink w:anchor="_Toc236509046" w:history="1">
         <w:r>
           <w:rPr>
             <w:rStyle w:val="Hyperlink"/>
@@ -324,7 +324,7 @@
             <w:noProof/>
             <w:webHidden/>
           </w:rPr>
-          <w:instrText xml:space="preserve"> PAGEREF _Toc236499057 \h </w:instrText>
+          <w:instrText xml:space="preserve"> PAGEREF _Toc236509046 \h </w:instrText>
         </w:r>
         <w:r>
           <w:rPr>
@@ -368,7 +368,7 @@
           <w14:ligatures w14:val="standardContextual"/>
         </w:rPr>
       </w:pPr>
-      <w:hyperlink w:anchor="_Toc236499058" w:history="1">
+      <w:hyperlink w:anchor="_Toc236509047" w:history="1">
         <w:r>
           <w:rPr>
             <w:rStyle w:val="Hyperlink"/>
@@ -396,7 +396,7 @@
             <w:noProof/>
             <w:webHidden/>
           </w:rPr>
-          <w:instrText xml:space="preserve"> PAGEREF _Toc236499058 \h </w:instrText>
+          <w:instrText xml:space="preserve"> PAGEREF _Toc236509047 \h </w:instrText>
         </w:r>
         <w:r>
           <w:rPr>
@@ -440,7 +440,7 @@
           <w14:ligatures w14:val="standardContextual"/>
         </w:rPr>
       </w:pPr>
-      <w:hyperlink w:anchor="_Toc236499059" w:history="1">
+      <w:hyperlink w:anchor="_Toc236509048" w:history="1">
         <w:r>
           <w:rPr>
             <w:rStyle w:val="Hyperlink"/>
@@ -468,7 +468,7 @@
             <w:noProof/>
             <w:webHidden/>
           </w:rPr>
-          <w:instrText xml:space="preserve"> PAGEREF _Toc236499059 \h </w:instrText>
+          <w:instrText xml:space="preserve"> PAGEREF _Toc236509048 \h </w:instrText>
         </w:r>
         <w:r>
           <w:rPr>
@@ -512,7 +512,7 @@
           <w14:ligatures w14:val="standardContextual"/>
         </w:rPr>
       </w:pPr>
-      <w:hyperlink w:anchor="_Toc236499060" w:history="1">
+      <w:hyperlink w:anchor="_Toc236509049" w:history="1">
         <w:r>
           <w:rPr>
             <w:rStyle w:val="Hyperlink"/>
@@ -540,7 +540,7 @@
             <w:noProof/>
             <w:webHidden/>
           </w:rPr>
-          <w:instrText xml:space="preserve"> PAGEREF _Toc236499060 \h </w:instrText>
+          <w:instrText xml:space="preserve"> PAGEREF _Toc236509049 \h </w:instrText>
         </w:r>
         <w:r>
           <w:rPr>
@@ -584,7 +584,7 @@
           <w14:ligatures w14:val="standardContextual"/>
         </w:rPr>
       </w:pPr>
-      <w:hyperlink w:anchor="_Toc236499061" w:history="1">
+      <w:hyperlink w:anchor="_Toc236509050" w:history="1">
         <w:r>
           <w:rPr>
             <w:rStyle w:val="Hyperlink"/>
@@ -612,7 +612,7 @@
             <w:noProof/>
             <w:webHidden/>
           </w:rPr>
-          <w:instrText xml:space="preserve"> PAGEREF _Toc236499061 \h </w:instrText>
+          <w:instrText xml:space="preserve"> PAGEREF _Toc236509050 \h </w:instrText>
         </w:r>
         <w:r>
           <w:rPr>
@@ -656,7 +656,7 @@
           <w14:ligatures w14:val="standardContextual"/>
         </w:rPr>
       </w:pPr>
-      <w:hyperlink w:anchor="_Toc236499062" w:history="1">
+      <w:hyperlink w:anchor="_Toc236509051" w:history="1">
         <w:r>
           <w:rPr>
             <w:rStyle w:val="Hyperlink"/>
@@ -684,7 +684,7 @@
             <w:noProof/>
             <w:webHidden/>
           </w:rPr>
-          <w:instrText xml:space="preserve"> PAGEREF _Toc236499062 \h </w:instrText>
+          <w:instrText xml:space="preserve"> PAGEREF _Toc236509051 \h </w:instrText>
         </w:r>
         <w:r>
           <w:rPr>
@@ -728,7 +728,7 @@
           <w14:ligatures w14:val="standardContextual"/>
         </w:rPr>
       </w:pPr>
-      <w:hyperlink w:anchor="_Toc236499063" w:history="1">
+      <w:hyperlink w:anchor="_Toc236509052" w:history="1">
         <w:r>
           <w:rPr>
             <w:rStyle w:val="Hyperlink"/>
@@ -756,7 +756,7 @@
             <w:noProof/>
             <w:webHidden/>
           </w:rPr>
-          <w:instrText xml:space="preserve"> PAGEREF _Toc236499063 \h </w:instrText>
+          <w:instrText xml:space="preserve"> PAGEREF _Toc236509052 \h </w:instrText>
         </w:r>
         <w:r>
           <w:rPr>
@@ -800,7 +800,7 @@
           <w14:ligatures w14:val="standardContextual"/>
         </w:rPr>
       </w:pPr>
-      <w:hyperlink w:anchor="_Toc236499064" w:history="1">
+      <w:hyperlink w:anchor="_Toc236509053" w:history="1">
         <w:r>
           <w:rPr>
             <w:rStyle w:val="Hyperlink"/>
@@ -828,7 +828,7 @@
             <w:noProof/>
             <w:webHidden/>
           </w:rPr>
-          <w:instrText xml:space="preserve"> PAGEREF _Toc236499064 \h </w:instrText>
+          <w:instrText xml:space="preserve"> PAGEREF _Toc236509053 \h </w:instrText>
         </w:r>
         <w:r>
           <w:rPr>
@@ -872,7 +872,7 @@
           <w14:ligatures w14:val="standardContextual"/>
         </w:rPr>
       </w:pPr>
-      <w:hyperlink w:anchor="_Toc236499065" w:history="1">
+      <w:hyperlink w:anchor="_Toc236509054" w:history="1">
         <w:r>
           <w:rPr>
             <w:rStyle w:val="Hyperlink"/>
@@ -900,7 +900,7 @@
             <w:noProof/>
             <w:webHidden/>
           </w:rPr>
-          <w:instrText xml:space="preserve"> PAGEREF _Toc236499065 \h </w:instrText>
+          <w:instrText xml:space="preserve"> PAGEREF _Toc236509054 \h </w:instrText>
         </w:r>
         <w:r>
           <w:rPr>
@@ -944,7 +944,7 @@
           <w14:ligatures w14:val="standardContextual"/>
         </w:rPr>
       </w:pPr>
-      <w:hyperlink w:anchor="_Toc236499066" w:history="1">
+      <w:hyperlink w:anchor="_Toc236509055" w:history="1">
         <w:r>
           <w:rPr>
             <w:rStyle w:val="Hyperlink"/>
@@ -972,7 +972,7 @@
             <w:noProof/>
             <w:webHidden/>
           </w:rPr>
-          <w:instrText xml:space="preserve"> PAGEREF _Toc236499066 \h </w:instrText>
+          <w:instrText xml:space="preserve"> PAGEREF _Toc236509055 \h </w:instrText>
         </w:r>
         <w:r>
           <w:rPr>
@@ -1016,7 +1016,7 @@
           <w14:ligatures w14:val="standardContextual"/>
         </w:rPr>
       </w:pPr>
-      <w:hyperlink w:anchor="_Toc236499067" w:history="1">
+      <w:hyperlink w:anchor="_Toc236509056" w:history="1">
         <w:r>
           <w:rPr>
             <w:rStyle w:val="Hyperlink"/>
@@ -1044,7 +1044,7 @@
             <w:noProof/>
             <w:webHidden/>
           </w:rPr>
-          <w:instrText xml:space="preserve"> PAGEREF _Toc236499067 \h </w:instrText>
+          <w:instrText xml:space="preserve"> PAGEREF _Toc236509056 \h </w:instrText>
         </w:r>
         <w:r>
           <w:rPr>
@@ -1088,7 +1088,7 @@
           <w14:ligatures w14:val="standardContextual"/>
         </w:rPr>
       </w:pPr>
-      <w:hyperlink w:anchor="_Toc236499068" w:history="1">
+      <w:hyperlink w:anchor="_Toc236509057" w:history="1">
         <w:r>
           <w:rPr>
             <w:rStyle w:val="Hyperlink"/>
@@ -1116,7 +1116,7 @@
             <w:noProof/>
             <w:webHidden/>
           </w:rPr>
-          <w:instrText xml:space="preserve"> PAGEREF _Toc236499068 \h </w:instrText>
+          <w:instrText xml:space="preserve"> PAGEREF _Toc236509057 \h </w:instrText>
         </w:r>
         <w:r>
           <w:rPr>
@@ -1160,7 +1160,7 @@
           <w14:ligatures w14:val="standardContextual"/>
         </w:rPr>
       </w:pPr>
-      <w:hyperlink w:anchor="_Toc236499069" w:history="1">
+      <w:hyperlink w:anchor="_Toc236509058" w:history="1">
         <w:r>
           <w:rPr>
             <w:rStyle w:val="Hyperlink"/>
@@ -1188,7 +1188,7 @@
             <w:noProof/>
             <w:webHidden/>
           </w:rPr>
-          <w:instrText xml:space="preserve"> PAGEREF _Toc236499069 \h </w:instrText>
+          <w:instrText xml:space="preserve"> PAGEREF _Toc236509058 \h </w:instrText>
         </w:r>
         <w:r>
           <w:rPr>
@@ -1232,7 +1232,7 @@
           <w14:ligatures w14:val="standardContextual"/>
         </w:rPr>
       </w:pPr>
-      <w:hyperlink w:anchor="_Toc236499070" w:history="1">
+      <w:hyperlink w:anchor="_Toc236509059" w:history="1">
         <w:r>
           <w:rPr>
             <w:rStyle w:val="Hyperlink"/>
@@ -1260,7 +1260,7 @@
             <w:noProof/>
             <w:webHidden/>
           </w:rPr>
-          <w:instrText xml:space="preserve"> PAGEREF _Toc236499070 \h </w:instrText>
+          <w:instrText xml:space="preserve"> PAGEREF _Toc236509059 \h </w:instrText>
         </w:r>
         <w:r>
           <w:rPr>
@@ -1304,7 +1304,7 @@
           <w14:ligatures w14:val="standardContextual"/>
         </w:rPr>
       </w:pPr>
-      <w:hyperlink w:anchor="_Toc236499071" w:history="1">
+      <w:hyperlink w:anchor="_Toc236509060" w:history="1">
         <w:r>
           <w:rPr>
             <w:rStyle w:val="Hyperlink"/>
@@ -1332,7 +1332,7 @@
             <w:noProof/>
             <w:webHidden/>
           </w:rPr>
-          <w:instrText xml:space="preserve"> PAGEREF _Toc236499071 \h </w:instrText>
+          <w:instrText xml:space="preserve"> PAGEREF _Toc236509060 \h </w:instrText>
         </w:r>
         <w:r>
           <w:rPr>
@@ -1376,23 +1376,14 @@
           <w14:ligatures w14:val="standardContextual"/>
         </w:rPr>
       </w:pPr>
-      <w:hyperlink w:anchor="_Toc236499072" w:history="1">
+      <w:hyperlink w:anchor="_Toc236509061" w:history="1">
         <w:r>
           <w:rPr>
             <w:rStyle w:val="Hyperlink"/>
             <w:noProof/>
             <w:rtl/>
           </w:rPr>
-          <w:t>סעיף ה. הגדלת נתונים באמצעות תמורות</w:t>
-        </w:r>
-        <w:r>
-          <w:rPr>
-            <w:rStyle w:val="Hyperlink"/>
-            <w:noProof/>
-            <w:rtl/>
-          </w:rPr>
-          <w:lastRenderedPageBreak/>
-          <w:t>.</w:t>
+          <w:t>סעיף ה. הגדלת נתונים באמצעות תמורות.</w:t>
         </w:r>
         <w:r>
           <w:rPr>
@@ -1413,7 +1404,7 @@
             <w:noProof/>
             <w:webHidden/>
           </w:rPr>
-          <w:instrText xml:space="preserve"> PAGEREF _Toc236499072 \h </w:instrText>
+          <w:instrText xml:space="preserve"> PAGEREF _Toc236509061 \h </w:instrText>
         </w:r>
         <w:r>
           <w:rPr>
@@ -1457,7 +1448,7 @@
           <w14:ligatures w14:val="standardContextual"/>
         </w:rPr>
       </w:pPr>
-      <w:hyperlink w:anchor="_Toc236499073" w:history="1">
+      <w:hyperlink w:anchor="_Toc236509062" w:history="1">
         <w:r>
           <w:rPr>
             <w:rStyle w:val="Hyperlink"/>
@@ -1485,7 +1476,7 @@
             <w:noProof/>
             <w:webHidden/>
           </w:rPr>
-          <w:instrText xml:space="preserve"> PAGEREF _Toc236499073 \h </w:instrText>
+          <w:instrText xml:space="preserve"> PAGEREF _Toc236509062 \h </w:instrText>
         </w:r>
         <w:r>
           <w:rPr>
@@ -1529,7 +1520,7 @@
           <w14:ligatures w14:val="standardContextual"/>
         </w:rPr>
       </w:pPr>
-      <w:hyperlink w:anchor="_Toc236499074" w:history="1">
+      <w:hyperlink w:anchor="_Toc236509063" w:history="1">
         <w:r>
           <w:rPr>
             <w:rStyle w:val="Hyperlink"/>
@@ -1557,7 +1548,7 @@
             <w:noProof/>
             <w:webHidden/>
           </w:rPr>
-          <w:instrText xml:space="preserve"> PAGEREF _Toc236499074 \h </w:instrText>
+          <w:instrText xml:space="preserve"> PAGEREF _Toc236509063 \h </w:instrText>
         </w:r>
         <w:r>
           <w:rPr>
@@ -1601,7 +1592,7 @@
           <w14:ligatures w14:val="standardContextual"/>
         </w:rPr>
       </w:pPr>
-      <w:hyperlink w:anchor="_Toc236499075" w:history="1">
+      <w:hyperlink w:anchor="_Toc236509064" w:history="1">
         <w:r>
           <w:rPr>
             <w:rStyle w:val="Hyperlink"/>
@@ -1629,7 +1620,7 @@
             <w:noProof/>
             <w:webHidden/>
           </w:rPr>
-          <w:instrText xml:space="preserve"> PAGEREF _Toc236499075 \h </w:instrText>
+          <w:instrText xml:space="preserve"> PAGEREF _Toc236509064 \h </w:instrText>
         </w:r>
         <w:r>
           <w:rPr>
@@ -1673,7 +1664,7 @@
           <w14:ligatures w14:val="standardContextual"/>
         </w:rPr>
       </w:pPr>
-      <w:hyperlink w:anchor="_Toc236499076" w:history="1">
+      <w:hyperlink w:anchor="_Toc236509065" w:history="1">
         <w:r>
           <w:rPr>
             <w:rStyle w:val="Hyperlink"/>
@@ -1701,7 +1692,7 @@
             <w:noProof/>
             <w:webHidden/>
           </w:rPr>
-          <w:instrText xml:space="preserve"> PAGEREF _Toc236499076 \h </w:instrText>
+          <w:instrText xml:space="preserve"> PAGEREF _Toc236509065 \h </w:instrText>
         </w:r>
         <w:r>
           <w:rPr>
@@ -1745,7 +1736,7 @@
           <w14:ligatures w14:val="standardContextual"/>
         </w:rPr>
       </w:pPr>
-      <w:hyperlink w:anchor="_Toc236499077" w:history="1">
+      <w:hyperlink w:anchor="_Toc236509066" w:history="1">
         <w:r>
           <w:rPr>
             <w:rStyle w:val="Hyperlink"/>
@@ -1773,7 +1764,7 @@
             <w:noProof/>
             <w:webHidden/>
           </w:rPr>
-          <w:instrText xml:space="preserve"> PAGEREF _Toc236499077 \h </w:instrText>
+          <w:instrText xml:space="preserve"> PAGEREF _Toc236509066 \h </w:instrText>
         </w:r>
         <w:r>
           <w:rPr>
@@ -1817,7 +1808,7 @@
           <w14:ligatures w14:val="standardContextual"/>
         </w:rPr>
       </w:pPr>
-      <w:hyperlink w:anchor="_Toc236499078" w:history="1">
+      <w:hyperlink w:anchor="_Toc236509067" w:history="1">
         <w:r>
           <w:rPr>
             <w:rStyle w:val="Hyperlink"/>
@@ -1845,7 +1836,7 @@
             <w:noProof/>
             <w:webHidden/>
           </w:rPr>
-          <w:instrText xml:space="preserve"> PAGEREF _Toc236499078 \h </w:instrText>
+          <w:instrText xml:space="preserve"> PAGEREF _Toc236509067 \h </w:instrText>
         </w:r>
         <w:r>
           <w:rPr>
@@ -1889,7 +1880,7 @@
           <w14:ligatures w14:val="standardContextual"/>
         </w:rPr>
       </w:pPr>
-      <w:hyperlink w:anchor="_Toc236499079" w:history="1">
+      <w:hyperlink w:anchor="_Toc236509068" w:history="1">
         <w:r>
           <w:rPr>
             <w:rStyle w:val="Hyperlink"/>
@@ -1917,7 +1908,7 @@
             <w:noProof/>
             <w:webHidden/>
           </w:rPr>
-          <w:instrText xml:space="preserve"> PAGEREF _Toc236499079 \h </w:instrText>
+          <w:instrText xml:space="preserve"> PAGEREF _Toc236509068 \h </w:instrText>
         </w:r>
         <w:r>
           <w:rPr>
@@ -1961,14 +1952,23 @@
           <w14:ligatures w14:val="standardContextual"/>
         </w:rPr>
       </w:pPr>
-      <w:hyperlink w:anchor="_Toc236499080" w:history="1">
+      <w:hyperlink w:anchor="_Toc236509069" w:history="1">
         <w:r>
           <w:rPr>
             <w:rStyle w:val="Hyperlink"/>
             <w:noProof/>
             <w:rtl/>
           </w:rPr>
-          <w:t>תוצאות, ניתוח והמלצה.</w:t>
+          <w:t>תוצא</w:t>
+        </w:r>
+        <w:r>
+          <w:rPr>
+            <w:rStyle w:val="Hyperlink"/>
+            <w:noProof/>
+            <w:rtl/>
+          </w:rPr>
+          <w:lastRenderedPageBreak/>
+          <w:t>ות, ניתוח והמלצה.</w:t>
         </w:r>
         <w:r>
           <w:rPr>
@@ -1989,7 +1989,7 @@
             <w:noProof/>
             <w:webHidden/>
           </w:rPr>
-          <w:instrText xml:space="preserve"> PAGEREF _Toc236499080 \h </w:instrText>
+          <w:instrText xml:space="preserve"> PAGEREF _Toc236509069 \h </w:instrText>
         </w:r>
         <w:r>
           <w:rPr>
@@ -2010,6 +2010,78 @@
             <w:webHidden/>
           </w:rPr>
           <w:t>22</w:t>
+        </w:r>
+        <w:r>
+          <w:rPr>
+            <w:noProof/>
+            <w:webHidden/>
+          </w:rPr>
+          <w:fldChar w:fldCharType="end"/>
+        </w:r>
+      </w:hyperlink>
+    </w:p>
+    <w:p>
+      <w:pPr>
+        <w:pStyle w:val="TOC2"/>
+        <w:tabs>
+          <w:tab w:val="right" w:leader="dot" w:pos="9402"/>
+        </w:tabs>
+        <w:rPr>
+          <w:rFonts w:asciiTheme="minorHAnsi" w:eastAsiaTheme="minorEastAsia" w:hAnsiTheme="minorHAnsi" w:cstheme="minorBidi"/>
+          <w:noProof/>
+          <w:kern w:val="2"/>
+          <w14:ligatures w14:val="standardContextual"/>
+        </w:rPr>
+      </w:pPr>
+      <w:hyperlink w:anchor="_Toc236509070" w:history="1">
+        <w:r>
+          <w:rPr>
+            <w:rStyle w:val="Hyperlink"/>
+            <w:noProof/>
+            <w:rtl/>
+          </w:rPr>
+          <w:t>Bonus. שימוש ב-surface normals.</w:t>
+        </w:r>
+        <w:r>
+          <w:rPr>
+            <w:noProof/>
+            <w:webHidden/>
+          </w:rPr>
+          <w:tab/>
+        </w:r>
+        <w:r>
+          <w:rPr>
+            <w:noProof/>
+            <w:webHidden/>
+          </w:rPr>
+          <w:fldChar w:fldCharType="begin"/>
+        </w:r>
+        <w:r>
+          <w:rPr>
+            <w:noProof/>
+            <w:webHidden/>
+          </w:rPr>
+          <w:instrText xml:space="preserve"> PAGEREF _Toc236509070 \h </w:instrText>
+        </w:r>
+        <w:r>
+          <w:rPr>
+            <w:noProof/>
+            <w:webHidden/>
+          </w:rPr>
+        </w:r>
+        <w:r>
+          <w:rPr>
+            <w:noProof/>
+            <w:webHidden/>
+          </w:rPr>
+          <w:fldChar w:fldCharType="separate"/>
+        </w:r>
+        <w:r>
+          <w:rPr>
+            <w:noProof/>
+            <w:webHidden/>
+          </w:rPr>
+          <w:t>25</w:t>
         </w:r>
         <w:r>
           <w:rPr>
@@ -2037,7 +2109,7 @@
         </w:rPr>
         <w:fldChar w:fldCharType="end"/>
       </w:r>
-      <w:bookmarkStart w:id="1" w:name="_Toc236499055"/>
+      <w:bookmarkStart w:id="1" w:name="_Toc236509044"/>
       <w:r>
         <w:rPr>
           <w:rtl/>
@@ -3004,7 +3076,7 @@
           <w:rtl/>
         </w:rPr>
       </w:pPr>
-      <w:bookmarkStart w:id="2" w:name="_Toc236499056"/>
+      <w:bookmarkStart w:id="2" w:name="_Toc236509045"/>
       <w:r>
         <w:rPr>
           <w:rtl/>
@@ -4722,7 +4794,7 @@
           <w:rtl/>
         </w:rPr>
       </w:pPr>
-      <w:bookmarkStart w:id="3" w:name="_Toc236499057"/>
+      <w:bookmarkStart w:id="3" w:name="_Toc236509046"/>
       <w:r>
         <w:rPr>
           <w:rtl/>
@@ -6319,7 +6391,7 @@
           <w:rtl/>
         </w:rPr>
       </w:pPr>
-      <w:bookmarkStart w:id="4" w:name="_Toc236499058"/>
+      <w:bookmarkStart w:id="4" w:name="_Toc236509047"/>
       <w:r>
         <w:rPr>
           <w:rtl/>
@@ -7903,7 +7975,7 @@
           <w:rtl/>
         </w:rPr>
       </w:pPr>
-      <w:bookmarkStart w:id="5" w:name="_Toc236499059"/>
+      <w:bookmarkStart w:id="5" w:name="_Toc236509048"/>
       <w:r>
         <w:rPr>
           <w:rtl/>
@@ -8490,7 +8562,7 @@
         </w:rPr>
       </w:pPr>
       <w:bookmarkStart w:id="6" w:name="שאלה-2"/>
-      <w:bookmarkStart w:id="7" w:name="_Toc236499060"/>
+      <w:bookmarkStart w:id="7" w:name="_Toc236509049"/>
       <w:bookmarkEnd w:id="0"/>
       <w:r>
         <w:rPr>
@@ -9282,7 +9354,7 @@
           <w:rtl/>
         </w:rPr>
       </w:pPr>
-      <w:bookmarkStart w:id="8" w:name="_Toc236499061"/>
+      <w:bookmarkStart w:id="8" w:name="_Toc236509050"/>
       <w:r>
         <w:rPr>
           <w:rtl/>
@@ -10495,7 +10567,7 @@
           <w:rtl/>
         </w:rPr>
       </w:pPr>
-      <w:bookmarkStart w:id="9" w:name="_Toc236499062"/>
+      <w:bookmarkStart w:id="9" w:name="_Toc236509051"/>
       <w:r>
         <w:rPr>
           <w:rtl/>
@@ -13888,7 +13960,7 @@
           <w:rtl/>
         </w:rPr>
       </w:pPr>
-      <w:bookmarkStart w:id="10" w:name="_Toc236499063"/>
+      <w:bookmarkStart w:id="10" w:name="_Toc236509052"/>
       <w:r>
         <w:rPr>
           <w:rtl/>
@@ -15246,7 +15318,7 @@
           <w:rtl/>
         </w:rPr>
       </w:pPr>
-      <w:bookmarkStart w:id="11" w:name="_Toc236499064"/>
+      <w:bookmarkStart w:id="11" w:name="_Toc236509053"/>
       <w:r>
         <w:rPr>
           <w:rtl/>
@@ -16556,7 +16628,7 @@
           <w:rtl/>
         </w:rPr>
       </w:pPr>
-      <w:bookmarkStart w:id="12" w:name="_Toc236499065"/>
+      <w:bookmarkStart w:id="12" w:name="_Toc236509054"/>
       <w:r>
         <w:rPr>
           <w:rtl/>
@@ -16674,7 +16746,7 @@
           <w:rtl/>
         </w:rPr>
       </w:pPr>
-      <w:bookmarkStart w:id="13" w:name="_Toc236499066"/>
+      <w:bookmarkStart w:id="13" w:name="_Toc236509055"/>
       <w:r>
         <w:rPr>
           <w:rtl/>
@@ -16804,7 +16876,7 @@
           <w:rtl/>
         </w:rPr>
       </w:pPr>
-      <w:bookmarkStart w:id="14" w:name="_Toc236499067"/>
+      <w:bookmarkStart w:id="14" w:name="_Toc236509056"/>
       <w:r>
         <w:rPr>
           <w:rtl/>
@@ -17400,7 +17472,7 @@
           <w:rtl/>
         </w:rPr>
       </w:pPr>
-      <w:bookmarkStart w:id="15" w:name="_Toc236499068"/>
+      <w:bookmarkStart w:id="15" w:name="_Toc236509057"/>
       <w:r>
         <w:rPr>
           <w:rtl/>
@@ -18336,7 +18408,7 @@
           <w:rtl/>
         </w:rPr>
       </w:pPr>
-      <w:bookmarkStart w:id="16" w:name="_Toc236499069"/>
+      <w:bookmarkStart w:id="16" w:name="_Toc236509058"/>
       <w:r>
         <w:rPr>
           <w:rtl/>
@@ -19636,7 +19708,7 @@
           <w:rtl/>
         </w:rPr>
       </w:pPr>
-      <w:bookmarkStart w:id="17" w:name="_Toc236499070"/>
+      <w:bookmarkStart w:id="17" w:name="_Toc236509059"/>
       <w:r>
         <w:rPr>
           <w:rtl/>
@@ -21718,7 +21790,7 @@
           <w:rtl/>
         </w:rPr>
       </w:pPr>
-      <w:bookmarkStart w:id="18" w:name="_Toc236499071"/>
+      <w:bookmarkStart w:id="18" w:name="_Toc236509060"/>
       <w:r>
         <w:rPr>
           <w:rtl/>
@@ -23316,7 +23388,7 @@
           <w:rtl/>
         </w:rPr>
       </w:pPr>
-      <w:bookmarkStart w:id="19" w:name="_Toc236499072"/>
+      <w:bookmarkStart w:id="19" w:name="_Toc236509061"/>
       <w:r>
         <w:rPr>
           <w:rtl/>
@@ -26931,7 +27003,7 @@
           <w:rtl/>
         </w:rPr>
       </w:pPr>
-      <w:bookmarkStart w:id="20" w:name="_Toc236499073"/>
+      <w:bookmarkStart w:id="20" w:name="_Toc236509062"/>
       <w:r>
         <w:rPr>
           <w:rtl/>
@@ -27043,7 +27115,7 @@
           <w:rtl/>
         </w:rPr>
       </w:pPr>
-      <w:bookmarkStart w:id="21" w:name="_Toc236499074"/>
+      <w:bookmarkStart w:id="21" w:name="_Toc236509063"/>
       <w:r>
         <w:rPr>
           <w:rtl/>
@@ -28091,7 +28163,7 @@
           <w:rtl/>
         </w:rPr>
       </w:pPr>
-      <w:bookmarkStart w:id="22" w:name="_Toc236499075"/>
+      <w:bookmarkStart w:id="22" w:name="_Toc236509064"/>
       <w:r>
         <w:rPr>
           <w:rtl/>
@@ -28166,7 +28238,7 @@
           <w:rtl/>
         </w:rPr>
       </w:pPr>
-      <w:bookmarkStart w:id="23" w:name="_Toc236499076"/>
+      <w:bookmarkStart w:id="23" w:name="_Toc236509065"/>
       <w:r>
         <w:rPr>
           <w:rtl/>
@@ -28213,7 +28285,7 @@
           <w:rtl/>
         </w:rPr>
       </w:pPr>
-      <w:bookmarkStart w:id="24" w:name="_Toc236499077"/>
+      <w:bookmarkStart w:id="24" w:name="_Toc236509066"/>
       <w:r>
         <w:rPr>
           <w:rtl/>
@@ -28284,7 +28356,7 @@
           <w:rtl/>
         </w:rPr>
       </w:pPr>
-      <w:bookmarkStart w:id="25" w:name="_Toc236499078"/>
+      <w:bookmarkStart w:id="25" w:name="_Toc236509067"/>
       <w:r>
         <w:rPr>
           <w:rtl/>
@@ -28686,7 +28758,7 @@
           <w:rtl/>
         </w:rPr>
       </w:pPr>
-      <w:bookmarkStart w:id="26" w:name="_Toc236499079"/>
+      <w:bookmarkStart w:id="26" w:name="_Toc236509068"/>
       <w:r>
         <w:rPr>
           <w:rtl/>
@@ -28719,7 +28791,7 @@
           <w:rtl/>
         </w:rPr>
       </w:pPr>
-      <w:bookmarkStart w:id="27" w:name="_Toc236499080"/>
+      <w:bookmarkStart w:id="27" w:name="_Toc236509069"/>
       <w:r>
         <w:rPr>
           <w:rtl/>
@@ -28803,7 +28875,52 @@
         <w:rPr>
           <w:rtl/>
         </w:rPr>
-        <w:t>בטבלת הדיוק כל תא מציג overall accuracy ולאחריו mean-class accuracy. המדד הראשון הוא מדד ההכרעה הראשי.</w:t>
+        <w:t xml:space="preserve">בטבלת הדיוק כל תא מציג </w:t>
+      </w:r>
+      <w:r>
+        <w:t>overall accuracy</w:t>
+      </w:r>
+      <w:r>
+        <w:rPr>
+          <w:rtl/>
+        </w:rPr>
+        <w:t xml:space="preserve"> ולאחריו </w:t>
+      </w:r>
+      <w:r>
+        <w:t>mean-class accuracy</w:t>
+      </w:r>
+      <w:r>
+        <w:rPr>
+          <w:rtl/>
+        </w:rPr>
+        <w:t>. בסוגריים מופיע השינוי ב-</w:t>
+      </w:r>
+      <w:r>
+        <w:t>overall accuracy</w:t>
+      </w:r>
+      <w:r>
+        <w:rPr>
+          <w:rtl/>
+        </w:rPr>
+        <w:t xml:space="preserve"> לאחר הוספת </w:t>
+      </w:r>
+      <w:r>
+        <w:t>surface normals</w:t>
+      </w:r>
+      <w:r>
+        <w:rPr>
+          <w:rtl/>
+        </w:rPr>
+        <w:t xml:space="preserve">, בנקודות אחוז </w:t>
+      </w:r>
+      <w:r>
+        <w:t>(pp)</w:t>
+      </w:r>
+      <w:r>
+        <w:rPr>
+          <w:rtl/>
+        </w:rPr>
+        <w:t>. המדד הראשון הוא מדד ההכרעה הראשי.</w:t>
       </w:r>
     </w:p>
     <w:tbl>
@@ -29002,6 +29119,10 @@
             <w:r>
               <w:t>13.98% / 13.58%</w:t>
             </w:r>
+            <w:r>
+              <w:br/>
+              <w:t>(+5.71 pp)</w:t>
+            </w:r>
           </w:p>
         </w:tc>
         <w:tc>
@@ -29026,6 +29147,10 @@
             <w:r>
               <w:t>21.27% / 19.12%</w:t>
             </w:r>
+            <w:r>
+              <w:br/>
+              <w:t>(+1.58 pp)</w:t>
+            </w:r>
           </w:p>
         </w:tc>
         <w:tc>
@@ -29049,6 +29174,10 @@
             </w:pPr>
             <w:r>
               <w:t>33.27% / 31.25%</w:t>
+            </w:r>
+            <w:r>
+              <w:br/>
+              <w:t>(+1.74 pp)</w:t>
             </w:r>
           </w:p>
         </w:tc>
@@ -29104,6 +29233,10 @@
             <w:r>
               <w:t>10.98% / 11.61%</w:t>
             </w:r>
+            <w:r>
+              <w:br/>
+              <w:t>(−7.58 pp)</w:t>
+            </w:r>
           </w:p>
         </w:tc>
         <w:tc>
@@ -29128,6 +29261,10 @@
             <w:r>
               <w:t>23.42% / 21.83%</w:t>
             </w:r>
+            <w:r>
+              <w:br/>
+              <w:t>(−19.57 pp)</w:t>
+            </w:r>
           </w:p>
         </w:tc>
         <w:tc>
@@ -29151,6 +29288,10 @@
             </w:pPr>
             <w:r>
               <w:t>41.98% / 41.84%</w:t>
+            </w:r>
+            <w:r>
+              <w:br/>
+              <w:t>(−3.85 pp)</w:t>
             </w:r>
           </w:p>
         </w:tc>
@@ -29206,6 +29347,10 @@
             <w:r>
               <w:t>10.53% / 11.43%</w:t>
             </w:r>
+            <w:r>
+              <w:br/>
+              <w:t>(−6.77 pp)</w:t>
+            </w:r>
           </w:p>
         </w:tc>
         <w:tc>
@@ -29230,6 +29375,10 @@
             <w:r>
               <w:t>24.23% / 22.16%</w:t>
             </w:r>
+            <w:r>
+              <w:br/>
+              <w:t>(−20.46 pp)</w:t>
+            </w:r>
           </w:p>
         </w:tc>
         <w:tc>
@@ -29253,6 +29402,10 @@
             </w:pPr>
             <w:r>
               <w:t>41.98% / 40.79%</w:t>
+            </w:r>
+            <w:r>
+              <w:br/>
+              <w:t>(−3.97 pp)</w:t>
             </w:r>
           </w:p>
         </w:tc>
@@ -29308,6 +29461,10 @@
             <w:r>
               <w:t>13.98% / 14.91%</w:t>
             </w:r>
+            <w:r>
+              <w:br/>
+              <w:t>(+7.09 pp)</w:t>
+            </w:r>
           </w:p>
         </w:tc>
         <w:tc>
@@ -29332,6 +29489,10 @@
             <w:r>
               <w:t>27.71% / 26.83%</w:t>
             </w:r>
+            <w:r>
+              <w:br/>
+              <w:t>(+6.16 pp)</w:t>
+            </w:r>
           </w:p>
         </w:tc>
         <w:tc>
@@ -29355,6 +29516,10 @@
             </w:pPr>
             <w:r>
               <w:t>58.31% / 55.82%</w:t>
+            </w:r>
+            <w:r>
+              <w:br/>
+              <w:t>(+10.33 pp)</w:t>
             </w:r>
           </w:p>
         </w:tc>
@@ -29408,6 +29573,10 @@
             <w:r>
               <w:t>2.11% / 5.40%</w:t>
             </w:r>
+            <w:r>
+              <w:br/>
+              <w:t>(+0.20 pp)</w:t>
+            </w:r>
           </w:p>
         </w:tc>
         <w:tc>
@@ -29431,6 +29600,10 @@
             <w:r>
               <w:t>5.11% / 7.86%</w:t>
             </w:r>
+            <w:r>
+              <w:br/>
+              <w:t>(−0.73 pp)</w:t>
+            </w:r>
           </w:p>
         </w:tc>
         <w:tc>
@@ -29453,6 +29626,10 @@
             </w:pPr>
             <w:r>
               <w:t>24.68% / 20.77%</w:t>
+            </w:r>
+            <w:r>
+              <w:br/>
+              <w:t>(+1.01 pp)</w:t>
             </w:r>
           </w:p>
         </w:tc>
@@ -30454,6 +30631,492 @@
           <w:rtl/>
         </w:rPr>
         <w:t>בהשוואה לכך, המודל canonization-based network מבטיח invariance רק לאחר מיון אך אינו משתף משקלים בין מיקומי הקלט ורגיש לחילופים בסדר lexicographic; full symmetrization מדויקת אך בעלת עלות פקטוריאלית; sampled symmetrization חוסכת חישוב במחיר approximation error; ושיטת data augmentation משאירה במודל רכיב non-invariant שעליו ללמוד לדכא. משום כך linear equivariant layers מתאימות במיוחד לענני נקודות גדולים, והתוצאות שנמדדו תואמות את היתרון התאורטי הזה.</w:t>
+      </w:r>
+    </w:p>
+    <w:p>
+      <w:pPr>
+        <w:pStyle w:val="Heading2"/>
+        <w:rPr>
+          <w:rtl/>
+        </w:rPr>
+      </w:pPr>
+      <w:bookmarkStart w:id="28" w:name="_Toc236509070"/>
+      <w:r>
+        <w:rPr>
+          <w:rtl/>
+        </w:rPr>
+        <w:t>Bonus. שימוש ב-surface normals.</w:t>
+      </w:r>
+      <w:bookmarkEnd w:id="28"/>
+    </w:p>
+    <w:p>
+      <w:r>
+        <w:rPr>
+          <w:rtl/>
+        </w:rPr>
+        <w:t>בניסוי ה-</w:t>
+      </w:r>
+      <w:r>
+        <w:t>Bonus</w:t>
+      </w:r>
+      <w:r>
+        <w:rPr>
+          <w:rtl/>
+        </w:rPr>
+        <w:t xml:space="preserve"> חזרנו על כל 15 הניסויים לאחר שהרחבנו כל נקודה מן הייצוג </w:t>
+      </w:r>
+      <w:r>
+        <w:t>(x, y, z)</w:t>
+      </w:r>
+      <w:r>
+        <w:rPr>
+          <w:rtl/>
+        </w:rPr>
+        <w:t xml:space="preserve"> לייצוג </w:t>
+      </w:r>
+      <w:r>
+        <w:t>(x, y, z, n_x, n_y, n_z)</w:t>
+      </w:r>
+      <w:r>
+        <w:rPr>
+          <w:rtl/>
+        </w:rPr>
+        <w:t xml:space="preserve">. בכל </w:t>
+      </w:r>
+      <w:r>
+        <w:t>permutation</w:t>
+      </w:r>
+      <w:r>
+        <w:rPr>
+          <w:rtl/>
+        </w:rPr>
+        <w:t xml:space="preserve"> המיקום וה-</w:t>
+      </w:r>
+      <w:r>
+        <w:t>normal</w:t>
+      </w:r>
+      <w:r>
+        <w:rPr>
+          <w:rtl/>
+        </w:rPr>
+        <w:t xml:space="preserve"> של אותה נקודה הועברו יחד. במודל </w:t>
+      </w:r>
+      <w:r>
+        <w:t>canonization</w:t>
+      </w:r>
+      <w:r>
+        <w:rPr>
+          <w:rtl/>
+        </w:rPr>
+        <w:t xml:space="preserve"> המיון ה-</w:t>
+      </w:r>
+      <w:r>
+        <w:t>lexicographic</w:t>
+      </w:r>
+      <w:r>
+        <w:rPr>
+          <w:rtl/>
+        </w:rPr>
+        <w:t xml:space="preserve"> נותר מבוסס על קואורדינטות </w:t>
+      </w:r>
+      <w:r>
+        <w:t>XYZ</w:t>
+      </w:r>
+      <w:r>
+        <w:rPr>
+          <w:rtl/>
+        </w:rPr>
+        <w:t xml:space="preserve"> בלבד, וכל השורה בת ששת המאפיינים הועברה לפי אותו סדר. לא נמצאו שתי נקודות בעלות אותן קואורדינטות </w:t>
+      </w:r>
+      <w:r>
+        <w:t>XYZ</w:t>
+      </w:r>
+      <w:r>
+        <w:rPr>
+          <w:rtl/>
+        </w:rPr>
+        <w:t xml:space="preserve"> באף אחד מ-4,468 ענני הנקודות שנבדקו. חלוקות הנתונים, </w:t>
+      </w:r>
+      <w:r>
+        <w:t>seed 2319</w:t>
+      </w:r>
+      <w:r>
+        <w:rPr>
+          <w:rtl/>
+        </w:rPr>
+        <w:t>, רוחבי השכבות וה-</w:t>
+      </w:r>
+      <w:r>
+        <w:t>hyperparameters</w:t>
+      </w:r>
+      <w:r>
+        <w:rPr>
+          <w:rtl/>
+        </w:rPr>
+        <w:t xml:space="preserve"> של האימון נשמרו ללא שינוי.</w:t>
+      </w:r>
+    </w:p>
+    <w:p>
+      <w:r>
+        <w:rPr>
+          <w:rtl/>
+        </w:rPr>
+        <w:t xml:space="preserve">ההשוואה אינה </w:t>
+      </w:r>
+      <w:r>
+        <w:t>parameter-matched</w:t>
+      </w:r>
+      <w:r>
+        <w:rPr>
+          <w:rtl/>
+        </w:rPr>
+        <w:t xml:space="preserve">, משום שהכפלת מספר מאפייני הקלט מ-3 ל-6 הגדילה באופן שונה את מספר הפרמטרים בכל ארכיטקטורה. לאחר ההרחבה היו 105,128 פרמטרים במודלים </w:t>
+      </w:r>
+      <w:r>
+        <w:t>canonization-based network</w:t>
+      </w:r>
+      <w:r>
+        <w:rPr>
+          <w:rtl/>
+        </w:rPr>
+        <w:t xml:space="preserve"> ו-</w:t>
+      </w:r>
+      <w:r>
+        <w:t>data augmentation</w:t>
+      </w:r>
+      <w:r>
+        <w:rPr>
+          <w:rtl/>
+        </w:rPr>
+        <w:t xml:space="preserve">, 60,277 פרמטרים במודלים </w:t>
+      </w:r>
+      <w:r>
+        <w:t>full symmetrization</w:t>
+      </w:r>
+      <w:r>
+        <w:rPr>
+          <w:rtl/>
+        </w:rPr>
+        <w:t xml:space="preserve"> ו-</w:t>
+      </w:r>
+      <w:r>
+        <w:t>sampled symmetrization</w:t>
+      </w:r>
+      <w:r>
+        <w:rPr>
+          <w:rtl/>
+        </w:rPr>
+        <w:t xml:space="preserve">, ו-56,232 פרמטרים במודל </w:t>
+      </w:r>
+      <w:r>
+        <w:t>equivariant network</w:t>
+      </w:r>
+      <w:r>
+        <w:rPr>
+          <w:rtl/>
+        </w:rPr>
+        <w:t>. לכן אין לפרש את התוצאות כהשוואה שמבודדת את השפעת הסימטריה בלבד.</w:t>
+      </w:r>
+    </w:p>
+    <w:p>
+      <w:r>
+        <w:rPr>
+          <w:rtl/>
+        </w:rPr>
+        <w:t>השינוי ב-</w:t>
+      </w:r>
+      <w:r>
+        <w:t>overall accuracy</w:t>
+      </w:r>
+      <w:r>
+        <w:rPr>
+          <w:rtl/>
+        </w:rPr>
+        <w:t xml:space="preserve"> מופיע בסוגריים בטבלת התוצאות הראשית. השיפור הגדול והעקבי ביותר התקבל במודל </w:t>
+      </w:r>
+      <w:r>
+        <w:t>equivariant network</w:t>
+      </w:r>
+      <w:r>
+        <w:rPr>
+          <w:rtl/>
+        </w:rPr>
+        <w:t xml:space="preserve">, ובפרט שיפור של </w:t>
+      </w:r>
+      <w:r>
+        <w:t>+10.33 pp</w:t>
+      </w:r>
+      <w:r>
+        <w:rPr>
+          <w:rtl/>
+        </w:rPr>
+        <w:t xml:space="preserve"> ב-50 דוגמאות למחלקה. במודל </w:t>
+      </w:r>
+      <w:r>
+        <w:t>canonization-based network</w:t>
+      </w:r>
+      <w:r>
+        <w:rPr>
+          <w:rtl/>
+        </w:rPr>
+        <w:t xml:space="preserve"> התקבל שיפור מתון, ואילו ב-</w:t>
+      </w:r>
+      <w:r>
+        <w:t>data augmentation</w:t>
+      </w:r>
+      <w:r>
+        <w:rPr>
+          <w:rtl/>
+        </w:rPr>
+        <w:t xml:space="preserve"> השינוי היה זניח. לעומת זאת, בשתי שיטות ה-</w:t>
+      </w:r>
+      <w:r>
+        <w:t>symmetrization</w:t>
+      </w:r>
+      <w:r>
+        <w:rPr>
+          <w:rtl/>
+        </w:rPr>
+        <w:t xml:space="preserve"> הדיוק ירד, בעיקר בניסוי של 10 דוגמאות למחלקה.</w:t>
+      </w:r>
+    </w:p>
+    <w:p>
+      <w:r>
+        <w:rPr>
+          <w:rtl/>
+        </w:rPr>
+        <w:t xml:space="preserve">הסבר סביר ליתרון של המודל </w:t>
+      </w:r>
+      <w:r>
+        <w:t>equivariant network</w:t>
+      </w:r>
+      <w:r>
+        <w:rPr>
+          <w:rtl/>
+        </w:rPr>
+        <w:t xml:space="preserve"> הוא ה-</w:t>
+      </w:r>
+      <w:r>
+        <w:t>pointwise weight sharing</w:t>
+      </w:r>
+      <w:r>
+        <w:rPr>
+          <w:rtl/>
+        </w:rPr>
+        <w:t xml:space="preserve"> הפנימי: אותם פרמטרים משמשים לעיבוד הקשר בין מיקום לבין </w:t>
+      </w:r>
+      <w:r>
+        <w:t>normal</w:t>
+      </w:r>
+      <w:r>
+        <w:rPr>
+          <w:rtl/>
+        </w:rPr>
+        <w:t xml:space="preserve"> בכל 256 הנקודות. כך המודל לומד תבניות גאומטריות חוזרות במרחב פרמטרים מצומצם ומותאם למבנה הקבוצה, ולכן מסוגל לנצל ביעילות את המידע הנוסף.</w:t>
+      </w:r>
+    </w:p>
+    <w:p>
+      <w:r>
+        <w:rPr>
+          <w:rtl/>
+        </w:rPr>
+        <w:t xml:space="preserve">המודלים </w:t>
+      </w:r>
+      <w:r>
+        <w:t>full symmetrization</w:t>
+      </w:r>
+      <w:r>
+        <w:rPr>
+          <w:rtl/>
+        </w:rPr>
+        <w:t xml:space="preserve"> ו-</w:t>
+      </w:r>
+      <w:r>
+        <w:t>sampled symmetrization</w:t>
+      </w:r>
+      <w:r>
+        <w:rPr>
+          <w:rtl/>
+        </w:rPr>
+        <w:t xml:space="preserve"> מבטיחים או מקרבים </w:t>
+      </w:r>
+      <w:r>
+        <w:t>invariant output</w:t>
+      </w:r>
+      <w:r>
+        <w:rPr>
+          <w:rtl/>
+        </w:rPr>
+        <w:t xml:space="preserve"> באמצעות מיצוע, אך ה-</w:t>
+      </w:r>
+      <w:r>
+        <w:t>flattened MLP</w:t>
+      </w:r>
+      <w:r>
+        <w:rPr>
+          <w:rtl/>
+        </w:rPr>
+        <w:t xml:space="preserve"> הבסיסי אינו כולל </w:t>
+      </w:r>
+      <w:r>
+        <w:t>internal pointwise weight sharing</w:t>
+      </w:r>
+      <w:r>
+        <w:rPr>
+          <w:rtl/>
+        </w:rPr>
+        <w:t>. לכן הוא נדרש ללמוד במרחב פרמטרים רחב ורווי כיוונים תלויי-מיקום ומיותרים. נוסף על כך, שתי השיטות קיבלו שבע נקודות בלבד ולכן נחשפו להרבה פחות מידע מן ה-</w:t>
+      </w:r>
+      <w:r>
+        <w:t>normals</w:t>
+      </w:r>
+      <w:r>
+        <w:rPr>
+          <w:rtl/>
+        </w:rPr>
+        <w:t>. התוצאות הכמעט זהות של שתי השיטות מלמדות שהירידה אינה נובעת מ-</w:t>
+      </w:r>
+      <w:r>
+        <w:t>Monte Carlo approximation</w:t>
+      </w:r>
+      <w:r>
+        <w:rPr>
+          <w:rtl/>
+        </w:rPr>
+        <w:t>. בניסויים של 5 ושל 10 דוגמאות למחלקה ערך ה-</w:t>
+      </w:r>
+      <w:r>
+        <w:t>validation cross-entropy</w:t>
+      </w:r>
+      <w:r>
+        <w:rPr>
+          <w:rtl/>
+        </w:rPr>
+        <w:t xml:space="preserve"> נותר קרוב ל-</w:t>
+      </w:r>
+      <w:r>
+        <w:t>log(40)</w:t>
+      </w:r>
+      <w:r>
+        <w:rPr>
+          <w:rtl/>
+        </w:rPr>
+        <w:t>, כלומר המודלים כמעט שלא למדו מעבר לניחוש אקראי.</w:t>
+      </w:r>
+    </w:p>
+    <w:p>
+      <w:r>
+        <w:rPr>
+          <w:rtl/>
+        </w:rPr>
+        <w:t>גם הגידול במספר הפרמטרים של המודלים הלא-</w:t>
+      </w:r>
+      <w:r>
+        <w:t>equivariant</w:t>
+      </w:r>
+      <w:r>
+        <w:rPr>
+          <w:rtl/>
+        </w:rPr>
+        <w:t xml:space="preserve"> לא פתר את הבעיה: למודלים </w:t>
+      </w:r>
+      <w:r>
+        <w:t>canonization-based network</w:t>
+      </w:r>
+      <w:r>
+        <w:rPr>
+          <w:rtl/>
+        </w:rPr>
+        <w:t xml:space="preserve"> ו-</w:t>
+      </w:r>
+      <w:r>
+        <w:t>data augmentation</w:t>
+      </w:r>
+      <w:r>
+        <w:rPr>
+          <w:rtl/>
+        </w:rPr>
+        <w:t xml:space="preserve"> היו כ-105 אלף פרמטרים, אך השיפור שלהם היה קטן בהרבה. המודל </w:t>
+      </w:r>
+      <w:r>
+        <w:t>canonization-based network</w:t>
+      </w:r>
+      <w:r>
+        <w:rPr>
+          <w:rtl/>
+        </w:rPr>
+        <w:t xml:space="preserve"> נהנה מעט מן המידע הנוסף משום שהוא מבטיח </w:t>
+      </w:r>
+      <w:r>
+        <w:t>invariance</w:t>
+      </w:r>
+      <w:r>
+        <w:rPr>
+          <w:rtl/>
+        </w:rPr>
+        <w:t xml:space="preserve"> באמצעות מיון, אך עדיין חסר בו </w:t>
+      </w:r>
+      <w:r>
+        <w:t>pointwise weight sharing</w:t>
+      </w:r>
+      <w:r>
+        <w:rPr>
+          <w:rtl/>
+        </w:rPr>
+        <w:t xml:space="preserve">; בשיטת </w:t>
+      </w:r>
+      <w:r>
+        <w:t>data augmentation</w:t>
+      </w:r>
+      <w:r>
+        <w:rPr>
+          <w:rtl/>
+        </w:rPr>
+        <w:t xml:space="preserve"> הסימטריה נלמדת רק מן הדוגמאות שנצפו ולכן השיפור נותר זניח.</w:t>
+      </w:r>
+    </w:p>
+    <w:p>
+      <w:r>
+        <w:rPr>
+          <w:rtl/>
+        </w:rPr>
+        <w:t>יש לפרש את ההשוואה בזהירות: מספר הנקודות אינו זהה בכל השיטות, תוספת הפרמטרים אינה אחידה, וה-</w:t>
+      </w:r>
+      <w:r>
+        <w:t>hyperparameters</w:t>
+      </w:r>
+      <w:r>
+        <w:rPr>
+          <w:rtl/>
+        </w:rPr>
+        <w:t xml:space="preserve"> נשמרו לצורך השוואה ישירה ולא כווננו מחדש לכל ארכיטקטורה. לפיכך, התוצאות מראות כי בתנאי הניסוי שנבדקו המודל </w:t>
+      </w:r>
+      <w:r>
+        <w:t>equivariant network</w:t>
+      </w:r>
+      <w:r>
+        <w:rPr>
+          <w:rtl/>
+        </w:rPr>
+        <w:t xml:space="preserve"> היה השיטה המעשית הטובה ביותר לניצול </w:t>
+      </w:r>
+      <w:r>
+        <w:t>surface normals</w:t>
+      </w:r>
+      <w:r>
+        <w:rPr>
+          <w:rtl/>
+        </w:rPr>
+        <w:t>, אך אינן מוכיחות שכל השיפור נגרם מן ה-</w:t>
+      </w:r>
+      <w:r>
+        <w:t>equivariance</w:t>
+      </w:r>
+      <w:r>
+        <w:rPr>
+          <w:rtl/>
+        </w:rPr>
+        <w:t xml:space="preserve"> בלבד.</w:t>
       </w:r>
     </w:p>
     <w:sectPr>

</xml_diff>